<commit_message>
Manual screenshots on v2.3.2, regenerated manual
Every screenshot retaken from a fresh demo upload on Excel and PowerPoint for
the web with the audited pane, the two old-brand-era shots included; the manual
now says v2.3.2.
</commit_message>
<xml_diff>
--- a/manual/out/pls,fix rokasgrāmata.docx
+++ b/manual/out/pls,fix rokasgrāmata.docx
@@ -123,7 +123,7 @@
           <w:bCs/>
           <w:rFonts w:ascii="Aptos" w:hAnsi="Aptos" w:cs="Aptos" w:eastAsia="Aptos"/>
         </w:rPr>
-        <w:t xml:space="preserve">v2.2.006</w:t>
+        <w:t xml:space="preserve">v2.3.002</w:t>
       </w:r>
     </w:p>
     <w:p>
@@ -2923,7 +2923,7 @@
         <w:rPr/>
         <w:drawing>
           <wp:inline distT="0" distB="0" distL="0" distR="0">
-            <wp:extent cx="3040838" cy="3960000"/>
+            <wp:extent cx="2568848" cy="3960000"/>
             <wp:effectExtent b="0" l="0" r="0" t="0"/>
             <wp:docPr id="2" name="Attēls 2" descr="pls,fix panelis Excel loga labajā pusē: komata logotips, stāvokļa rinda &quot;Excel connected&quot; un ciļņu josla."/>
             <wp:cNvGraphicFramePr>
@@ -2948,7 +2948,7 @@
                   <pic:spPr bwMode="auto">
                     <a:xfrm rot="0">
                       <a:off x="0" y="0"/>
-                      <a:ext cx="3040838" cy="3960000"/>
+                      <a:ext cx="2568848" cy="3960000"/>
                     </a:xfrm>
                     <a:prstGeom prst="rect">
                       <a:avLst/>
@@ -4669,7 +4669,7 @@
         <w:rPr/>
         <w:drawing>
           <wp:inline distT="0" distB="0" distL="0" distR="0">
-            <wp:extent cx="5400000" cy="2688750"/>
+            <wp:extent cx="5256093" cy="3960000"/>
             <wp:effectExtent b="0" l="0" r="0" t="0"/>
             <wp:docPr id="4" name="Attēls 4" descr="Peļņas un zaudējumu aprēķins pēc krāsošanas: ievadītie skaitļi, formulas un atsauces uz citu lapu katra savā krāsā."/>
             <wp:cNvGraphicFramePr>
@@ -4694,7 +4694,7 @@
                   <pic:spPr bwMode="auto">
                     <a:xfrm rot="0">
                       <a:off x="0" y="0"/>
-                      <a:ext cx="5400000" cy="2688750"/>
+                      <a:ext cx="5256093" cy="3960000"/>
                     </a:xfrm>
                     <a:prstGeom prst="rect">
                       <a:avLst/>
@@ -4800,7 +4800,7 @@
         <w:rPr/>
         <w:drawing>
           <wp:inline distT="0" distB="0" distL="0" distR="0">
-            <wp:extent cx="5400000" cy="2898750"/>
+            <wp:extent cx="5256093" cy="3960000"/>
             <wp:effectExtent b="0" l="0" r="0" t="0"/>
             <wp:docPr id="5" name="Attēls 5" descr="Pārbaudes slānis peļņas un zaudējumu aprēķinā: svītrotas šūnas ar vienādām formulām un sarkanīgas šūnas, kas no parauga atšķiras."/>
             <wp:cNvGraphicFramePr>
@@ -4825,7 +4825,7 @@
                   <pic:spPr bwMode="auto">
                     <a:xfrm rot="0">
                       <a:off x="0" y="0"/>
-                      <a:ext cx="5400000" cy="2898750"/>
+                      <a:ext cx="5256093" cy="3960000"/>
                     </a:xfrm>
                     <a:prstGeom prst="rect">
                       <a:avLst/>
@@ -6736,7 +6736,7 @@
         <w:rPr/>
         <w:drawing>
           <wp:inline distT="0" distB="0" distL="0" distR="0">
-            <wp:extent cx="2064393" cy="3960000"/>
+            <wp:extent cx="2209263" cy="3960000"/>
             <wp:effectExtent b="0" l="0" r="0" t="0"/>
             <wp:docPr id="7" name="Attēls 7" descr="PowerPoint cilne &quot;Settings&quot; ar saites atslēgas lauku un pogām &quot;Save key&quot; un &quot;Forget key&quot;."/>
             <wp:cNvGraphicFramePr>
@@ -6761,7 +6761,7 @@
                   <pic:spPr bwMode="auto">
                     <a:xfrm rot="0">
                       <a:off x="0" y="0"/>
-                      <a:ext cx="2064393" cy="3960000"/>
+                      <a:ext cx="2209263" cy="3960000"/>
                     </a:xfrm>
                     <a:prstGeom prst="rect">
                       <a:avLst/>
@@ -7393,7 +7393,7 @@
         <w:rPr/>
         <w:drawing>
           <wp:inline distT="0" distB="0" distL="0" distR="0">
-            <wp:extent cx="2064393" cy="3960000"/>
+            <wp:extent cx="2209263" cy="3960000"/>
             <wp:effectExtent b="0" l="0" r="0" t="0"/>
             <wp:docPr id="9" name="Attēls 9" descr="PowerPoint cilne &quot;Inbox&quot; ar tukšu sarakstu un paskaidrojumu par vienumu derīguma termiņu."/>
             <wp:cNvGraphicFramePr>
@@ -7418,7 +7418,7 @@
                   <pic:spPr bwMode="auto">
                     <a:xfrm rot="0">
                       <a:off x="0" y="0"/>
-                      <a:ext cx="2064393" cy="3960000"/>
+                      <a:ext cx="2209263" cy="3960000"/>
                     </a:xfrm>
                     <a:prstGeom prst="rect">
                       <a:avLst/>
@@ -7767,7 +7767,7 @@
         <w:rPr/>
         <w:drawing>
           <wp:inline distT="0" distB="0" distL="0" distR="0">
-            <wp:extent cx="2064393" cy="3960000"/>
+            <wp:extent cx="2209263" cy="3960000"/>
             <wp:effectExtent b="0" l="0" r="0" t="0"/>
             <wp:docPr id="10" name="Attēls 10" descr="PowerPoint cilne &quot;Links&quot;: atjaunināšanas pogas un saišu tabula ar slaidu, avotu un stāvokli."/>
             <wp:cNvGraphicFramePr>
@@ -7783,7 +7783,7 @@
                     </pic:cNvPicPr>
                   </pic:nvPicPr>
                   <pic:blipFill>
-                    <a:blip r:embed="rIdImage10"/>
+                    <a:blip r:embed="rIdImage9"/>
                     <a:srcRect/>
                     <a:stretch>
                       <a:fillRect/>
@@ -7792,7 +7792,7 @@
                   <pic:spPr bwMode="auto">
                     <a:xfrm rot="0">
                       <a:off x="0" y="0"/>
-                      <a:ext cx="2064393" cy="3960000"/>
+                      <a:ext cx="2209263" cy="3960000"/>
                     </a:xfrm>
                     <a:prstGeom prst="rect">
                       <a:avLst/>
@@ -8433,7 +8433,7 @@
                     </pic:cNvPicPr>
                   </pic:nvPicPr>
                   <pic:blipFill>
-                    <a:blip r:embed="rIdImage11"/>
+                    <a:blip r:embed="rIdImage2"/>
                     <a:srcRect/>
                     <a:stretch>
                       <a:fillRect/>
@@ -12819,7 +12819,7 @@
           <w:color w:val="1A1A1A"/>
           <w:rFonts w:ascii="Aptos" w:hAnsi="Aptos" w:cs="Aptos" w:eastAsia="Aptos"/>
         </w:rPr>
-        <w:t xml:space="preserve">Šī rokasgrāmata apraksta pls,fix versiju v2.2.006. Tā pati versija ir uzrakstīta uz vāka un katras lapas apakšā.</w:t>
+        <w:t xml:space="preserve">Šī rokasgrāmata apraksta pls,fix versiju v2.3.002. Tā pati versija ir uzrakstīta uz vāka un katras lapas apakšā.</w:t>
       </w:r>
     </w:p>
     <w:p>
@@ -12884,7 +12884,7 @@
         <w:color w:val="5B6472"/>
         <w:rFonts w:ascii="Aptos" w:hAnsi="Aptos" w:cs="Aptos" w:eastAsia="Aptos"/>
       </w:rPr>
-      <w:t xml:space="preserve">pls,fix rokasgrāmata v2.2.006   |   </w:t>
+      <w:t xml:space="preserve">pls,fix rokasgrāmata v2.3.002   |   </w:t>
     </w:r>
     <w:r>
       <w:rPr>

</xml_diff>

<commit_message>
Document the section help in README, manual and Map
One sentence in README under the pane description, one Latvian paragraph
in "Panelis un cilnes" saying every section has a "?" and how it closes,
and the regenerated .docx. The Map gains src/help/, ui/help.ts,
styles/help.css and the symptom line for a missing card row.
</commit_message>
<xml_diff>
--- a/manual/out/pls,fix rokasgrāmata.docx
+++ b/manual/out/pls,fix rokasgrāmata.docx
@@ -2912,6 +2912,21 @@
           <w:rFonts w:ascii="Aptos" w:hAnsi="Aptos" w:cs="Aptos" w:eastAsia="Aptos"/>
         </w:rPr>
         <w:t xml:space="preserve">Paneļa apakšā ir rinda "Workbook data stays inside Excel" un pašreizējā versija. PowerPoint pusē tajā pašā vietā ir rinda "Linked objects stay inside PowerPoint".</w:t>
+      </w:r>
+    </w:p>
+    <w:p>
+      <w:pPr>
+        <w:rPr/>
+        <w:spacing w:after="120" w:line="276"/>
+      </w:pPr>
+      <w:r>
+        <w:rPr>
+          <w:sz w:val="22"/>
+          <w:szCs w:val="22"/>
+          <w:color w:val="1A1A1A"/>
+          <w:rFonts w:ascii="Aptos" w:hAnsi="Aptos" w:cs="Aptos" w:eastAsia="Aptos"/>
+        </w:rPr>
+        <w:t xml:space="preserve">Katrai paneļa sadaļai blakus virsrakstam ir apaļa poga "?", kas atver īsu skaidrojumu par sadaļu un par katru tās pogu. Vienlaikus ir atvērts viens skaidrojums, un to aizver ar to pašu pogu vai ar taustiņu Esc.</w:t>
       </w:r>
     </w:p>
     <w:p>

</xml_diff>

<commit_message>
Add the Veidnes chapter to the manual
One section per template, with the English button labels the pane shows
and the block size each one writes. Regenerated the .docx.
</commit_message>
<xml_diff>
--- a/manual/out/pls,fix rokasgrāmata.docx
+++ b/manual/out/pls,fix rokasgrāmata.docx
@@ -920,7 +920,7 @@
               </w:pPr>
               <w:r>
                 <w:rPr/>
-                <w:t xml:space="preserve">5  Cilne Workbook</w:t>
+                <w:t xml:space="preserve">5  Veidnes</w:t>
               </w:r>
               <w:r>
                 <w:rPr/>
@@ -945,7 +945,7 @@
               </w:pPr>
               <w:r>
                 <w:rPr/>
-                <w:t xml:space="preserve">Lapu saraksts</w:t>
+                <w:t xml:space="preserve">Kas ir veidnes</w:t>
               </w:r>
               <w:r>
                 <w:rPr/>
@@ -970,7 +970,7 @@
               </w:pPr>
               <w:r>
                 <w:rPr/>
-                <w:t xml:space="preserve">Super Find</w:t>
+                <w:t xml:space="preserve">Debt schedule (annuity)</w:t>
               </w:r>
               <w:r>
                 <w:rPr/>
@@ -995,7 +995,7 @@
               </w:pPr>
               <w:r>
                 <w:rPr/>
-                <w:t xml:space="preserve">Satura rādītājs</w:t>
+                <w:t xml:space="preserve">DCF valuation</w:t>
               </w:r>
               <w:r>
                 <w:rPr/>
@@ -1020,7 +1020,7 @@
               </w:pPr>
               <w:r>
                 <w:rPr/>
-                <w:t xml:space="preserve">Bojātie nosaukumi</w:t>
+                <w:t xml:space="preserve">NPV / IRR</w:t>
               </w:r>
               <w:r>
                 <w:rPr/>
@@ -1045,7 +1045,7 @@
               </w:pPr>
               <w:r>
                 <w:rPr/>
-                <w:t xml:space="preserve">Neizmantotie stili</w:t>
+                <w:t xml:space="preserve">Working capital days</w:t>
               </w:r>
               <w:r>
                 <w:rPr/>
@@ -1070,7 +1070,7 @@
               </w:pPr>
               <w:r>
                 <w:rPr/>
-                <w:t xml:space="preserve">Prepare for sharing</w:t>
+                <w:t xml:space="preserve">Two-way sensitivity</w:t>
               </w:r>
               <w:r>
                 <w:rPr/>
@@ -1088,6 +1088,31 @@
             <w:p>
               <w:pPr>
                 <w:rPr/>
+                <w:pStyle w:val="ToC2"/>
+                <w:tabs>
+                  <w:tab w:val="right" w:leader="dot" w:pos="80000"/>
+                </w:tabs>
+              </w:pPr>
+              <w:r>
+                <w:rPr/>
+                <w:t xml:space="preserve">EBITDA bridge</w:t>
+              </w:r>
+              <w:r>
+                <w:rPr/>
+                <w:tab/>
+              </w:r>
+              <w:r>
+                <w:rPr/>
+                <w:fldChar w:fldCharType="begin" w:dirty="false"/>
+                <w:instrText>PAGEREF _Toc00000037 \h</w:instrText>
+                <w:fldChar w:fldCharType="separate" w:dirty="false"/>
+                <w:t xml:space="preserve">1</w:t>
+                <w:fldChar w:fldCharType="end" w:dirty="false"/>
+              </w:r>
+            </w:p>
+            <w:p>
+              <w:pPr>
+                <w:rPr/>
                 <w:pStyle w:val="ToC1"/>
                 <w:tabs>
                   <w:tab w:val="right" w:leader="dot" w:pos="80000"/>
@@ -1095,7 +1120,7 @@
               </w:pPr>
               <w:r>
                 <w:rPr/>
-                <w:t xml:space="preserve">6  Saites uz PowerPoint</w:t>
+                <w:t xml:space="preserve">6  Cilne Workbook</w:t>
               </w:r>
               <w:r>
                 <w:rPr/>
@@ -1104,7 +1129,7 @@
               <w:r>
                 <w:rPr/>
                 <w:fldChar w:fldCharType="begin" w:dirty="false"/>
-                <w:instrText>PAGEREF _Toc00000037 \h</w:instrText>
+                <w:instrText>PAGEREF _Toc00000038 \h</w:instrText>
                 <w:fldChar w:fldCharType="separate" w:dirty="false"/>
                 <w:t xml:space="preserve">1</w:t>
                 <w:fldChar w:fldCharType="end" w:dirty="false"/>
@@ -1120,7 +1145,7 @@
               </w:pPr>
               <w:r>
                 <w:rPr/>
-                <w:t xml:space="preserve">Kā saite darbojas</w:t>
+                <w:t xml:space="preserve">Lapu saraksts</w:t>
               </w:r>
               <w:r>
                 <w:rPr/>
@@ -1129,7 +1154,7 @@
               <w:r>
                 <w:rPr/>
                 <w:fldChar w:fldCharType="begin" w:dirty="false"/>
-                <w:instrText>PAGEREF _Toc00000038 \h</w:instrText>
+                <w:instrText>PAGEREF _Toc00000039 \h</w:instrText>
                 <w:fldChar w:fldCharType="separate" w:dirty="false"/>
                 <w:t xml:space="preserve">1</w:t>
                 <w:fldChar w:fldCharType="end" w:dirty="false"/>
@@ -1145,7 +1170,7 @@
               </w:pPr>
               <w:r>
                 <w:rPr/>
-                <w:t xml:space="preserve">Saites atslēga</w:t>
+                <w:t xml:space="preserve">Super Find</w:t>
               </w:r>
               <w:r>
                 <w:rPr/>
@@ -1154,7 +1179,7 @@
               <w:r>
                 <w:rPr/>
                 <w:fldChar w:fldCharType="begin" w:dirty="false"/>
-                <w:instrText>PAGEREF _Toc00000039 \h</w:instrText>
+                <w:instrText>PAGEREF _Toc00000040 \h</w:instrText>
                 <w:fldChar w:fldCharType="separate" w:dirty="false"/>
                 <w:t xml:space="preserve">1</w:t>
                 <w:fldChar w:fldCharType="end" w:dirty="false"/>
@@ -1170,7 +1195,7 @@
               </w:pPr>
               <w:r>
                 <w:rPr/>
-                <w:t xml:space="preserve">Eksports no Excel</w:t>
+                <w:t xml:space="preserve">Satura rādītājs</w:t>
               </w:r>
               <w:r>
                 <w:rPr/>
@@ -1179,7 +1204,7 @@
               <w:r>
                 <w:rPr/>
                 <w:fldChar w:fldCharType="begin" w:dirty="false"/>
-                <w:instrText>PAGEREF _Toc00000040 \h</w:instrText>
+                <w:instrText>PAGEREF _Toc00000041 \h</w:instrText>
                 <w:fldChar w:fldCharType="separate" w:dirty="false"/>
                 <w:t xml:space="preserve">1</w:t>
                 <w:fldChar w:fldCharType="end" w:dirty="false"/>
@@ -1195,7 +1220,7 @@
               </w:pPr>
               <w:r>
                 <w:rPr/>
-                <w:t xml:space="preserve">Saišu saraksts Excel pusē</w:t>
+                <w:t xml:space="preserve">Bojātie nosaukumi</w:t>
               </w:r>
               <w:r>
                 <w:rPr/>
@@ -1204,7 +1229,7 @@
               <w:r>
                 <w:rPr/>
                 <w:fldChar w:fldCharType="begin" w:dirty="false"/>
-                <w:instrText>PAGEREF _Toc00000041 \h</w:instrText>
+                <w:instrText>PAGEREF _Toc00000042 \h</w:instrText>
                 <w:fldChar w:fldCharType="separate" w:dirty="false"/>
                 <w:t xml:space="preserve">1</w:t>
                 <w:fldChar w:fldCharType="end" w:dirty="false"/>
@@ -1220,7 +1245,7 @@
               </w:pPr>
               <w:r>
                 <w:rPr/>
-                <w:t xml:space="preserve">Auto-push on edit un Highlight linked cells</w:t>
+                <w:t xml:space="preserve">Neizmantotie stili</w:t>
               </w:r>
               <w:r>
                 <w:rPr/>
@@ -1229,7 +1254,7 @@
               <w:r>
                 <w:rPr/>
                 <w:fldChar w:fldCharType="begin" w:dirty="false"/>
-                <w:instrText>PAGEREF _Toc00000042 \h</w:instrText>
+                <w:instrText>PAGEREF _Toc00000043 \h</w:instrText>
                 <w:fldChar w:fldCharType="separate" w:dirty="false"/>
                 <w:t xml:space="preserve">1</w:t>
                 <w:fldChar w:fldCharType="end" w:dirty="false"/>
@@ -1245,7 +1270,7 @@
               </w:pPr>
               <w:r>
                 <w:rPr/>
-                <w:t xml:space="preserve">Ievietošana PowerPoint</w:t>
+                <w:t xml:space="preserve">Prepare for sharing</w:t>
               </w:r>
               <w:r>
                 <w:rPr/>
@@ -1254,7 +1279,32 @@
               <w:r>
                 <w:rPr/>
                 <w:fldChar w:fldCharType="begin" w:dirty="false"/>
-                <w:instrText>PAGEREF _Toc00000043 \h</w:instrText>
+                <w:instrText>PAGEREF _Toc00000044 \h</w:instrText>
+                <w:fldChar w:fldCharType="separate" w:dirty="false"/>
+                <w:t xml:space="preserve">1</w:t>
+                <w:fldChar w:fldCharType="end" w:dirty="false"/>
+              </w:r>
+            </w:p>
+            <w:p>
+              <w:pPr>
+                <w:rPr/>
+                <w:pStyle w:val="ToC1"/>
+                <w:tabs>
+                  <w:tab w:val="right" w:leader="dot" w:pos="80000"/>
+                </w:tabs>
+              </w:pPr>
+              <w:r>
+                <w:rPr/>
+                <w:t xml:space="preserve">7  Saites uz PowerPoint</w:t>
+              </w:r>
+              <w:r>
+                <w:rPr/>
+                <w:tab/>
+              </w:r>
+              <w:r>
+                <w:rPr/>
+                <w:fldChar w:fldCharType="begin" w:dirty="false"/>
+                <w:instrText>PAGEREF _Toc00000045 \h</w:instrText>
                 <w:fldChar w:fldCharType="separate" w:dirty="false"/>
                 <w:t xml:space="preserve">1</w:t>
                 <w:fldChar w:fldCharType="end" w:dirty="false"/>
@@ -1270,7 +1320,7 @@
               </w:pPr>
               <w:r>
                 <w:rPr/>
-                <w:t xml:space="preserve">Atjaunināšana</w:t>
+                <w:t xml:space="preserve">Kā saite darbojas</w:t>
               </w:r>
               <w:r>
                 <w:rPr/>
@@ -1279,7 +1329,7 @@
               <w:r>
                 <w:rPr/>
                 <w:fldChar w:fldCharType="begin" w:dirty="false"/>
-                <w:instrText>PAGEREF _Toc00000044 \h</w:instrText>
+                <w:instrText>PAGEREF _Toc00000046 \h</w:instrText>
                 <w:fldChar w:fldCharType="separate" w:dirty="false"/>
                 <w:t xml:space="preserve">1</w:t>
                 <w:fldChar w:fldCharType="end" w:dirty="false"/>
@@ -1295,7 +1345,7 @@
               </w:pPr>
               <w:r>
                 <w:rPr/>
-                <w:t xml:space="preserve">Go to slide, Change source un Break link</w:t>
+                <w:t xml:space="preserve">Saites atslēga</w:t>
               </w:r>
               <w:r>
                 <w:rPr/>
@@ -1304,7 +1354,7 @@
               <w:r>
                 <w:rPr/>
                 <w:fldChar w:fldCharType="begin" w:dirty="false"/>
-                <w:instrText>PAGEREF _Toc00000045 \h</w:instrText>
+                <w:instrText>PAGEREF _Toc00000047 \h</w:instrText>
                 <w:fldChar w:fldCharType="separate" w:dirty="false"/>
                 <w:t xml:space="preserve">1</w:t>
                 <w:fldChar w:fldCharType="end" w:dirty="false"/>
@@ -1320,6 +1370,156 @@
               </w:pPr>
               <w:r>
                 <w:rPr/>
+                <w:t xml:space="preserve">Eksports no Excel</w:t>
+              </w:r>
+              <w:r>
+                <w:rPr/>
+                <w:tab/>
+              </w:r>
+              <w:r>
+                <w:rPr/>
+                <w:fldChar w:fldCharType="begin" w:dirty="false"/>
+                <w:instrText>PAGEREF _Toc00000048 \h</w:instrText>
+                <w:fldChar w:fldCharType="separate" w:dirty="false"/>
+                <w:t xml:space="preserve">1</w:t>
+                <w:fldChar w:fldCharType="end" w:dirty="false"/>
+              </w:r>
+            </w:p>
+            <w:p>
+              <w:pPr>
+                <w:rPr/>
+                <w:pStyle w:val="ToC2"/>
+                <w:tabs>
+                  <w:tab w:val="right" w:leader="dot" w:pos="80000"/>
+                </w:tabs>
+              </w:pPr>
+              <w:r>
+                <w:rPr/>
+                <w:t xml:space="preserve">Saišu saraksts Excel pusē</w:t>
+              </w:r>
+              <w:r>
+                <w:rPr/>
+                <w:tab/>
+              </w:r>
+              <w:r>
+                <w:rPr/>
+                <w:fldChar w:fldCharType="begin" w:dirty="false"/>
+                <w:instrText>PAGEREF _Toc00000049 \h</w:instrText>
+                <w:fldChar w:fldCharType="separate" w:dirty="false"/>
+                <w:t xml:space="preserve">1</w:t>
+                <w:fldChar w:fldCharType="end" w:dirty="false"/>
+              </w:r>
+            </w:p>
+            <w:p>
+              <w:pPr>
+                <w:rPr/>
+                <w:pStyle w:val="ToC2"/>
+                <w:tabs>
+                  <w:tab w:val="right" w:leader="dot" w:pos="80000"/>
+                </w:tabs>
+              </w:pPr>
+              <w:r>
+                <w:rPr/>
+                <w:t xml:space="preserve">Auto-push on edit un Highlight linked cells</w:t>
+              </w:r>
+              <w:r>
+                <w:rPr/>
+                <w:tab/>
+              </w:r>
+              <w:r>
+                <w:rPr/>
+                <w:fldChar w:fldCharType="begin" w:dirty="false"/>
+                <w:instrText>PAGEREF _Toc00000050 \h</w:instrText>
+                <w:fldChar w:fldCharType="separate" w:dirty="false"/>
+                <w:t xml:space="preserve">1</w:t>
+                <w:fldChar w:fldCharType="end" w:dirty="false"/>
+              </w:r>
+            </w:p>
+            <w:p>
+              <w:pPr>
+                <w:rPr/>
+                <w:pStyle w:val="ToC2"/>
+                <w:tabs>
+                  <w:tab w:val="right" w:leader="dot" w:pos="80000"/>
+                </w:tabs>
+              </w:pPr>
+              <w:r>
+                <w:rPr/>
+                <w:t xml:space="preserve">Ievietošana PowerPoint</w:t>
+              </w:r>
+              <w:r>
+                <w:rPr/>
+                <w:tab/>
+              </w:r>
+              <w:r>
+                <w:rPr/>
+                <w:fldChar w:fldCharType="begin" w:dirty="false"/>
+                <w:instrText>PAGEREF _Toc00000051 \h</w:instrText>
+                <w:fldChar w:fldCharType="separate" w:dirty="false"/>
+                <w:t xml:space="preserve">1</w:t>
+                <w:fldChar w:fldCharType="end" w:dirty="false"/>
+              </w:r>
+            </w:p>
+            <w:p>
+              <w:pPr>
+                <w:rPr/>
+                <w:pStyle w:val="ToC2"/>
+                <w:tabs>
+                  <w:tab w:val="right" w:leader="dot" w:pos="80000"/>
+                </w:tabs>
+              </w:pPr>
+              <w:r>
+                <w:rPr/>
+                <w:t xml:space="preserve">Atjaunināšana</w:t>
+              </w:r>
+              <w:r>
+                <w:rPr/>
+                <w:tab/>
+              </w:r>
+              <w:r>
+                <w:rPr/>
+                <w:fldChar w:fldCharType="begin" w:dirty="false"/>
+                <w:instrText>PAGEREF _Toc00000052 \h</w:instrText>
+                <w:fldChar w:fldCharType="separate" w:dirty="false"/>
+                <w:t xml:space="preserve">1</w:t>
+                <w:fldChar w:fldCharType="end" w:dirty="false"/>
+              </w:r>
+            </w:p>
+            <w:p>
+              <w:pPr>
+                <w:rPr/>
+                <w:pStyle w:val="ToC2"/>
+                <w:tabs>
+                  <w:tab w:val="right" w:leader="dot" w:pos="80000"/>
+                </w:tabs>
+              </w:pPr>
+              <w:r>
+                <w:rPr/>
+                <w:t xml:space="preserve">Go to slide, Change source un Break link</w:t>
+              </w:r>
+              <w:r>
+                <w:rPr/>
+                <w:tab/>
+              </w:r>
+              <w:r>
+                <w:rPr/>
+                <w:fldChar w:fldCharType="begin" w:dirty="false"/>
+                <w:instrText>PAGEREF _Toc00000053 \h</w:instrText>
+                <w:fldChar w:fldCharType="separate" w:dirty="false"/>
+                <w:t xml:space="preserve">1</w:t>
+                <w:fldChar w:fldCharType="end" w:dirty="false"/>
+              </w:r>
+            </w:p>
+            <w:p>
+              <w:pPr>
+                <w:rPr/>
+                <w:pStyle w:val="ToC2"/>
+                <w:tabs>
+                  <w:tab w:val="right" w:leader="dot" w:pos="80000"/>
+                </w:tabs>
+              </w:pPr>
+              <w:r>
+                <w:rPr/>
                 <w:t xml:space="preserve">Drošība</w:t>
               </w:r>
               <w:r>
@@ -1329,7 +1529,7 @@
               <w:r>
                 <w:rPr/>
                 <w:fldChar w:fldCharType="begin" w:dirty="false"/>
-                <w:instrText>PAGEREF _Toc00000046 \h</w:instrText>
+                <w:instrText>PAGEREF _Toc00000054 \h</w:instrText>
                 <w:fldChar w:fldCharType="separate" w:dirty="false"/>
                 <w:t xml:space="preserve">1</w:t>
                 <w:fldChar w:fldCharType="end" w:dirty="false"/>
@@ -1345,7 +1545,7 @@
               </w:pPr>
               <w:r>
                 <w:rPr/>
-                <w:t xml:space="preserve">7  Cilne Brand</w:t>
+                <w:t xml:space="preserve">8  Cilne Brand</w:t>
               </w:r>
               <w:r>
                 <w:rPr/>
@@ -1354,7 +1554,7 @@
               <w:r>
                 <w:rPr/>
                 <w:fldChar w:fldCharType="begin" w:dirty="false"/>
-                <w:instrText>PAGEREF _Toc00000047 \h</w:instrText>
+                <w:instrText>PAGEREF _Toc00000055 \h</w:instrText>
                 <w:fldChar w:fldCharType="separate" w:dirty="false"/>
                 <w:t xml:space="preserve">1</w:t>
                 <w:fldChar w:fldCharType="end" w:dirty="false"/>
@@ -1379,7 +1579,7 @@
               <w:r>
                 <w:rPr/>
                 <w:fldChar w:fldCharType="begin" w:dirty="false"/>
-                <w:instrText>PAGEREF _Toc00000048 \h</w:instrText>
+                <w:instrText>PAGEREF _Toc00000056 \h</w:instrText>
                 <w:fldChar w:fldCharType="separate" w:dirty="false"/>
                 <w:t xml:space="preserve">1</w:t>
                 <w:fldChar w:fldCharType="end" w:dirty="false"/>
@@ -1404,7 +1604,7 @@
               <w:r>
                 <w:rPr/>
                 <w:fldChar w:fldCharType="begin" w:dirty="false"/>
-                <w:instrText>PAGEREF _Toc00000049 \h</w:instrText>
+                <w:instrText>PAGEREF _Toc00000057 \h</w:instrText>
                 <w:fldChar w:fldCharType="separate" w:dirty="false"/>
                 <w:t xml:space="preserve">1</w:t>
                 <w:fldChar w:fldCharType="end" w:dirty="false"/>
@@ -1429,7 +1629,7 @@
               <w:r>
                 <w:rPr/>
                 <w:fldChar w:fldCharType="begin" w:dirty="false"/>
-                <w:instrText>PAGEREF _Toc00000050 \h</w:instrText>
+                <w:instrText>PAGEREF _Toc00000058 \h</w:instrText>
                 <w:fldChar w:fldCharType="separate" w:dirty="false"/>
                 <w:t xml:space="preserve">1</w:t>
                 <w:fldChar w:fldCharType="end" w:dirty="false"/>
@@ -1454,7 +1654,7 @@
               <w:r>
                 <w:rPr/>
                 <w:fldChar w:fldCharType="begin" w:dirty="false"/>
-                <w:instrText>PAGEREF _Toc00000051 \h</w:instrText>
+                <w:instrText>PAGEREF _Toc00000059 \h</w:instrText>
                 <w:fldChar w:fldCharType="separate" w:dirty="false"/>
                 <w:t xml:space="preserve">1</w:t>
                 <w:fldChar w:fldCharType="end" w:dirty="false"/>
@@ -1479,7 +1679,7 @@
               <w:r>
                 <w:rPr/>
                 <w:fldChar w:fldCharType="begin" w:dirty="false"/>
-                <w:instrText>PAGEREF _Toc00000052 \h</w:instrText>
+                <w:instrText>PAGEREF _Toc00000060 \h</w:instrText>
                 <w:fldChar w:fldCharType="separate" w:dirty="false"/>
                 <w:t xml:space="preserve">1</w:t>
                 <w:fldChar w:fldCharType="end" w:dirty="false"/>
@@ -1504,7 +1704,7 @@
               <w:r>
                 <w:rPr/>
                 <w:fldChar w:fldCharType="begin" w:dirty="false"/>
-                <w:instrText>PAGEREF _Toc00000053 \h</w:instrText>
+                <w:instrText>PAGEREF _Toc00000061 \h</w:instrText>
                 <w:fldChar w:fldCharType="separate" w:dirty="false"/>
                 <w:t xml:space="preserve">1</w:t>
                 <w:fldChar w:fldCharType="end" w:dirty="false"/>
@@ -1520,7 +1720,7 @@
               </w:pPr>
               <w:r>
                 <w:rPr/>
-                <w:t xml:space="preserve">8  Īsinājumtaustiņi</w:t>
+                <w:t xml:space="preserve">9  Īsinājumtaustiņi</w:t>
               </w:r>
               <w:r>
                 <w:rPr/>
@@ -1529,7 +1729,7 @@
               <w:r>
                 <w:rPr/>
                 <w:fldChar w:fldCharType="begin" w:dirty="false"/>
-                <w:instrText>PAGEREF _Toc00000054 \h</w:instrText>
+                <w:instrText>PAGEREF _Toc00000062 \h</w:instrText>
                 <w:fldChar w:fldCharType="separate" w:dirty="false"/>
                 <w:t xml:space="preserve">1</w:t>
                 <w:fldChar w:fldCharType="end" w:dirty="false"/>
@@ -1554,7 +1754,7 @@
               <w:r>
                 <w:rPr/>
                 <w:fldChar w:fldCharType="begin" w:dirty="false"/>
-                <w:instrText>PAGEREF _Toc00000055 \h</w:instrText>
+                <w:instrText>PAGEREF _Toc00000063 \h</w:instrText>
                 <w:fldChar w:fldCharType="separate" w:dirty="false"/>
                 <w:t xml:space="preserve">1</w:t>
                 <w:fldChar w:fldCharType="end" w:dirty="false"/>
@@ -1570,7 +1770,7 @@
               </w:pPr>
               <w:r>
                 <w:rPr/>
-                <w:t xml:space="preserve">9  Biežākās problēmas</w:t>
+                <w:t xml:space="preserve">10  Biežākās problēmas</w:t>
               </w:r>
               <w:r>
                 <w:rPr/>
@@ -1579,7 +1779,7 @@
               <w:r>
                 <w:rPr/>
                 <w:fldChar w:fldCharType="begin" w:dirty="false"/>
-                <w:instrText>PAGEREF _Toc00000056 \h</w:instrText>
+                <w:instrText>PAGEREF _Toc00000064 \h</w:instrText>
                 <w:fldChar w:fldCharType="separate" w:dirty="false"/>
                 <w:t xml:space="preserve">1</w:t>
                 <w:fldChar w:fldCharType="end" w:dirty="false"/>
@@ -1604,7 +1804,7 @@
               <w:r>
                 <w:rPr/>
                 <w:fldChar w:fldCharType="begin" w:dirty="false"/>
-                <w:instrText>PAGEREF _Toc00000057 \h</w:instrText>
+                <w:instrText>PAGEREF _Toc00000065 \h</w:instrText>
                 <w:fldChar w:fldCharType="separate" w:dirty="false"/>
                 <w:t xml:space="preserve">1</w:t>
                 <w:fldChar w:fldCharType="end" w:dirty="false"/>
@@ -1629,7 +1829,7 @@
               <w:r>
                 <w:rPr/>
                 <w:fldChar w:fldCharType="begin" w:dirty="false"/>
-                <w:instrText>PAGEREF _Toc00000058 \h</w:instrText>
+                <w:instrText>PAGEREF _Toc00000066 \h</w:instrText>
                 <w:fldChar w:fldCharType="separate" w:dirty="false"/>
                 <w:t xml:space="preserve">1</w:t>
                 <w:fldChar w:fldCharType="end" w:dirty="false"/>
@@ -1645,7 +1845,7 @@
               </w:pPr>
               <w:r>
                 <w:rPr/>
-                <w:t xml:space="preserve">10  Versija</w:t>
+                <w:t xml:space="preserve">11  Versija</w:t>
               </w:r>
               <w:r>
                 <w:rPr/>
@@ -1654,7 +1854,7 @@
               <w:r>
                 <w:rPr/>
                 <w:fldChar w:fldCharType="begin" w:dirty="false"/>
-                <w:instrText>PAGEREF _Toc00000059 \h</w:instrText>
+                <w:instrText>PAGEREF _Toc00000067 \h</w:instrText>
                 <w:fldChar w:fldCharType="separate" w:dirty="false"/>
                 <w:t xml:space="preserve">1</w:t>
                 <w:fldChar w:fldCharType="end" w:dirty="false"/>
@@ -1679,7 +1879,7 @@
               <w:r>
                 <w:rPr/>
                 <w:fldChar w:fldCharType="begin" w:dirty="false"/>
-                <w:instrText>PAGEREF _Toc00000060 \h</w:instrText>
+                <w:instrText>PAGEREF _Toc00000068 \h</w:instrText>
                 <w:fldChar w:fldCharType="separate" w:dirty="false"/>
                 <w:t xml:space="preserve">1</w:t>
                 <w:fldChar w:fldCharType="end" w:dirty="false"/>
@@ -5888,7 +6088,7 @@
           <w:bCs/>
           <w:rFonts w:ascii="Aptos" w:hAnsi="Aptos" w:cs="Aptos" w:eastAsia="Aptos"/>
         </w:rPr>
-        <w:t xml:space="preserve">Cilne Workbook</w:t>
+        <w:t xml:space="preserve">Veidnes</w:t>
       </w:r>
       <w:bookmarkEnd w:id="31"/>
     </w:p>
@@ -5909,9 +6109,327 @@
           <w:bCs/>
           <w:rFonts w:ascii="Aptos" w:hAnsi="Aptos" w:cs="Aptos" w:eastAsia="Aptos"/>
         </w:rPr>
+        <w:t xml:space="preserve">Kas ir veidnes</w:t>
+      </w:r>
+      <w:bookmarkEnd w:id="32"/>
+    </w:p>
+    <w:p>
+      <w:pPr>
+        <w:rPr/>
+        <w:spacing w:after="120" w:line="276"/>
+      </w:pPr>
+      <w:r>
+        <w:rPr>
+          <w:sz w:val="22"/>
+          <w:szCs w:val="22"/>
+          <w:color w:val="1A1A1A"/>
+          <w:rFonts w:ascii="Aptos" w:hAnsi="Aptos" w:cs="Aptos" w:eastAsia="Aptos"/>
+        </w:rPr>
+        <w:t xml:space="preserve">Cilnes "Tools" beigās ir sadaļa "Templates". Katra poga ieraksta gatavu aprēķina bloku, kura augšējais kreisais stūris ir aktīvajā šūnā. Bloku var ierakstīt jebkurā lapā un jebkurā vietā, jo visas formulas norāda uz paša bloka šūnām.</w:t>
+      </w:r>
+    </w:p>
+    <w:p>
+      <w:pPr>
+        <w:rPr/>
+        <w:spacing w:after="120" w:line="276"/>
+      </w:pPr>
+      <w:r>
+        <w:rPr>
+          <w:sz w:val="22"/>
+          <w:szCs w:val="22"/>
+          <w:color w:val="1A1A1A"/>
+          <w:rFonts w:ascii="Aptos" w:hAnsi="Aptos" w:cs="Aptos" w:eastAsia="Aptos"/>
+        </w:rPr>
+        <w:t xml:space="preserve">Ja bloka vietā jau kaut kas atrodas, panelis to neaizstāj, bet paziņo, cik rindu un cik kolonnu brīvas vietas tam vajag.</w:t>
+      </w:r>
+    </w:p>
+    <w:p>
+      <w:pPr>
+        <w:rPr/>
+        <w:spacing w:after="120" w:line="276"/>
+      </w:pPr>
+      <w:r>
+        <w:rPr>
+          <w:sz w:val="22"/>
+          <w:szCs w:val="22"/>
+          <w:color w:val="1A1A1A"/>
+          <w:rFonts w:ascii="Aptos" w:hAnsi="Aptos" w:cs="Aptos" w:eastAsia="Aptos"/>
+        </w:rPr>
+        <w:t xml:space="preserve">Ierakstītie skaitļi ir zili, formulas melnas, virsraksta un galvenes rindas noformētas jūsu paletē, un skaitļu formāti nāk no paneļa iestatījumiem. Pēc ierakstīšanas bloks paliek atlasīts, un to var atcelt ar pogu "Undo last pls,fix action".</w:t>
+      </w:r>
+    </w:p>
+    <w:p>
+      <w:pPr>
+        <w:rPr/>
+        <w:pStyle w:val="Heading2"/>
+        <w:spacing w:before="240" w:after="100"/>
+        <w:keepNext/>
+      </w:pPr>
+      <w:bookmarkStart w:id="33" w:name="_Toc00000032"/>
+      <w:r>
+        <w:rPr>
+          <w:sz w:val="26"/>
+          <w:szCs w:val="26"/>
+          <w:color w:val="14213D"/>
+          <w:b/>
+          <w:bCs/>
+          <w:rFonts w:ascii="Aptos" w:hAnsi="Aptos" w:cs="Aptos" w:eastAsia="Aptos"/>
+        </w:rPr>
+        <w:t xml:space="preserve">Debt schedule (annuity)</w:t>
+      </w:r>
+      <w:bookmarkEnd w:id="33"/>
+    </w:p>
+    <w:p>
+      <w:pPr>
+        <w:rPr/>
+        <w:spacing w:after="120" w:line="276"/>
+      </w:pPr>
+      <w:r>
+        <w:rPr>
+          <w:sz w:val="22"/>
+          <w:szCs w:val="22"/>
+          <w:color w:val="1A1A1A"/>
+          <w:rFonts w:ascii="Aptos" w:hAnsi="Aptos" w:cs="Aptos" w:eastAsia="Aptos"/>
+        </w:rPr>
+        <w:t xml:space="preserve">Poga "Debt schedule (annuity)" ieraksta 20 rindu un 6 kolonnu bloku. Ievaddati ir aizdevuma summa, gada likme, gadu skaits un maksājumu skaits gadā; no tiem bloks aprēķina periodu skaitu un vienādu periodisko maksājumu ar funkciju PMT. Desmit periodu rindās ir sākuma atlikums, maksājums, procenti, pamatsummas daļa un beigu atlikums, un pēdējā rinda saskaita maksājumus, procentus un pamatsummu.</w:t>
+      </w:r>
+    </w:p>
+    <w:p>
+      <w:pPr>
+        <w:rPr/>
+        <w:pStyle w:val="Heading2"/>
+        <w:spacing w:before="240" w:after="100"/>
+        <w:keepNext/>
+      </w:pPr>
+      <w:bookmarkStart w:id="34" w:name="_Toc00000033"/>
+      <w:r>
+        <w:rPr>
+          <w:sz w:val="26"/>
+          <w:szCs w:val="26"/>
+          <w:color w:val="14213D"/>
+          <w:b/>
+          <w:bCs/>
+          <w:rFonts w:ascii="Aptos" w:hAnsi="Aptos" w:cs="Aptos" w:eastAsia="Aptos"/>
+        </w:rPr>
+        <w:t xml:space="preserve">DCF valuation</w:t>
+      </w:r>
+      <w:bookmarkEnd w:id="34"/>
+    </w:p>
+    <w:p>
+      <w:pPr>
+        <w:rPr/>
+        <w:spacing w:after="120" w:line="276"/>
+      </w:pPr>
+      <w:r>
+        <w:rPr>
+          <w:sz w:val="22"/>
+          <w:szCs w:val="22"/>
+          <w:color w:val="1A1A1A"/>
+          <w:rFonts w:ascii="Aptos" w:hAnsi="Aptos" w:cs="Aptos" w:eastAsia="Aptos"/>
+        </w:rPr>
+        <w:t xml:space="preserve">Poga "DCF valuation" ieraksta 13 rindu un 6 kolonnu bloku. Ievaddati ir WACC, terminālā izaugsme un piecu gadu brīvā naudas plūsma. Bloks aprēķina katra gada diskonta koeficientu, naudas plūsmas pašreizējo vērtību, terminālo vērtību pēc Gordona formulas, tās pašreizējo vērtību un uzņēmuma vērtību.</w:t>
+      </w:r>
+    </w:p>
+    <w:p>
+      <w:pPr>
+        <w:rPr/>
+        <w:pStyle w:val="Heading2"/>
+        <w:spacing w:before="240" w:after="100"/>
+        <w:keepNext/>
+      </w:pPr>
+      <w:bookmarkStart w:id="35" w:name="_Toc00000034"/>
+      <w:r>
+        <w:rPr>
+          <w:sz w:val="26"/>
+          <w:szCs w:val="26"/>
+          <w:color w:val="14213D"/>
+          <w:b/>
+          <w:bCs/>
+          <w:rFonts w:ascii="Aptos" w:hAnsi="Aptos" w:cs="Aptos" w:eastAsia="Aptos"/>
+        </w:rPr>
+        <w:t xml:space="preserve">NPV / IRR</w:t>
+      </w:r>
+      <w:bookmarkEnd w:id="35"/>
+    </w:p>
+    <w:p>
+      <w:pPr>
+        <w:rPr/>
+        <w:spacing w:after="120" w:line="276"/>
+      </w:pPr>
+      <w:r>
+        <w:rPr>
+          <w:sz w:val="22"/>
+          <w:szCs w:val="22"/>
+          <w:color w:val="1A1A1A"/>
+          <w:rFonts w:ascii="Aptos" w:hAnsi="Aptos" w:cs="Aptos" w:eastAsia="Aptos"/>
+        </w:rPr>
+        <w:t xml:space="preserve">Poga "NPV / IRR" ieraksta 17 rindu un 3 kolonnu bloku. Ievaddati ir sākotnējais ieguldījums, astoņas periodu naudas plūsmas un diskonta likme. Bloks veido uzkrātās naudas plūsmas kolonnu un aprēķina neto pašreizējo vērtību, iekšējo ienesīguma likmi un atmaksāšanās periodu. Atmaksāšanās periods arī ir formula, nevis ierakstīts skaitlis, un tas rāda "n/a", ja ieguldījums neatmaksājas.</w:t>
+      </w:r>
+    </w:p>
+    <w:p>
+      <w:pPr>
+        <w:rPr/>
+        <w:pStyle w:val="Heading2"/>
+        <w:spacing w:before="240" w:after="100"/>
+        <w:keepNext/>
+      </w:pPr>
+      <w:bookmarkStart w:id="36" w:name="_Toc00000035"/>
+      <w:r>
+        <w:rPr>
+          <w:sz w:val="26"/>
+          <w:szCs w:val="26"/>
+          <w:color w:val="14213D"/>
+          <w:b/>
+          <w:bCs/>
+          <w:rFonts w:ascii="Aptos" w:hAnsi="Aptos" w:cs="Aptos" w:eastAsia="Aptos"/>
+        </w:rPr>
+        <w:t xml:space="preserve">Working capital days</w:t>
+      </w:r>
+      <w:bookmarkEnd w:id="36"/>
+    </w:p>
+    <w:p>
+      <w:pPr>
+        <w:rPr/>
+        <w:spacing w:after="120" w:line="276"/>
+      </w:pPr>
+      <w:r>
+        <w:rPr>
+          <w:sz w:val="22"/>
+          <w:szCs w:val="22"/>
+          <w:color w:val="1A1A1A"/>
+          <w:rFonts w:ascii="Aptos" w:hAnsi="Aptos" w:cs="Aptos" w:eastAsia="Aptos"/>
+        </w:rPr>
+        <w:t xml:space="preserve">Poga "Working capital days" ieraksta 12 rindu un 2 kolonnu bloku. Ievaddati ir apgrozījums, pārdotās produkcijas izmaksas, debitori, krājumi un kreditori. Bloks aprēķina debitoru, krājumu un kreditoru aprites dienas un naudas konversijas ciklu.</w:t>
+      </w:r>
+    </w:p>
+    <w:p>
+      <w:pPr>
+        <w:rPr/>
+        <w:pStyle w:val="Heading2"/>
+        <w:spacing w:before="240" w:after="100"/>
+        <w:keepNext/>
+      </w:pPr>
+      <w:bookmarkStart w:id="37" w:name="_Toc00000036"/>
+      <w:r>
+        <w:rPr>
+          <w:sz w:val="26"/>
+          <w:szCs w:val="26"/>
+          <w:color w:val="14213D"/>
+          <w:b/>
+          <w:bCs/>
+          <w:rFonts w:ascii="Aptos" w:hAnsi="Aptos" w:cs="Aptos" w:eastAsia="Aptos"/>
+        </w:rPr>
+        <w:t xml:space="preserve">Two-way sensitivity</w:t>
+      </w:r>
+      <w:bookmarkEnd w:id="37"/>
+    </w:p>
+    <w:p>
+      <w:pPr>
+        <w:rPr/>
+        <w:spacing w:after="120" w:line="276"/>
+      </w:pPr>
+      <w:r>
+        <w:rPr>
+          <w:sz w:val="22"/>
+          <w:szCs w:val="22"/>
+          <w:color w:val="1A1A1A"/>
+          <w:rFonts w:ascii="Aptos" w:hAnsi="Aptos" w:cs="Aptos" w:eastAsia="Aptos"/>
+        </w:rPr>
+        <w:t xml:space="preserve">Poga "Two-way sensitivity" ieraksta 11 rindu un 6 kolonnu bloku. Ievaddati ir bāzes vērtība un divu faktoru soļa lielumi. Bloks izveido 5 x 5 formulu tabulu, kurā katra šūna reizina bāzes vērtību ar rindas un kolonnas soli. Asu vērtības arī ir formulas, tāpēc soļa maiņa pārrēķina visu tabulu; Excel iebūvētā Data Table funkcija netiek izmantota.</w:t>
+      </w:r>
+    </w:p>
+    <w:p>
+      <w:pPr>
+        <w:rPr/>
+        <w:pStyle w:val="Heading2"/>
+        <w:spacing w:before="240" w:after="100"/>
+        <w:keepNext/>
+      </w:pPr>
+      <w:bookmarkStart w:id="38" w:name="_Toc00000037"/>
+      <w:r>
+        <w:rPr>
+          <w:sz w:val="26"/>
+          <w:szCs w:val="26"/>
+          <w:color w:val="14213D"/>
+          <w:b/>
+          <w:bCs/>
+          <w:rFonts w:ascii="Aptos" w:hAnsi="Aptos" w:cs="Aptos" w:eastAsia="Aptos"/>
+        </w:rPr>
+        <w:t xml:space="preserve">EBITDA bridge</w:t>
+      </w:r>
+      <w:bookmarkEnd w:id="38"/>
+    </w:p>
+    <w:p>
+      <w:pPr>
+        <w:rPr/>
+        <w:spacing w:after="120" w:line="276"/>
+      </w:pPr>
+      <w:r>
+        <w:rPr>
+          <w:sz w:val="22"/>
+          <w:szCs w:val="22"/>
+          <w:color w:val="1A1A1A"/>
+          <w:rFonts w:ascii="Aptos" w:hAnsi="Aptos" w:cs="Aptos" w:eastAsia="Aptos"/>
+        </w:rPr>
+        <w:t xml:space="preserve">Poga "EBITDA bridge" ieraksta 9 rindu un 2 kolonnu bloku: sākuma EBITDA, pieci nosaukti soļi, beigu EBITDA un pārbaudes rinda. Bloks ir tieši tādā formā, kādu gaida poga "Waterfall from selection": nosaukumi kreisajā kolonnā, skaitļi labajā, kopsummas pirmajā un pēdējā rindā. Diagrammai jāatlasa septiņas tilta rindas bez virsraksta rindas un bez pārbaudes rindas.</w:t>
+      </w:r>
+    </w:p>
+    <w:p>
+      <w:pPr>
+        <w:rPr/>
+        <w:pStyle w:val="Heading1"/>
+        <w:spacing w:before="120" w:after="200"/>
+        <w:pBdr>
+          <w:bottom w:val="single" w:space="6" w:sz="8" w:color="2EC4B6"/>
+        </w:pBdr>
+        <w:keepNext/>
+        <w:pageBreakBefore/>
+      </w:pPr>
+      <w:bookmarkStart w:id="39" w:name="_Toc00000038"/>
+      <w:r>
+        <w:rPr>
+          <w:sz w:val="36"/>
+          <w:szCs w:val="36"/>
+          <w:color w:val="2EC4B6"/>
+          <w:b/>
+          <w:bCs/>
+          <w:rFonts w:ascii="Aptos" w:hAnsi="Aptos" w:cs="Aptos" w:eastAsia="Aptos"/>
+        </w:rPr>
+        <w:t xml:space="preserve">6  </w:t>
+      </w:r>
+      <w:r>
+        <w:rPr>
+          <w:sz w:val="36"/>
+          <w:szCs w:val="36"/>
+          <w:color w:val="14213D"/>
+          <w:b/>
+          <w:bCs/>
+          <w:rFonts w:ascii="Aptos" w:hAnsi="Aptos" w:cs="Aptos" w:eastAsia="Aptos"/>
+        </w:rPr>
+        <w:t xml:space="preserve">Cilne Workbook</w:t>
+      </w:r>
+      <w:bookmarkEnd w:id="39"/>
+    </w:p>
+    <w:p>
+      <w:pPr>
+        <w:rPr/>
+        <w:pStyle w:val="Heading2"/>
+        <w:spacing w:before="240" w:after="100"/>
+        <w:keepNext/>
+      </w:pPr>
+      <w:bookmarkStart w:id="40" w:name="_Toc00000039"/>
+      <w:r>
+        <w:rPr>
+          <w:sz w:val="26"/>
+          <w:szCs w:val="26"/>
+          <w:color w:val="14213D"/>
+          <w:b/>
+          <w:bCs/>
+          <w:rFonts w:ascii="Aptos" w:hAnsi="Aptos" w:cs="Aptos" w:eastAsia="Aptos"/>
+        </w:rPr>
         <w:t xml:space="preserve">Lapu saraksts</w:t>
       </w:r>
-      <w:bookmarkEnd w:id="32"/>
+      <w:bookmarkEnd w:id="40"/>
     </w:p>
     <w:p>
       <w:pPr>
@@ -6015,7 +6533,7 @@
         <w:spacing w:before="240" w:after="100"/>
         <w:keepNext/>
       </w:pPr>
-      <w:bookmarkStart w:id="33" w:name="_Toc00000032"/>
+      <w:bookmarkStart w:id="41" w:name="_Toc00000040"/>
       <w:r>
         <w:rPr>
           <w:sz w:val="26"/>
@@ -6027,7 +6545,7 @@
         </w:rPr>
         <w:t xml:space="preserve">Super Find</w:t>
       </w:r>
-      <w:bookmarkEnd w:id="33"/>
+      <w:bookmarkEnd w:id="41"/>
     </w:p>
     <w:p>
       <w:pPr>
@@ -6191,7 +6709,7 @@
         <w:spacing w:before="240" w:after="100"/>
         <w:keepNext/>
       </w:pPr>
-      <w:bookmarkStart w:id="34" w:name="_Toc00000033"/>
+      <w:bookmarkStart w:id="42" w:name="_Toc00000041"/>
       <w:r>
         <w:rPr>
           <w:sz w:val="26"/>
@@ -6203,7 +6721,7 @@
         </w:rPr>
         <w:t xml:space="preserve">Satura rādītājs</w:t>
       </w:r>
-      <w:bookmarkEnd w:id="34"/>
+      <w:bookmarkEnd w:id="42"/>
     </w:p>
     <w:p>
       <w:pPr>
@@ -6227,7 +6745,7 @@
         <w:spacing w:before="240" w:after="100"/>
         <w:keepNext/>
       </w:pPr>
-      <w:bookmarkStart w:id="35" w:name="_Toc00000034"/>
+      <w:bookmarkStart w:id="43" w:name="_Toc00000042"/>
       <w:r>
         <w:rPr>
           <w:sz w:val="26"/>
@@ -6239,7 +6757,7 @@
         </w:rPr>
         <w:t xml:space="preserve">Bojātie nosaukumi</w:t>
       </w:r>
-      <w:bookmarkEnd w:id="35"/>
+      <w:bookmarkEnd w:id="43"/>
     </w:p>
     <w:p>
       <w:pPr>
@@ -6278,7 +6796,7 @@
         <w:spacing w:before="240" w:after="100"/>
         <w:keepNext/>
       </w:pPr>
-      <w:bookmarkStart w:id="36" w:name="_Toc00000035"/>
+      <w:bookmarkStart w:id="44" w:name="_Toc00000043"/>
       <w:r>
         <w:rPr>
           <w:sz w:val="26"/>
@@ -6290,7 +6808,7 @@
         </w:rPr>
         <w:t xml:space="preserve">Neizmantotie stili</w:t>
       </w:r>
-      <w:bookmarkEnd w:id="36"/>
+      <w:bookmarkEnd w:id="44"/>
     </w:p>
     <w:p>
       <w:pPr>
@@ -6329,7 +6847,7 @@
         <w:spacing w:before="240" w:after="100"/>
         <w:keepNext/>
       </w:pPr>
-      <w:bookmarkStart w:id="37" w:name="_Toc00000036"/>
+      <w:bookmarkStart w:id="45" w:name="_Toc00000044"/>
       <w:r>
         <w:rPr>
           <w:sz w:val="26"/>
@@ -6341,7 +6859,7 @@
         </w:rPr>
         <w:t xml:space="preserve">Prepare for sharing</w:t>
       </w:r>
-      <w:bookmarkEnd w:id="37"/>
+      <w:bookmarkEnd w:id="45"/>
     </w:p>
     <w:p>
       <w:pPr>
@@ -6513,7 +7031,7 @@
         <w:keepNext/>
         <w:pageBreakBefore/>
       </w:pPr>
-      <w:bookmarkStart w:id="38" w:name="_Toc00000037"/>
+      <w:bookmarkStart w:id="46" w:name="_Toc00000045"/>
       <w:r>
         <w:rPr>
           <w:sz w:val="36"/>
@@ -6523,7 +7041,7 @@
           <w:bCs/>
           <w:rFonts w:ascii="Aptos" w:hAnsi="Aptos" w:cs="Aptos" w:eastAsia="Aptos"/>
         </w:rPr>
-        <w:t xml:space="preserve">6  </w:t>
+        <w:t xml:space="preserve">7  </w:t>
       </w:r>
       <w:r>
         <w:rPr>
@@ -6536,7 +7054,7 @@
         </w:rPr>
         <w:t xml:space="preserve">Saites uz PowerPoint</w:t>
       </w:r>
-      <w:bookmarkEnd w:id="38"/>
+      <w:bookmarkEnd w:id="46"/>
     </w:p>
     <w:p>
       <w:pPr>
@@ -6545,7 +7063,7 @@
         <w:spacing w:before="240" w:after="100"/>
         <w:keepNext/>
       </w:pPr>
-      <w:bookmarkStart w:id="39" w:name="_Toc00000038"/>
+      <w:bookmarkStart w:id="47" w:name="_Toc00000046"/>
       <w:r>
         <w:rPr>
           <w:sz w:val="26"/>
@@ -6557,7 +7075,7 @@
         </w:rPr>
         <w:t xml:space="preserve">Kā saite darbojas</w:t>
       </w:r>
-      <w:bookmarkEnd w:id="39"/>
+      <w:bookmarkEnd w:id="47"/>
     </w:p>
     <w:p>
       <w:pPr>
@@ -6611,7 +7129,7 @@
         <w:spacing w:before="240" w:after="100"/>
         <w:keepNext/>
       </w:pPr>
-      <w:bookmarkStart w:id="40" w:name="_Toc00000039"/>
+      <w:bookmarkStart w:id="48" w:name="_Toc00000047"/>
       <w:r>
         <w:rPr>
           <w:sz w:val="26"/>
@@ -6623,7 +7141,7 @@
         </w:rPr>
         <w:t xml:space="preserve">Saites atslēga</w:t>
       </w:r>
-      <w:bookmarkEnd w:id="40"/>
+      <w:bookmarkEnd w:id="48"/>
     </w:p>
     <w:p>
       <w:pPr>
@@ -6799,7 +7317,7 @@
         <w:spacing w:before="240" w:after="100"/>
         <w:keepNext/>
       </w:pPr>
-      <w:bookmarkStart w:id="41" w:name="_Toc00000040"/>
+      <w:bookmarkStart w:id="49" w:name="_Toc00000048"/>
       <w:r>
         <w:rPr>
           <w:sz w:val="26"/>
@@ -6811,7 +7329,7 @@
         </w:rPr>
         <w:t xml:space="preserve">Eksports no Excel</w:t>
       </w:r>
-      <w:bookmarkEnd w:id="41"/>
+      <w:bookmarkEnd w:id="49"/>
     </w:p>
     <w:p>
       <w:pPr>
@@ -6953,7 +7471,7 @@
         <w:spacing w:before="240" w:after="100"/>
         <w:keepNext/>
       </w:pPr>
-      <w:bookmarkStart w:id="42" w:name="_Toc00000041"/>
+      <w:bookmarkStart w:id="50" w:name="_Toc00000049"/>
       <w:r>
         <w:rPr>
           <w:sz w:val="26"/>
@@ -6965,7 +7483,7 @@
         </w:rPr>
         <w:t xml:space="preserve">Saišu saraksts Excel pusē</w:t>
       </w:r>
-      <w:bookmarkEnd w:id="42"/>
+      <w:bookmarkEnd w:id="50"/>
     </w:p>
     <w:p>
       <w:pPr>
@@ -7232,7 +7750,7 @@
         <w:spacing w:before="240" w:after="100"/>
         <w:keepNext/>
       </w:pPr>
-      <w:bookmarkStart w:id="43" w:name="_Toc00000042"/>
+      <w:bookmarkStart w:id="51" w:name="_Toc00000050"/>
       <w:r>
         <w:rPr>
           <w:sz w:val="26"/>
@@ -7244,7 +7762,7 @@
         </w:rPr>
         <w:t xml:space="preserve">Auto-push on edit un Highlight linked cells</w:t>
       </w:r>
-      <w:bookmarkEnd w:id="43"/>
+      <w:bookmarkEnd w:id="51"/>
     </w:p>
     <w:p>
       <w:pPr>
@@ -7283,7 +7801,7 @@
         <w:spacing w:before="240" w:after="100"/>
         <w:keepNext/>
       </w:pPr>
-      <w:bookmarkStart w:id="44" w:name="_Toc00000043"/>
+      <w:bookmarkStart w:id="52" w:name="_Toc00000051"/>
       <w:r>
         <w:rPr>
           <w:sz w:val="26"/>
@@ -7295,7 +7813,7 @@
         </w:rPr>
         <w:t xml:space="preserve">Ievietošana PowerPoint</w:t>
       </w:r>
-      <w:bookmarkEnd w:id="44"/>
+      <w:bookmarkEnd w:id="52"/>
     </w:p>
     <w:p>
       <w:pPr>
@@ -7456,7 +7974,7 @@
         <w:spacing w:before="240" w:after="100"/>
         <w:keepNext/>
       </w:pPr>
-      <w:bookmarkStart w:id="45" w:name="_Toc00000044"/>
+      <w:bookmarkStart w:id="53" w:name="_Toc00000052"/>
       <w:r>
         <w:rPr>
           <w:sz w:val="26"/>
@@ -7468,7 +7986,7 @@
         </w:rPr>
         <w:t xml:space="preserve">Atjaunināšana</w:t>
       </w:r>
-      <w:bookmarkEnd w:id="45"/>
+      <w:bookmarkEnd w:id="53"/>
     </w:p>
     <w:p>
       <w:pPr>
@@ -7830,7 +8348,7 @@
         <w:spacing w:before="240" w:after="100"/>
         <w:keepNext/>
       </w:pPr>
-      <w:bookmarkStart w:id="46" w:name="_Toc00000045"/>
+      <w:bookmarkStart w:id="54" w:name="_Toc00000053"/>
       <w:r>
         <w:rPr>
           <w:sz w:val="26"/>
@@ -7842,7 +8360,7 @@
         </w:rPr>
         <w:t xml:space="preserve">Go to slide, Change source un Break link</w:t>
       </w:r>
-      <w:bookmarkEnd w:id="46"/>
+      <w:bookmarkEnd w:id="54"/>
     </w:p>
     <w:p>
       <w:pPr>
@@ -7911,7 +8429,7 @@
         <w:spacing w:before="240" w:after="100"/>
         <w:keepNext/>
       </w:pPr>
-      <w:bookmarkStart w:id="47" w:name="_Toc00000046"/>
+      <w:bookmarkStart w:id="55" w:name="_Toc00000054"/>
       <w:r>
         <w:rPr>
           <w:sz w:val="26"/>
@@ -7923,7 +8441,7 @@
         </w:rPr>
         <w:t xml:space="preserve">Drošība</w:t>
       </w:r>
-      <w:bookmarkEnd w:id="47"/>
+      <w:bookmarkEnd w:id="55"/>
     </w:p>
     <w:p>
       <w:pPr>
@@ -7966,7 +8484,7 @@
         <w:keepNext/>
         <w:pageBreakBefore/>
       </w:pPr>
-      <w:bookmarkStart w:id="48" w:name="_Toc00000047"/>
+      <w:bookmarkStart w:id="56" w:name="_Toc00000055"/>
       <w:r>
         <w:rPr>
           <w:sz w:val="36"/>
@@ -7976,7 +8494,7 @@
           <w:bCs/>
           <w:rFonts w:ascii="Aptos" w:hAnsi="Aptos" w:cs="Aptos" w:eastAsia="Aptos"/>
         </w:rPr>
-        <w:t xml:space="preserve">7  </w:t>
+        <w:t xml:space="preserve">8  </w:t>
       </w:r>
       <w:r>
         <w:rPr>
@@ -7989,7 +8507,7 @@
         </w:rPr>
         <w:t xml:space="preserve">Cilne Brand</w:t>
       </w:r>
-      <w:bookmarkEnd w:id="48"/>
+      <w:bookmarkEnd w:id="56"/>
     </w:p>
     <w:p>
       <w:pPr>
@@ -7998,7 +8516,7 @@
         <w:spacing w:before="240" w:after="100"/>
         <w:keepNext/>
       </w:pPr>
-      <w:bookmarkStart w:id="49" w:name="_Toc00000048"/>
+      <w:bookmarkStart w:id="57" w:name="_Toc00000056"/>
       <w:r>
         <w:rPr>
           <w:sz w:val="26"/>
@@ -8010,7 +8528,7 @@
         </w:rPr>
         <w:t xml:space="preserve">Palete</w:t>
       </w:r>
-      <w:bookmarkEnd w:id="49"/>
+      <w:bookmarkEnd w:id="57"/>
     </w:p>
     <w:p>
       <w:pPr>
@@ -8480,7 +8998,7 @@
         <w:spacing w:before="240" w:after="100"/>
         <w:keepNext/>
       </w:pPr>
-      <w:bookmarkStart w:id="50" w:name="_Toc00000049"/>
+      <w:bookmarkStart w:id="58" w:name="_Toc00000057"/>
       <w:r>
         <w:rPr>
           <w:sz w:val="26"/>
@@ -8492,7 +9010,7 @@
         </w:rPr>
         <w:t xml:space="preserve">Krāsas no logotipa</w:t>
       </w:r>
-      <w:bookmarkEnd w:id="50"/>
+      <w:bookmarkEnd w:id="58"/>
     </w:p>
     <w:p>
       <w:pPr>
@@ -8516,7 +9034,7 @@
         <w:spacing w:before="240" w:after="100"/>
         <w:keepNext/>
       </w:pPr>
-      <w:bookmarkStart w:id="51" w:name="_Toc00000050"/>
+      <w:bookmarkStart w:id="59" w:name="_Toc00000058"/>
       <w:r>
         <w:rPr>
           <w:sz w:val="26"/>
@@ -8528,7 +9046,7 @@
         </w:rPr>
         <w:t xml:space="preserve">Fonts, valoda un skaitļu stils</w:t>
       </w:r>
-      <w:bookmarkEnd w:id="51"/>
+      <w:bookmarkEnd w:id="59"/>
     </w:p>
     <w:p>
       <w:pPr>
@@ -8959,7 +9477,7 @@
         <w:spacing w:before="240" w:after="100"/>
         <w:keepNext/>
       </w:pPr>
-      <w:bookmarkStart w:id="52" w:name="_Toc00000051"/>
+      <w:bookmarkStart w:id="60" w:name="_Toc00000059"/>
       <w:r>
         <w:rPr>
           <w:sz w:val="26"/>
@@ -8971,7 +9489,7 @@
         </w:rPr>
         <w:t xml:space="preserve">Valūta</w:t>
       </w:r>
-      <w:bookmarkEnd w:id="52"/>
+      <w:bookmarkEnd w:id="60"/>
     </w:p>
     <w:p>
       <w:pPr>
@@ -8995,7 +9513,7 @@
         <w:spacing w:before="240" w:after="100"/>
         <w:keepNext/>
       </w:pPr>
-      <w:bookmarkStart w:id="53" w:name="_Toc00000052"/>
+      <w:bookmarkStart w:id="61" w:name="_Toc00000060"/>
       <w:r>
         <w:rPr>
           <w:sz w:val="26"/>
@@ -9007,7 +9525,7 @@
         </w:rPr>
         <w:t xml:space="preserve">Autocolor on edit</w:t>
       </w:r>
-      <w:bookmarkEnd w:id="53"/>
+      <w:bookmarkEnd w:id="61"/>
     </w:p>
     <w:p>
       <w:pPr>
@@ -9031,7 +9549,7 @@
         <w:spacing w:before="240" w:after="100"/>
         <w:keepNext/>
       </w:pPr>
-      <w:bookmarkStart w:id="54" w:name="_Toc00000053"/>
+      <w:bookmarkStart w:id="62" w:name="_Toc00000061"/>
       <w:r>
         <w:rPr>
           <w:sz w:val="26"/>
@@ -9043,7 +9561,7 @@
         </w:rPr>
         <w:t xml:space="preserve">Iestatījumu pārnešana un atiestatīšana</w:t>
       </w:r>
-      <w:bookmarkEnd w:id="54"/>
+      <w:bookmarkEnd w:id="62"/>
     </w:p>
     <w:p>
       <w:pPr>
@@ -9101,7 +9619,7 @@
         <w:keepNext/>
         <w:pageBreakBefore/>
       </w:pPr>
-      <w:bookmarkStart w:id="55" w:name="_Toc00000054"/>
+      <w:bookmarkStart w:id="63" w:name="_Toc00000062"/>
       <w:r>
         <w:rPr>
           <w:sz w:val="36"/>
@@ -9111,7 +9629,7 @@
           <w:bCs/>
           <w:rFonts w:ascii="Aptos" w:hAnsi="Aptos" w:cs="Aptos" w:eastAsia="Aptos"/>
         </w:rPr>
-        <w:t xml:space="preserve">8  </w:t>
+        <w:t xml:space="preserve">9  </w:t>
       </w:r>
       <w:r>
         <w:rPr>
@@ -9124,7 +9642,7 @@
         </w:rPr>
         <w:t xml:space="preserve">Īsinājumtaustiņi</w:t>
       </w:r>
-      <w:bookmarkEnd w:id="55"/>
+      <w:bookmarkEnd w:id="63"/>
     </w:p>
     <w:p>
       <w:pPr>
@@ -9133,7 +9651,7 @@
         <w:spacing w:before="240" w:after="100"/>
         <w:keepNext/>
       </w:pPr>
-      <w:bookmarkStart w:id="56" w:name="_Toc00000055"/>
+      <w:bookmarkStart w:id="64" w:name="_Toc00000063"/>
       <w:r>
         <w:rPr>
           <w:sz w:val="26"/>
@@ -9145,7 +9663,7 @@
         </w:rPr>
         <w:t xml:space="preserve">Visas kombinācijas</w:t>
       </w:r>
-      <w:bookmarkEnd w:id="56"/>
+      <w:bookmarkEnd w:id="64"/>
     </w:p>
     <w:p>
       <w:pPr>
@@ -11810,7 +12328,7 @@
         <w:keepNext/>
         <w:pageBreakBefore/>
       </w:pPr>
-      <w:bookmarkStart w:id="57" w:name="_Toc00000056"/>
+      <w:bookmarkStart w:id="65" w:name="_Toc00000064"/>
       <w:r>
         <w:rPr>
           <w:sz w:val="36"/>
@@ -11820,7 +12338,7 @@
           <w:bCs/>
           <w:rFonts w:ascii="Aptos" w:hAnsi="Aptos" w:cs="Aptos" w:eastAsia="Aptos"/>
         </w:rPr>
-        <w:t xml:space="preserve">9  </w:t>
+        <w:t xml:space="preserve">10  </w:t>
       </w:r>
       <w:r>
         <w:rPr>
@@ -11833,7 +12351,7 @@
         </w:rPr>
         <w:t xml:space="preserve">Biežākās problēmas</w:t>
       </w:r>
-      <w:bookmarkEnd w:id="57"/>
+      <w:bookmarkEnd w:id="65"/>
     </w:p>
     <w:p>
       <w:pPr>
@@ -11842,7 +12360,7 @@
         <w:spacing w:before="240" w:after="100"/>
         <w:keepNext/>
       </w:pPr>
-      <w:bookmarkStart w:id="58" w:name="_Toc00000057"/>
+      <w:bookmarkStart w:id="66" w:name="_Toc00000065"/>
       <w:r>
         <w:rPr>
           <w:sz w:val="26"/>
@@ -11854,7 +12372,7 @@
         </w:rPr>
         <w:t xml:space="preserve">Ziņojumi un to iemesli</w:t>
       </w:r>
-      <w:bookmarkEnd w:id="58"/>
+      <w:bookmarkEnd w:id="66"/>
     </w:p>
     <w:tbl>
       <w:tblPr>
@@ -12565,7 +13083,7 @@
         <w:spacing w:before="240" w:after="100"/>
         <w:keepNext/>
       </w:pPr>
-      <w:bookmarkStart w:id="59" w:name="_Toc00000058"/>
+      <w:bookmarkStart w:id="67" w:name="_Toc00000066"/>
       <w:r>
         <w:rPr>
           <w:sz w:val="26"/>
@@ -12577,7 +13095,7 @@
         </w:rPr>
         <w:t xml:space="preserve">Ierobežojumi</w:t>
       </w:r>
-      <w:bookmarkEnd w:id="59"/>
+      <w:bookmarkEnd w:id="67"/>
     </w:p>
     <w:p>
       <w:pPr>
@@ -12761,7 +13279,7 @@
         <w:keepNext/>
         <w:pageBreakBefore/>
       </w:pPr>
-      <w:bookmarkStart w:id="60" w:name="_Toc00000059"/>
+      <w:bookmarkStart w:id="68" w:name="_Toc00000067"/>
       <w:r>
         <w:rPr>
           <w:sz w:val="36"/>
@@ -12771,7 +13289,7 @@
           <w:bCs/>
           <w:rFonts w:ascii="Aptos" w:hAnsi="Aptos" w:cs="Aptos" w:eastAsia="Aptos"/>
         </w:rPr>
-        <w:t xml:space="preserve">10  </w:t>
+        <w:t xml:space="preserve">11  </w:t>
       </w:r>
       <w:r>
         <w:rPr>
@@ -12784,7 +13302,7 @@
         </w:rPr>
         <w:t xml:space="preserve">Versija</w:t>
       </w:r>
-      <w:bookmarkEnd w:id="60"/>
+      <w:bookmarkEnd w:id="68"/>
     </w:p>
     <w:p>
       <w:pPr>
@@ -12793,7 +13311,7 @@
         <w:spacing w:before="240" w:after="100"/>
         <w:keepNext/>
       </w:pPr>
-      <w:bookmarkStart w:id="61" w:name="_Toc00000060"/>
+      <w:bookmarkStart w:id="69" w:name="_Toc00000068"/>
       <w:r>
         <w:rPr>
           <w:sz w:val="26"/>
@@ -12805,7 +13323,7 @@
         </w:rPr>
         <w:t xml:space="preserve">Kura versija ir aprakstīta</w:t>
       </w:r>
-      <w:bookmarkEnd w:id="61"/>
+      <w:bookmarkEnd w:id="69"/>
     </w:p>
     <w:p>
       <w:pPr>

</xml_diff>

<commit_message>
Help copy for the Templates section, manual regenerated
</commit_message>
<xml_diff>
--- a/manual/out/pls,fix rokasgrāmata.docx
+++ b/manual/out/pls,fix rokasgrāmata.docx
@@ -123,7 +123,7 @@
           <w:bCs/>
           <w:rFonts w:ascii="Aptos" w:hAnsi="Aptos" w:cs="Aptos" w:eastAsia="Aptos"/>
         </w:rPr>
-        <w:t xml:space="preserve">v2.3.002</w:t>
+        <w:t xml:space="preserve">v2.3.003</w:t>
       </w:r>
     </w:p>
     <w:p>
@@ -3112,6 +3112,21 @@
           <w:rFonts w:ascii="Aptos" w:hAnsi="Aptos" w:cs="Aptos" w:eastAsia="Aptos"/>
         </w:rPr>
         <w:t xml:space="preserve">Paneļa apakšā ir rinda "Workbook data stays inside Excel" un pašreizējā versija. PowerPoint pusē tajā pašā vietā ir rinda "Linked objects stay inside PowerPoint".</w:t>
+      </w:r>
+    </w:p>
+    <w:p>
+      <w:pPr>
+        <w:rPr/>
+        <w:spacing w:after="120" w:line="276"/>
+      </w:pPr>
+      <w:r>
+        <w:rPr>
+          <w:sz w:val="22"/>
+          <w:szCs w:val="22"/>
+          <w:color w:val="1A1A1A"/>
+          <w:rFonts w:ascii="Aptos" w:hAnsi="Aptos" w:cs="Aptos" w:eastAsia="Aptos"/>
+        </w:rPr>
+        <w:t xml:space="preserve">Katrai paneļa sadaļai blakus virsrakstam ir apaļa poga "?", kas atver īsu skaidrojumu par sadaļu un par katru tās pogu. Vienlaikus ir atvērts viens skaidrojums, un to aizver ar to pašu pogu vai ar taustiņu Esc.</w:t>
       </w:r>
     </w:p>
     <w:p>
@@ -13337,7 +13352,7 @@
           <w:color w:val="1A1A1A"/>
           <w:rFonts w:ascii="Aptos" w:hAnsi="Aptos" w:cs="Aptos" w:eastAsia="Aptos"/>
         </w:rPr>
-        <w:t xml:space="preserve">Šī rokasgrāmata apraksta pls,fix versiju v2.3.002. Tā pati versija ir uzrakstīta uz vāka un katras lapas apakšā.</w:t>
+        <w:t xml:space="preserve">Šī rokasgrāmata apraksta pls,fix versiju v2.3.003. Tā pati versija ir uzrakstīta uz vāka un katras lapas apakšā.</w:t>
       </w:r>
     </w:p>
     <w:p>
@@ -13402,7 +13417,7 @@
         <w:color w:val="5B6472"/>
         <w:rFonts w:ascii="Aptos" w:hAnsi="Aptos" w:cs="Aptos" w:eastAsia="Aptos"/>
       </w:rPr>
-      <w:t xml:space="preserve">pls,fix rokasgrāmata v2.3.002   |   </w:t>
+      <w:t xml:space="preserve">pls,fix rokasgrāmata v2.3.003   |   </w:t>
     </w:r>
     <w:r>
       <w:rPr>

</xml_diff>

<commit_message>
Manual regenerated at v2.3.5
</commit_message>
<xml_diff>
--- a/manual/out/pls,fix rokasgrāmata.docx
+++ b/manual/out/pls,fix rokasgrāmata.docx
@@ -123,7 +123,7 @@
           <w:bCs/>
           <w:rFonts w:ascii="Aptos" w:hAnsi="Aptos" w:cs="Aptos" w:eastAsia="Aptos"/>
         </w:rPr>
-        <w:t xml:space="preserve">v2.3.003</w:t>
+        <w:t xml:space="preserve">v2.3.005</w:t>
       </w:r>
     </w:p>
     <w:p>
@@ -13352,7 +13352,7 @@
           <w:color w:val="1A1A1A"/>
           <w:rFonts w:ascii="Aptos" w:hAnsi="Aptos" w:cs="Aptos" w:eastAsia="Aptos"/>
         </w:rPr>
-        <w:t xml:space="preserve">Šī rokasgrāmata apraksta pls,fix versiju v2.3.003. Tā pati versija ir uzrakstīta uz vāka un katras lapas apakšā.</w:t>
+        <w:t xml:space="preserve">Šī rokasgrāmata apraksta pls,fix versiju v2.3.005. Tā pati versija ir uzrakstīta uz vāka un katras lapas apakšā.</w:t>
       </w:r>
     </w:p>
     <w:p>
@@ -13417,7 +13417,7 @@
         <w:color w:val="5B6472"/>
         <w:rFonts w:ascii="Aptos" w:hAnsi="Aptos" w:cs="Aptos" w:eastAsia="Aptos"/>
       </w:rPr>
-      <w:t xml:space="preserve">pls,fix rokasgrāmata v2.3.003   |   </w:t>
+      <w:t xml:space="preserve">pls,fix rokasgrāmata v2.3.005   |   </w:t>
     </w:r>
     <w:r>
       <w:rPr>

</xml_diff>

<commit_message>
Manual regenerated at v2.3.6
</commit_message>
<xml_diff>
--- a/manual/out/pls,fix rokasgrāmata.docx
+++ b/manual/out/pls,fix rokasgrāmata.docx
@@ -123,7 +123,7 @@
           <w:bCs/>
           <w:rFonts w:ascii="Aptos" w:hAnsi="Aptos" w:cs="Aptos" w:eastAsia="Aptos"/>
         </w:rPr>
-        <w:t xml:space="preserve">v2.3.005</w:t>
+        <w:t xml:space="preserve">v2.3.006</w:t>
       </w:r>
     </w:p>
     <w:p>
@@ -3623,7 +3623,7 @@
           <w:color w:val="1A1A1A"/>
           <w:rFonts w:ascii="Aptos" w:hAnsi="Aptos" w:cs="Aptos" w:eastAsia="Aptos"/>
         </w:rPr>
-        <w:t xml:space="preserve">Cilne "Tools" ir paneļa darba daļa. Tā ir sadalīta blokos: atlases pārskats, noformējums, formātu cikli, modeļa rīki, pārbaude un diagrammas.</w:t>
+        <w:t xml:space="preserve">Cilne "Tools" ir paneļa darba daļa. Tā ir sadalīta blokos: atlases pārskats, veidnes, noformējums, formātu cikli, modeļa rīki, pārbaude un diagrammas.</w:t>
       </w:r>
     </w:p>
     <w:p>
@@ -5679,6 +5679,21 @@
     <w:p>
       <w:pPr>
         <w:rPr/>
+        <w:spacing w:after="120" w:line="276"/>
+      </w:pPr>
+      <w:r>
+        <w:rPr>
+          <w:sz w:val="22"/>
+          <w:szCs w:val="22"/>
+          <w:color w:val="1A1A1A"/>
+          <w:rFonts w:ascii="Aptos" w:hAnsi="Aptos" w:cs="Aptos" w:eastAsia="Aptos"/>
+        </w:rPr>
+        <w:t xml:space="preserve">Stabiņu galos ir tikai vērtības, tajā pašā skaitļu formātā, kādā atlasē ir zemākā un augstākā vērtība.</w:t>
+      </w:r>
+    </w:p>
+    <w:p>
+      <w:pPr>
+        <w:rPr/>
         <w:pStyle w:val="Heading2"/>
         <w:spacing w:before="240" w:after="100"/>
         <w:keepNext/>
@@ -5709,7 +5724,7 @@
           <w:color w:val="1A1A1A"/>
           <w:rFonts w:ascii="Aptos" w:hAnsi="Aptos" w:cs="Aptos" w:eastAsia="Aptos"/>
         </w:rPr>
-        <w:t xml:space="preserve">Poga "Brand-format chart" pārnoformē atlasīto diagrammu: fonts, sēriju krāsas un leģenda nāk no jūsu paletes, palīglīnijas tiek izslēgtas. Vispirms jāatlasa diagramma, citādi panelis paziņo "Select a chart first".</w:t>
+        <w:t xml:space="preserve">Poga "Brand-format chart" pārnoformē atlasīto diagrammu: fonts, sēriju krāsas un leģenda nāk no jūsu paletes, palīglīnijas tiek izslēgtas, un datu etiķetēs paliek tikai vērtības (bez kategoriju nosaukumiem, sēriju nosaukumiem un procentiem). Sektoru diagrammai etiķetes tiek novietotas ārpus sektoriem, un kategoriju nosaukumus rāda leģenda. Vispirms jāatlasa diagramma, citādi panelis paziņo "Select a chart first".</w:t>
       </w:r>
     </w:p>
     <w:p>
@@ -6140,7 +6155,7 @@
           <w:color w:val="1A1A1A"/>
           <w:rFonts w:ascii="Aptos" w:hAnsi="Aptos" w:cs="Aptos" w:eastAsia="Aptos"/>
         </w:rPr>
-        <w:t xml:space="preserve">Cilnes "Tools" beigās ir sadaļa "Templates". Katra poga ieraksta gatavu aprēķina bloku, kura augšējais kreisais stūris ir aktīvajā šūnā. Bloku var ierakstīt jebkurā lapā un jebkurā vietā, jo visas formulas norāda uz paša bloka šūnām.</w:t>
+        <w:t xml:space="preserve">Cilnes "Tools" sākumā, tūlīt zem atlases pārskata, ir sadaļa "Templates" ar sešām pogām. Katra poga ieraksta gatavu aprēķina bloku, kura augšējais kreisais stūris ir aktīvajā šūnā. Bloku var ierakstīt jebkurā lapā un jebkurā vietā, jo visas formulas norāda uz paša bloka šūnām.</w:t>
       </w:r>
     </w:p>
     <w:p>
@@ -13352,7 +13367,7 @@
           <w:color w:val="1A1A1A"/>
           <w:rFonts w:ascii="Aptos" w:hAnsi="Aptos" w:cs="Aptos" w:eastAsia="Aptos"/>
         </w:rPr>
-        <w:t xml:space="preserve">Šī rokasgrāmata apraksta pls,fix versiju v2.3.005. Tā pati versija ir uzrakstīta uz vāka un katras lapas apakšā.</w:t>
+        <w:t xml:space="preserve">Šī rokasgrāmata apraksta pls,fix versiju v2.3.006. Tā pati versija ir uzrakstīta uz vāka un katras lapas apakšā.</w:t>
       </w:r>
     </w:p>
     <w:p>
@@ -13417,7 +13432,7 @@
         <w:color w:val="5B6472"/>
         <w:rFonts w:ascii="Aptos" w:hAnsi="Aptos" w:cs="Aptos" w:eastAsia="Aptos"/>
       </w:rPr>
-      <w:t xml:space="preserve">pls,fix rokasgrāmata v2.3.005   |   </w:t>
+      <w:t xml:space="preserve">pls,fix rokasgrāmata v2.3.006   |   </w:t>
     </w:r>
     <w:r>
       <w:rPr>

</xml_diff>

<commit_message>
Manual regenerated at v2.4.0
</commit_message>
<xml_diff>
--- a/manual/out/pls,fix rokasgrāmata.docx
+++ b/manual/out/pls,fix rokasgrāmata.docx
@@ -123,7 +123,7 @@
           <w:bCs/>
           <w:rFonts w:ascii="Aptos" w:hAnsi="Aptos" w:cs="Aptos" w:eastAsia="Aptos"/>
         </w:rPr>
-        <w:t xml:space="preserve">v2.3.006</w:t>
+        <w:t xml:space="preserve">v2.4.000</w:t>
       </w:r>
     </w:p>
     <w:p>
@@ -7119,7 +7119,7 @@
           <w:color w:val="1A1A1A"/>
           <w:rFonts w:ascii="Aptos" w:hAnsi="Aptos" w:cs="Aptos" w:eastAsia="Aptos"/>
         </w:rPr>
-        <w:t xml:space="preserve">pls,fix ļauj eksportēt Excel šūnu apgabalu vai diagrammu uz PowerPoint kā saistītu attēlu. Attēlu pēc tam var atjaunināt vietā, nemainot tā pozīciju un izmēru, arī tad, kad avota dati Excel darbgrāmatā ir mainījušies.</w:t>
+        <w:t xml:space="preserve">pls,fix ļauj eksportēt Excel šūnu apgabalu vai diagrammu uz PowerPoint kā saistītu attēlu, tabulu vai diagrammu. Objektu pēc tam var atjaunināt vietā, nemainot tā pozīciju un izmēru, arī tad, kad avota dati Excel darbgrāmatā ir mainījušies.</w:t>
       </w:r>
     </w:p>
     <w:p>
@@ -7149,7 +7149,7 @@
           <w:color w:val="1A1A1A"/>
           <w:rFonts w:ascii="Aptos" w:hAnsi="Aptos" w:cs="Aptos" w:eastAsia="Aptos"/>
         </w:rPr>
-        <w:t xml:space="preserve">Šajā versijā saitē var būt tikai attēls.</w:t>
+        <w:t xml:space="preserve">Saitē var būt attēls, tabula vai diagramma. Diagramma slaidā nonāk kā rediģējamu figūru grupa ar zīmola krāsām un tikai vērtību etiķetēm (stabiņu, joslu, tilta un sektoru diagrammas). Ja PowerPoint to nevar uzzīmēt vai diagramma ir par lielu (vairāk nekā 40 punkti, 3 sērijas vai 12 sektori), tā tiek ievietota kā attēls, un panelis to pasaka.</w:t>
       </w:r>
     </w:p>
     <w:p>
@@ -7914,7 +7914,7 @@
           <w:color w:val="1A1A1A"/>
           <w:rFonts w:ascii="Aptos" w:hAnsi="Aptos" w:cs="Aptos" w:eastAsia="Aptos"/>
         </w:rPr>
-        <w:t xml:space="preserve">Attēls tiek ievietots atlasītajā slaidā un pielāgots tā izmēram. Pēc tam to var pārvietot un mainīt tā izmēru.</w:t>
+        <w:t xml:space="preserve">Objekts (attēls, tabula vai diagramma) tiek ievietots atlasītajā slaidā brīvā vietā un pielāgots tā izmēram. Pēc tam to var pārvietot un mainīt tā izmēru.</w:t>
       </w:r>
     </w:p>
     <w:p>
@@ -13367,7 +13367,7 @@
           <w:color w:val="1A1A1A"/>
           <w:rFonts w:ascii="Aptos" w:hAnsi="Aptos" w:cs="Aptos" w:eastAsia="Aptos"/>
         </w:rPr>
-        <w:t xml:space="preserve">Šī rokasgrāmata apraksta pls,fix versiju v2.3.006. Tā pati versija ir uzrakstīta uz vāka un katras lapas apakšā.</w:t>
+        <w:t xml:space="preserve">Šī rokasgrāmata apraksta pls,fix versiju v2.4.000. Tā pati versija ir uzrakstīta uz vāka un katras lapas apakšā.</w:t>
       </w:r>
     </w:p>
     <w:p>
@@ -13432,7 +13432,7 @@
         <w:color w:val="5B6472"/>
         <w:rFonts w:ascii="Aptos" w:hAnsi="Aptos" w:cs="Aptos" w:eastAsia="Aptos"/>
       </w:rPr>
-      <w:t xml:space="preserve">pls,fix rokasgrāmata v2.3.006   |   </w:t>
+      <w:t xml:space="preserve">pls,fix rokasgrāmata v2.4.000   |   </w:t>
     </w:r>
     <w:r>
       <w:rPr>

</xml_diff>

<commit_message>
Text links: docs, Map and spec as shipped
FEATURES row shipped, one README sentence, the Latvian guide and manual
paragraph, Map lines for link-export, link-render, link-touch and
texts.ts, spec amended to the one-cell rule and the 'text' label.
</commit_message>
<xml_diff>
--- a/manual/out/pls,fix rokasgrāmata.docx
+++ b/manual/out/pls,fix rokasgrāmata.docx
@@ -123,7 +123,7 @@
           <w:bCs/>
           <w:rFonts w:ascii="Aptos" w:hAnsi="Aptos" w:cs="Aptos" w:eastAsia="Aptos"/>
         </w:rPr>
-        <w:t xml:space="preserve">v2.4.000</w:t>
+        <w:t xml:space="preserve">v2.4.003</w:t>
       </w:r>
     </w:p>
     <w:p>
@@ -7432,6 +7432,21 @@
     <w:p>
       <w:pPr>
         <w:rPr/>
+        <w:spacing w:after="120" w:line="276"/>
+      </w:pPr>
+      <w:r>
+        <w:rPr>
+          <w:sz w:val="22"/>
+          <w:szCs w:val="22"/>
+          <w:color w:val="1A1A1A"/>
+          <w:rFonts w:ascii="Aptos" w:hAnsi="Aptos" w:cs="Aptos" w:eastAsia="Aptos"/>
+        </w:rPr>
+        <w:t xml:space="preserve">Ar "Export as text" vienas šūnas attēlotais teksts nonāk slaidā kā atsevišķs teksta lauks. Atjaunināšana maina tikai tekstu; lauka vieta, izmērs un fonts paliek tādi, kādus tos atstājāt (līdz 500 rakstzīmēm).</w:t>
+      </w:r>
+    </w:p>
+    <w:p>
+      <w:pPr>
+        <w:rPr/>
         <w:jc w:val="center"/>
       </w:pPr>
       <w:r>
@@ -7929,7 +7944,7 @@
           <w:color w:val="1A1A1A"/>
           <w:rFonts w:ascii="Aptos" w:hAnsi="Aptos" w:cs="Aptos" w:eastAsia="Aptos"/>
         </w:rPr>
-        <w:t xml:space="preserve">Vienumi cilnē "Inbox" ir derīgi 24 stundas pēc nosūtīšanas. Ja saraksts ir tukšs un panelī redzams "Not paired", vispirms ielīmējiet saites atslēgu cilnē "Settings".</w:t>
+        <w:t xml:space="preserve">Vienumi cilnē "Inbox" ir derīgi 7 dienas pēc nosūtīšanas. Ja saraksts ir tukšs un panelī redzams "Not paired", vispirms ielīmējiet saites atslēgu cilnē "Settings".</w:t>
       </w:r>
     </w:p>
     <w:p>
@@ -8485,7 +8500,7 @@
           <w:color w:val="1A1A1A"/>
           <w:rFonts w:ascii="Aptos" w:hAnsi="Aptos" w:cs="Aptos" w:eastAsia="Aptos"/>
         </w:rPr>
-        <w:t xml:space="preserve">Relejs glabā eksportētos attēlus tikai šifrētā veidā un ne ilgāk kā 7 dienas. Ikviens, kam ir pieejama prezentācija, šajā laikā var lejupielādēt saites jaunāko attēlu, pat ja saite prezentācijā vairs nav redzama.</w:t>
+        <w:t xml:space="preserve">Relejs glabā eksportētos attēlus tikai šifrētā veidā un ne ilgāk kā 30 dienas. Ikviens, kam ir pieejama prezentācija, šajā laikā var lejupielādēt saites jaunāko attēlu, pat ja saite prezentācijā vairs nav redzama.</w:t>
       </w:r>
     </w:p>
     <w:p>
@@ -13367,7 +13382,7 @@
           <w:color w:val="1A1A1A"/>
           <w:rFonts w:ascii="Aptos" w:hAnsi="Aptos" w:cs="Aptos" w:eastAsia="Aptos"/>
         </w:rPr>
-        <w:t xml:space="preserve">Šī rokasgrāmata apraksta pls,fix versiju v2.4.000. Tā pati versija ir uzrakstīta uz vāka un katras lapas apakšā.</w:t>
+        <w:t xml:space="preserve">Šī rokasgrāmata apraksta pls,fix versiju v2.4.003. Tā pati versija ir uzrakstīta uz vāka un katras lapas apakšā.</w:t>
       </w:r>
     </w:p>
     <w:p>
@@ -13432,7 +13447,7 @@
         <w:color w:val="5B6472"/>
         <w:rFonts w:ascii="Aptos" w:hAnsi="Aptos" w:cs="Aptos" w:eastAsia="Aptos"/>
       </w:rPr>
-      <w:t xml:space="preserve">pls,fix rokasgrāmata v2.4.000   |   </w:t>
+      <w:t xml:space="preserve">pls,fix rokasgrāmata v2.4.003   |   </w:t>
     </w:r>
     <w:r>
       <w:rPr>

</xml_diff>

<commit_message>
Manual regenerated: model check and text links
</commit_message>
<xml_diff>
--- a/manual/out/pls,fix rokasgrāmata.docx
+++ b/manual/out/pls,fix rokasgrāmata.docx
@@ -123,7 +123,7 @@
           <w:bCs/>
           <w:rFonts w:ascii="Aptos" w:hAnsi="Aptos" w:cs="Aptos" w:eastAsia="Aptos"/>
         </w:rPr>
-        <w:t xml:space="preserve">v2.4.003</w:t>
+        <w:t xml:space="preserve">v2.4.004</w:t>
       </w:r>
     </w:p>
     <w:p>
@@ -1288,6 +1288,31 @@
             <w:p>
               <w:pPr>
                 <w:rPr/>
+                <w:pStyle w:val="ToC2"/>
+                <w:tabs>
+                  <w:tab w:val="right" w:leader="dot" w:pos="80000"/>
+                </w:tabs>
+              </w:pPr>
+              <w:r>
+                <w:rPr/>
+                <w:t xml:space="preserve">Model check</w:t>
+              </w:r>
+              <w:r>
+                <w:rPr/>
+                <w:tab/>
+              </w:r>
+              <w:r>
+                <w:rPr/>
+                <w:fldChar w:fldCharType="begin" w:dirty="false"/>
+                <w:instrText>PAGEREF _Toc00000045 \h</w:instrText>
+                <w:fldChar w:fldCharType="separate" w:dirty="false"/>
+                <w:t xml:space="preserve">1</w:t>
+                <w:fldChar w:fldCharType="end" w:dirty="false"/>
+              </w:r>
+            </w:p>
+            <w:p>
+              <w:pPr>
+                <w:rPr/>
                 <w:pStyle w:val="ToC1"/>
                 <w:tabs>
                   <w:tab w:val="right" w:leader="dot" w:pos="80000"/>
@@ -1304,7 +1329,7 @@
               <w:r>
                 <w:rPr/>
                 <w:fldChar w:fldCharType="begin" w:dirty="false"/>
-                <w:instrText>PAGEREF _Toc00000045 \h</w:instrText>
+                <w:instrText>PAGEREF _Toc00000046 \h</w:instrText>
                 <w:fldChar w:fldCharType="separate" w:dirty="false"/>
                 <w:t xml:space="preserve">1</w:t>
                 <w:fldChar w:fldCharType="end" w:dirty="false"/>
@@ -1329,7 +1354,7 @@
               <w:r>
                 <w:rPr/>
                 <w:fldChar w:fldCharType="begin" w:dirty="false"/>
-                <w:instrText>PAGEREF _Toc00000046 \h</w:instrText>
+                <w:instrText>PAGEREF _Toc00000047 \h</w:instrText>
                 <w:fldChar w:fldCharType="separate" w:dirty="false"/>
                 <w:t xml:space="preserve">1</w:t>
                 <w:fldChar w:fldCharType="end" w:dirty="false"/>
@@ -1354,7 +1379,7 @@
               <w:r>
                 <w:rPr/>
                 <w:fldChar w:fldCharType="begin" w:dirty="false"/>
-                <w:instrText>PAGEREF _Toc00000047 \h</w:instrText>
+                <w:instrText>PAGEREF _Toc00000048 \h</w:instrText>
                 <w:fldChar w:fldCharType="separate" w:dirty="false"/>
                 <w:t xml:space="preserve">1</w:t>
                 <w:fldChar w:fldCharType="end" w:dirty="false"/>
@@ -1379,7 +1404,7 @@
               <w:r>
                 <w:rPr/>
                 <w:fldChar w:fldCharType="begin" w:dirty="false"/>
-                <w:instrText>PAGEREF _Toc00000048 \h</w:instrText>
+                <w:instrText>PAGEREF _Toc00000049 \h</w:instrText>
                 <w:fldChar w:fldCharType="separate" w:dirty="false"/>
                 <w:t xml:space="preserve">1</w:t>
                 <w:fldChar w:fldCharType="end" w:dirty="false"/>
@@ -1404,7 +1429,7 @@
               <w:r>
                 <w:rPr/>
                 <w:fldChar w:fldCharType="begin" w:dirty="false"/>
-                <w:instrText>PAGEREF _Toc00000049 \h</w:instrText>
+                <w:instrText>PAGEREF _Toc00000050 \h</w:instrText>
                 <w:fldChar w:fldCharType="separate" w:dirty="false"/>
                 <w:t xml:space="preserve">1</w:t>
                 <w:fldChar w:fldCharType="end" w:dirty="false"/>
@@ -1429,7 +1454,7 @@
               <w:r>
                 <w:rPr/>
                 <w:fldChar w:fldCharType="begin" w:dirty="false"/>
-                <w:instrText>PAGEREF _Toc00000050 \h</w:instrText>
+                <w:instrText>PAGEREF _Toc00000051 \h</w:instrText>
                 <w:fldChar w:fldCharType="separate" w:dirty="false"/>
                 <w:t xml:space="preserve">1</w:t>
                 <w:fldChar w:fldCharType="end" w:dirty="false"/>
@@ -1454,7 +1479,7 @@
               <w:r>
                 <w:rPr/>
                 <w:fldChar w:fldCharType="begin" w:dirty="false"/>
-                <w:instrText>PAGEREF _Toc00000051 \h</w:instrText>
+                <w:instrText>PAGEREF _Toc00000052 \h</w:instrText>
                 <w:fldChar w:fldCharType="separate" w:dirty="false"/>
                 <w:t xml:space="preserve">1</w:t>
                 <w:fldChar w:fldCharType="end" w:dirty="false"/>
@@ -1479,7 +1504,7 @@
               <w:r>
                 <w:rPr/>
                 <w:fldChar w:fldCharType="begin" w:dirty="false"/>
-                <w:instrText>PAGEREF _Toc00000052 \h</w:instrText>
+                <w:instrText>PAGEREF _Toc00000053 \h</w:instrText>
                 <w:fldChar w:fldCharType="separate" w:dirty="false"/>
                 <w:t xml:space="preserve">1</w:t>
                 <w:fldChar w:fldCharType="end" w:dirty="false"/>
@@ -1504,7 +1529,7 @@
               <w:r>
                 <w:rPr/>
                 <w:fldChar w:fldCharType="begin" w:dirty="false"/>
-                <w:instrText>PAGEREF _Toc00000053 \h</w:instrText>
+                <w:instrText>PAGEREF _Toc00000054 \h</w:instrText>
                 <w:fldChar w:fldCharType="separate" w:dirty="false"/>
                 <w:t xml:space="preserve">1</w:t>
                 <w:fldChar w:fldCharType="end" w:dirty="false"/>
@@ -1529,7 +1554,7 @@
               <w:r>
                 <w:rPr/>
                 <w:fldChar w:fldCharType="begin" w:dirty="false"/>
-                <w:instrText>PAGEREF _Toc00000054 \h</w:instrText>
+                <w:instrText>PAGEREF _Toc00000055 \h</w:instrText>
                 <w:fldChar w:fldCharType="separate" w:dirty="false"/>
                 <w:t xml:space="preserve">1</w:t>
                 <w:fldChar w:fldCharType="end" w:dirty="false"/>
@@ -1554,7 +1579,7 @@
               <w:r>
                 <w:rPr/>
                 <w:fldChar w:fldCharType="begin" w:dirty="false"/>
-                <w:instrText>PAGEREF _Toc00000055 \h</w:instrText>
+                <w:instrText>PAGEREF _Toc00000056 \h</w:instrText>
                 <w:fldChar w:fldCharType="separate" w:dirty="false"/>
                 <w:t xml:space="preserve">1</w:t>
                 <w:fldChar w:fldCharType="end" w:dirty="false"/>
@@ -1579,7 +1604,7 @@
               <w:r>
                 <w:rPr/>
                 <w:fldChar w:fldCharType="begin" w:dirty="false"/>
-                <w:instrText>PAGEREF _Toc00000056 \h</w:instrText>
+                <w:instrText>PAGEREF _Toc00000057 \h</w:instrText>
                 <w:fldChar w:fldCharType="separate" w:dirty="false"/>
                 <w:t xml:space="preserve">1</w:t>
                 <w:fldChar w:fldCharType="end" w:dirty="false"/>
@@ -1604,7 +1629,7 @@
               <w:r>
                 <w:rPr/>
                 <w:fldChar w:fldCharType="begin" w:dirty="false"/>
-                <w:instrText>PAGEREF _Toc00000057 \h</w:instrText>
+                <w:instrText>PAGEREF _Toc00000058 \h</w:instrText>
                 <w:fldChar w:fldCharType="separate" w:dirty="false"/>
                 <w:t xml:space="preserve">1</w:t>
                 <w:fldChar w:fldCharType="end" w:dirty="false"/>
@@ -1629,7 +1654,7 @@
               <w:r>
                 <w:rPr/>
                 <w:fldChar w:fldCharType="begin" w:dirty="false"/>
-                <w:instrText>PAGEREF _Toc00000058 \h</w:instrText>
+                <w:instrText>PAGEREF _Toc00000059 \h</w:instrText>
                 <w:fldChar w:fldCharType="separate" w:dirty="false"/>
                 <w:t xml:space="preserve">1</w:t>
                 <w:fldChar w:fldCharType="end" w:dirty="false"/>
@@ -1654,7 +1679,7 @@
               <w:r>
                 <w:rPr/>
                 <w:fldChar w:fldCharType="begin" w:dirty="false"/>
-                <w:instrText>PAGEREF _Toc00000059 \h</w:instrText>
+                <w:instrText>PAGEREF _Toc00000060 \h</w:instrText>
                 <w:fldChar w:fldCharType="separate" w:dirty="false"/>
                 <w:t xml:space="preserve">1</w:t>
                 <w:fldChar w:fldCharType="end" w:dirty="false"/>
@@ -1679,7 +1704,7 @@
               <w:r>
                 <w:rPr/>
                 <w:fldChar w:fldCharType="begin" w:dirty="false"/>
-                <w:instrText>PAGEREF _Toc00000060 \h</w:instrText>
+                <w:instrText>PAGEREF _Toc00000061 \h</w:instrText>
                 <w:fldChar w:fldCharType="separate" w:dirty="false"/>
                 <w:t xml:space="preserve">1</w:t>
                 <w:fldChar w:fldCharType="end" w:dirty="false"/>
@@ -1704,7 +1729,7 @@
               <w:r>
                 <w:rPr/>
                 <w:fldChar w:fldCharType="begin" w:dirty="false"/>
-                <w:instrText>PAGEREF _Toc00000061 \h</w:instrText>
+                <w:instrText>PAGEREF _Toc00000062 \h</w:instrText>
                 <w:fldChar w:fldCharType="separate" w:dirty="false"/>
                 <w:t xml:space="preserve">1</w:t>
                 <w:fldChar w:fldCharType="end" w:dirty="false"/>
@@ -1729,7 +1754,7 @@
               <w:r>
                 <w:rPr/>
                 <w:fldChar w:fldCharType="begin" w:dirty="false"/>
-                <w:instrText>PAGEREF _Toc00000062 \h</w:instrText>
+                <w:instrText>PAGEREF _Toc00000063 \h</w:instrText>
                 <w:fldChar w:fldCharType="separate" w:dirty="false"/>
                 <w:t xml:space="preserve">1</w:t>
                 <w:fldChar w:fldCharType="end" w:dirty="false"/>
@@ -1754,7 +1779,7 @@
               <w:r>
                 <w:rPr/>
                 <w:fldChar w:fldCharType="begin" w:dirty="false"/>
-                <w:instrText>PAGEREF _Toc00000063 \h</w:instrText>
+                <w:instrText>PAGEREF _Toc00000064 \h</w:instrText>
                 <w:fldChar w:fldCharType="separate" w:dirty="false"/>
                 <w:t xml:space="preserve">1</w:t>
                 <w:fldChar w:fldCharType="end" w:dirty="false"/>
@@ -1779,7 +1804,7 @@
               <w:r>
                 <w:rPr/>
                 <w:fldChar w:fldCharType="begin" w:dirty="false"/>
-                <w:instrText>PAGEREF _Toc00000064 \h</w:instrText>
+                <w:instrText>PAGEREF _Toc00000065 \h</w:instrText>
                 <w:fldChar w:fldCharType="separate" w:dirty="false"/>
                 <w:t xml:space="preserve">1</w:t>
                 <w:fldChar w:fldCharType="end" w:dirty="false"/>
@@ -1804,7 +1829,7 @@
               <w:r>
                 <w:rPr/>
                 <w:fldChar w:fldCharType="begin" w:dirty="false"/>
-                <w:instrText>PAGEREF _Toc00000065 \h</w:instrText>
+                <w:instrText>PAGEREF _Toc00000066 \h</w:instrText>
                 <w:fldChar w:fldCharType="separate" w:dirty="false"/>
                 <w:t xml:space="preserve">1</w:t>
                 <w:fldChar w:fldCharType="end" w:dirty="false"/>
@@ -1829,7 +1854,7 @@
               <w:r>
                 <w:rPr/>
                 <w:fldChar w:fldCharType="begin" w:dirty="false"/>
-                <w:instrText>PAGEREF _Toc00000066 \h</w:instrText>
+                <w:instrText>PAGEREF _Toc00000067 \h</w:instrText>
                 <w:fldChar w:fldCharType="separate" w:dirty="false"/>
                 <w:t xml:space="preserve">1</w:t>
                 <w:fldChar w:fldCharType="end" w:dirty="false"/>
@@ -1854,7 +1879,7 @@
               <w:r>
                 <w:rPr/>
                 <w:fldChar w:fldCharType="begin" w:dirty="false"/>
-                <w:instrText>PAGEREF _Toc00000067 \h</w:instrText>
+                <w:instrText>PAGEREF _Toc00000068 \h</w:instrText>
                 <w:fldChar w:fldCharType="separate" w:dirty="false"/>
                 <w:t xml:space="preserve">1</w:t>
                 <w:fldChar w:fldCharType="end" w:dirty="false"/>
@@ -1879,7 +1904,7 @@
               <w:r>
                 <w:rPr/>
                 <w:fldChar w:fldCharType="begin" w:dirty="false"/>
-                <w:instrText>PAGEREF _Toc00000068 \h</w:instrText>
+                <w:instrText>PAGEREF _Toc00000069 \h</w:instrText>
                 <w:fldChar w:fldCharType="separate" w:dirty="false"/>
                 <w:t xml:space="preserve">1</w:t>
                 <w:fldChar w:fldCharType="end" w:dirty="false"/>
@@ -7053,6 +7078,42 @@
     <w:p>
       <w:pPr>
         <w:rPr/>
+        <w:pStyle w:val="Heading2"/>
+        <w:spacing w:before="240" w:after="100"/>
+        <w:keepNext/>
+      </w:pPr>
+      <w:bookmarkStart w:id="46" w:name="_Toc00000045"/>
+      <w:r>
+        <w:rPr>
+          <w:sz w:val="26"/>
+          <w:szCs w:val="26"/>
+          <w:color w:val="14213D"/>
+          <w:b/>
+          <w:bCs/>
+          <w:rFonts w:ascii="Aptos" w:hAnsi="Aptos" w:cs="Aptos" w:eastAsia="Aptos"/>
+        </w:rPr>
+        <w:t xml:space="preserve">Model check</w:t>
+      </w:r>
+      <w:bookmarkEnd w:id="46"/>
+    </w:p>
+    <w:p>
+      <w:pPr>
+        <w:rPr/>
+        <w:spacing w:after="120" w:line="276"/>
+      </w:pPr>
+      <w:r>
+        <w:rPr>
+          <w:sz w:val="22"/>
+          <w:szCs w:val="22"/>
+          <w:color w:val="1A1A1A"/>
+          <w:rFonts w:ascii="Aptos" w:hAnsi="Aptos" w:cs="Aptos" w:eastAsia="Aptos"/>
+        </w:rPr>
+        <w:t xml:space="preserve">"Model check" vienā piegājienā uzskaita, ko pārbaudītājs modelī atzīmētu: formulu kļūdas, skaitļus formulās, no rindas atšķirīgas formulas, mainīgās funkcijas (OFFSET, INDIRECT, NOW u. c.), sabojātos nosaukumus, nelietotos stilus, slēptās lapas un ārējās saites. Klikšķis uz rindas aizved uz šūnu; "Copy report" nokopē sarakstu.</w:t>
+      </w:r>
+    </w:p>
+    <w:p>
+      <w:pPr>
+        <w:rPr/>
         <w:pStyle w:val="Heading1"/>
         <w:spacing w:before="120" w:after="200"/>
         <w:pBdr>
@@ -7061,7 +7122,7 @@
         <w:keepNext/>
         <w:pageBreakBefore/>
       </w:pPr>
-      <w:bookmarkStart w:id="46" w:name="_Toc00000045"/>
+      <w:bookmarkStart w:id="47" w:name="_Toc00000046"/>
       <w:r>
         <w:rPr>
           <w:sz w:val="36"/>
@@ -7084,7 +7145,7 @@
         </w:rPr>
         <w:t xml:space="preserve">Saites uz PowerPoint</w:t>
       </w:r>
-      <w:bookmarkEnd w:id="46"/>
+      <w:bookmarkEnd w:id="47"/>
     </w:p>
     <w:p>
       <w:pPr>
@@ -7093,7 +7154,7 @@
         <w:spacing w:before="240" w:after="100"/>
         <w:keepNext/>
       </w:pPr>
-      <w:bookmarkStart w:id="47" w:name="_Toc00000046"/>
+      <w:bookmarkStart w:id="48" w:name="_Toc00000047"/>
       <w:r>
         <w:rPr>
           <w:sz w:val="26"/>
@@ -7105,7 +7166,7 @@
         </w:rPr>
         <w:t xml:space="preserve">Kā saite darbojas</w:t>
       </w:r>
-      <w:bookmarkEnd w:id="47"/>
+      <w:bookmarkEnd w:id="48"/>
     </w:p>
     <w:p>
       <w:pPr>
@@ -7159,7 +7220,7 @@
         <w:spacing w:before="240" w:after="100"/>
         <w:keepNext/>
       </w:pPr>
-      <w:bookmarkStart w:id="48" w:name="_Toc00000047"/>
+      <w:bookmarkStart w:id="49" w:name="_Toc00000048"/>
       <w:r>
         <w:rPr>
           <w:sz w:val="26"/>
@@ -7171,7 +7232,7 @@
         </w:rPr>
         <w:t xml:space="preserve">Saites atslēga</w:t>
       </w:r>
-      <w:bookmarkEnd w:id="48"/>
+      <w:bookmarkEnd w:id="49"/>
     </w:p>
     <w:p>
       <w:pPr>
@@ -7347,7 +7408,7 @@
         <w:spacing w:before="240" w:after="100"/>
         <w:keepNext/>
       </w:pPr>
-      <w:bookmarkStart w:id="49" w:name="_Toc00000048"/>
+      <w:bookmarkStart w:id="50" w:name="_Toc00000049"/>
       <w:r>
         <w:rPr>
           <w:sz w:val="26"/>
@@ -7359,7 +7420,7 @@
         </w:rPr>
         <w:t xml:space="preserve">Eksports no Excel</w:t>
       </w:r>
-      <w:bookmarkEnd w:id="49"/>
+      <w:bookmarkEnd w:id="50"/>
     </w:p>
     <w:p>
       <w:pPr>
@@ -7516,7 +7577,7 @@
         <w:spacing w:before="240" w:after="100"/>
         <w:keepNext/>
       </w:pPr>
-      <w:bookmarkStart w:id="50" w:name="_Toc00000049"/>
+      <w:bookmarkStart w:id="51" w:name="_Toc00000050"/>
       <w:r>
         <w:rPr>
           <w:sz w:val="26"/>
@@ -7528,7 +7589,7 @@
         </w:rPr>
         <w:t xml:space="preserve">Saišu saraksts Excel pusē</w:t>
       </w:r>
-      <w:bookmarkEnd w:id="50"/>
+      <w:bookmarkEnd w:id="51"/>
     </w:p>
     <w:p>
       <w:pPr>
@@ -7795,7 +7856,7 @@
         <w:spacing w:before="240" w:after="100"/>
         <w:keepNext/>
       </w:pPr>
-      <w:bookmarkStart w:id="51" w:name="_Toc00000050"/>
+      <w:bookmarkStart w:id="52" w:name="_Toc00000051"/>
       <w:r>
         <w:rPr>
           <w:sz w:val="26"/>
@@ -7807,7 +7868,7 @@
         </w:rPr>
         <w:t xml:space="preserve">Auto-push on edit un Highlight linked cells</w:t>
       </w:r>
-      <w:bookmarkEnd w:id="51"/>
+      <w:bookmarkEnd w:id="52"/>
     </w:p>
     <w:p>
       <w:pPr>
@@ -7846,7 +7907,7 @@
         <w:spacing w:before="240" w:after="100"/>
         <w:keepNext/>
       </w:pPr>
-      <w:bookmarkStart w:id="52" w:name="_Toc00000051"/>
+      <w:bookmarkStart w:id="53" w:name="_Toc00000052"/>
       <w:r>
         <w:rPr>
           <w:sz w:val="26"/>
@@ -7858,7 +7919,7 @@
         </w:rPr>
         <w:t xml:space="preserve">Ievietošana PowerPoint</w:t>
       </w:r>
-      <w:bookmarkEnd w:id="52"/>
+      <w:bookmarkEnd w:id="53"/>
     </w:p>
     <w:p>
       <w:pPr>
@@ -8019,7 +8080,7 @@
         <w:spacing w:before="240" w:after="100"/>
         <w:keepNext/>
       </w:pPr>
-      <w:bookmarkStart w:id="53" w:name="_Toc00000052"/>
+      <w:bookmarkStart w:id="54" w:name="_Toc00000053"/>
       <w:r>
         <w:rPr>
           <w:sz w:val="26"/>
@@ -8031,7 +8092,7 @@
         </w:rPr>
         <w:t xml:space="preserve">Atjaunināšana</w:t>
       </w:r>
-      <w:bookmarkEnd w:id="53"/>
+      <w:bookmarkEnd w:id="54"/>
     </w:p>
     <w:p>
       <w:pPr>
@@ -8393,7 +8454,7 @@
         <w:spacing w:before="240" w:after="100"/>
         <w:keepNext/>
       </w:pPr>
-      <w:bookmarkStart w:id="54" w:name="_Toc00000053"/>
+      <w:bookmarkStart w:id="55" w:name="_Toc00000054"/>
       <w:r>
         <w:rPr>
           <w:sz w:val="26"/>
@@ -8405,7 +8466,7 @@
         </w:rPr>
         <w:t xml:space="preserve">Go to slide, Change source un Break link</w:t>
       </w:r>
-      <w:bookmarkEnd w:id="54"/>
+      <w:bookmarkEnd w:id="55"/>
     </w:p>
     <w:p>
       <w:pPr>
@@ -8474,7 +8535,7 @@
         <w:spacing w:before="240" w:after="100"/>
         <w:keepNext/>
       </w:pPr>
-      <w:bookmarkStart w:id="55" w:name="_Toc00000054"/>
+      <w:bookmarkStart w:id="56" w:name="_Toc00000055"/>
       <w:r>
         <w:rPr>
           <w:sz w:val="26"/>
@@ -8486,7 +8547,7 @@
         </w:rPr>
         <w:t xml:space="preserve">Drošība</w:t>
       </w:r>
-      <w:bookmarkEnd w:id="55"/>
+      <w:bookmarkEnd w:id="56"/>
     </w:p>
     <w:p>
       <w:pPr>
@@ -8529,7 +8590,7 @@
         <w:keepNext/>
         <w:pageBreakBefore/>
       </w:pPr>
-      <w:bookmarkStart w:id="56" w:name="_Toc00000055"/>
+      <w:bookmarkStart w:id="57" w:name="_Toc00000056"/>
       <w:r>
         <w:rPr>
           <w:sz w:val="36"/>
@@ -8552,7 +8613,7 @@
         </w:rPr>
         <w:t xml:space="preserve">Cilne Brand</w:t>
       </w:r>
-      <w:bookmarkEnd w:id="56"/>
+      <w:bookmarkEnd w:id="57"/>
     </w:p>
     <w:p>
       <w:pPr>
@@ -8561,7 +8622,7 @@
         <w:spacing w:before="240" w:after="100"/>
         <w:keepNext/>
       </w:pPr>
-      <w:bookmarkStart w:id="57" w:name="_Toc00000056"/>
+      <w:bookmarkStart w:id="58" w:name="_Toc00000057"/>
       <w:r>
         <w:rPr>
           <w:sz w:val="26"/>
@@ -8573,7 +8634,7 @@
         </w:rPr>
         <w:t xml:space="preserve">Palete</w:t>
       </w:r>
-      <w:bookmarkEnd w:id="57"/>
+      <w:bookmarkEnd w:id="58"/>
     </w:p>
     <w:p>
       <w:pPr>
@@ -9043,7 +9104,7 @@
         <w:spacing w:before="240" w:after="100"/>
         <w:keepNext/>
       </w:pPr>
-      <w:bookmarkStart w:id="58" w:name="_Toc00000057"/>
+      <w:bookmarkStart w:id="59" w:name="_Toc00000058"/>
       <w:r>
         <w:rPr>
           <w:sz w:val="26"/>
@@ -9055,7 +9116,7 @@
         </w:rPr>
         <w:t xml:space="preserve">Krāsas no logotipa</w:t>
       </w:r>
-      <w:bookmarkEnd w:id="58"/>
+      <w:bookmarkEnd w:id="59"/>
     </w:p>
     <w:p>
       <w:pPr>
@@ -9079,7 +9140,7 @@
         <w:spacing w:before="240" w:after="100"/>
         <w:keepNext/>
       </w:pPr>
-      <w:bookmarkStart w:id="59" w:name="_Toc00000058"/>
+      <w:bookmarkStart w:id="60" w:name="_Toc00000059"/>
       <w:r>
         <w:rPr>
           <w:sz w:val="26"/>
@@ -9091,7 +9152,7 @@
         </w:rPr>
         <w:t xml:space="preserve">Fonts, valoda un skaitļu stils</w:t>
       </w:r>
-      <w:bookmarkEnd w:id="59"/>
+      <w:bookmarkEnd w:id="60"/>
     </w:p>
     <w:p>
       <w:pPr>
@@ -9522,7 +9583,7 @@
         <w:spacing w:before="240" w:after="100"/>
         <w:keepNext/>
       </w:pPr>
-      <w:bookmarkStart w:id="60" w:name="_Toc00000059"/>
+      <w:bookmarkStart w:id="61" w:name="_Toc00000060"/>
       <w:r>
         <w:rPr>
           <w:sz w:val="26"/>
@@ -9534,7 +9595,7 @@
         </w:rPr>
         <w:t xml:space="preserve">Valūta</w:t>
       </w:r>
-      <w:bookmarkEnd w:id="60"/>
+      <w:bookmarkEnd w:id="61"/>
     </w:p>
     <w:p>
       <w:pPr>
@@ -9558,7 +9619,7 @@
         <w:spacing w:before="240" w:after="100"/>
         <w:keepNext/>
       </w:pPr>
-      <w:bookmarkStart w:id="61" w:name="_Toc00000060"/>
+      <w:bookmarkStart w:id="62" w:name="_Toc00000061"/>
       <w:r>
         <w:rPr>
           <w:sz w:val="26"/>
@@ -9570,7 +9631,7 @@
         </w:rPr>
         <w:t xml:space="preserve">Autocolor on edit</w:t>
       </w:r>
-      <w:bookmarkEnd w:id="61"/>
+      <w:bookmarkEnd w:id="62"/>
     </w:p>
     <w:p>
       <w:pPr>
@@ -9594,7 +9655,7 @@
         <w:spacing w:before="240" w:after="100"/>
         <w:keepNext/>
       </w:pPr>
-      <w:bookmarkStart w:id="62" w:name="_Toc00000061"/>
+      <w:bookmarkStart w:id="63" w:name="_Toc00000062"/>
       <w:r>
         <w:rPr>
           <w:sz w:val="26"/>
@@ -9606,7 +9667,7 @@
         </w:rPr>
         <w:t xml:space="preserve">Iestatījumu pārnešana un atiestatīšana</w:t>
       </w:r>
-      <w:bookmarkEnd w:id="62"/>
+      <w:bookmarkEnd w:id="63"/>
     </w:p>
     <w:p>
       <w:pPr>
@@ -9664,7 +9725,7 @@
         <w:keepNext/>
         <w:pageBreakBefore/>
       </w:pPr>
-      <w:bookmarkStart w:id="63" w:name="_Toc00000062"/>
+      <w:bookmarkStart w:id="64" w:name="_Toc00000063"/>
       <w:r>
         <w:rPr>
           <w:sz w:val="36"/>
@@ -9687,7 +9748,7 @@
         </w:rPr>
         <w:t xml:space="preserve">Īsinājumtaustiņi</w:t>
       </w:r>
-      <w:bookmarkEnd w:id="63"/>
+      <w:bookmarkEnd w:id="64"/>
     </w:p>
     <w:p>
       <w:pPr>
@@ -9696,7 +9757,7 @@
         <w:spacing w:before="240" w:after="100"/>
         <w:keepNext/>
       </w:pPr>
-      <w:bookmarkStart w:id="64" w:name="_Toc00000063"/>
+      <w:bookmarkStart w:id="65" w:name="_Toc00000064"/>
       <w:r>
         <w:rPr>
           <w:sz w:val="26"/>
@@ -9708,7 +9769,7 @@
         </w:rPr>
         <w:t xml:space="preserve">Visas kombinācijas</w:t>
       </w:r>
-      <w:bookmarkEnd w:id="64"/>
+      <w:bookmarkEnd w:id="65"/>
     </w:p>
     <w:p>
       <w:pPr>
@@ -12373,7 +12434,7 @@
         <w:keepNext/>
         <w:pageBreakBefore/>
       </w:pPr>
-      <w:bookmarkStart w:id="65" w:name="_Toc00000064"/>
+      <w:bookmarkStart w:id="66" w:name="_Toc00000065"/>
       <w:r>
         <w:rPr>
           <w:sz w:val="36"/>
@@ -12396,7 +12457,7 @@
         </w:rPr>
         <w:t xml:space="preserve">Biežākās problēmas</w:t>
       </w:r>
-      <w:bookmarkEnd w:id="65"/>
+      <w:bookmarkEnd w:id="66"/>
     </w:p>
     <w:p>
       <w:pPr>
@@ -12405,7 +12466,7 @@
         <w:spacing w:before="240" w:after="100"/>
         <w:keepNext/>
       </w:pPr>
-      <w:bookmarkStart w:id="66" w:name="_Toc00000065"/>
+      <w:bookmarkStart w:id="67" w:name="_Toc00000066"/>
       <w:r>
         <w:rPr>
           <w:sz w:val="26"/>
@@ -12417,7 +12478,7 @@
         </w:rPr>
         <w:t xml:space="preserve">Ziņojumi un to iemesli</w:t>
       </w:r>
-      <w:bookmarkEnd w:id="66"/>
+      <w:bookmarkEnd w:id="67"/>
     </w:p>
     <w:tbl>
       <w:tblPr>
@@ -13128,7 +13189,7 @@
         <w:spacing w:before="240" w:after="100"/>
         <w:keepNext/>
       </w:pPr>
-      <w:bookmarkStart w:id="67" w:name="_Toc00000066"/>
+      <w:bookmarkStart w:id="68" w:name="_Toc00000067"/>
       <w:r>
         <w:rPr>
           <w:sz w:val="26"/>
@@ -13140,7 +13201,7 @@
         </w:rPr>
         <w:t xml:space="preserve">Ierobežojumi</w:t>
       </w:r>
-      <w:bookmarkEnd w:id="67"/>
+      <w:bookmarkEnd w:id="68"/>
     </w:p>
     <w:p>
       <w:pPr>
@@ -13324,7 +13385,7 @@
         <w:keepNext/>
         <w:pageBreakBefore/>
       </w:pPr>
-      <w:bookmarkStart w:id="68" w:name="_Toc00000067"/>
+      <w:bookmarkStart w:id="69" w:name="_Toc00000068"/>
       <w:r>
         <w:rPr>
           <w:sz w:val="36"/>
@@ -13347,7 +13408,7 @@
         </w:rPr>
         <w:t xml:space="preserve">Versija</w:t>
       </w:r>
-      <w:bookmarkEnd w:id="68"/>
+      <w:bookmarkEnd w:id="69"/>
     </w:p>
     <w:p>
       <w:pPr>
@@ -13356,7 +13417,7 @@
         <w:spacing w:before="240" w:after="100"/>
         <w:keepNext/>
       </w:pPr>
-      <w:bookmarkStart w:id="69" w:name="_Toc00000068"/>
+      <w:bookmarkStart w:id="70" w:name="_Toc00000069"/>
       <w:r>
         <w:rPr>
           <w:sz w:val="26"/>
@@ -13368,7 +13429,7 @@
         </w:rPr>
         <w:t xml:space="preserve">Kura versija ir aprakstīta</w:t>
       </w:r>
-      <w:bookmarkEnd w:id="69"/>
+      <w:bookmarkEnd w:id="70"/>
     </w:p>
     <w:p>
       <w:pPr>
@@ -13382,7 +13443,7 @@
           <w:color w:val="1A1A1A"/>
           <w:rFonts w:ascii="Aptos" w:hAnsi="Aptos" w:cs="Aptos" w:eastAsia="Aptos"/>
         </w:rPr>
-        <w:t xml:space="preserve">Šī rokasgrāmata apraksta pls,fix versiju v2.4.003. Tā pati versija ir uzrakstīta uz vāka un katras lapas apakšā.</w:t>
+        <w:t xml:space="preserve">Šī rokasgrāmata apraksta pls,fix versiju v2.4.004. Tā pati versija ir uzrakstīta uz vāka un katras lapas apakšā.</w:t>
       </w:r>
     </w:p>
     <w:p>
@@ -13447,7 +13508,7 @@
         <w:color w:val="5B6472"/>
         <w:rFonts w:ascii="Aptos" w:hAnsi="Aptos" w:cs="Aptos" w:eastAsia="Aptos"/>
       </w:rPr>
-      <w:t xml:space="preserve">pls,fix rokasgrāmata v2.4.003   |   </w:t>
+      <w:t xml:space="preserve">pls,fix rokasgrāmata v2.4.004   |   </w:t>
     </w:r>
     <w:r>
       <w:rPr>

</xml_diff>

<commit_message>
Manual: document the v2.5-v2.6 feature slice
Adds Atrast kombināciju (Find a combination) to the Tools chapter,
updates the paint slot wording for Save/Use and workbook-saved slots,
and covers PowerPoint's Links search and filters, Paste latest linked,
the Tools tab's Object tools and Smart Painter, native line charts and
per-command ribbon icons. Regenerated the docx.

Co-Authored-By: Claude Fable 5.1 <noreply@anthropic.com>
Claude-Session: https://claude.ai/code/session_01XZyLnHgn7KBMTuqrVTXN5p
</commit_message>
<xml_diff>
--- a/manual/out/pls,fix rokasgrāmata.docx
+++ b/manual/out/pls,fix rokasgrāmata.docx
@@ -123,7 +123,7 @@
           <w:bCs/>
           <w:rFonts w:ascii="Aptos" w:hAnsi="Aptos" w:cs="Aptos" w:eastAsia="Aptos"/>
         </w:rPr>
-        <w:t xml:space="preserve">v2.4.004</w:t>
+        <w:t xml:space="preserve">v2.5.004</w:t>
       </w:r>
     </w:p>
     <w:p>
@@ -545,7 +545,7 @@
               </w:pPr>
               <w:r>
                 <w:rPr/>
-                <w:t xml:space="preserve">Noformējuma stili un skaitļu formāti</w:t>
+                <w:t xml:space="preserve">Atrast kombināciju</w:t>
               </w:r>
               <w:r>
                 <w:rPr/>
@@ -570,7 +570,7 @@
               </w:pPr>
               <w:r>
                 <w:rPr/>
-                <w:t xml:space="preserve">Otas sloti</w:t>
+                <w:t xml:space="preserve">Noformējuma stili un skaitļu formāti</w:t>
               </w:r>
               <w:r>
                 <w:rPr/>
@@ -595,7 +595,7 @@
               </w:pPr>
               <w:r>
                 <w:rPr/>
-                <w:t xml:space="preserve">Formātu cikli</w:t>
+                <w:t xml:space="preserve">Otas sloti</w:t>
               </w:r>
               <w:r>
                 <w:rPr/>
@@ -620,7 +620,7 @@
               </w:pPr>
               <w:r>
                 <w:rPr/>
-                <w:t xml:space="preserve">Aizpildīšana un ielīmēšana</w:t>
+                <w:t xml:space="preserve">Formātu cikli</w:t>
               </w:r>
               <w:r>
                 <w:rPr/>
@@ -645,7 +645,7 @@
               </w:pPr>
               <w:r>
                 <w:rPr/>
-                <w:t xml:space="preserve">IFERROR aizsargs</w:t>
+                <w:t xml:space="preserve">Aizpildīšana un ielīmēšana</w:t>
               </w:r>
               <w:r>
                 <w:rPr/>
@@ -670,7 +670,7 @@
               </w:pPr>
               <w:r>
                 <w:rPr/>
-                <w:t xml:space="preserve">Autocolor</w:t>
+                <w:t xml:space="preserve">IFERROR aizsargs</w:t>
               </w:r>
               <w:r>
                 <w:rPr/>
@@ -695,7 +695,7 @@
               </w:pPr>
               <w:r>
                 <w:rPr/>
-                <w:t xml:space="preserve">Formulu pārbaude</w:t>
+                <w:t xml:space="preserve">Autocolor</w:t>
               </w:r>
               <w:r>
                 <w:rPr/>
@@ -720,7 +720,7 @@
               </w:pPr>
               <w:r>
                 <w:rPr/>
-                <w:t xml:space="preserve">Precedents un Dependents</w:t>
+                <w:t xml:space="preserve">Formulu pārbaude</w:t>
               </w:r>
               <w:r>
                 <w:rPr/>
@@ -745,7 +745,7 @@
               </w:pPr>
               <w:r>
                 <w:rPr/>
-                <w:t xml:space="preserve">CAGR, zīme, mērogs un zīmes aiz komata</w:t>
+                <w:t xml:space="preserve">Precedents un Dependents</w:t>
               </w:r>
               <w:r>
                 <w:rPr/>
@@ -770,7 +770,7 @@
               </w:pPr>
               <w:r>
                 <w:rPr/>
-                <w:t xml:space="preserve">Waterfall from selection</w:t>
+                <w:t xml:space="preserve">CAGR, zīme, mērogs un zīmes aiz komata</w:t>
               </w:r>
               <w:r>
                 <w:rPr/>
@@ -795,7 +795,7 @@
               </w:pPr>
               <w:r>
                 <w:rPr/>
-                <w:t xml:space="preserve">Tornado from selection</w:t>
+                <w:t xml:space="preserve">Waterfall from selection</w:t>
               </w:r>
               <w:r>
                 <w:rPr/>
@@ -820,7 +820,7 @@
               </w:pPr>
               <w:r>
                 <w:rPr/>
-                <w:t xml:space="preserve">Brand-format chart un CAGR label</w:t>
+                <w:t xml:space="preserve">Tornado from selection</w:t>
               </w:r>
               <w:r>
                 <w:rPr/>
@@ -845,7 +845,7 @@
               </w:pPr>
               <w:r>
                 <w:rPr/>
-                <w:t xml:space="preserve">Consistent rounding un funkcijas PLSFIX</w:t>
+                <w:t xml:space="preserve">Brand-format chart un CAGR label</w:t>
               </w:r>
               <w:r>
                 <w:rPr/>
@@ -870,7 +870,7 @@
               </w:pPr>
               <w:r>
                 <w:rPr/>
-                <w:t xml:space="preserve">Unpivot selection</w:t>
+                <w:t xml:space="preserve">Consistent rounding un funkcijas PLSFIX</w:t>
               </w:r>
               <w:r>
                 <w:rPr/>
@@ -895,7 +895,7 @@
               </w:pPr>
               <w:r>
                 <w:rPr/>
-                <w:t xml:space="preserve">Undo last pls,fix action</w:t>
+                <w:t xml:space="preserve">Unpivot selection</w:t>
               </w:r>
               <w:r>
                 <w:rPr/>
@@ -913,6 +913,31 @@
             <w:p>
               <w:pPr>
                 <w:rPr/>
+                <w:pStyle w:val="ToC2"/>
+                <w:tabs>
+                  <w:tab w:val="right" w:leader="dot" w:pos="80000"/>
+                </w:tabs>
+              </w:pPr>
+              <w:r>
+                <w:rPr/>
+                <w:t xml:space="preserve">Undo last pls,fix action</w:t>
+              </w:r>
+              <w:r>
+                <w:rPr/>
+                <w:tab/>
+              </w:r>
+              <w:r>
+                <w:rPr/>
+                <w:fldChar w:fldCharType="begin" w:dirty="false"/>
+                <w:instrText>PAGEREF _Toc00000030 \h</w:instrText>
+                <w:fldChar w:fldCharType="separate" w:dirty="false"/>
+                <w:t xml:space="preserve">1</w:t>
+                <w:fldChar w:fldCharType="end" w:dirty="false"/>
+              </w:r>
+            </w:p>
+            <w:p>
+              <w:pPr>
+                <w:rPr/>
                 <w:pStyle w:val="ToC1"/>
                 <w:tabs>
                   <w:tab w:val="right" w:leader="dot" w:pos="80000"/>
@@ -929,7 +954,7 @@
               <w:r>
                 <w:rPr/>
                 <w:fldChar w:fldCharType="begin" w:dirty="false"/>
-                <w:instrText>PAGEREF _Toc00000030 \h</w:instrText>
+                <w:instrText>PAGEREF _Toc00000031 \h</w:instrText>
                 <w:fldChar w:fldCharType="separate" w:dirty="false"/>
                 <w:t xml:space="preserve">1</w:t>
                 <w:fldChar w:fldCharType="end" w:dirty="false"/>
@@ -954,7 +979,7 @@
               <w:r>
                 <w:rPr/>
                 <w:fldChar w:fldCharType="begin" w:dirty="false"/>
-                <w:instrText>PAGEREF _Toc00000031 \h</w:instrText>
+                <w:instrText>PAGEREF _Toc00000032 \h</w:instrText>
                 <w:fldChar w:fldCharType="separate" w:dirty="false"/>
                 <w:t xml:space="preserve">1</w:t>
                 <w:fldChar w:fldCharType="end" w:dirty="false"/>
@@ -979,7 +1004,7 @@
               <w:r>
                 <w:rPr/>
                 <w:fldChar w:fldCharType="begin" w:dirty="false"/>
-                <w:instrText>PAGEREF _Toc00000032 \h</w:instrText>
+                <w:instrText>PAGEREF _Toc00000033 \h</w:instrText>
                 <w:fldChar w:fldCharType="separate" w:dirty="false"/>
                 <w:t xml:space="preserve">1</w:t>
                 <w:fldChar w:fldCharType="end" w:dirty="false"/>
@@ -1004,7 +1029,7 @@
               <w:r>
                 <w:rPr/>
                 <w:fldChar w:fldCharType="begin" w:dirty="false"/>
-                <w:instrText>PAGEREF _Toc00000033 \h</w:instrText>
+                <w:instrText>PAGEREF _Toc00000034 \h</w:instrText>
                 <w:fldChar w:fldCharType="separate" w:dirty="false"/>
                 <w:t xml:space="preserve">1</w:t>
                 <w:fldChar w:fldCharType="end" w:dirty="false"/>
@@ -1029,7 +1054,7 @@
               <w:r>
                 <w:rPr/>
                 <w:fldChar w:fldCharType="begin" w:dirty="false"/>
-                <w:instrText>PAGEREF _Toc00000034 \h</w:instrText>
+                <w:instrText>PAGEREF _Toc00000035 \h</w:instrText>
                 <w:fldChar w:fldCharType="separate" w:dirty="false"/>
                 <w:t xml:space="preserve">1</w:t>
                 <w:fldChar w:fldCharType="end" w:dirty="false"/>
@@ -1054,7 +1079,7 @@
               <w:r>
                 <w:rPr/>
                 <w:fldChar w:fldCharType="begin" w:dirty="false"/>
-                <w:instrText>PAGEREF _Toc00000035 \h</w:instrText>
+                <w:instrText>PAGEREF _Toc00000036 \h</w:instrText>
                 <w:fldChar w:fldCharType="separate" w:dirty="false"/>
                 <w:t xml:space="preserve">1</w:t>
                 <w:fldChar w:fldCharType="end" w:dirty="false"/>
@@ -1079,7 +1104,7 @@
               <w:r>
                 <w:rPr/>
                 <w:fldChar w:fldCharType="begin" w:dirty="false"/>
-                <w:instrText>PAGEREF _Toc00000036 \h</w:instrText>
+                <w:instrText>PAGEREF _Toc00000037 \h</w:instrText>
                 <w:fldChar w:fldCharType="separate" w:dirty="false"/>
                 <w:t xml:space="preserve">1</w:t>
                 <w:fldChar w:fldCharType="end" w:dirty="false"/>
@@ -1104,7 +1129,7 @@
               <w:r>
                 <w:rPr/>
                 <w:fldChar w:fldCharType="begin" w:dirty="false"/>
-                <w:instrText>PAGEREF _Toc00000037 \h</w:instrText>
+                <w:instrText>PAGEREF _Toc00000038 \h</w:instrText>
                 <w:fldChar w:fldCharType="separate" w:dirty="false"/>
                 <w:t xml:space="preserve">1</w:t>
                 <w:fldChar w:fldCharType="end" w:dirty="false"/>
@@ -1129,7 +1154,7 @@
               <w:r>
                 <w:rPr/>
                 <w:fldChar w:fldCharType="begin" w:dirty="false"/>
-                <w:instrText>PAGEREF _Toc00000038 \h</w:instrText>
+                <w:instrText>PAGEREF _Toc00000039 \h</w:instrText>
                 <w:fldChar w:fldCharType="separate" w:dirty="false"/>
                 <w:t xml:space="preserve">1</w:t>
                 <w:fldChar w:fldCharType="end" w:dirty="false"/>
@@ -1154,7 +1179,7 @@
               <w:r>
                 <w:rPr/>
                 <w:fldChar w:fldCharType="begin" w:dirty="false"/>
-                <w:instrText>PAGEREF _Toc00000039 \h</w:instrText>
+                <w:instrText>PAGEREF _Toc00000040 \h</w:instrText>
                 <w:fldChar w:fldCharType="separate" w:dirty="false"/>
                 <w:t xml:space="preserve">1</w:t>
                 <w:fldChar w:fldCharType="end" w:dirty="false"/>
@@ -1179,7 +1204,7 @@
               <w:r>
                 <w:rPr/>
                 <w:fldChar w:fldCharType="begin" w:dirty="false"/>
-                <w:instrText>PAGEREF _Toc00000040 \h</w:instrText>
+                <w:instrText>PAGEREF _Toc00000041 \h</w:instrText>
                 <w:fldChar w:fldCharType="separate" w:dirty="false"/>
                 <w:t xml:space="preserve">1</w:t>
                 <w:fldChar w:fldCharType="end" w:dirty="false"/>
@@ -1204,7 +1229,7 @@
               <w:r>
                 <w:rPr/>
                 <w:fldChar w:fldCharType="begin" w:dirty="false"/>
-                <w:instrText>PAGEREF _Toc00000041 \h</w:instrText>
+                <w:instrText>PAGEREF _Toc00000042 \h</w:instrText>
                 <w:fldChar w:fldCharType="separate" w:dirty="false"/>
                 <w:t xml:space="preserve">1</w:t>
                 <w:fldChar w:fldCharType="end" w:dirty="false"/>
@@ -1229,7 +1254,7 @@
               <w:r>
                 <w:rPr/>
                 <w:fldChar w:fldCharType="begin" w:dirty="false"/>
-                <w:instrText>PAGEREF _Toc00000042 \h</w:instrText>
+                <w:instrText>PAGEREF _Toc00000043 \h</w:instrText>
                 <w:fldChar w:fldCharType="separate" w:dirty="false"/>
                 <w:t xml:space="preserve">1</w:t>
                 <w:fldChar w:fldCharType="end" w:dirty="false"/>
@@ -1254,7 +1279,7 @@
               <w:r>
                 <w:rPr/>
                 <w:fldChar w:fldCharType="begin" w:dirty="false"/>
-                <w:instrText>PAGEREF _Toc00000043 \h</w:instrText>
+                <w:instrText>PAGEREF _Toc00000044 \h</w:instrText>
                 <w:fldChar w:fldCharType="separate" w:dirty="false"/>
                 <w:t xml:space="preserve">1</w:t>
                 <w:fldChar w:fldCharType="end" w:dirty="false"/>
@@ -1279,7 +1304,7 @@
               <w:r>
                 <w:rPr/>
                 <w:fldChar w:fldCharType="begin" w:dirty="false"/>
-                <w:instrText>PAGEREF _Toc00000044 \h</w:instrText>
+                <w:instrText>PAGEREF _Toc00000045 \h</w:instrText>
                 <w:fldChar w:fldCharType="separate" w:dirty="false"/>
                 <w:t xml:space="preserve">1</w:t>
                 <w:fldChar w:fldCharType="end" w:dirty="false"/>
@@ -1304,7 +1329,7 @@
               <w:r>
                 <w:rPr/>
                 <w:fldChar w:fldCharType="begin" w:dirty="false"/>
-                <w:instrText>PAGEREF _Toc00000045 \h</w:instrText>
+                <w:instrText>PAGEREF _Toc00000046 \h</w:instrText>
                 <w:fldChar w:fldCharType="separate" w:dirty="false"/>
                 <w:t xml:space="preserve">1</w:t>
                 <w:fldChar w:fldCharType="end" w:dirty="false"/>
@@ -1329,7 +1354,7 @@
               <w:r>
                 <w:rPr/>
                 <w:fldChar w:fldCharType="begin" w:dirty="false"/>
-                <w:instrText>PAGEREF _Toc00000046 \h</w:instrText>
+                <w:instrText>PAGEREF _Toc00000047 \h</w:instrText>
                 <w:fldChar w:fldCharType="separate" w:dirty="false"/>
                 <w:t xml:space="preserve">1</w:t>
                 <w:fldChar w:fldCharType="end" w:dirty="false"/>
@@ -1354,7 +1379,7 @@
               <w:r>
                 <w:rPr/>
                 <w:fldChar w:fldCharType="begin" w:dirty="false"/>
-                <w:instrText>PAGEREF _Toc00000047 \h</w:instrText>
+                <w:instrText>PAGEREF _Toc00000048 \h</w:instrText>
                 <w:fldChar w:fldCharType="separate" w:dirty="false"/>
                 <w:t xml:space="preserve">1</w:t>
                 <w:fldChar w:fldCharType="end" w:dirty="false"/>
@@ -1379,7 +1404,7 @@
               <w:r>
                 <w:rPr/>
                 <w:fldChar w:fldCharType="begin" w:dirty="false"/>
-                <w:instrText>PAGEREF _Toc00000048 \h</w:instrText>
+                <w:instrText>PAGEREF _Toc00000049 \h</w:instrText>
                 <w:fldChar w:fldCharType="separate" w:dirty="false"/>
                 <w:t xml:space="preserve">1</w:t>
                 <w:fldChar w:fldCharType="end" w:dirty="false"/>
@@ -1404,7 +1429,7 @@
               <w:r>
                 <w:rPr/>
                 <w:fldChar w:fldCharType="begin" w:dirty="false"/>
-                <w:instrText>PAGEREF _Toc00000049 \h</w:instrText>
+                <w:instrText>PAGEREF _Toc00000050 \h</w:instrText>
                 <w:fldChar w:fldCharType="separate" w:dirty="false"/>
                 <w:t xml:space="preserve">1</w:t>
                 <w:fldChar w:fldCharType="end" w:dirty="false"/>
@@ -1429,7 +1454,7 @@
               <w:r>
                 <w:rPr/>
                 <w:fldChar w:fldCharType="begin" w:dirty="false"/>
-                <w:instrText>PAGEREF _Toc00000050 \h</w:instrText>
+                <w:instrText>PAGEREF _Toc00000051 \h</w:instrText>
                 <w:fldChar w:fldCharType="separate" w:dirty="false"/>
                 <w:t xml:space="preserve">1</w:t>
                 <w:fldChar w:fldCharType="end" w:dirty="false"/>
@@ -1454,7 +1479,7 @@
               <w:r>
                 <w:rPr/>
                 <w:fldChar w:fldCharType="begin" w:dirty="false"/>
-                <w:instrText>PAGEREF _Toc00000051 \h</w:instrText>
+                <w:instrText>PAGEREF _Toc00000052 \h</w:instrText>
                 <w:fldChar w:fldCharType="separate" w:dirty="false"/>
                 <w:t xml:space="preserve">1</w:t>
                 <w:fldChar w:fldCharType="end" w:dirty="false"/>
@@ -1479,7 +1504,7 @@
               <w:r>
                 <w:rPr/>
                 <w:fldChar w:fldCharType="begin" w:dirty="false"/>
-                <w:instrText>PAGEREF _Toc00000052 \h</w:instrText>
+                <w:instrText>PAGEREF _Toc00000053 \h</w:instrText>
                 <w:fldChar w:fldCharType="separate" w:dirty="false"/>
                 <w:t xml:space="preserve">1</w:t>
                 <w:fldChar w:fldCharType="end" w:dirty="false"/>
@@ -1504,7 +1529,7 @@
               <w:r>
                 <w:rPr/>
                 <w:fldChar w:fldCharType="begin" w:dirty="false"/>
-                <w:instrText>PAGEREF _Toc00000053 \h</w:instrText>
+                <w:instrText>PAGEREF _Toc00000054 \h</w:instrText>
                 <w:fldChar w:fldCharType="separate" w:dirty="false"/>
                 <w:t xml:space="preserve">1</w:t>
                 <w:fldChar w:fldCharType="end" w:dirty="false"/>
@@ -1520,7 +1545,7 @@
               </w:pPr>
               <w:r>
                 <w:rPr/>
-                <w:t xml:space="preserve">Go to slide, Change source un Break link</w:t>
+                <w:t xml:space="preserve">Meklēšana un filtrēšana</w:t>
               </w:r>
               <w:r>
                 <w:rPr/>
@@ -1529,7 +1554,7 @@
               <w:r>
                 <w:rPr/>
                 <w:fldChar w:fldCharType="begin" w:dirty="false"/>
-                <w:instrText>PAGEREF _Toc00000054 \h</w:instrText>
+                <w:instrText>PAGEREF _Toc00000055 \h</w:instrText>
                 <w:fldChar w:fldCharType="separate" w:dirty="false"/>
                 <w:t xml:space="preserve">1</w:t>
                 <w:fldChar w:fldCharType="end" w:dirty="false"/>
@@ -1545,6 +1570,81 @@
               </w:pPr>
               <w:r>
                 <w:rPr/>
+                <w:t xml:space="preserve">Go to slide, Change source un Break link</w:t>
+              </w:r>
+              <w:r>
+                <w:rPr/>
+                <w:tab/>
+              </w:r>
+              <w:r>
+                <w:rPr/>
+                <w:fldChar w:fldCharType="begin" w:dirty="false"/>
+                <w:instrText>PAGEREF _Toc00000056 \h</w:instrText>
+                <w:fldChar w:fldCharType="separate" w:dirty="false"/>
+                <w:t xml:space="preserve">1</w:t>
+                <w:fldChar w:fldCharType="end" w:dirty="false"/>
+              </w:r>
+            </w:p>
+            <w:p>
+              <w:pPr>
+                <w:rPr/>
+                <w:pStyle w:val="ToC2"/>
+                <w:tabs>
+                  <w:tab w:val="right" w:leader="dot" w:pos="80000"/>
+                </w:tabs>
+              </w:pPr>
+              <w:r>
+                <w:rPr/>
+                <w:t xml:space="preserve">Object tools</w:t>
+              </w:r>
+              <w:r>
+                <w:rPr/>
+                <w:tab/>
+              </w:r>
+              <w:r>
+                <w:rPr/>
+                <w:fldChar w:fldCharType="begin" w:dirty="false"/>
+                <w:instrText>PAGEREF _Toc00000057 \h</w:instrText>
+                <w:fldChar w:fldCharType="separate" w:dirty="false"/>
+                <w:t xml:space="preserve">1</w:t>
+                <w:fldChar w:fldCharType="end" w:dirty="false"/>
+              </w:r>
+            </w:p>
+            <w:p>
+              <w:pPr>
+                <w:rPr/>
+                <w:pStyle w:val="ToC2"/>
+                <w:tabs>
+                  <w:tab w:val="right" w:leader="dot" w:pos="80000"/>
+                </w:tabs>
+              </w:pPr>
+              <w:r>
+                <w:rPr/>
+                <w:t xml:space="preserve">Smart Painter</w:t>
+              </w:r>
+              <w:r>
+                <w:rPr/>
+                <w:tab/>
+              </w:r>
+              <w:r>
+                <w:rPr/>
+                <w:fldChar w:fldCharType="begin" w:dirty="false"/>
+                <w:instrText>PAGEREF _Toc00000058 \h</w:instrText>
+                <w:fldChar w:fldCharType="separate" w:dirty="false"/>
+                <w:t xml:space="preserve">1</w:t>
+                <w:fldChar w:fldCharType="end" w:dirty="false"/>
+              </w:r>
+            </w:p>
+            <w:p>
+              <w:pPr>
+                <w:rPr/>
+                <w:pStyle w:val="ToC2"/>
+                <w:tabs>
+                  <w:tab w:val="right" w:leader="dot" w:pos="80000"/>
+                </w:tabs>
+              </w:pPr>
+              <w:r>
+                <w:rPr/>
                 <w:t xml:space="preserve">Drošība</w:t>
               </w:r>
               <w:r>
@@ -1554,7 +1654,7 @@
               <w:r>
                 <w:rPr/>
                 <w:fldChar w:fldCharType="begin" w:dirty="false"/>
-                <w:instrText>PAGEREF _Toc00000055 \h</w:instrText>
+                <w:instrText>PAGEREF _Toc00000059 \h</w:instrText>
                 <w:fldChar w:fldCharType="separate" w:dirty="false"/>
                 <w:t xml:space="preserve">1</w:t>
                 <w:fldChar w:fldCharType="end" w:dirty="false"/>
@@ -1579,7 +1679,7 @@
               <w:r>
                 <w:rPr/>
                 <w:fldChar w:fldCharType="begin" w:dirty="false"/>
-                <w:instrText>PAGEREF _Toc00000056 \h</w:instrText>
+                <w:instrText>PAGEREF _Toc00000060 \h</w:instrText>
                 <w:fldChar w:fldCharType="separate" w:dirty="false"/>
                 <w:t xml:space="preserve">1</w:t>
                 <w:fldChar w:fldCharType="end" w:dirty="false"/>
@@ -1604,7 +1704,7 @@
               <w:r>
                 <w:rPr/>
                 <w:fldChar w:fldCharType="begin" w:dirty="false"/>
-                <w:instrText>PAGEREF _Toc00000057 \h</w:instrText>
+                <w:instrText>PAGEREF _Toc00000061 \h</w:instrText>
                 <w:fldChar w:fldCharType="separate" w:dirty="false"/>
                 <w:t xml:space="preserve">1</w:t>
                 <w:fldChar w:fldCharType="end" w:dirty="false"/>
@@ -1629,7 +1729,7 @@
               <w:r>
                 <w:rPr/>
                 <w:fldChar w:fldCharType="begin" w:dirty="false"/>
-                <w:instrText>PAGEREF _Toc00000058 \h</w:instrText>
+                <w:instrText>PAGEREF _Toc00000062 \h</w:instrText>
                 <w:fldChar w:fldCharType="separate" w:dirty="false"/>
                 <w:t xml:space="preserve">1</w:t>
                 <w:fldChar w:fldCharType="end" w:dirty="false"/>
@@ -1654,7 +1754,7 @@
               <w:r>
                 <w:rPr/>
                 <w:fldChar w:fldCharType="begin" w:dirty="false"/>
-                <w:instrText>PAGEREF _Toc00000059 \h</w:instrText>
+                <w:instrText>PAGEREF _Toc00000063 \h</w:instrText>
                 <w:fldChar w:fldCharType="separate" w:dirty="false"/>
                 <w:t xml:space="preserve">1</w:t>
                 <w:fldChar w:fldCharType="end" w:dirty="false"/>
@@ -1679,7 +1779,7 @@
               <w:r>
                 <w:rPr/>
                 <w:fldChar w:fldCharType="begin" w:dirty="false"/>
-                <w:instrText>PAGEREF _Toc00000060 \h</w:instrText>
+                <w:instrText>PAGEREF _Toc00000064 \h</w:instrText>
                 <w:fldChar w:fldCharType="separate" w:dirty="false"/>
                 <w:t xml:space="preserve">1</w:t>
                 <w:fldChar w:fldCharType="end" w:dirty="false"/>
@@ -1704,7 +1804,7 @@
               <w:r>
                 <w:rPr/>
                 <w:fldChar w:fldCharType="begin" w:dirty="false"/>
-                <w:instrText>PAGEREF _Toc00000061 \h</w:instrText>
+                <w:instrText>PAGEREF _Toc00000065 \h</w:instrText>
                 <w:fldChar w:fldCharType="separate" w:dirty="false"/>
                 <w:t xml:space="preserve">1</w:t>
                 <w:fldChar w:fldCharType="end" w:dirty="false"/>
@@ -1729,7 +1829,7 @@
               <w:r>
                 <w:rPr/>
                 <w:fldChar w:fldCharType="begin" w:dirty="false"/>
-                <w:instrText>PAGEREF _Toc00000062 \h</w:instrText>
+                <w:instrText>PAGEREF _Toc00000066 \h</w:instrText>
                 <w:fldChar w:fldCharType="separate" w:dirty="false"/>
                 <w:t xml:space="preserve">1</w:t>
                 <w:fldChar w:fldCharType="end" w:dirty="false"/>
@@ -1754,7 +1854,7 @@
               <w:r>
                 <w:rPr/>
                 <w:fldChar w:fldCharType="begin" w:dirty="false"/>
-                <w:instrText>PAGEREF _Toc00000063 \h</w:instrText>
+                <w:instrText>PAGEREF _Toc00000067 \h</w:instrText>
                 <w:fldChar w:fldCharType="separate" w:dirty="false"/>
                 <w:t xml:space="preserve">1</w:t>
                 <w:fldChar w:fldCharType="end" w:dirty="false"/>
@@ -1779,7 +1879,7 @@
               <w:r>
                 <w:rPr/>
                 <w:fldChar w:fldCharType="begin" w:dirty="false"/>
-                <w:instrText>PAGEREF _Toc00000064 \h</w:instrText>
+                <w:instrText>PAGEREF _Toc00000068 \h</w:instrText>
                 <w:fldChar w:fldCharType="separate" w:dirty="false"/>
                 <w:t xml:space="preserve">1</w:t>
                 <w:fldChar w:fldCharType="end" w:dirty="false"/>
@@ -1804,7 +1904,7 @@
               <w:r>
                 <w:rPr/>
                 <w:fldChar w:fldCharType="begin" w:dirty="false"/>
-                <w:instrText>PAGEREF _Toc00000065 \h</w:instrText>
+                <w:instrText>PAGEREF _Toc00000069 \h</w:instrText>
                 <w:fldChar w:fldCharType="separate" w:dirty="false"/>
                 <w:t xml:space="preserve">1</w:t>
                 <w:fldChar w:fldCharType="end" w:dirty="false"/>
@@ -1829,7 +1929,7 @@
               <w:r>
                 <w:rPr/>
                 <w:fldChar w:fldCharType="begin" w:dirty="false"/>
-                <w:instrText>PAGEREF _Toc00000066 \h</w:instrText>
+                <w:instrText>PAGEREF _Toc00000070 \h</w:instrText>
                 <w:fldChar w:fldCharType="separate" w:dirty="false"/>
                 <w:t xml:space="preserve">1</w:t>
                 <w:fldChar w:fldCharType="end" w:dirty="false"/>
@@ -1854,7 +1954,7 @@
               <w:r>
                 <w:rPr/>
                 <w:fldChar w:fldCharType="begin" w:dirty="false"/>
-                <w:instrText>PAGEREF _Toc00000067 \h</w:instrText>
+                <w:instrText>PAGEREF _Toc00000071 \h</w:instrText>
                 <w:fldChar w:fldCharType="separate" w:dirty="false"/>
                 <w:t xml:space="preserve">1</w:t>
                 <w:fldChar w:fldCharType="end" w:dirty="false"/>
@@ -1879,7 +1979,7 @@
               <w:r>
                 <w:rPr/>
                 <w:fldChar w:fldCharType="begin" w:dirty="false"/>
-                <w:instrText>PAGEREF _Toc00000068 \h</w:instrText>
+                <w:instrText>PAGEREF _Toc00000072 \h</w:instrText>
                 <w:fldChar w:fldCharType="separate" w:dirty="false"/>
                 <w:t xml:space="preserve">1</w:t>
                 <w:fldChar w:fldCharType="end" w:dirty="false"/>
@@ -1904,7 +2004,7 @@
               <w:r>
                 <w:rPr/>
                 <w:fldChar w:fldCharType="begin" w:dirty="false"/>
-                <w:instrText>PAGEREF _Toc00000069 \h</w:instrText>
+                <w:instrText>PAGEREF _Toc00000073 \h</w:instrText>
                 <w:fldChar w:fldCharType="separate" w:dirty="false"/>
                 <w:t xml:space="preserve">1</w:t>
                 <w:fldChar w:fldCharType="end" w:dirty="false"/>
@@ -3006,6 +3106,21 @@
       <w:pPr>
         <w:rPr/>
       </w:pPr>
+    </w:p>
+    <w:p>
+      <w:pPr>
+        <w:rPr/>
+        <w:spacing w:after="120" w:line="276"/>
+      </w:pPr>
+      <w:r>
+        <w:rPr>
+          <w:sz w:val="22"/>
+          <w:szCs w:val="22"/>
+          <w:color w:val="1A1A1A"/>
+          <w:rFonts w:ascii="Aptos" w:hAnsi="Aptos" w:cs="Aptos" w:eastAsia="Aptos"/>
+        </w:rPr>
+        <w:t xml:space="preserve">Katrai lentes pogai ir sava ikona, tāpēc darbības var atpazīt bez uzraksta.</w:t>
+      </w:r>
     </w:p>
     <w:p>
       <w:pPr>
@@ -3510,7 +3625,7 @@
           <w:color w:val="1A1A1A"/>
           <w:rFonts w:ascii="Aptos" w:hAnsi="Aptos" w:cs="Aptos" w:eastAsia="Aptos"/>
         </w:rPr>
-        <w:t xml:space="preserve">PowerPoint panelī ir trīs cilnes: "Links", "Inbox" un "Settings". Tās aprakstītas nodaļā par saitēm.</w:t>
+        <w:t xml:space="preserve">PowerPoint panelī ir četras cilnes: "Links", "Inbox", "Tools" un "Settings". Tās aprakstītas nodaļā par saitēm.</w:t>
       </w:r>
     </w:p>
     <w:p>
@@ -3784,7 +3899,7 @@
           <w:bCs/>
           <w:rFonts w:ascii="Aptos" w:hAnsi="Aptos" w:cs="Aptos" w:eastAsia="Aptos"/>
         </w:rPr>
-        <w:t xml:space="preserve">Noformējuma stili un skaitļu formāti</w:t>
+        <w:t xml:space="preserve">Atrast kombināciju</w:t>
       </w:r>
       <w:bookmarkEnd w:id="16"/>
     </w:p>
@@ -3800,7 +3915,64 @@
           <w:color w:val="1A1A1A"/>
           <w:rFonts w:ascii="Aptos" w:hAnsi="Aptos" w:cs="Aptos" w:eastAsia="Aptos"/>
         </w:rPr>
-        <w:t xml:space="preserve">Bloks "Model formatting" uzliek atlasei vienu no pieciem modeļa stiliem: "Title", "Header", "Input", "Formula" un "Result". Poga "Clear" noņem noformējumu.</w:t>
+        <w:t xml:space="preserve">Sadaļa "Find a combination" atrod, kuras atlasītā apgabala šūnas kopā dod vēlamo summu. Tas noder, piemēram, pārbaudot, kuri posteņi kopā veido starpību starp divām kopsummām.</w:t>
+      </w:r>
+    </w:p>
+    <w:p>
+      <w:pPr>
+        <w:rPr/>
+        <w:numPr>
+          <w:numId w:val="15"/>
+          <w:ilvl w:val="0"/>
+        </w:numPr>
+        <w:spacing w:after="60" w:line="276"/>
+      </w:pPr>
+      <w:r>
+        <w:rPr>
+          <w:sz w:val="22"/>
+          <w:szCs w:val="22"/>
+          <w:color w:val="1A1A1A"/>
+          <w:rFonts w:ascii="Aptos" w:hAnsi="Aptos" w:cs="Aptos" w:eastAsia="Aptos"/>
+        </w:rPr>
+        <w:t xml:space="preserve">Atlasiet vienu nepārtrauktu apgabalu ar skaitļiem.</w:t>
+      </w:r>
+    </w:p>
+    <w:p>
+      <w:pPr>
+        <w:rPr/>
+        <w:numPr>
+          <w:numId w:val="15"/>
+          <w:ilvl w:val="0"/>
+        </w:numPr>
+        <w:spacing w:after="60" w:line="276"/>
+      </w:pPr>
+      <w:r>
+        <w:rPr>
+          <w:sz w:val="22"/>
+          <w:szCs w:val="22"/>
+          <w:color w:val="1A1A1A"/>
+          <w:rFonts w:ascii="Aptos" w:hAnsi="Aptos" w:cs="Aptos" w:eastAsia="Aptos"/>
+        </w:rPr>
+        <w:t xml:space="preserve">Laukā "Target" ierakstiet meklējamo summu, laukā "Tolerance" pieļaujamo novirzi.</w:t>
+      </w:r>
+    </w:p>
+    <w:p>
+      <w:pPr>
+        <w:rPr/>
+        <w:numPr>
+          <w:numId w:val="15"/>
+          <w:ilvl w:val="0"/>
+        </w:numPr>
+        <w:spacing w:after="60" w:line="276"/>
+      </w:pPr>
+      <w:r>
+        <w:rPr>
+          <w:sz w:val="22"/>
+          <w:szCs w:val="22"/>
+          <w:color w:val="1A1A1A"/>
+          <w:rFonts w:ascii="Aptos" w:hAnsi="Aptos" w:cs="Aptos" w:eastAsia="Aptos"/>
+        </w:rPr>
+        <w:t xml:space="preserve">Nospiediet "Find cells".</w:t>
       </w:r>
     </w:p>
     <w:p>
@@ -3815,7 +3987,7 @@
           <w:color w:val="1A1A1A"/>
           <w:rFonts w:ascii="Aptos" w:hAnsi="Aptos" w:cs="Aptos" w:eastAsia="Aptos"/>
         </w:rPr>
-        <w:t xml:space="preserve">Zem stiliem ir četras skaitļu formātu pogas: "1,234" veseliem skaitļiem, "1,234.0" ar vienu zīmi aiz komata, valūtas poga un "12.3%" procentiem. Valūtas pogas uzraksts seko iestatītajai valūtai un valodai cilnē "Brand".</w:t>
+        <w:t xml:space="preserve">Apgabalā drīkst būt līdz 34 skaitliskām šūnām; teksts, tukšas šūnas un formulu kļūdas netiek skaitītas. Ja atlasē ir vairāk, panelis lūdz atlasīt mazāku apgabalu.</w:t>
       </w:r>
     </w:p>
     <w:p>
@@ -3830,7 +4002,7 @@
           <w:color w:val="1A1A1A"/>
           <w:rFonts w:ascii="Aptos" w:hAnsi="Aptos" w:cs="Aptos" w:eastAsia="Aptos"/>
         </w:rPr>
-        <w:t xml:space="preserve">Visi stili ņem krāsas un fontu no cilnes "Brand", tāpēc viena darbgrāmata izskatās vienādi neatkarīgi no tā, kurš to noformē.</w:t>
+        <w:t xml:space="preserve">Kad kombinācija atrasta, tieši tās šūnas kļūst par jauno atlasi. Zem pogas parādās, cik šūnu atrasts, to summa ("Sum") un atlikusī novirze no mērķa ("Variance"). Ja neviena kombinācija tolerances robežās neatbilst, panelis to pasaka.</w:t>
       </w:r>
     </w:p>
     <w:p>
@@ -3850,7 +4022,7 @@
           <w:bCs/>
           <w:rFonts w:ascii="Aptos" w:hAnsi="Aptos" w:cs="Aptos" w:eastAsia="Aptos"/>
         </w:rPr>
-        <w:t xml:space="preserve">Otas sloti</w:t>
+        <w:t xml:space="preserve">Noformējuma stili un skaitļu formāti</w:t>
       </w:r>
       <w:bookmarkEnd w:id="17"/>
     </w:p>
@@ -3866,7 +4038,7 @@
           <w:color w:val="1A1A1A"/>
           <w:rFonts w:ascii="Aptos" w:hAnsi="Aptos" w:cs="Aptos" w:eastAsia="Aptos"/>
         </w:rPr>
-        <w:t xml:space="preserve">Pogas "Capture 1", "Capture 2" un "Capture 3" iegaumē aktīvās šūnas skaitļu formātu, fontu, aizpildījumu, līdzinājumu un apmales. Pogas "Apply 1", "Apply 2" un "Apply 3" uzliek iegaumēto noformējumu atlasei.</w:t>
+        <w:t xml:space="preserve">Bloks "Model formatting" uzliek atlasei vienu no pieciem modeļa stiliem: "Title", "Header", "Input", "Formula" un "Result". Poga "Clear" noņem noformējumu.</w:t>
       </w:r>
     </w:p>
     <w:p>
@@ -3881,7 +4053,22 @@
           <w:color w:val="1A1A1A"/>
           <w:rFonts w:ascii="Aptos" w:hAnsi="Aptos" w:cs="Aptos" w:eastAsia="Aptos"/>
         </w:rPr>
-        <w:t xml:space="preserve">Sloti glabājas datorā, tāpēc tie saglabājas arī pēc paneļa aizvēršanas. Zem pogām redzams, kas katrā slotā ir iegaumēts.</w:t>
+        <w:t xml:space="preserve">Zem stiliem ir četras skaitļu formātu pogas: "1,234" veseliem skaitļiem, "1,234.0" ar vienu zīmi aiz komata, valūtas poga un "12.3%" procentiem. Valūtas pogas uzraksts seko iestatītajai valūtai un valodai cilnē "Brand".</w:t>
+      </w:r>
+    </w:p>
+    <w:p>
+      <w:pPr>
+        <w:rPr/>
+        <w:spacing w:after="120" w:line="276"/>
+      </w:pPr>
+      <w:r>
+        <w:rPr>
+          <w:sz w:val="22"/>
+          <w:szCs w:val="22"/>
+          <w:color w:val="1A1A1A"/>
+          <w:rFonts w:ascii="Aptos" w:hAnsi="Aptos" w:cs="Aptos" w:eastAsia="Aptos"/>
+        </w:rPr>
+        <w:t xml:space="preserve">Visi stili ņem krāsas un fontu no cilnes "Brand", tāpēc viena darbgrāmata izskatās vienādi neatkarīgi no tā, kurš to noformē.</w:t>
       </w:r>
     </w:p>
     <w:p>
@@ -3901,9 +4088,60 @@
           <w:bCs/>
           <w:rFonts w:ascii="Aptos" w:hAnsi="Aptos" w:cs="Aptos" w:eastAsia="Aptos"/>
         </w:rPr>
+        <w:t xml:space="preserve">Otas sloti</w:t>
+      </w:r>
+      <w:bookmarkEnd w:id="18"/>
+    </w:p>
+    <w:p>
+      <w:pPr>
+        <w:rPr/>
+        <w:spacing w:after="120" w:line="276"/>
+      </w:pPr>
+      <w:r>
+        <w:rPr>
+          <w:sz w:val="22"/>
+          <w:szCs w:val="22"/>
+          <w:color w:val="1A1A1A"/>
+          <w:rFonts w:ascii="Aptos" w:hAnsi="Aptos" w:cs="Aptos" w:eastAsia="Aptos"/>
+        </w:rPr>
+        <w:t xml:space="preserve">Pogas "Save 1", "Save 2" un "Save 3" iegaumē aktīvās šūnas skaitļu formātu, fontu, aizpildījumu, līdzinājumu un apmales. Pogas "Use 1", "Use 2" un "Use 3" uzliek iegaumēto noformējumu atlasei.</w:t>
+      </w:r>
+    </w:p>
+    <w:p>
+      <w:pPr>
+        <w:rPr/>
+        <w:spacing w:after="120" w:line="276"/>
+      </w:pPr>
+      <w:r>
+        <w:rPr>
+          <w:sz w:val="22"/>
+          <w:szCs w:val="22"/>
+          <w:color w:val="1A1A1A"/>
+          <w:rFonts w:ascii="Aptos" w:hAnsi="Aptos" w:cs="Aptos" w:eastAsia="Aptos"/>
+        </w:rPr>
+        <w:t xml:space="preserve">Sloti tiek saglabāti pašā darbgrāmatā, tāpēc kolēģis, kas atver to pašu failu citā datorā, redz tos pašus trīs slotus. Ja darbgrāmata vēl nekad nav saglabājusi nevienu slotu, tiek izmantoti šī datora sloti. Zem pogām redzams, kas katrā slotā ir iegaumēts.</w:t>
+      </w:r>
+    </w:p>
+    <w:p>
+      <w:pPr>
+        <w:rPr/>
+        <w:pStyle w:val="Heading2"/>
+        <w:spacing w:before="240" w:after="100"/>
+        <w:keepNext/>
+      </w:pPr>
+      <w:bookmarkStart w:id="19" w:name="_Toc00000018"/>
+      <w:r>
+        <w:rPr>
+          <w:sz w:val="26"/>
+          <w:szCs w:val="26"/>
+          <w:color w:val="14213D"/>
+          <w:b/>
+          <w:bCs/>
+          <w:rFonts w:ascii="Aptos" w:hAnsi="Aptos" w:cs="Aptos" w:eastAsia="Aptos"/>
+        </w:rPr>
         <w:t xml:space="preserve">Formātu cikli</w:t>
       </w:r>
-      <w:bookmarkEnd w:id="18"/>
+      <w:bookmarkEnd w:id="19"/>
     </w:p>
     <w:p>
       <w:pPr>
@@ -4431,7 +4669,7 @@
         <w:spacing w:before="240" w:after="100"/>
         <w:keepNext/>
       </w:pPr>
-      <w:bookmarkStart w:id="19" w:name="_Toc00000018"/>
+      <w:bookmarkStart w:id="20" w:name="_Toc00000019"/>
       <w:r>
         <w:rPr>
           <w:sz w:val="26"/>
@@ -4443,7 +4681,7 @@
         </w:rPr>
         <w:t xml:space="preserve">Aizpildīšana un ielīmēšana</w:t>
       </w:r>
-      <w:bookmarkEnd w:id="19"/>
+      <w:bookmarkEnd w:id="20"/>
     </w:p>
     <w:p>
       <w:pPr>
@@ -4725,7 +4963,7 @@
         <w:spacing w:before="240" w:after="100"/>
         <w:keepNext/>
       </w:pPr>
-      <w:bookmarkStart w:id="20" w:name="_Toc00000019"/>
+      <w:bookmarkStart w:id="21" w:name="_Toc00000020"/>
       <w:r>
         <w:rPr>
           <w:sz w:val="26"/>
@@ -4737,7 +4975,7 @@
         </w:rPr>
         <w:t xml:space="preserve">IFERROR aizsargs</w:t>
       </w:r>
-      <w:bookmarkEnd w:id="20"/>
+      <w:bookmarkEnd w:id="21"/>
     </w:p>
     <w:p>
       <w:pPr>
@@ -4761,7 +4999,7 @@
         <w:spacing w:before="240" w:after="100"/>
         <w:keepNext/>
       </w:pPr>
-      <w:bookmarkStart w:id="21" w:name="_Toc00000020"/>
+      <w:bookmarkStart w:id="22" w:name="_Toc00000021"/>
       <w:r>
         <w:rPr>
           <w:sz w:val="26"/>
@@ -4773,7 +5011,7 @@
         </w:rPr>
         <w:t xml:space="preserve">Autocolor</w:t>
       </w:r>
-      <w:bookmarkEnd w:id="21"/>
+      <w:bookmarkEnd w:id="22"/>
     </w:p>
     <w:p>
       <w:pPr>
@@ -4794,7 +5032,7 @@
       <w:pPr>
         <w:rPr/>
         <w:numPr>
-          <w:numId w:val="15"/>
+          <w:numId w:val="16"/>
           <w:ilvl w:val="0"/>
         </w:numPr>
         <w:spacing w:after="60" w:line="276"/>
@@ -4813,7 +5051,7 @@
       <w:pPr>
         <w:rPr/>
         <w:numPr>
-          <w:numId w:val="15"/>
+          <w:numId w:val="16"/>
           <w:ilvl w:val="0"/>
         </w:numPr>
         <w:spacing w:after="60" w:line="276"/>
@@ -4832,7 +5070,7 @@
       <w:pPr>
         <w:rPr/>
         <w:numPr>
-          <w:numId w:val="15"/>
+          <w:numId w:val="16"/>
           <w:ilvl w:val="0"/>
         </w:numPr>
         <w:spacing w:after="60" w:line="276"/>
@@ -4851,7 +5089,7 @@
       <w:pPr>
         <w:rPr/>
         <w:numPr>
-          <w:numId w:val="15"/>
+          <w:numId w:val="16"/>
           <w:ilvl w:val="0"/>
         </w:numPr>
         <w:spacing w:after="60" w:line="276"/>
@@ -4870,7 +5108,7 @@
       <w:pPr>
         <w:rPr/>
         <w:numPr>
-          <w:numId w:val="15"/>
+          <w:numId w:val="16"/>
           <w:ilvl w:val="0"/>
         </w:numPr>
         <w:spacing w:after="60" w:line="276"/>
@@ -4972,7 +5210,7 @@
         <w:spacing w:before="240" w:after="100"/>
         <w:keepNext/>
       </w:pPr>
-      <w:bookmarkStart w:id="22" w:name="_Toc00000021"/>
+      <w:bookmarkStart w:id="23" w:name="_Toc00000022"/>
       <w:r>
         <w:rPr>
           <w:sz w:val="26"/>
@@ -4984,7 +5222,7 @@
         </w:rPr>
         <w:t xml:space="preserve">Formulu pārbaude</w:t>
       </w:r>
-      <w:bookmarkEnd w:id="22"/>
+      <w:bookmarkEnd w:id="23"/>
     </w:p>
     <w:p>
       <w:pPr>
@@ -5103,7 +5341,7 @@
         <w:spacing w:before="240" w:after="100"/>
         <w:keepNext/>
       </w:pPr>
-      <w:bookmarkStart w:id="23" w:name="_Toc00000022"/>
+      <w:bookmarkStart w:id="24" w:name="_Toc00000023"/>
       <w:r>
         <w:rPr>
           <w:sz w:val="26"/>
@@ -5115,7 +5353,7 @@
         </w:rPr>
         <w:t xml:space="preserve">Precedents un Dependents</w:t>
       </w:r>
-      <w:bookmarkEnd w:id="23"/>
+      <w:bookmarkEnd w:id="24"/>
     </w:p>
     <w:p>
       <w:pPr>
@@ -5169,7 +5407,7 @@
         <w:spacing w:before="240" w:after="100"/>
         <w:keepNext/>
       </w:pPr>
-      <w:bookmarkStart w:id="24" w:name="_Toc00000023"/>
+      <w:bookmarkStart w:id="25" w:name="_Toc00000024"/>
       <w:r>
         <w:rPr>
           <w:sz w:val="26"/>
@@ -5181,7 +5419,7 @@
         </w:rPr>
         <w:t xml:space="preserve">CAGR, zīme, mērogs un zīmes aiz komata</w:t>
       </w:r>
-      <w:bookmarkEnd w:id="24"/>
+      <w:bookmarkEnd w:id="25"/>
     </w:p>
     <w:tbl>
       <w:tblPr>
@@ -5530,7 +5768,7 @@
         <w:spacing w:before="240" w:after="100"/>
         <w:keepNext/>
       </w:pPr>
-      <w:bookmarkStart w:id="25" w:name="_Toc00000024"/>
+      <w:bookmarkStart w:id="26" w:name="_Toc00000025"/>
       <w:r>
         <w:rPr>
           <w:sz w:val="26"/>
@@ -5542,7 +5780,7 @@
         </w:rPr>
         <w:t xml:space="preserve">Waterfall from selection</w:t>
       </w:r>
-      <w:bookmarkEnd w:id="25"/>
+      <w:bookmarkEnd w:id="26"/>
     </w:p>
     <w:p>
       <w:pPr>
@@ -5563,7 +5801,7 @@
       <w:pPr>
         <w:rPr/>
         <w:numPr>
-          <w:numId w:val="16"/>
+          <w:numId w:val="17"/>
           <w:ilvl w:val="0"/>
         </w:numPr>
         <w:spacing w:after="60" w:line="276"/>
@@ -5582,7 +5820,7 @@
       <w:pPr>
         <w:rPr/>
         <w:numPr>
-          <w:numId w:val="16"/>
+          <w:numId w:val="17"/>
           <w:ilvl w:val="0"/>
         </w:numPr>
         <w:spacing w:after="60" w:line="276"/>
@@ -5601,7 +5839,7 @@
       <w:pPr>
         <w:rPr/>
         <w:numPr>
-          <w:numId w:val="16"/>
+          <w:numId w:val="17"/>
           <w:ilvl w:val="0"/>
         </w:numPr>
         <w:spacing w:after="60" w:line="276"/>
@@ -5620,7 +5858,7 @@
       <w:pPr>
         <w:rPr/>
         <w:numPr>
-          <w:numId w:val="16"/>
+          <w:numId w:val="17"/>
           <w:ilvl w:val="0"/>
         </w:numPr>
         <w:spacing w:after="60" w:line="276"/>
@@ -5657,7 +5895,7 @@
         <w:spacing w:before="240" w:after="100"/>
         <w:keepNext/>
       </w:pPr>
-      <w:bookmarkStart w:id="26" w:name="_Toc00000025"/>
+      <w:bookmarkStart w:id="27" w:name="_Toc00000026"/>
       <w:r>
         <w:rPr>
           <w:sz w:val="26"/>
@@ -5669,7 +5907,7 @@
         </w:rPr>
         <w:t xml:space="preserve">Tornado from selection</w:t>
       </w:r>
-      <w:bookmarkEnd w:id="26"/>
+      <w:bookmarkEnd w:id="27"/>
     </w:p>
     <w:p>
       <w:pPr>
@@ -5723,7 +5961,7 @@
         <w:spacing w:before="240" w:after="100"/>
         <w:keepNext/>
       </w:pPr>
-      <w:bookmarkStart w:id="27" w:name="_Toc00000026"/>
+      <w:bookmarkStart w:id="28" w:name="_Toc00000027"/>
       <w:r>
         <w:rPr>
           <w:sz w:val="26"/>
@@ -5735,7 +5973,7 @@
         </w:rPr>
         <w:t xml:space="preserve">Brand-format chart un CAGR label</w:t>
       </w:r>
-      <w:bookmarkEnd w:id="27"/>
+      <w:bookmarkEnd w:id="28"/>
     </w:p>
     <w:p>
       <w:pPr>
@@ -5774,7 +6012,7 @@
         <w:spacing w:before="240" w:after="100"/>
         <w:keepNext/>
       </w:pPr>
-      <w:bookmarkStart w:id="28" w:name="_Toc00000027"/>
+      <w:bookmarkStart w:id="29" w:name="_Toc00000028"/>
       <w:r>
         <w:rPr>
           <w:sz w:val="26"/>
@@ -5786,7 +6024,7 @@
         </w:rPr>
         <w:t xml:space="preserve">Consistent rounding un funkcijas PLSFIX</w:t>
       </w:r>
-      <w:bookmarkEnd w:id="28"/>
+      <w:bookmarkEnd w:id="29"/>
     </w:p>
     <w:p>
       <w:pPr>
@@ -6016,7 +6254,7 @@
         <w:spacing w:before="240" w:after="100"/>
         <w:keepNext/>
       </w:pPr>
-      <w:bookmarkStart w:id="29" w:name="_Toc00000028"/>
+      <w:bookmarkStart w:id="30" w:name="_Toc00000029"/>
       <w:r>
         <w:rPr>
           <w:sz w:val="26"/>
@@ -6028,7 +6266,7 @@
         </w:rPr>
         <w:t xml:space="preserve">Unpivot selection</w:t>
       </w:r>
-      <w:bookmarkEnd w:id="29"/>
+      <w:bookmarkEnd w:id="30"/>
     </w:p>
     <w:p>
       <w:pPr>
@@ -6067,7 +6305,7 @@
         <w:spacing w:before="240" w:after="100"/>
         <w:keepNext/>
       </w:pPr>
-      <w:bookmarkStart w:id="30" w:name="_Toc00000029"/>
+      <w:bookmarkStart w:id="31" w:name="_Toc00000030"/>
       <w:r>
         <w:rPr>
           <w:sz w:val="26"/>
@@ -6079,7 +6317,7 @@
         </w:rPr>
         <w:t xml:space="preserve">Undo last pls,fix action</w:t>
       </w:r>
-      <w:bookmarkEnd w:id="30"/>
+      <w:bookmarkEnd w:id="31"/>
     </w:p>
     <w:p>
       <w:pPr>
@@ -6122,7 +6360,7 @@
         <w:keepNext/>
         <w:pageBreakBefore/>
       </w:pPr>
-      <w:bookmarkStart w:id="31" w:name="_Toc00000030"/>
+      <w:bookmarkStart w:id="32" w:name="_Toc00000031"/>
       <w:r>
         <w:rPr>
           <w:sz w:val="36"/>
@@ -6145,7 +6383,7 @@
         </w:rPr>
         <w:t xml:space="preserve">Veidnes</w:t>
       </w:r>
-      <w:bookmarkEnd w:id="31"/>
+      <w:bookmarkEnd w:id="32"/>
     </w:p>
     <w:p>
       <w:pPr>
@@ -6154,7 +6392,7 @@
         <w:spacing w:before="240" w:after="100"/>
         <w:keepNext/>
       </w:pPr>
-      <w:bookmarkStart w:id="32" w:name="_Toc00000031"/>
+      <w:bookmarkStart w:id="33" w:name="_Toc00000032"/>
       <w:r>
         <w:rPr>
           <w:sz w:val="26"/>
@@ -6166,7 +6404,7 @@
         </w:rPr>
         <w:t xml:space="preserve">Kas ir veidnes</w:t>
       </w:r>
-      <w:bookmarkEnd w:id="32"/>
+      <w:bookmarkEnd w:id="33"/>
     </w:p>
     <w:p>
       <w:pPr>
@@ -6220,7 +6458,7 @@
         <w:spacing w:before="240" w:after="100"/>
         <w:keepNext/>
       </w:pPr>
-      <w:bookmarkStart w:id="33" w:name="_Toc00000032"/>
+      <w:bookmarkStart w:id="34" w:name="_Toc00000033"/>
       <w:r>
         <w:rPr>
           <w:sz w:val="26"/>
@@ -6232,7 +6470,7 @@
         </w:rPr>
         <w:t xml:space="preserve">Debt schedule (annuity)</w:t>
       </w:r>
-      <w:bookmarkEnd w:id="33"/>
+      <w:bookmarkEnd w:id="34"/>
     </w:p>
     <w:p>
       <w:pPr>
@@ -6256,7 +6494,7 @@
         <w:spacing w:before="240" w:after="100"/>
         <w:keepNext/>
       </w:pPr>
-      <w:bookmarkStart w:id="34" w:name="_Toc00000033"/>
+      <w:bookmarkStart w:id="35" w:name="_Toc00000034"/>
       <w:r>
         <w:rPr>
           <w:sz w:val="26"/>
@@ -6268,7 +6506,7 @@
         </w:rPr>
         <w:t xml:space="preserve">DCF valuation</w:t>
       </w:r>
-      <w:bookmarkEnd w:id="34"/>
+      <w:bookmarkEnd w:id="35"/>
     </w:p>
     <w:p>
       <w:pPr>
@@ -6292,7 +6530,7 @@
         <w:spacing w:before="240" w:after="100"/>
         <w:keepNext/>
       </w:pPr>
-      <w:bookmarkStart w:id="35" w:name="_Toc00000034"/>
+      <w:bookmarkStart w:id="36" w:name="_Toc00000035"/>
       <w:r>
         <w:rPr>
           <w:sz w:val="26"/>
@@ -6304,7 +6542,7 @@
         </w:rPr>
         <w:t xml:space="preserve">NPV / IRR</w:t>
       </w:r>
-      <w:bookmarkEnd w:id="35"/>
+      <w:bookmarkEnd w:id="36"/>
     </w:p>
     <w:p>
       <w:pPr>
@@ -6328,7 +6566,7 @@
         <w:spacing w:before="240" w:after="100"/>
         <w:keepNext/>
       </w:pPr>
-      <w:bookmarkStart w:id="36" w:name="_Toc00000035"/>
+      <w:bookmarkStart w:id="37" w:name="_Toc00000036"/>
       <w:r>
         <w:rPr>
           <w:sz w:val="26"/>
@@ -6340,7 +6578,7 @@
         </w:rPr>
         <w:t xml:space="preserve">Working capital days</w:t>
       </w:r>
-      <w:bookmarkEnd w:id="36"/>
+      <w:bookmarkEnd w:id="37"/>
     </w:p>
     <w:p>
       <w:pPr>
@@ -6364,7 +6602,7 @@
         <w:spacing w:before="240" w:after="100"/>
         <w:keepNext/>
       </w:pPr>
-      <w:bookmarkStart w:id="37" w:name="_Toc00000036"/>
+      <w:bookmarkStart w:id="38" w:name="_Toc00000037"/>
       <w:r>
         <w:rPr>
           <w:sz w:val="26"/>
@@ -6376,7 +6614,7 @@
         </w:rPr>
         <w:t xml:space="preserve">Two-way sensitivity</w:t>
       </w:r>
-      <w:bookmarkEnd w:id="37"/>
+      <w:bookmarkEnd w:id="38"/>
     </w:p>
     <w:p>
       <w:pPr>
@@ -6400,7 +6638,7 @@
         <w:spacing w:before="240" w:after="100"/>
         <w:keepNext/>
       </w:pPr>
-      <w:bookmarkStart w:id="38" w:name="_Toc00000037"/>
+      <w:bookmarkStart w:id="39" w:name="_Toc00000038"/>
       <w:r>
         <w:rPr>
           <w:sz w:val="26"/>
@@ -6412,7 +6650,7 @@
         </w:rPr>
         <w:t xml:space="preserve">EBITDA bridge</w:t>
       </w:r>
-      <w:bookmarkEnd w:id="38"/>
+      <w:bookmarkEnd w:id="39"/>
     </w:p>
     <w:p>
       <w:pPr>
@@ -6440,7 +6678,7 @@
         <w:keepNext/>
         <w:pageBreakBefore/>
       </w:pPr>
-      <w:bookmarkStart w:id="39" w:name="_Toc00000038"/>
+      <w:bookmarkStart w:id="40" w:name="_Toc00000039"/>
       <w:r>
         <w:rPr>
           <w:sz w:val="36"/>
@@ -6463,7 +6701,7 @@
         </w:rPr>
         <w:t xml:space="preserve">Cilne Workbook</w:t>
       </w:r>
-      <w:bookmarkEnd w:id="39"/>
+      <w:bookmarkEnd w:id="40"/>
     </w:p>
     <w:p>
       <w:pPr>
@@ -6472,7 +6710,7 @@
         <w:spacing w:before="240" w:after="100"/>
         <w:keepNext/>
       </w:pPr>
-      <w:bookmarkStart w:id="40" w:name="_Toc00000039"/>
+      <w:bookmarkStart w:id="41" w:name="_Toc00000040"/>
       <w:r>
         <w:rPr>
           <w:sz w:val="26"/>
@@ -6484,7 +6722,7 @@
         </w:rPr>
         <w:t xml:space="preserve">Lapu saraksts</w:t>
       </w:r>
-      <w:bookmarkEnd w:id="40"/>
+      <w:bookmarkEnd w:id="41"/>
     </w:p>
     <w:p>
       <w:pPr>
@@ -6588,7 +6826,7 @@
         <w:spacing w:before="240" w:after="100"/>
         <w:keepNext/>
       </w:pPr>
-      <w:bookmarkStart w:id="41" w:name="_Toc00000040"/>
+      <w:bookmarkStart w:id="42" w:name="_Toc00000041"/>
       <w:r>
         <w:rPr>
           <w:sz w:val="26"/>
@@ -6600,7 +6838,7 @@
         </w:rPr>
         <w:t xml:space="preserve">Super Find</w:t>
       </w:r>
-      <w:bookmarkEnd w:id="41"/>
+      <w:bookmarkEnd w:id="42"/>
     </w:p>
     <w:p>
       <w:pPr>
@@ -6636,7 +6874,7 @@
       <w:pPr>
         <w:rPr/>
         <w:numPr>
-          <w:numId w:val="17"/>
+          <w:numId w:val="18"/>
           <w:ilvl w:val="0"/>
         </w:numPr>
         <w:spacing w:after="60" w:line="276"/>
@@ -6655,7 +6893,7 @@
       <w:pPr>
         <w:rPr/>
         <w:numPr>
-          <w:numId w:val="17"/>
+          <w:numId w:val="18"/>
           <w:ilvl w:val="0"/>
         </w:numPr>
         <w:spacing w:after="60" w:line="276"/>
@@ -6674,7 +6912,7 @@
       <w:pPr>
         <w:rPr/>
         <w:numPr>
-          <w:numId w:val="17"/>
+          <w:numId w:val="18"/>
           <w:ilvl w:val="0"/>
         </w:numPr>
         <w:spacing w:after="60" w:line="276"/>
@@ -6693,7 +6931,7 @@
       <w:pPr>
         <w:rPr/>
         <w:numPr>
-          <w:numId w:val="17"/>
+          <w:numId w:val="18"/>
           <w:ilvl w:val="0"/>
         </w:numPr>
         <w:spacing w:after="60" w:line="276"/>
@@ -6712,7 +6950,7 @@
       <w:pPr>
         <w:rPr/>
         <w:numPr>
-          <w:numId w:val="17"/>
+          <w:numId w:val="18"/>
           <w:ilvl w:val="0"/>
         </w:numPr>
         <w:spacing w:after="60" w:line="276"/>
@@ -6764,7 +7002,7 @@
         <w:spacing w:before="240" w:after="100"/>
         <w:keepNext/>
       </w:pPr>
-      <w:bookmarkStart w:id="42" w:name="_Toc00000041"/>
+      <w:bookmarkStart w:id="43" w:name="_Toc00000042"/>
       <w:r>
         <w:rPr>
           <w:sz w:val="26"/>
@@ -6776,7 +7014,7 @@
         </w:rPr>
         <w:t xml:space="preserve">Satura rādītājs</w:t>
       </w:r>
-      <w:bookmarkEnd w:id="42"/>
+      <w:bookmarkEnd w:id="43"/>
     </w:p>
     <w:p>
       <w:pPr>
@@ -6800,7 +7038,7 @@
         <w:spacing w:before="240" w:after="100"/>
         <w:keepNext/>
       </w:pPr>
-      <w:bookmarkStart w:id="43" w:name="_Toc00000042"/>
+      <w:bookmarkStart w:id="44" w:name="_Toc00000043"/>
       <w:r>
         <w:rPr>
           <w:sz w:val="26"/>
@@ -6812,7 +7050,7 @@
         </w:rPr>
         <w:t xml:space="preserve">Bojātie nosaukumi</w:t>
       </w:r>
-      <w:bookmarkEnd w:id="43"/>
+      <w:bookmarkEnd w:id="44"/>
     </w:p>
     <w:p>
       <w:pPr>
@@ -6851,7 +7089,7 @@
         <w:spacing w:before="240" w:after="100"/>
         <w:keepNext/>
       </w:pPr>
-      <w:bookmarkStart w:id="44" w:name="_Toc00000043"/>
+      <w:bookmarkStart w:id="45" w:name="_Toc00000044"/>
       <w:r>
         <w:rPr>
           <w:sz w:val="26"/>
@@ -6863,7 +7101,7 @@
         </w:rPr>
         <w:t xml:space="preserve">Neizmantotie stili</w:t>
       </w:r>
-      <w:bookmarkEnd w:id="44"/>
+      <w:bookmarkEnd w:id="45"/>
     </w:p>
     <w:p>
       <w:pPr>
@@ -6902,7 +7140,7 @@
         <w:spacing w:before="240" w:after="100"/>
         <w:keepNext/>
       </w:pPr>
-      <w:bookmarkStart w:id="45" w:name="_Toc00000044"/>
+      <w:bookmarkStart w:id="46" w:name="_Toc00000045"/>
       <w:r>
         <w:rPr>
           <w:sz w:val="26"/>
@@ -6914,7 +7152,7 @@
         </w:rPr>
         <w:t xml:space="preserve">Prepare for sharing</w:t>
       </w:r>
-      <w:bookmarkEnd w:id="45"/>
+      <w:bookmarkEnd w:id="46"/>
     </w:p>
     <w:p>
       <w:pPr>
@@ -6950,7 +7188,7 @@
       <w:pPr>
         <w:rPr/>
         <w:numPr>
-          <w:numId w:val="18"/>
+          <w:numId w:val="19"/>
           <w:ilvl w:val="0"/>
         </w:numPr>
         <w:spacing w:after="60" w:line="276"/>
@@ -6969,7 +7207,7 @@
       <w:pPr>
         <w:rPr/>
         <w:numPr>
-          <w:numId w:val="18"/>
+          <w:numId w:val="19"/>
           <w:ilvl w:val="0"/>
         </w:numPr>
         <w:spacing w:after="60" w:line="276"/>
@@ -6988,7 +7226,7 @@
       <w:pPr>
         <w:rPr/>
         <w:numPr>
-          <w:numId w:val="18"/>
+          <w:numId w:val="19"/>
           <w:ilvl w:val="0"/>
         </w:numPr>
         <w:spacing w:after="60" w:line="276"/>
@@ -7007,7 +7245,7 @@
       <w:pPr>
         <w:rPr/>
         <w:numPr>
-          <w:numId w:val="18"/>
+          <w:numId w:val="19"/>
           <w:ilvl w:val="0"/>
         </w:numPr>
         <w:spacing w:after="60" w:line="276"/>
@@ -7026,7 +7264,7 @@
       <w:pPr>
         <w:rPr/>
         <w:numPr>
-          <w:numId w:val="18"/>
+          <w:numId w:val="19"/>
           <w:ilvl w:val="0"/>
         </w:numPr>
         <w:spacing w:after="60" w:line="276"/>
@@ -7045,7 +7283,7 @@
       <w:pPr>
         <w:rPr/>
         <w:numPr>
-          <w:numId w:val="18"/>
+          <w:numId w:val="19"/>
           <w:ilvl w:val="0"/>
         </w:numPr>
         <w:spacing w:after="60" w:line="276"/>
@@ -7082,7 +7320,7 @@
         <w:spacing w:before="240" w:after="100"/>
         <w:keepNext/>
       </w:pPr>
-      <w:bookmarkStart w:id="46" w:name="_Toc00000045"/>
+      <w:bookmarkStart w:id="47" w:name="_Toc00000046"/>
       <w:r>
         <w:rPr>
           <w:sz w:val="26"/>
@@ -7094,7 +7332,7 @@
         </w:rPr>
         <w:t xml:space="preserve">Model check</w:t>
       </w:r>
-      <w:bookmarkEnd w:id="46"/>
+      <w:bookmarkEnd w:id="47"/>
     </w:p>
     <w:p>
       <w:pPr>
@@ -7122,7 +7360,7 @@
         <w:keepNext/>
         <w:pageBreakBefore/>
       </w:pPr>
-      <w:bookmarkStart w:id="47" w:name="_Toc00000046"/>
+      <w:bookmarkStart w:id="48" w:name="_Toc00000047"/>
       <w:r>
         <w:rPr>
           <w:sz w:val="36"/>
@@ -7145,7 +7383,7 @@
         </w:rPr>
         <w:t xml:space="preserve">Saites uz PowerPoint</w:t>
       </w:r>
-      <w:bookmarkEnd w:id="47"/>
+      <w:bookmarkEnd w:id="48"/>
     </w:p>
     <w:p>
       <w:pPr>
@@ -7154,7 +7392,7 @@
         <w:spacing w:before="240" w:after="100"/>
         <w:keepNext/>
       </w:pPr>
-      <w:bookmarkStart w:id="48" w:name="_Toc00000047"/>
+      <w:bookmarkStart w:id="49" w:name="_Toc00000048"/>
       <w:r>
         <w:rPr>
           <w:sz w:val="26"/>
@@ -7166,7 +7404,7 @@
         </w:rPr>
         <w:t xml:space="preserve">Kā saite darbojas</w:t>
       </w:r>
-      <w:bookmarkEnd w:id="48"/>
+      <w:bookmarkEnd w:id="49"/>
     </w:p>
     <w:p>
       <w:pPr>
@@ -7210,7 +7448,7 @@
           <w:color w:val="1A1A1A"/>
           <w:rFonts w:ascii="Aptos" w:hAnsi="Aptos" w:cs="Aptos" w:eastAsia="Aptos"/>
         </w:rPr>
-        <w:t xml:space="preserve">Saitē var būt attēls, tabula vai diagramma. Diagramma slaidā nonāk kā rediģējamu figūru grupa ar zīmola krāsām un tikai vērtību etiķetēm (stabiņu, joslu, tilta un sektoru diagrammas). Ja PowerPoint to nevar uzzīmēt vai diagramma ir par lielu (vairāk nekā 40 punkti, 3 sērijas vai 12 sektori), tā tiek ievietota kā attēls, un panelis to pasaka.</w:t>
+        <w:t xml:space="preserve">Saitē var būt attēls, tabula vai diagramma. Diagramma slaidā nonāk kā rediģējamu figūru grupa ar zīmola krāsām un tikai vērtību etiķetēm: stabiņu, joslu, tilta, sektoru un līniju diagrammas. Līniju diagrammā katrs punkts ir sava figūra, savienota ar līniju līdz nākamajam punktam. Šai figūru grupai nepieciešams PowerPoint 2504 vai jaunāks Windows datorā, 16.96 vai jaunāks Mac datorā; vecākā versijā, kā arī pāri 40 punktiem, 3 sērijām vai 12 sektoriem, diagramma tiek ievietota kā attēls, un panelis to pasaka.</w:t>
       </w:r>
     </w:p>
     <w:p>
@@ -7220,7 +7458,7 @@
         <w:spacing w:before="240" w:after="100"/>
         <w:keepNext/>
       </w:pPr>
-      <w:bookmarkStart w:id="49" w:name="_Toc00000048"/>
+      <w:bookmarkStart w:id="50" w:name="_Toc00000049"/>
       <w:r>
         <w:rPr>
           <w:sz w:val="26"/>
@@ -7232,7 +7470,7 @@
         </w:rPr>
         <w:t xml:space="preserve">Saites atslēga</w:t>
       </w:r>
-      <w:bookmarkEnd w:id="49"/>
+      <w:bookmarkEnd w:id="50"/>
     </w:p>
     <w:p>
       <w:pPr>
@@ -7253,7 +7491,7 @@
       <w:pPr>
         <w:rPr/>
         <w:numPr>
-          <w:numId w:val="19"/>
+          <w:numId w:val="20"/>
           <w:ilvl w:val="0"/>
         </w:numPr>
         <w:spacing w:after="60" w:line="276"/>
@@ -7272,7 +7510,7 @@
       <w:pPr>
         <w:rPr/>
         <w:numPr>
-          <w:numId w:val="19"/>
+          <w:numId w:val="20"/>
           <w:ilvl w:val="0"/>
         </w:numPr>
         <w:spacing w:after="60" w:line="276"/>
@@ -7291,7 +7529,7 @@
       <w:pPr>
         <w:rPr/>
         <w:numPr>
-          <w:numId w:val="19"/>
+          <w:numId w:val="20"/>
           <w:ilvl w:val="0"/>
         </w:numPr>
         <w:spacing w:after="60" w:line="276"/>
@@ -7408,7 +7646,7 @@
         <w:spacing w:before="240" w:after="100"/>
         <w:keepNext/>
       </w:pPr>
-      <w:bookmarkStart w:id="50" w:name="_Toc00000049"/>
+      <w:bookmarkStart w:id="51" w:name="_Toc00000050"/>
       <w:r>
         <w:rPr>
           <w:sz w:val="26"/>
@@ -7420,7 +7658,7 @@
         </w:rPr>
         <w:t xml:space="preserve">Eksports no Excel</w:t>
       </w:r>
-      <w:bookmarkEnd w:id="50"/>
+      <w:bookmarkEnd w:id="51"/>
     </w:p>
     <w:p>
       <w:pPr>
@@ -7441,7 +7679,7 @@
       <w:pPr>
         <w:rPr/>
         <w:numPr>
-          <w:numId w:val="20"/>
+          <w:numId w:val="21"/>
           <w:ilvl w:val="0"/>
         </w:numPr>
         <w:spacing w:after="60" w:line="276"/>
@@ -7460,7 +7698,7 @@
       <w:pPr>
         <w:rPr/>
         <w:numPr>
-          <w:numId w:val="20"/>
+          <w:numId w:val="21"/>
           <w:ilvl w:val="0"/>
         </w:numPr>
         <w:spacing w:after="60" w:line="276"/>
@@ -7577,7 +7815,7 @@
         <w:spacing w:before="240" w:after="100"/>
         <w:keepNext/>
       </w:pPr>
-      <w:bookmarkStart w:id="51" w:name="_Toc00000050"/>
+      <w:bookmarkStart w:id="52" w:name="_Toc00000051"/>
       <w:r>
         <w:rPr>
           <w:sz w:val="26"/>
@@ -7589,7 +7827,7 @@
         </w:rPr>
         <w:t xml:space="preserve">Saišu saraksts Excel pusē</w:t>
       </w:r>
-      <w:bookmarkEnd w:id="51"/>
+      <w:bookmarkEnd w:id="52"/>
     </w:p>
     <w:p>
       <w:pPr>
@@ -7856,7 +8094,7 @@
         <w:spacing w:before="240" w:after="100"/>
         <w:keepNext/>
       </w:pPr>
-      <w:bookmarkStart w:id="52" w:name="_Toc00000051"/>
+      <w:bookmarkStart w:id="53" w:name="_Toc00000052"/>
       <w:r>
         <w:rPr>
           <w:sz w:val="26"/>
@@ -7868,7 +8106,7 @@
         </w:rPr>
         <w:t xml:space="preserve">Auto-push on edit un Highlight linked cells</w:t>
       </w:r>
-      <w:bookmarkEnd w:id="52"/>
+      <w:bookmarkEnd w:id="53"/>
     </w:p>
     <w:p>
       <w:pPr>
@@ -7907,7 +8145,7 @@
         <w:spacing w:before="240" w:after="100"/>
         <w:keepNext/>
       </w:pPr>
-      <w:bookmarkStart w:id="53" w:name="_Toc00000052"/>
+      <w:bookmarkStart w:id="54" w:name="_Toc00000053"/>
       <w:r>
         <w:rPr>
           <w:sz w:val="26"/>
@@ -7919,7 +8157,7 @@
         </w:rPr>
         <w:t xml:space="preserve">Ievietošana PowerPoint</w:t>
       </w:r>
-      <w:bookmarkEnd w:id="53"/>
+      <w:bookmarkEnd w:id="54"/>
     </w:p>
     <w:p>
       <w:pPr>
@@ -7940,7 +8178,7 @@
       <w:pPr>
         <w:rPr/>
         <w:numPr>
-          <w:numId w:val="21"/>
+          <w:numId w:val="22"/>
           <w:ilvl w:val="0"/>
         </w:numPr>
         <w:spacing w:after="60" w:line="276"/>
@@ -7959,7 +8197,7 @@
       <w:pPr>
         <w:rPr/>
         <w:numPr>
-          <w:numId w:val="21"/>
+          <w:numId w:val="22"/>
           <w:ilvl w:val="0"/>
         </w:numPr>
         <w:spacing w:after="60" w:line="276"/>
@@ -7978,7 +8216,7 @@
       <w:pPr>
         <w:rPr/>
         <w:numPr>
-          <w:numId w:val="21"/>
+          <w:numId w:val="22"/>
           <w:ilvl w:val="0"/>
         </w:numPr>
         <w:spacing w:after="60" w:line="276"/>
@@ -7991,6 +8229,21 @@
           <w:rFonts w:ascii="Aptos" w:hAnsi="Aptos" w:cs="Aptos" w:eastAsia="Aptos"/>
         </w:rPr>
         <w:t xml:space="preserve">Objekts (attēls, tabula vai diagramma) tiek ievietots atlasītajā slaidā brīvā vietā un pielāgots tā izmēram. Pēc tam to var pārvietot un mainīt tā izmēru.</w:t>
+      </w:r>
+    </w:p>
+    <w:p>
+      <w:pPr>
+        <w:rPr/>
+        <w:spacing w:after="120" w:line="276"/>
+      </w:pPr>
+      <w:r>
+        <w:rPr>
+          <w:sz w:val="22"/>
+          <w:szCs w:val="22"/>
+          <w:color w:val="1A1A1A"/>
+          <w:rFonts w:ascii="Aptos" w:hAnsi="Aptos" w:cs="Aptos" w:eastAsia="Aptos"/>
+        </w:rPr>
+        <w:t xml:space="preserve">Poga "Paste latest linked" paveic to pašu vienā solī: tā ievieto jaunāko no Excel nosūtīto eksportu aktīvajā slaidā, neizvēloties konkrētu vienumu sarakstā.</w:t>
       </w:r>
     </w:p>
     <w:p>
@@ -8080,7 +8333,7 @@
         <w:spacing w:before="240" w:after="100"/>
         <w:keepNext/>
       </w:pPr>
-      <w:bookmarkStart w:id="54" w:name="_Toc00000053"/>
+      <w:bookmarkStart w:id="55" w:name="_Toc00000054"/>
       <w:r>
         <w:rPr>
           <w:sz w:val="26"/>
@@ -8092,7 +8345,7 @@
         </w:rPr>
         <w:t xml:space="preserve">Atjaunināšana</w:t>
       </w:r>
-      <w:bookmarkEnd w:id="54"/>
+      <w:bookmarkEnd w:id="55"/>
     </w:p>
     <w:p>
       <w:pPr>
@@ -8454,7 +8707,7 @@
         <w:spacing w:before="240" w:after="100"/>
         <w:keepNext/>
       </w:pPr>
-      <w:bookmarkStart w:id="55" w:name="_Toc00000054"/>
+      <w:bookmarkStart w:id="56" w:name="_Toc00000055"/>
       <w:r>
         <w:rPr>
           <w:sz w:val="26"/>
@@ -8464,9 +8717,9 @@
           <w:bCs/>
           <w:rFonts w:ascii="Aptos" w:hAnsi="Aptos" w:cs="Aptos" w:eastAsia="Aptos"/>
         </w:rPr>
-        <w:t xml:space="preserve">Go to slide, Change source un Break link</w:t>
-      </w:r>
-      <w:bookmarkEnd w:id="55"/>
+        <w:t xml:space="preserve">Meklēšana un filtrēšana</w:t>
+      </w:r>
+      <w:bookmarkEnd w:id="56"/>
     </w:p>
     <w:p>
       <w:pPr>
@@ -8480,8 +8733,251 @@
           <w:color w:val="1A1A1A"/>
           <w:rFonts w:ascii="Aptos" w:hAnsi="Aptos" w:cs="Aptos" w:eastAsia="Aptos"/>
         </w:rPr>
-        <w:t xml:space="preserve">Poga "Go to slide" pārlec uz pirmās atzīmētās saites slaidu.</w:t>
-      </w:r>
+        <w:t xml:space="preserve">Virs saišu tabulas cilnē "Links" ir meklēšanas lauks un trīs filtri. Tie sašaurina redzamo sarakstu, bet atzīmētās rindas paliek atzīmētas arī tad, kad filtrs tās paslēpj.</w:t>
+      </w:r>
+    </w:p>
+    <w:tbl>
+      <w:tblPr>
+        <w:tblW w:w="9638" w:type="dxa"/>
+        <w:jc w:val="left"/>
+        <w:tblBorders>
+          <w:top w:val="single" w:sz="2" w:space="0" w:color="C8CEDA"/>
+          <w:left w:val="single" w:sz="2" w:space="0" w:color="C8CEDA"/>
+          <w:bottom w:val="single" w:sz="2" w:space="0" w:color="C8CEDA"/>
+          <w:right w:val="single" w:sz="2" w:space="0" w:color="C8CEDA"/>
+          <w:insideH w:val="single" w:sz="2" w:space="0" w:color="C8CEDA"/>
+          <w:insideV w:val="single" w:sz="2" w:space="0" w:color="C8CEDA"/>
+        </w:tblBorders>
+        <w:tblCellMar>
+          <w:top w:w="60" w:type="dxa"/>
+          <w:left w:w="108" w:type="dxa"/>
+          <w:bottom w:w="60" w:type="dxa"/>
+          <w:right w:w="108" w:type="dxa"/>
+        </w:tblCellMar>
+        <w:tblLayout w:type="fixed"/>
+      </w:tblPr>
+      <w:tblGrid>
+        <w:gridCol w:w="2698" w:type="dxa"/>
+        <w:gridCol w:w="6940" w:type="dxa"/>
+      </w:tblGrid>
+      <w:tr>
+        <w:trPr>
+          <w:cantSplit/>
+        </w:trPr>
+        <w:tc>
+          <w:tcPr>
+            <w:tcW w:w="2698" w:type="dxa"/>
+            <w:shd w:val="clear" w:color="auto" w:fill="DFF5F2"/>
+          </w:tcPr>
+          <w:p>
+            <w:pPr>
+              <w:rPr/>
+            </w:pPr>
+            <w:r>
+              <w:rPr>
+                <w:sz w:val="20"/>
+                <w:szCs w:val="20"/>
+                <w:color w:val="14213D"/>
+                <w:b/>
+                <w:bCs/>
+                <w:rFonts w:ascii="Aptos" w:hAnsi="Aptos" w:cs="Aptos" w:eastAsia="Aptos"/>
+              </w:rPr>
+              <w:t xml:space="preserve">Vadīkla</w:t>
+            </w:r>
+          </w:p>
+        </w:tc>
+        <w:tc>
+          <w:tcPr>
+            <w:tcW w:w="6940" w:type="dxa"/>
+            <w:shd w:val="clear" w:color="auto" w:fill="DFF5F2"/>
+          </w:tcPr>
+          <w:p>
+            <w:pPr>
+              <w:rPr/>
+            </w:pPr>
+            <w:r>
+              <w:rPr>
+                <w:sz w:val="20"/>
+                <w:szCs w:val="20"/>
+                <w:color w:val="14213D"/>
+                <w:b/>
+                <w:bCs/>
+                <w:rFonts w:ascii="Aptos" w:hAnsi="Aptos" w:cs="Aptos" w:eastAsia="Aptos"/>
+              </w:rPr>
+              <w:t xml:space="preserve">Ko tā sašaurina</w:t>
+            </w:r>
+          </w:p>
+        </w:tc>
+      </w:tr>
+      <w:tr>
+        <w:trPr/>
+        <w:tc>
+          <w:tcPr>
+            <w:tcW w:w="2698" w:type="dxa"/>
+          </w:tcPr>
+          <w:p>
+            <w:pPr>
+              <w:rPr/>
+            </w:pPr>
+            <w:r>
+              <w:rPr>
+                <w:sz w:val="20"/>
+                <w:szCs w:val="20"/>
+                <w:color w:val="1A1A1A"/>
+                <w:rFonts w:ascii="Aptos" w:hAnsi="Aptos" w:cs="Aptos" w:eastAsia="Aptos"/>
+              </w:rPr>
+              <w:t xml:space="preserve">Meklēšanas lauks</w:t>
+            </w:r>
+          </w:p>
+        </w:tc>
+        <w:tc>
+          <w:tcPr>
+            <w:tcW w:w="6940" w:type="dxa"/>
+          </w:tcPr>
+          <w:p>
+            <w:pPr>
+              <w:rPr/>
+            </w:pPr>
+            <w:r>
+              <w:rPr>
+                <w:sz w:val="20"/>
+                <w:szCs w:val="20"/>
+                <w:color w:val="1A1A1A"/>
+                <w:rFonts w:ascii="Aptos" w:hAnsi="Aptos" w:cs="Aptos" w:eastAsia="Aptos"/>
+              </w:rPr>
+              <w:t xml:space="preserve">meklē pēc slaida numura, objekta un tā avota darbgrāmatas nosaukuma</w:t>
+            </w:r>
+          </w:p>
+        </w:tc>
+      </w:tr>
+      <w:tr>
+        <w:trPr/>
+        <w:tc>
+          <w:tcPr>
+            <w:tcW w:w="2698" w:type="dxa"/>
+          </w:tcPr>
+          <w:p>
+            <w:pPr>
+              <w:rPr/>
+            </w:pPr>
+            <w:r>
+              <w:rPr>
+                <w:sz w:val="20"/>
+                <w:szCs w:val="20"/>
+                <w:color w:val="1A1A1A"/>
+                <w:rFonts w:ascii="Aptos" w:hAnsi="Aptos" w:cs="Aptos" w:eastAsia="Aptos"/>
+              </w:rPr>
+              <w:t xml:space="preserve">"Source workbook"</w:t>
+            </w:r>
+          </w:p>
+        </w:tc>
+        <w:tc>
+          <w:tcPr>
+            <w:tcW w:w="6940" w:type="dxa"/>
+          </w:tcPr>
+          <w:p>
+            <w:pPr>
+              <w:rPr/>
+            </w:pPr>
+            <w:r>
+              <w:rPr>
+                <w:sz w:val="20"/>
+                <w:szCs w:val="20"/>
+                <w:color w:val="1A1A1A"/>
+                <w:rFonts w:ascii="Aptos" w:hAnsi="Aptos" w:cs="Aptos" w:eastAsia="Aptos"/>
+              </w:rPr>
+              <w:t xml:space="preserve">rāda tikai izvēlētās darbgrāmatas saites</w:t>
+            </w:r>
+          </w:p>
+        </w:tc>
+      </w:tr>
+      <w:tr>
+        <w:trPr/>
+        <w:tc>
+          <w:tcPr>
+            <w:tcW w:w="2698" w:type="dxa"/>
+          </w:tcPr>
+          <w:p>
+            <w:pPr>
+              <w:rPr/>
+            </w:pPr>
+            <w:r>
+              <w:rPr>
+                <w:sz w:val="20"/>
+                <w:szCs w:val="20"/>
+                <w:color w:val="1A1A1A"/>
+                <w:rFonts w:ascii="Aptos" w:hAnsi="Aptos" w:cs="Aptos" w:eastAsia="Aptos"/>
+              </w:rPr>
+              <w:t xml:space="preserve">"Slide"</w:t>
+            </w:r>
+          </w:p>
+        </w:tc>
+        <w:tc>
+          <w:tcPr>
+            <w:tcW w:w="6940" w:type="dxa"/>
+          </w:tcPr>
+          <w:p>
+            <w:pPr>
+              <w:rPr/>
+            </w:pPr>
+            <w:r>
+              <w:rPr>
+                <w:sz w:val="20"/>
+                <w:szCs w:val="20"/>
+                <w:color w:val="1A1A1A"/>
+                <w:rFonts w:ascii="Aptos" w:hAnsi="Aptos" w:cs="Aptos" w:eastAsia="Aptos"/>
+              </w:rPr>
+              <w:t xml:space="preserve">rāda tikai izvēlētā slaida saites</w:t>
+            </w:r>
+          </w:p>
+        </w:tc>
+      </w:tr>
+      <w:tr>
+        <w:trPr/>
+        <w:tc>
+          <w:tcPr>
+            <w:tcW w:w="2698" w:type="dxa"/>
+          </w:tcPr>
+          <w:p>
+            <w:pPr>
+              <w:rPr/>
+            </w:pPr>
+            <w:r>
+              <w:rPr>
+                <w:sz w:val="20"/>
+                <w:szCs w:val="20"/>
+                <w:color w:val="1A1A1A"/>
+                <w:rFonts w:ascii="Aptos" w:hAnsi="Aptos" w:cs="Aptos" w:eastAsia="Aptos"/>
+              </w:rPr>
+              <w:t xml:space="preserve">"Link status"</w:t>
+            </w:r>
+          </w:p>
+        </w:tc>
+        <w:tc>
+          <w:tcPr>
+            <w:tcW w:w="6940" w:type="dxa"/>
+          </w:tcPr>
+          <w:p>
+            <w:pPr>
+              <w:rPr/>
+            </w:pPr>
+            <w:r>
+              <w:rPr>
+                <w:sz w:val="20"/>
+                <w:szCs w:val="20"/>
+                <w:color w:val="1A1A1A"/>
+                <w:rFonts w:ascii="Aptos" w:hAnsi="Aptos" w:cs="Aptos" w:eastAsia="Aptos"/>
+              </w:rPr>
+              <w:t xml:space="preserve">rāda tikai izvēlētā stāvokļa saites</w:t>
+            </w:r>
+          </w:p>
+        </w:tc>
+      </w:tr>
+    </w:tbl>
+    <w:p>
+      <w:pPr>
+        <w:rPr/>
+      </w:pPr>
     </w:p>
     <w:p>
       <w:pPr>
@@ -8495,37 +8991,83 @@
           <w:color w:val="1A1A1A"/>
           <w:rFonts w:ascii="Aptos" w:hAnsi="Aptos" w:cs="Aptos" w:eastAsia="Aptos"/>
         </w:rPr>
-        <w:t xml:space="preserve">Lai attēlu saistītu ar citu eksportu, piemēram, ar to pašu tabulu no jaunākas darbgrāmatas, atzīmējiet vienu rindu, nospiediet "Change source" un izvēlieties kādu no cilnē "Inbox" gaidošajiem eksportiem. Izvēli apstiprina poga "Confirm", atceļ poga "Cancel". Attēla slaids, pozīcija un izmērs paliek nemainīgi.</w:t>
-      </w:r>
-    </w:p>
-    <w:p>
-      <w:pPr>
-        <w:rPr/>
-        <w:spacing w:after="120" w:line="276"/>
-      </w:pPr>
-      <w:r>
-        <w:rPr>
-          <w:sz w:val="22"/>
-          <w:szCs w:val="22"/>
-          <w:color w:val="1A1A1A"/>
-          <w:rFonts w:ascii="Aptos" w:hAnsi="Aptos" w:cs="Aptos" w:eastAsia="Aptos"/>
-        </w:rPr>
-        <w:t xml:space="preserve">Darbgrāmatas versiju maiņa notiek tikai caur cilni "Inbox": vispirms jaunā darbgrāmata jāeksportē no Excel, un tikai pēc tam saiti var pārvirzīt uz to.</w:t>
-      </w:r>
-    </w:p>
-    <w:p>
-      <w:pPr>
-        <w:rPr/>
-        <w:spacing w:after="120" w:line="276"/>
-      </w:pPr>
-      <w:r>
-        <w:rPr>
-          <w:sz w:val="22"/>
-          <w:szCs w:val="22"/>
-          <w:color w:val="1A1A1A"/>
-          <w:rFonts w:ascii="Aptos" w:hAnsi="Aptos" w:cs="Aptos" w:eastAsia="Aptos"/>
-        </w:rPr>
-        <w:t xml:space="preserve">Poga "Break link" noņem attēlam saites marķieri. Attēls slaidā paliek, bet vairs netiek atjaunināts.</w:t>
+        <w:t xml:space="preserve">Stāvokļa filtra četras vērtības:</w:t>
+      </w:r>
+    </w:p>
+    <w:p>
+      <w:pPr>
+        <w:rPr/>
+        <w:numPr>
+          <w:numId w:val="23"/>
+          <w:ilvl w:val="0"/>
+        </w:numPr>
+        <w:spacing w:after="60" w:line="276"/>
+      </w:pPr>
+      <w:r>
+        <w:rPr>
+          <w:sz w:val="22"/>
+          <w:szCs w:val="22"/>
+          <w:color w:val="1A1A1A"/>
+          <w:rFonts w:ascii="Aptos" w:hAnsi="Aptos" w:cs="Aptos" w:eastAsia="Aptos"/>
+        </w:rPr>
+        <w:t xml:space="preserve">"Needs update": avota dati Excel pusē mainījušies kopš pēdējās atjaunināšanas.</w:t>
+      </w:r>
+    </w:p>
+    <w:p>
+      <w:pPr>
+        <w:rPr/>
+        <w:numPr>
+          <w:numId w:val="23"/>
+          <w:ilvl w:val="0"/>
+        </w:numPr>
+        <w:spacing w:after="60" w:line="276"/>
+      </w:pPr>
+      <w:r>
+        <w:rPr>
+          <w:sz w:val="22"/>
+          <w:szCs w:val="22"/>
+          <w:color w:val="1A1A1A"/>
+          <w:rFonts w:ascii="Aptos" w:hAnsi="Aptos" w:cs="Aptos" w:eastAsia="Aptos"/>
+        </w:rPr>
+        <w:t xml:space="preserve">"Missing source": relejā šai saitei vairs nav neviena attēla.</w:t>
+      </w:r>
+    </w:p>
+    <w:p>
+      <w:pPr>
+        <w:rPr/>
+        <w:numPr>
+          <w:numId w:val="23"/>
+          <w:ilvl w:val="0"/>
+        </w:numPr>
+        <w:spacing w:after="60" w:line="276"/>
+      </w:pPr>
+      <w:r>
+        <w:rPr>
+          <w:sz w:val="22"/>
+          <w:szCs w:val="22"/>
+          <w:color w:val="1A1A1A"/>
+          <w:rFonts w:ascii="Aptos" w:hAnsi="Aptos" w:cs="Aptos" w:eastAsia="Aptos"/>
+        </w:rPr>
+        <w:t xml:space="preserve">"Wrong link key": attēls saglabāts ar citu saites atslēgu, nevis šī datora aktuālo.</w:t>
+      </w:r>
+    </w:p>
+    <w:p>
+      <w:pPr>
+        <w:rPr/>
+        <w:numPr>
+          <w:numId w:val="23"/>
+          <w:ilvl w:val="0"/>
+        </w:numPr>
+        <w:spacing w:after="60" w:line="276"/>
+      </w:pPr>
+      <w:r>
+        <w:rPr>
+          <w:sz w:val="22"/>
+          <w:szCs w:val="22"/>
+          <w:color w:val="1A1A1A"/>
+          <w:rFonts w:ascii="Aptos" w:hAnsi="Aptos" w:cs="Aptos" w:eastAsia="Aptos"/>
+        </w:rPr>
+        <w:t xml:space="preserve">"Up to date": attēls atbilst jaunākajam Excel eksportam.</w:t>
       </w:r>
     </w:p>
     <w:p>
@@ -8535,7 +9077,7 @@
         <w:spacing w:before="240" w:after="100"/>
         <w:keepNext/>
       </w:pPr>
-      <w:bookmarkStart w:id="56" w:name="_Toc00000055"/>
+      <w:bookmarkStart w:id="57" w:name="_Toc00000056"/>
       <w:r>
         <w:rPr>
           <w:sz w:val="26"/>
@@ -8545,9 +9087,466 @@
           <w:bCs/>
           <w:rFonts w:ascii="Aptos" w:hAnsi="Aptos" w:cs="Aptos" w:eastAsia="Aptos"/>
         </w:rPr>
+        <w:t xml:space="preserve">Go to slide, Change source un Break link</w:t>
+      </w:r>
+      <w:bookmarkEnd w:id="57"/>
+    </w:p>
+    <w:p>
+      <w:pPr>
+        <w:rPr/>
+        <w:spacing w:after="120" w:line="276"/>
+      </w:pPr>
+      <w:r>
+        <w:rPr>
+          <w:sz w:val="22"/>
+          <w:szCs w:val="22"/>
+          <w:color w:val="1A1A1A"/>
+          <w:rFonts w:ascii="Aptos" w:hAnsi="Aptos" w:cs="Aptos" w:eastAsia="Aptos"/>
+        </w:rPr>
+        <w:t xml:space="preserve">Poga "Go to slide" pārlec uz pirmās atzīmētās saites slaidu.</w:t>
+      </w:r>
+    </w:p>
+    <w:p>
+      <w:pPr>
+        <w:rPr/>
+        <w:spacing w:after="120" w:line="276"/>
+      </w:pPr>
+      <w:r>
+        <w:rPr>
+          <w:sz w:val="22"/>
+          <w:szCs w:val="22"/>
+          <w:color w:val="1A1A1A"/>
+          <w:rFonts w:ascii="Aptos" w:hAnsi="Aptos" w:cs="Aptos" w:eastAsia="Aptos"/>
+        </w:rPr>
+        <w:t xml:space="preserve">Lai attēlu saistītu ar citu eksportu, piemēram, ar to pašu tabulu no jaunākas darbgrāmatas, atzīmējiet vienu rindu, nospiediet "Change source" un izvēlieties kādu no cilnē "Inbox" gaidošajiem eksportiem. Izvēli apstiprina poga "Confirm", atceļ poga "Cancel". Attēla slaids, pozīcija un izmērs paliek nemainīgi.</w:t>
+      </w:r>
+    </w:p>
+    <w:p>
+      <w:pPr>
+        <w:rPr/>
+        <w:spacing w:after="120" w:line="276"/>
+      </w:pPr>
+      <w:r>
+        <w:rPr>
+          <w:sz w:val="22"/>
+          <w:szCs w:val="22"/>
+          <w:color w:val="1A1A1A"/>
+          <w:rFonts w:ascii="Aptos" w:hAnsi="Aptos" w:cs="Aptos" w:eastAsia="Aptos"/>
+        </w:rPr>
+        <w:t xml:space="preserve">Darbgrāmatas versiju maiņa notiek tikai caur cilni "Inbox": vispirms jaunā darbgrāmata jāeksportē no Excel, un tikai pēc tam saiti var pārvirzīt uz to.</w:t>
+      </w:r>
+    </w:p>
+    <w:p>
+      <w:pPr>
+        <w:rPr/>
+        <w:spacing w:after="120" w:line="276"/>
+      </w:pPr>
+      <w:r>
+        <w:rPr>
+          <w:sz w:val="22"/>
+          <w:szCs w:val="22"/>
+          <w:color w:val="1A1A1A"/>
+          <w:rFonts w:ascii="Aptos" w:hAnsi="Aptos" w:cs="Aptos" w:eastAsia="Aptos"/>
+        </w:rPr>
+        <w:t xml:space="preserve">Poga "Break link" noņem attēlam saites marķieri. Attēls slaidā paliek, bet vairs netiek atjaunināts.</w:t>
+      </w:r>
+    </w:p>
+    <w:p>
+      <w:pPr>
+        <w:rPr/>
+        <w:pStyle w:val="Heading2"/>
+        <w:spacing w:before="240" w:after="100"/>
+        <w:keepNext/>
+      </w:pPr>
+      <w:bookmarkStart w:id="58" w:name="_Toc00000057"/>
+      <w:r>
+        <w:rPr>
+          <w:sz w:val="26"/>
+          <w:szCs w:val="26"/>
+          <w:color w:val="14213D"/>
+          <w:b/>
+          <w:bCs/>
+          <w:rFonts w:ascii="Aptos" w:hAnsi="Aptos" w:cs="Aptos" w:eastAsia="Aptos"/>
+        </w:rPr>
+        <w:t xml:space="preserve">Object tools</w:t>
+      </w:r>
+      <w:bookmarkEnd w:id="58"/>
+    </w:p>
+    <w:p>
+      <w:pPr>
+        <w:rPr/>
+        <w:spacing w:after="120" w:line="276"/>
+      </w:pPr>
+      <w:r>
+        <w:rPr>
+          <w:sz w:val="22"/>
+          <w:szCs w:val="22"/>
+          <w:color w:val="1A1A1A"/>
+          <w:rFonts w:ascii="Aptos" w:hAnsi="Aptos" w:cs="Aptos" w:eastAsia="Aptos"/>
+        </w:rPr>
+        <w:t xml:space="preserve">PowerPoint cilnē "Tools" ir sadaļa "Object tools" darbam ar slaidā atlasītajām figūrām. Tā prasa PowerPoint 2021 vai Microsoft 365; vecākā versijā panelis to pasaka jau pieslēdzoties.</w:t>
+      </w:r>
+    </w:p>
+    <w:p>
+      <w:pPr>
+        <w:rPr/>
+        <w:spacing w:after="120" w:line="276"/>
+      </w:pPr>
+      <w:r>
+        <w:rPr>
+          <w:sz w:val="22"/>
+          <w:szCs w:val="22"/>
+          <w:color w:val="1A1A1A"/>
+          <w:rFonts w:ascii="Aptos" w:hAnsi="Aptos" w:cs="Aptos" w:eastAsia="Aptos"/>
+        </w:rPr>
+        <w:t xml:space="preserve">"Align" izvēlnē izvēlieties virzienu (pa kreisi, centrā, pa labi, augšā, vidū vai apakšā) un nospiediet "Apply": atlasītās figūras līdzinās pēc visu atlasīto figūru kopējām malām. Nepieciešamas vismaz divas figūras.</w:t>
+      </w:r>
+    </w:p>
+    <w:p>
+      <w:pPr>
+        <w:rPr/>
+        <w:spacing w:after="120" w:line="276"/>
+      </w:pPr>
+      <w:r>
+        <w:rPr>
+          <w:sz w:val="22"/>
+          <w:szCs w:val="22"/>
+          <w:color w:val="1A1A1A"/>
+          <w:rFonts w:ascii="Aptos" w:hAnsi="Aptos" w:cs="Aptos" w:eastAsia="Aptos"/>
+        </w:rPr>
+        <w:t xml:space="preserve">"Distribute" izvēlnē izvēlieties virzienu (šķērsām vai lejup) un nospiediet "Apply": atstarpes starp trim vai vairāk figūrām kļūst vienādas; pirmās un pēdējās figūras vieta nemainās. Nepieciešamas vismaz trīs figūras.</w:t>
+      </w:r>
+    </w:p>
+    <w:tbl>
+      <w:tblPr>
+        <w:tblW w:w="9638" w:type="dxa"/>
+        <w:jc w:val="left"/>
+        <w:tblBorders>
+          <w:top w:val="single" w:sz="2" w:space="0" w:color="C8CEDA"/>
+          <w:left w:val="single" w:sz="2" w:space="0" w:color="C8CEDA"/>
+          <w:bottom w:val="single" w:sz="2" w:space="0" w:color="C8CEDA"/>
+          <w:right w:val="single" w:sz="2" w:space="0" w:color="C8CEDA"/>
+          <w:insideH w:val="single" w:sz="2" w:space="0" w:color="C8CEDA"/>
+          <w:insideV w:val="single" w:sz="2" w:space="0" w:color="C8CEDA"/>
+        </w:tblBorders>
+        <w:tblCellMar>
+          <w:top w:w="60" w:type="dxa"/>
+          <w:left w:w="108" w:type="dxa"/>
+          <w:bottom w:w="60" w:type="dxa"/>
+          <w:right w:w="108" w:type="dxa"/>
+        </w:tblCellMar>
+        <w:tblLayout w:type="fixed"/>
+      </w:tblPr>
+      <w:tblGrid>
+        <w:gridCol w:w="2698" w:type="dxa"/>
+        <w:gridCol w:w="6940" w:type="dxa"/>
+      </w:tblGrid>
+      <w:tr>
+        <w:trPr>
+          <w:cantSplit/>
+        </w:trPr>
+        <w:tc>
+          <w:tcPr>
+            <w:tcW w:w="2698" w:type="dxa"/>
+            <w:shd w:val="clear" w:color="auto" w:fill="DFF5F2"/>
+          </w:tcPr>
+          <w:p>
+            <w:pPr>
+              <w:rPr/>
+            </w:pPr>
+            <w:r>
+              <w:rPr>
+                <w:sz w:val="20"/>
+                <w:szCs w:val="20"/>
+                <w:color w:val="14213D"/>
+                <w:b/>
+                <w:bCs/>
+                <w:rFonts w:ascii="Aptos" w:hAnsi="Aptos" w:cs="Aptos" w:eastAsia="Aptos"/>
+              </w:rPr>
+              <w:t xml:space="preserve">Poga</w:t>
+            </w:r>
+          </w:p>
+        </w:tc>
+        <w:tc>
+          <w:tcPr>
+            <w:tcW w:w="6940" w:type="dxa"/>
+            <w:shd w:val="clear" w:color="auto" w:fill="DFF5F2"/>
+          </w:tcPr>
+          <w:p>
+            <w:pPr>
+              <w:rPr/>
+            </w:pPr>
+            <w:r>
+              <w:rPr>
+                <w:sz w:val="20"/>
+                <w:szCs w:val="20"/>
+                <w:color w:val="14213D"/>
+                <w:b/>
+                <w:bCs/>
+                <w:rFonts w:ascii="Aptos" w:hAnsi="Aptos" w:cs="Aptos" w:eastAsia="Aptos"/>
+              </w:rPr>
+              <w:t xml:space="preserve">Ko tā dara</w:t>
+            </w:r>
+          </w:p>
+        </w:tc>
+      </w:tr>
+      <w:tr>
+        <w:trPr/>
+        <w:tc>
+          <w:tcPr>
+            <w:tcW w:w="2698" w:type="dxa"/>
+          </w:tcPr>
+          <w:p>
+            <w:pPr>
+              <w:rPr/>
+            </w:pPr>
+            <w:r>
+              <w:rPr>
+                <w:sz w:val="20"/>
+                <w:szCs w:val="20"/>
+                <w:color w:val="1A1A1A"/>
+                <w:rFonts w:ascii="Aptos" w:hAnsi="Aptos" w:cs="Aptos" w:eastAsia="Aptos"/>
+              </w:rPr>
+              <w:t xml:space="preserve">"Match size"</w:t>
+            </w:r>
+          </w:p>
+        </w:tc>
+        <w:tc>
+          <w:tcPr>
+            <w:tcW w:w="6940" w:type="dxa"/>
+          </w:tcPr>
+          <w:p>
+            <w:pPr>
+              <w:rPr/>
+            </w:pPr>
+            <w:r>
+              <w:rPr>
+                <w:sz w:val="20"/>
+                <w:szCs w:val="20"/>
+                <w:color w:val="1A1A1A"/>
+                <w:rFonts w:ascii="Aptos" w:hAnsi="Aptos" w:cs="Aptos" w:eastAsia="Aptos"/>
+              </w:rPr>
+              <w:t xml:space="preserve">uzliek pirmās atlasītās figūras platumu un augstumu visām pārējām atlasītajām figūrām</w:t>
+            </w:r>
+          </w:p>
+        </w:tc>
+      </w:tr>
+      <w:tr>
+        <w:trPr/>
+        <w:tc>
+          <w:tcPr>
+            <w:tcW w:w="2698" w:type="dxa"/>
+          </w:tcPr>
+          <w:p>
+            <w:pPr>
+              <w:rPr/>
+            </w:pPr>
+            <w:r>
+              <w:rPr>
+                <w:sz w:val="20"/>
+                <w:szCs w:val="20"/>
+                <w:color w:val="1A1A1A"/>
+                <w:rFonts w:ascii="Aptos" w:hAnsi="Aptos" w:cs="Aptos" w:eastAsia="Aptos"/>
+              </w:rPr>
+              <w:t xml:space="preserve">"Select similar"</w:t>
+            </w:r>
+          </w:p>
+        </w:tc>
+        <w:tc>
+          <w:tcPr>
+            <w:tcW w:w="6940" w:type="dxa"/>
+          </w:tcPr>
+          <w:p>
+            <w:pPr>
+              <w:rPr/>
+            </w:pPr>
+            <w:r>
+              <w:rPr>
+                <w:sz w:val="20"/>
+                <w:szCs w:val="20"/>
+                <w:color w:val="1A1A1A"/>
+                <w:rFonts w:ascii="Aptos" w:hAnsi="Aptos" w:cs="Aptos" w:eastAsia="Aptos"/>
+              </w:rPr>
+              <w:t xml:space="preserve">no vienas atlasītas figūras atlasa visas pārējās tā paša tipa un gandrīz tāda paša izmēra figūras tajā pašā slaidā</w:t>
+            </w:r>
+          </w:p>
+        </w:tc>
+      </w:tr>
+      <w:tr>
+        <w:trPr/>
+        <w:tc>
+          <w:tcPr>
+            <w:tcW w:w="2698" w:type="dxa"/>
+          </w:tcPr>
+          <w:p>
+            <w:pPr>
+              <w:rPr/>
+            </w:pPr>
+            <w:r>
+              <w:rPr>
+                <w:sz w:val="20"/>
+                <w:szCs w:val="20"/>
+                <w:color w:val="1A1A1A"/>
+                <w:rFonts w:ascii="Aptos" w:hAnsi="Aptos" w:cs="Aptos" w:eastAsia="Aptos"/>
+              </w:rPr>
+              <w:t xml:space="preserve">"Swap"</w:t>
+            </w:r>
+          </w:p>
+        </w:tc>
+        <w:tc>
+          <w:tcPr>
+            <w:tcW w:w="6940" w:type="dxa"/>
+          </w:tcPr>
+          <w:p>
+            <w:pPr>
+              <w:rPr/>
+            </w:pPr>
+            <w:r>
+              <w:rPr>
+                <w:sz w:val="20"/>
+                <w:szCs w:val="20"/>
+                <w:color w:val="1A1A1A"/>
+                <w:rFonts w:ascii="Aptos" w:hAnsi="Aptos" w:cs="Aptos" w:eastAsia="Aptos"/>
+              </w:rPr>
+              <w:t xml:space="preserve">samaina vietām tieši divas atlasītas figūras</w:t>
+            </w:r>
+          </w:p>
+        </w:tc>
+      </w:tr>
+    </w:tbl>
+    <w:p>
+      <w:pPr>
+        <w:rPr/>
+      </w:pPr>
+    </w:p>
+    <w:p>
+      <w:pPr>
+        <w:rPr/>
+        <w:pStyle w:val="Heading2"/>
+        <w:spacing w:before="240" w:after="100"/>
+        <w:keepNext/>
+      </w:pPr>
+      <w:bookmarkStart w:id="59" w:name="_Toc00000058"/>
+      <w:r>
+        <w:rPr>
+          <w:sz w:val="26"/>
+          <w:szCs w:val="26"/>
+          <w:color w:val="14213D"/>
+          <w:b/>
+          <w:bCs/>
+          <w:rFonts w:ascii="Aptos" w:hAnsi="Aptos" w:cs="Aptos" w:eastAsia="Aptos"/>
+        </w:rPr>
+        <w:t xml:space="preserve">Smart Painter</w:t>
+      </w:r>
+      <w:bookmarkEnd w:id="59"/>
+    </w:p>
+    <w:p>
+      <w:pPr>
+        <w:rPr/>
+        <w:spacing w:after="120" w:line="276"/>
+      </w:pPr>
+      <w:r>
+        <w:rPr>
+          <w:sz w:val="22"/>
+          <w:szCs w:val="22"/>
+          <w:color w:val="1A1A1A"/>
+          <w:rFonts w:ascii="Aptos" w:hAnsi="Aptos" w:cs="Aptos" w:eastAsia="Aptos"/>
+        </w:rPr>
+        <w:t xml:space="preserve">Zem "Object tools" ir "Smart Painter": tas nokopē vienas figūras aizpildījumu un kontūru uz citām figūrām, neatkarīgi no to izmēra vai satura.</w:t>
+      </w:r>
+    </w:p>
+    <w:p>
+      <w:pPr>
+        <w:rPr/>
+        <w:numPr>
+          <w:numId w:val="24"/>
+          <w:ilvl w:val="0"/>
+        </w:numPr>
+        <w:spacing w:after="60" w:line="276"/>
+      </w:pPr>
+      <w:r>
+        <w:rPr>
+          <w:sz w:val="22"/>
+          <w:szCs w:val="22"/>
+          <w:color w:val="1A1A1A"/>
+          <w:rFonts w:ascii="Aptos" w:hAnsi="Aptos" w:cs="Aptos" w:eastAsia="Aptos"/>
+        </w:rPr>
+        <w:t xml:space="preserve">Atlasiet vienu figūru ar vienkrāsainu aizpildījumu vai bez aizpildījuma un nospiediet "Capture".</w:t>
+      </w:r>
+    </w:p>
+    <w:p>
+      <w:pPr>
+        <w:rPr/>
+        <w:numPr>
+          <w:numId w:val="24"/>
+          <w:ilvl w:val="0"/>
+        </w:numPr>
+        <w:spacing w:after="60" w:line="276"/>
+      </w:pPr>
+      <w:r>
+        <w:rPr>
+          <w:sz w:val="22"/>
+          <w:szCs w:val="22"/>
+          <w:color w:val="1A1A1A"/>
+          <w:rFonts w:ascii="Aptos" w:hAnsi="Aptos" w:cs="Aptos" w:eastAsia="Aptos"/>
+        </w:rPr>
+        <w:t xml:space="preserve">Atlasiet vienu vai vairākas mērķa figūras.</w:t>
+      </w:r>
+    </w:p>
+    <w:p>
+      <w:pPr>
+        <w:rPr/>
+        <w:numPr>
+          <w:numId w:val="24"/>
+          <w:ilvl w:val="0"/>
+        </w:numPr>
+        <w:spacing w:after="60" w:line="276"/>
+      </w:pPr>
+      <w:r>
+        <w:rPr>
+          <w:sz w:val="22"/>
+          <w:szCs w:val="22"/>
+          <w:color w:val="1A1A1A"/>
+          <w:rFonts w:ascii="Aptos" w:hAnsi="Aptos" w:cs="Aptos" w:eastAsia="Aptos"/>
+        </w:rPr>
+        <w:t xml:space="preserve">Nospiediet "Apply".</w:t>
+      </w:r>
+    </w:p>
+    <w:p>
+      <w:pPr>
+        <w:rPr/>
+        <w:spacing w:after="120" w:line="276"/>
+      </w:pPr>
+      <w:r>
+        <w:rPr>
+          <w:sz w:val="22"/>
+          <w:szCs w:val="22"/>
+          <w:color w:val="1A1A1A"/>
+          <w:rFonts w:ascii="Aptos" w:hAnsi="Aptos" w:cs="Aptos" w:eastAsia="Aptos"/>
+        </w:rPr>
+        <w:t xml:space="preserve">Attēla vai gradienta aizpildījumu "Capture" nepieņem: der tikai vienkrāsains aizpildījums vai figūra bez aizpildījuma.</w:t>
+      </w:r>
+    </w:p>
+    <w:p>
+      <w:pPr>
+        <w:rPr/>
+        <w:pStyle w:val="Heading2"/>
+        <w:spacing w:before="240" w:after="100"/>
+        <w:keepNext/>
+      </w:pPr>
+      <w:bookmarkStart w:id="60" w:name="_Toc00000059"/>
+      <w:r>
+        <w:rPr>
+          <w:sz w:val="26"/>
+          <w:szCs w:val="26"/>
+          <w:color w:val="14213D"/>
+          <w:b/>
+          <w:bCs/>
+          <w:rFonts w:ascii="Aptos" w:hAnsi="Aptos" w:cs="Aptos" w:eastAsia="Aptos"/>
+        </w:rPr>
         <w:t xml:space="preserve">Drošība</w:t>
       </w:r>
-      <w:bookmarkEnd w:id="56"/>
+      <w:bookmarkEnd w:id="60"/>
     </w:p>
     <w:p>
       <w:pPr>
@@ -8590,7 +9589,7 @@
         <w:keepNext/>
         <w:pageBreakBefore/>
       </w:pPr>
-      <w:bookmarkStart w:id="57" w:name="_Toc00000056"/>
+      <w:bookmarkStart w:id="61" w:name="_Toc00000060"/>
       <w:r>
         <w:rPr>
           <w:sz w:val="36"/>
@@ -8613,7 +9612,7 @@
         </w:rPr>
         <w:t xml:space="preserve">Cilne Brand</w:t>
       </w:r>
-      <w:bookmarkEnd w:id="57"/>
+      <w:bookmarkEnd w:id="61"/>
     </w:p>
     <w:p>
       <w:pPr>
@@ -8622,7 +9621,7 @@
         <w:spacing w:before="240" w:after="100"/>
         <w:keepNext/>
       </w:pPr>
-      <w:bookmarkStart w:id="58" w:name="_Toc00000057"/>
+      <w:bookmarkStart w:id="62" w:name="_Toc00000061"/>
       <w:r>
         <w:rPr>
           <w:sz w:val="26"/>
@@ -8634,7 +9633,7 @@
         </w:rPr>
         <w:t xml:space="preserve">Palete</w:t>
       </w:r>
-      <w:bookmarkEnd w:id="58"/>
+      <w:bookmarkEnd w:id="62"/>
     </w:p>
     <w:p>
       <w:pPr>
@@ -9104,7 +10103,7 @@
         <w:spacing w:before="240" w:after="100"/>
         <w:keepNext/>
       </w:pPr>
-      <w:bookmarkStart w:id="59" w:name="_Toc00000058"/>
+      <w:bookmarkStart w:id="63" w:name="_Toc00000062"/>
       <w:r>
         <w:rPr>
           <w:sz w:val="26"/>
@@ -9116,7 +10115,7 @@
         </w:rPr>
         <w:t xml:space="preserve">Krāsas no logotipa</w:t>
       </w:r>
-      <w:bookmarkEnd w:id="59"/>
+      <w:bookmarkEnd w:id="63"/>
     </w:p>
     <w:p>
       <w:pPr>
@@ -9140,7 +10139,7 @@
         <w:spacing w:before="240" w:after="100"/>
         <w:keepNext/>
       </w:pPr>
-      <w:bookmarkStart w:id="60" w:name="_Toc00000059"/>
+      <w:bookmarkStart w:id="64" w:name="_Toc00000063"/>
       <w:r>
         <w:rPr>
           <w:sz w:val="26"/>
@@ -9152,7 +10151,7 @@
         </w:rPr>
         <w:t xml:space="preserve">Fonts, valoda un skaitļu stils</w:t>
       </w:r>
-      <w:bookmarkEnd w:id="60"/>
+      <w:bookmarkEnd w:id="64"/>
     </w:p>
     <w:p>
       <w:pPr>
@@ -9583,7 +10582,7 @@
         <w:spacing w:before="240" w:after="100"/>
         <w:keepNext/>
       </w:pPr>
-      <w:bookmarkStart w:id="61" w:name="_Toc00000060"/>
+      <w:bookmarkStart w:id="65" w:name="_Toc00000064"/>
       <w:r>
         <w:rPr>
           <w:sz w:val="26"/>
@@ -9595,7 +10594,7 @@
         </w:rPr>
         <w:t xml:space="preserve">Valūta</w:t>
       </w:r>
-      <w:bookmarkEnd w:id="61"/>
+      <w:bookmarkEnd w:id="65"/>
     </w:p>
     <w:p>
       <w:pPr>
@@ -9619,7 +10618,7 @@
         <w:spacing w:before="240" w:after="100"/>
         <w:keepNext/>
       </w:pPr>
-      <w:bookmarkStart w:id="62" w:name="_Toc00000061"/>
+      <w:bookmarkStart w:id="66" w:name="_Toc00000065"/>
       <w:r>
         <w:rPr>
           <w:sz w:val="26"/>
@@ -9631,7 +10630,7 @@
         </w:rPr>
         <w:t xml:space="preserve">Autocolor on edit</w:t>
       </w:r>
-      <w:bookmarkEnd w:id="62"/>
+      <w:bookmarkEnd w:id="66"/>
     </w:p>
     <w:p>
       <w:pPr>
@@ -9655,7 +10654,7 @@
         <w:spacing w:before="240" w:after="100"/>
         <w:keepNext/>
       </w:pPr>
-      <w:bookmarkStart w:id="63" w:name="_Toc00000062"/>
+      <w:bookmarkStart w:id="67" w:name="_Toc00000066"/>
       <w:r>
         <w:rPr>
           <w:sz w:val="26"/>
@@ -9667,7 +10666,7 @@
         </w:rPr>
         <w:t xml:space="preserve">Iestatījumu pārnešana un atiestatīšana</w:t>
       </w:r>
-      <w:bookmarkEnd w:id="63"/>
+      <w:bookmarkEnd w:id="67"/>
     </w:p>
     <w:p>
       <w:pPr>
@@ -9725,7 +10724,7 @@
         <w:keepNext/>
         <w:pageBreakBefore/>
       </w:pPr>
-      <w:bookmarkStart w:id="64" w:name="_Toc00000063"/>
+      <w:bookmarkStart w:id="68" w:name="_Toc00000067"/>
       <w:r>
         <w:rPr>
           <w:sz w:val="36"/>
@@ -9748,7 +10747,7 @@
         </w:rPr>
         <w:t xml:space="preserve">Īsinājumtaustiņi</w:t>
       </w:r>
-      <w:bookmarkEnd w:id="64"/>
+      <w:bookmarkEnd w:id="68"/>
     </w:p>
     <w:p>
       <w:pPr>
@@ -9757,7 +10756,7 @@
         <w:spacing w:before="240" w:after="100"/>
         <w:keepNext/>
       </w:pPr>
-      <w:bookmarkStart w:id="65" w:name="_Toc00000064"/>
+      <w:bookmarkStart w:id="69" w:name="_Toc00000068"/>
       <w:r>
         <w:rPr>
           <w:sz w:val="26"/>
@@ -9769,7 +10768,7 @@
         </w:rPr>
         <w:t xml:space="preserve">Visas kombinācijas</w:t>
       </w:r>
-      <w:bookmarkEnd w:id="65"/>
+      <w:bookmarkEnd w:id="69"/>
     </w:p>
     <w:p>
       <w:pPr>
@@ -12434,7 +13433,7 @@
         <w:keepNext/>
         <w:pageBreakBefore/>
       </w:pPr>
-      <w:bookmarkStart w:id="66" w:name="_Toc00000065"/>
+      <w:bookmarkStart w:id="70" w:name="_Toc00000069"/>
       <w:r>
         <w:rPr>
           <w:sz w:val="36"/>
@@ -12457,7 +13456,7 @@
         </w:rPr>
         <w:t xml:space="preserve">Biežākās problēmas</w:t>
       </w:r>
-      <w:bookmarkEnd w:id="66"/>
+      <w:bookmarkEnd w:id="70"/>
     </w:p>
     <w:p>
       <w:pPr>
@@ -12466,7 +13465,7 @@
         <w:spacing w:before="240" w:after="100"/>
         <w:keepNext/>
       </w:pPr>
-      <w:bookmarkStart w:id="67" w:name="_Toc00000066"/>
+      <w:bookmarkStart w:id="71" w:name="_Toc00000070"/>
       <w:r>
         <w:rPr>
           <w:sz w:val="26"/>
@@ -12478,7 +13477,7 @@
         </w:rPr>
         <w:t xml:space="preserve">Ziņojumi un to iemesli</w:t>
       </w:r>
-      <w:bookmarkEnd w:id="67"/>
+      <w:bookmarkEnd w:id="71"/>
     </w:p>
     <w:tbl>
       <w:tblPr>
@@ -13176,6 +14175,66 @@
           </w:p>
         </w:tc>
       </w:tr>
+      <w:tr>
+        <w:trPr/>
+        <w:tc>
+          <w:tcPr>
+            <w:tcW w:w="2698" w:type="dxa"/>
+          </w:tcPr>
+          <w:p>
+            <w:pPr>
+              <w:rPr/>
+            </w:pPr>
+            <w:r>
+              <w:rPr>
+                <w:sz w:val="20"/>
+                <w:szCs w:val="20"/>
+                <w:color w:val="1A1A1A"/>
+                <w:rFonts w:ascii="Aptos" w:hAnsi="Aptos" w:cs="Aptos" w:eastAsia="Aptos"/>
+              </w:rPr>
+              <w:t xml:space="preserve">"No combination reaches the target within the tolerance."</w:t>
+            </w:r>
+          </w:p>
+        </w:tc>
+        <w:tc>
+          <w:tcPr>
+            <w:tcW w:w="3470" w:type="dxa"/>
+          </w:tcPr>
+          <w:p>
+            <w:pPr>
+              <w:rPr/>
+            </w:pPr>
+            <w:r>
+              <w:rPr>
+                <w:sz w:val="20"/>
+                <w:szCs w:val="20"/>
+                <w:color w:val="1A1A1A"/>
+                <w:rFonts w:ascii="Aptos" w:hAnsi="Aptos" w:cs="Aptos" w:eastAsia="Aptos"/>
+              </w:rPr>
+              <w:t xml:space="preserve">Neviena skaitļu kombinācija atlasē nesasniedz mērķi pieļaujamās novirzes robežās.</w:t>
+            </w:r>
+          </w:p>
+        </w:tc>
+        <w:tc>
+          <w:tcPr>
+            <w:tcW w:w="3470" w:type="dxa"/>
+          </w:tcPr>
+          <w:p>
+            <w:pPr>
+              <w:rPr/>
+            </w:pPr>
+            <w:r>
+              <w:rPr>
+                <w:sz w:val="20"/>
+                <w:szCs w:val="20"/>
+                <w:color w:val="1A1A1A"/>
+                <w:rFonts w:ascii="Aptos" w:hAnsi="Aptos" w:cs="Aptos" w:eastAsia="Aptos"/>
+              </w:rPr>
+              <w:t xml:space="preserve">Palieliniet toleranci vai pārbaudiet, vai atlasē ir īstie skaitļi.</w:t>
+            </w:r>
+          </w:p>
+        </w:tc>
+      </w:tr>
     </w:tbl>
     <w:p>
       <w:pPr>
@@ -13189,7 +14248,7 @@
         <w:spacing w:before="240" w:after="100"/>
         <w:keepNext/>
       </w:pPr>
-      <w:bookmarkStart w:id="68" w:name="_Toc00000067"/>
+      <w:bookmarkStart w:id="72" w:name="_Toc00000071"/>
       <w:r>
         <w:rPr>
           <w:sz w:val="26"/>
@@ -13201,13 +14260,13 @@
         </w:rPr>
         <w:t xml:space="preserve">Ierobežojumi</w:t>
       </w:r>
-      <w:bookmarkEnd w:id="68"/>
+      <w:bookmarkEnd w:id="72"/>
     </w:p>
     <w:p>
       <w:pPr>
         <w:rPr/>
         <w:numPr>
-          <w:numId w:val="22"/>
+          <w:numId w:val="25"/>
           <w:ilvl w:val="0"/>
         </w:numPr>
         <w:spacing w:after="60" w:line="276"/>
@@ -13226,7 +14285,7 @@
       <w:pPr>
         <w:rPr/>
         <w:numPr>
-          <w:numId w:val="22"/>
+          <w:numId w:val="25"/>
           <w:ilvl w:val="0"/>
         </w:numPr>
         <w:spacing w:after="60" w:line="276"/>
@@ -13245,7 +14304,7 @@
       <w:pPr>
         <w:rPr/>
         <w:numPr>
-          <w:numId w:val="22"/>
+          <w:numId w:val="25"/>
           <w:ilvl w:val="0"/>
         </w:numPr>
         <w:spacing w:after="60" w:line="276"/>
@@ -13264,7 +14323,7 @@
       <w:pPr>
         <w:rPr/>
         <w:numPr>
-          <w:numId w:val="22"/>
+          <w:numId w:val="25"/>
           <w:ilvl w:val="0"/>
         </w:numPr>
         <w:spacing w:after="60" w:line="276"/>
@@ -13283,7 +14342,7 @@
       <w:pPr>
         <w:rPr/>
         <w:numPr>
-          <w:numId w:val="22"/>
+          <w:numId w:val="25"/>
           <w:ilvl w:val="0"/>
         </w:numPr>
         <w:spacing w:after="60" w:line="276"/>
@@ -13302,7 +14361,7 @@
       <w:pPr>
         <w:rPr/>
         <w:numPr>
-          <w:numId w:val="22"/>
+          <w:numId w:val="25"/>
           <w:ilvl w:val="0"/>
         </w:numPr>
         <w:spacing w:after="60" w:line="276"/>
@@ -13321,7 +14380,7 @@
       <w:pPr>
         <w:rPr/>
         <w:numPr>
-          <w:numId w:val="22"/>
+          <w:numId w:val="25"/>
           <w:ilvl w:val="0"/>
         </w:numPr>
         <w:spacing w:after="60" w:line="276"/>
@@ -13340,7 +14399,7 @@
       <w:pPr>
         <w:rPr/>
         <w:numPr>
-          <w:numId w:val="22"/>
+          <w:numId w:val="25"/>
           <w:ilvl w:val="0"/>
         </w:numPr>
         <w:spacing w:after="60" w:line="276"/>
@@ -13359,7 +14418,7 @@
       <w:pPr>
         <w:rPr/>
         <w:numPr>
-          <w:numId w:val="22"/>
+          <w:numId w:val="25"/>
           <w:ilvl w:val="0"/>
         </w:numPr>
         <w:spacing w:after="60" w:line="276"/>
@@ -13372,6 +14431,63 @@
           <w:rFonts w:ascii="Aptos" w:hAnsi="Aptos" w:cs="Aptos" w:eastAsia="Aptos"/>
         </w:rPr>
         <w:t xml:space="preserve">Relejs glabā vienu iepriekšējo attēla versiju, tāpēc "Revert last update" atgriež tikai vienu soli.</w:t>
+      </w:r>
+    </w:p>
+    <w:p>
+      <w:pPr>
+        <w:rPr/>
+        <w:numPr>
+          <w:numId w:val="25"/>
+          <w:ilvl w:val="0"/>
+        </w:numPr>
+        <w:spacing w:after="60" w:line="276"/>
+      </w:pPr>
+      <w:r>
+        <w:rPr>
+          <w:sz w:val="22"/>
+          <w:szCs w:val="22"/>
+          <w:color w:val="1A1A1A"/>
+          <w:rFonts w:ascii="Aptos" w:hAnsi="Aptos" w:cs="Aptos" w:eastAsia="Aptos"/>
+        </w:rPr>
+        <w:t xml:space="preserve">"Find a combination" aptver līdz 34 skaitliskām šūnām vienā atlasē.</w:t>
+      </w:r>
+    </w:p>
+    <w:p>
+      <w:pPr>
+        <w:rPr/>
+        <w:numPr>
+          <w:numId w:val="25"/>
+          <w:ilvl w:val="0"/>
+        </w:numPr>
+        <w:spacing w:after="60" w:line="276"/>
+      </w:pPr>
+      <w:r>
+        <w:rPr>
+          <w:sz w:val="22"/>
+          <w:szCs w:val="22"/>
+          <w:color w:val="1A1A1A"/>
+          <w:rFonts w:ascii="Aptos" w:hAnsi="Aptos" w:cs="Aptos" w:eastAsia="Aptos"/>
+        </w:rPr>
+        <w:t xml:space="preserve">"Object tools" un "Smart Painter" prasa PowerPoint 2021 vai Microsoft 365 (PowerPointApi 1.5).</w:t>
+      </w:r>
+    </w:p>
+    <w:p>
+      <w:pPr>
+        <w:rPr/>
+        <w:numPr>
+          <w:numId w:val="25"/>
+          <w:ilvl w:val="0"/>
+        </w:numPr>
+        <w:spacing w:after="60" w:line="276"/>
+      </w:pPr>
+      <w:r>
+        <w:rPr>
+          <w:sz w:val="22"/>
+          <w:szCs w:val="22"/>
+          <w:color w:val="1A1A1A"/>
+          <w:rFonts w:ascii="Aptos" w:hAnsi="Aptos" w:cs="Aptos" w:eastAsia="Aptos"/>
+        </w:rPr>
+        <w:t xml:space="preserve">"Align" prasa vismaz divas atlasītas figūras, "Distribute" vismaz trīs, "Swap" tieši divas.</w:t>
       </w:r>
     </w:p>
     <w:p>
@@ -13385,7 +14501,7 @@
         <w:keepNext/>
         <w:pageBreakBefore/>
       </w:pPr>
-      <w:bookmarkStart w:id="69" w:name="_Toc00000068"/>
+      <w:bookmarkStart w:id="73" w:name="_Toc00000072"/>
       <w:r>
         <w:rPr>
           <w:sz w:val="36"/>
@@ -13408,7 +14524,7 @@
         </w:rPr>
         <w:t xml:space="preserve">Versija</w:t>
       </w:r>
-      <w:bookmarkEnd w:id="69"/>
+      <w:bookmarkEnd w:id="73"/>
     </w:p>
     <w:p>
       <w:pPr>
@@ -13417,7 +14533,7 @@
         <w:spacing w:before="240" w:after="100"/>
         <w:keepNext/>
       </w:pPr>
-      <w:bookmarkStart w:id="70" w:name="_Toc00000069"/>
+      <w:bookmarkStart w:id="74" w:name="_Toc00000073"/>
       <w:r>
         <w:rPr>
           <w:sz w:val="26"/>
@@ -13429,7 +14545,7 @@
         </w:rPr>
         <w:t xml:space="preserve">Kura versija ir aprakstīta</w:t>
       </w:r>
-      <w:bookmarkEnd w:id="70"/>
+      <w:bookmarkEnd w:id="74"/>
     </w:p>
     <w:p>
       <w:pPr>
@@ -13443,7 +14559,7 @@
           <w:color w:val="1A1A1A"/>
           <w:rFonts w:ascii="Aptos" w:hAnsi="Aptos" w:cs="Aptos" w:eastAsia="Aptos"/>
         </w:rPr>
-        <w:t xml:space="preserve">Šī rokasgrāmata apraksta pls,fix versiju v2.4.004. Tā pati versija ir uzrakstīta uz vāka un katras lapas apakšā.</w:t>
+        <w:t xml:space="preserve">Šī rokasgrāmata apraksta pls,fix versiju v2.5.004. Tā pati versija ir uzrakstīta uz vāka un katras lapas apakšā.</w:t>
       </w:r>
     </w:p>
     <w:p>
@@ -13508,7 +14624,7 @@
         <w:color w:val="5B6472"/>
         <w:rFonts w:ascii="Aptos" w:hAnsi="Aptos" w:cs="Aptos" w:eastAsia="Aptos"/>
       </w:rPr>
-      <w:t xml:space="preserve">pls,fix rokasgrāmata v2.4.004   |   </w:t>
+      <w:t xml:space="preserve">pls,fix rokasgrāmata v2.5.004   |   </w:t>
     </w:r>
     <w:r>
       <w:rPr>
@@ -13694,19 +14810,19 @@
     </w:lvlOverride>
   </w:num>
   <w:num w:numId="15">
+    <w:abstractNumId w:val="1"/>
+    <w:lvlOverride w:ilvl="0">
+      <w:startOverride w:val="1"/>
+    </w:lvlOverride>
+  </w:num>
+  <w:num w:numId="16">
     <w:abstractNumId w:val="2"/>
     <w:lvlOverride w:ilvl="0">
       <w:startOverride w:val="1"/>
     </w:lvlOverride>
   </w:num>
-  <w:num w:numId="16">
+  <w:num w:numId="17">
     <w:abstractNumId w:val="1"/>
-    <w:lvlOverride w:ilvl="0">
-      <w:startOverride w:val="1"/>
-    </w:lvlOverride>
-  </w:num>
-  <w:num w:numId="17">
-    <w:abstractNumId w:val="2"/>
     <w:lvlOverride w:ilvl="0">
       <w:startOverride w:val="1"/>
     </w:lvlOverride>
@@ -13718,24 +14834,42 @@
     </w:lvlOverride>
   </w:num>
   <w:num w:numId="19">
+    <w:abstractNumId w:val="2"/>
+    <w:lvlOverride w:ilvl="0">
+      <w:startOverride w:val="1"/>
+    </w:lvlOverride>
+  </w:num>
+  <w:num w:numId="20">
     <w:abstractNumId w:val="1"/>
     <w:lvlOverride w:ilvl="0">
       <w:startOverride w:val="1"/>
     </w:lvlOverride>
   </w:num>
-  <w:num w:numId="20">
+  <w:num w:numId="21">
     <w:abstractNumId w:val="2"/>
     <w:lvlOverride w:ilvl="0">
       <w:startOverride w:val="1"/>
     </w:lvlOverride>
   </w:num>
-  <w:num w:numId="21">
+  <w:num w:numId="22">
     <w:abstractNumId w:val="1"/>
     <w:lvlOverride w:ilvl="0">
       <w:startOverride w:val="1"/>
     </w:lvlOverride>
   </w:num>
-  <w:num w:numId="22">
+  <w:num w:numId="23">
+    <w:abstractNumId w:val="2"/>
+    <w:lvlOverride w:ilvl="0">
+      <w:startOverride w:val="1"/>
+    </w:lvlOverride>
+  </w:num>
+  <w:num w:numId="24">
+    <w:abstractNumId w:val="1"/>
+    <w:lvlOverride w:ilvl="0">
+      <w:startOverride w:val="1"/>
+    </w:lvlOverride>
+  </w:num>
+  <w:num w:numId="25">
     <w:abstractNumId w:val="2"/>
     <w:lvlOverride w:ilvl="0">
       <w:startOverride w:val="1"/>

</xml_diff>

<commit_message>
Manual regenerated at v2.6.0
</commit_message>
<xml_diff>
--- a/manual/out/pls,fix rokasgrāmata.docx
+++ b/manual/out/pls,fix rokasgrāmata.docx
@@ -123,7 +123,7 @@
           <w:bCs/>
           <w:rFonts w:ascii="Aptos" w:hAnsi="Aptos" w:cs="Aptos" w:eastAsia="Aptos"/>
         </w:rPr>
-        <w:t xml:space="preserve">v2.5.004</w:t>
+        <w:t xml:space="preserve">v2.6.000</w:t>
       </w:r>
     </w:p>
     <w:p>
@@ -9184,7 +9184,7 @@
           <w:color w:val="1A1A1A"/>
           <w:rFonts w:ascii="Aptos" w:hAnsi="Aptos" w:cs="Aptos" w:eastAsia="Aptos"/>
         </w:rPr>
-        <w:t xml:space="preserve">PowerPoint cilnē "Tools" ir sadaļa "Object tools" darbam ar slaidā atlasītajām figūrām. Tā prasa PowerPoint 2021 vai Microsoft 365; vecākā versijā panelis to pasaka jau pieslēdzoties.</w:t>
+        <w:t xml:space="preserve">PowerPoint cilnē "Tools" ir sadaļa "Object tools" darbam ar slaidā atlasītajām figūrām. Tā prasa PowerPoint 2021 vai Microsoft 365; vecākā versijā panelis to pasaka, tiklīdz nospiež kādu no šīm pogām.</w:t>
       </w:r>
     </w:p>
     <w:p>
@@ -14559,7 +14559,7 @@
           <w:color w:val="1A1A1A"/>
           <w:rFonts w:ascii="Aptos" w:hAnsi="Aptos" w:cs="Aptos" w:eastAsia="Aptos"/>
         </w:rPr>
-        <w:t xml:space="preserve">Šī rokasgrāmata apraksta pls,fix versiju v2.5.004. Tā pati versija ir uzrakstīta uz vāka un katras lapas apakšā.</w:t>
+        <w:t xml:space="preserve">Šī rokasgrāmata apraksta pls,fix versiju v2.6.000. Tā pati versija ir uzrakstīta uz vāka un katras lapas apakšā.</w:t>
       </w:r>
     </w:p>
     <w:p>
@@ -14624,7 +14624,7 @@
         <w:color w:val="5B6472"/>
         <w:rFonts w:ascii="Aptos" w:hAnsi="Aptos" w:cs="Aptos" w:eastAsia="Aptos"/>
       </w:rPr>
-      <w:t xml:space="preserve">pls,fix rokasgrāmata v2.5.004   |   </w:t>
+      <w:t xml:space="preserve">pls,fix rokasgrāmata v2.6.000   |   </w:t>
     </w:r>
     <w:r>
       <w:rPr>

</xml_diff>

<commit_message>
Manual regenerated at v2.6.1
</commit_message>
<xml_diff>
--- a/manual/out/pls,fix rokasgrāmata.docx
+++ b/manual/out/pls,fix rokasgrāmata.docx
@@ -123,7 +123,7 @@
           <w:bCs/>
           <w:rFonts w:ascii="Aptos" w:hAnsi="Aptos" w:cs="Aptos" w:eastAsia="Aptos"/>
         </w:rPr>
-        <w:t xml:space="preserve">v2.6.000</w:t>
+        <w:t xml:space="preserve">v2.6.001</w:t>
       </w:r>
     </w:p>
     <w:p>
@@ -9184,7 +9184,7 @@
           <w:color w:val="1A1A1A"/>
           <w:rFonts w:ascii="Aptos" w:hAnsi="Aptos" w:cs="Aptos" w:eastAsia="Aptos"/>
         </w:rPr>
-        <w:t xml:space="preserve">PowerPoint cilnē "Tools" ir sadaļa "Object tools" darbam ar slaidā atlasītajām figūrām. Tā prasa PowerPoint 2021 vai Microsoft 365; vecākā versijā panelis to pasaka, tiklīdz nospiež kādu no šīm pogām.</w:t>
+        <w:t xml:space="preserve">PowerPoint cilnē "Tools" ir sadaļa "Object tools" darbam ar slaidā atlasītajām figūrām. Tā prasa PowerPoint 2021 vai Microsoft 365; vecākā versijā panelis to pasaka, tiklīdz nospiež kādu no šīm pogām. Tie paši rīki ir arī PowerPoint lentes cilnē "pls,fix": grupā "Objects" (Object tools, Match size, Select similar, Swap, Capture style, Apply style) un grupā "Arrange" (sešas līdzināšanas un abas izkārtošanas), katrs ar savu ikonu.</w:t>
       </w:r>
     </w:p>
     <w:p>
@@ -14559,7 +14559,7 @@
           <w:color w:val="1A1A1A"/>
           <w:rFonts w:ascii="Aptos" w:hAnsi="Aptos" w:cs="Aptos" w:eastAsia="Aptos"/>
         </w:rPr>
-        <w:t xml:space="preserve">Šī rokasgrāmata apraksta pls,fix versiju v2.6.000. Tā pati versija ir uzrakstīta uz vāka un katras lapas apakšā.</w:t>
+        <w:t xml:space="preserve">Šī rokasgrāmata apraksta pls,fix versiju v2.6.001. Tā pati versija ir uzrakstīta uz vāka un katras lapas apakšā.</w:t>
       </w:r>
     </w:p>
     <w:p>
@@ -14624,7 +14624,7 @@
         <w:color w:val="5B6472"/>
         <w:rFonts w:ascii="Aptos" w:hAnsi="Aptos" w:cs="Aptos" w:eastAsia="Aptos"/>
       </w:rPr>
-      <w:t xml:space="preserve">pls,fix rokasgrāmata v2.6.000   |   </w:t>
+      <w:t xml:space="preserve">pls,fix rokasgrāmata v2.6.001   |   </w:t>
     </w:r>
     <w:r>
       <w:rPr>

</xml_diff>

<commit_message>
Manual regenerated at v2.6.2
</commit_message>
<xml_diff>
--- a/manual/out/pls,fix rokasgrāmata.docx
+++ b/manual/out/pls,fix rokasgrāmata.docx
@@ -123,7 +123,7 @@
           <w:bCs/>
           <w:rFonts w:ascii="Aptos" w:hAnsi="Aptos" w:cs="Aptos" w:eastAsia="Aptos"/>
         </w:rPr>
-        <w:t xml:space="preserve">v2.6.001</w:t>
+        <w:t xml:space="preserve">v2.6.002</w:t>
       </w:r>
     </w:p>
     <w:p>
@@ -7448,7 +7448,7 @@
           <w:color w:val="1A1A1A"/>
           <w:rFonts w:ascii="Aptos" w:hAnsi="Aptos" w:cs="Aptos" w:eastAsia="Aptos"/>
         </w:rPr>
-        <w:t xml:space="preserve">Saitē var būt attēls, tabula vai diagramma. Diagramma slaidā nonāk kā rediģējamu figūru grupa ar zīmola krāsām un tikai vērtību etiķetēm: stabiņu, joslu, tilta, sektoru un līniju diagrammas. Līniju diagrammā katrs punkts ir sava figūra, savienota ar līniju līdz nākamajam punktam. Šai figūru grupai nepieciešams PowerPoint 2504 vai jaunāks Windows datorā, 16.96 vai jaunāks Mac datorā; vecākā versijā, kā arī pāri 40 punktiem, 3 sērijām vai 12 sektoriem, diagramma tiek ievietota kā attēls, un panelis to pasaka.</w:t>
+        <w:t xml:space="preserve">Saitē var būt attēls, tabula vai diagramma. Diagramma slaidā nonāk kā rediģējamu figūru grupa ar zīmola krāsām un tikai vērtību etiķetēm: stabiņu, joslu, tilta, sektoru un līniju diagrammas. Līniju diagrammā katrs punkts ir sava figūra, savienota ar līniju līdz nākamajam punktam. Šai figūru grupai nepieciešams PowerPoint 2504 vai jaunāks Windows datorā, 16.96 vai jaunāks Mac datorā; vecākā versijā, kā arī pāri 40 punktiem, 6 sērijām vai 12 sektoriem, kā arī diagrammas tipam, ko figūras neatveido, diagramma tiek ievietota kā attēls, un abi paneļi pasaka iemeslu.</w:t>
       </w:r>
     </w:p>
     <w:p>
@@ -14559,7 +14559,7 @@
           <w:color w:val="1A1A1A"/>
           <w:rFonts w:ascii="Aptos" w:hAnsi="Aptos" w:cs="Aptos" w:eastAsia="Aptos"/>
         </w:rPr>
-        <w:t xml:space="preserve">Šī rokasgrāmata apraksta pls,fix versiju v2.6.001. Tā pati versija ir uzrakstīta uz vāka un katras lapas apakšā.</w:t>
+        <w:t xml:space="preserve">Šī rokasgrāmata apraksta pls,fix versiju v2.6.002. Tā pati versija ir uzrakstīta uz vāka un katras lapas apakšā.</w:t>
       </w:r>
     </w:p>
     <w:p>
@@ -14624,7 +14624,7 @@
         <w:color w:val="5B6472"/>
         <w:rFonts w:ascii="Aptos" w:hAnsi="Aptos" w:cs="Aptos" w:eastAsia="Aptos"/>
       </w:rPr>
-      <w:t xml:space="preserve">pls,fix rokasgrāmata v2.6.001   |   </w:t>
+      <w:t xml:space="preserve">pls,fix rokasgrāmata v2.6.002   |   </w:t>
     </w:r>
     <w:r>
       <w:rPr>

</xml_diff>

<commit_message>
Manual regenerated at v2.6.14
</commit_message>
<xml_diff>
--- a/manual/out/pls,fix rokasgrāmata.docx
+++ b/manual/out/pls,fix rokasgrāmata.docx
@@ -123,7 +123,7 @@
           <w:bCs/>
           <w:rFonts w:ascii="Aptos" w:hAnsi="Aptos" w:cs="Aptos" w:eastAsia="Aptos"/>
         </w:rPr>
-        <w:t xml:space="preserve">v2.6.002</w:t>
+        <w:t xml:space="preserve">v2.6.014</w:t>
       </w:r>
     </w:p>
     <w:p>
@@ -14559,7 +14559,7 @@
           <w:color w:val="1A1A1A"/>
           <w:rFonts w:ascii="Aptos" w:hAnsi="Aptos" w:cs="Aptos" w:eastAsia="Aptos"/>
         </w:rPr>
-        <w:t xml:space="preserve">Šī rokasgrāmata apraksta pls,fix versiju v2.6.002. Tā pati versija ir uzrakstīta uz vāka un katras lapas apakšā.</w:t>
+        <w:t xml:space="preserve">Šī rokasgrāmata apraksta pls,fix versiju v2.6.014. Tā pati versija ir uzrakstīta uz vāka un katras lapas apakšā.</w:t>
       </w:r>
     </w:p>
     <w:p>
@@ -14624,7 +14624,7 @@
         <w:color w:val="5B6472"/>
         <w:rFonts w:ascii="Aptos" w:hAnsi="Aptos" w:cs="Aptos" w:eastAsia="Aptos"/>
       </w:rPr>
-      <w:t xml:space="preserve">pls,fix rokasgrāmata v2.6.002   |   </w:t>
+      <w:t xml:space="preserve">pls,fix rokasgrāmata v2.6.014   |   </w:t>
     </w:r>
     <w:r>
       <w:rPr>

</xml_diff>

<commit_message>
Manual regenerated at v2.6.15
</commit_message>
<xml_diff>
--- a/manual/out/pls,fix rokasgrāmata.docx
+++ b/manual/out/pls,fix rokasgrāmata.docx
@@ -123,7 +123,7 @@
           <w:bCs/>
           <w:rFonts w:ascii="Aptos" w:hAnsi="Aptos" w:cs="Aptos" w:eastAsia="Aptos"/>
         </w:rPr>
-        <w:t xml:space="preserve">v2.6.014</w:t>
+        <w:t xml:space="preserve">v2.6.015</w:t>
       </w:r>
     </w:p>
     <w:p>
@@ -14559,7 +14559,7 @@
           <w:color w:val="1A1A1A"/>
           <w:rFonts w:ascii="Aptos" w:hAnsi="Aptos" w:cs="Aptos" w:eastAsia="Aptos"/>
         </w:rPr>
-        <w:t xml:space="preserve">Šī rokasgrāmata apraksta pls,fix versiju v2.6.014. Tā pati versija ir uzrakstīta uz vāka un katras lapas apakšā.</w:t>
+        <w:t xml:space="preserve">Šī rokasgrāmata apraksta pls,fix versiju v2.6.015. Tā pati versija ir uzrakstīta uz vāka un katras lapas apakšā.</w:t>
       </w:r>
     </w:p>
     <w:p>
@@ -14624,7 +14624,7 @@
         <w:color w:val="5B6472"/>
         <w:rFonts w:ascii="Aptos" w:hAnsi="Aptos" w:cs="Aptos" w:eastAsia="Aptos"/>
       </w:rPr>
-      <w:t xml:space="preserve">pls,fix rokasgrāmata v2.6.014   |   </w:t>
+      <w:t xml:space="preserve">pls,fix rokasgrāmata v2.6.015   |   </w:t>
     </w:r>
     <w:r>
       <w:rPr>

</xml_diff>

<commit_message>
Manual: the v2.7 tools in Latvian
manual/src/content/charts.rs: Football field + Comps stats sections, the CAGR
row and example under Consistent rounding. tools.rs: Indent/Align/Underline/
Pinstripes rows, the overlay rule, the three narrow pastes, the two audit tools.
workbook.rs: the sheet tools row, Clean past the data, Keyboard shortcuts.
manual/out regenerated at 2.7.9; regenerated again at the wave's final tag.
</commit_message>
<xml_diff>
--- a/manual/out/pls,fix rokasgrāmata.docx
+++ b/manual/out/pls,fix rokasgrāmata.docx
@@ -123,7 +123,7 @@
           <w:bCs/>
           <w:rFonts w:ascii="Aptos" w:hAnsi="Aptos" w:cs="Aptos" w:eastAsia="Aptos"/>
         </w:rPr>
-        <w:t xml:space="preserve">v2.6.015</w:t>
+        <w:t xml:space="preserve">v2.7.009</w:t>
       </w:r>
     </w:p>
     <w:p>
@@ -845,7 +845,7 @@
               </w:pPr>
               <w:r>
                 <w:rPr/>
-                <w:t xml:space="preserve">Brand-format chart un CAGR label</w:t>
+                <w:t xml:space="preserve">Football field</w:t>
               </w:r>
               <w:r>
                 <w:rPr/>
@@ -870,7 +870,7 @@
               </w:pPr>
               <w:r>
                 <w:rPr/>
-                <w:t xml:space="preserve">Consistent rounding un funkcijas PLSFIX</w:t>
+                <w:t xml:space="preserve">Comps stats</w:t>
               </w:r>
               <w:r>
                 <w:rPr/>
@@ -895,7 +895,7 @@
               </w:pPr>
               <w:r>
                 <w:rPr/>
-                <w:t xml:space="preserve">Unpivot selection</w:t>
+                <w:t xml:space="preserve">Brand-format chart un CAGR label</w:t>
               </w:r>
               <w:r>
                 <w:rPr/>
@@ -920,7 +920,7 @@
               </w:pPr>
               <w:r>
                 <w:rPr/>
-                <w:t xml:space="preserve">Undo last pls,fix action</w:t>
+                <w:t xml:space="preserve">Consistent rounding un funkcijas PLSFIX</w:t>
               </w:r>
               <w:r>
                 <w:rPr/>
@@ -938,6 +938,56 @@
             <w:p>
               <w:pPr>
                 <w:rPr/>
+                <w:pStyle w:val="ToC2"/>
+                <w:tabs>
+                  <w:tab w:val="right" w:leader="dot" w:pos="80000"/>
+                </w:tabs>
+              </w:pPr>
+              <w:r>
+                <w:rPr/>
+                <w:t xml:space="preserve">Unpivot selection</w:t>
+              </w:r>
+              <w:r>
+                <w:rPr/>
+                <w:tab/>
+              </w:r>
+              <w:r>
+                <w:rPr/>
+                <w:fldChar w:fldCharType="begin" w:dirty="false"/>
+                <w:instrText>PAGEREF _Toc00000031 \h</w:instrText>
+                <w:fldChar w:fldCharType="separate" w:dirty="false"/>
+                <w:t xml:space="preserve">1</w:t>
+                <w:fldChar w:fldCharType="end" w:dirty="false"/>
+              </w:r>
+            </w:p>
+            <w:p>
+              <w:pPr>
+                <w:rPr/>
+                <w:pStyle w:val="ToC2"/>
+                <w:tabs>
+                  <w:tab w:val="right" w:leader="dot" w:pos="80000"/>
+                </w:tabs>
+              </w:pPr>
+              <w:r>
+                <w:rPr/>
+                <w:t xml:space="preserve">Undo last pls,fix action</w:t>
+              </w:r>
+              <w:r>
+                <w:rPr/>
+                <w:tab/>
+              </w:r>
+              <w:r>
+                <w:rPr/>
+                <w:fldChar w:fldCharType="begin" w:dirty="false"/>
+                <w:instrText>PAGEREF _Toc00000032 \h</w:instrText>
+                <w:fldChar w:fldCharType="separate" w:dirty="false"/>
+                <w:t xml:space="preserve">1</w:t>
+                <w:fldChar w:fldCharType="end" w:dirty="false"/>
+              </w:r>
+            </w:p>
+            <w:p>
+              <w:pPr>
+                <w:rPr/>
                 <w:pStyle w:val="ToC1"/>
                 <w:tabs>
                   <w:tab w:val="right" w:leader="dot" w:pos="80000"/>
@@ -954,7 +1004,7 @@
               <w:r>
                 <w:rPr/>
                 <w:fldChar w:fldCharType="begin" w:dirty="false"/>
-                <w:instrText>PAGEREF _Toc00000031 \h</w:instrText>
+                <w:instrText>PAGEREF _Toc00000033 \h</w:instrText>
                 <w:fldChar w:fldCharType="separate" w:dirty="false"/>
                 <w:t xml:space="preserve">1</w:t>
                 <w:fldChar w:fldCharType="end" w:dirty="false"/>
@@ -979,7 +1029,7 @@
               <w:r>
                 <w:rPr/>
                 <w:fldChar w:fldCharType="begin" w:dirty="false"/>
-                <w:instrText>PAGEREF _Toc00000032 \h</w:instrText>
+                <w:instrText>PAGEREF _Toc00000034 \h</w:instrText>
                 <w:fldChar w:fldCharType="separate" w:dirty="false"/>
                 <w:t xml:space="preserve">1</w:t>
                 <w:fldChar w:fldCharType="end" w:dirty="false"/>
@@ -1004,7 +1054,7 @@
               <w:r>
                 <w:rPr/>
                 <w:fldChar w:fldCharType="begin" w:dirty="false"/>
-                <w:instrText>PAGEREF _Toc00000033 \h</w:instrText>
+                <w:instrText>PAGEREF _Toc00000035 \h</w:instrText>
                 <w:fldChar w:fldCharType="separate" w:dirty="false"/>
                 <w:t xml:space="preserve">1</w:t>
                 <w:fldChar w:fldCharType="end" w:dirty="false"/>
@@ -1029,7 +1079,7 @@
               <w:r>
                 <w:rPr/>
                 <w:fldChar w:fldCharType="begin" w:dirty="false"/>
-                <w:instrText>PAGEREF _Toc00000034 \h</w:instrText>
+                <w:instrText>PAGEREF _Toc00000036 \h</w:instrText>
                 <w:fldChar w:fldCharType="separate" w:dirty="false"/>
                 <w:t xml:space="preserve">1</w:t>
                 <w:fldChar w:fldCharType="end" w:dirty="false"/>
@@ -1054,7 +1104,7 @@
               <w:r>
                 <w:rPr/>
                 <w:fldChar w:fldCharType="begin" w:dirty="false"/>
-                <w:instrText>PAGEREF _Toc00000035 \h</w:instrText>
+                <w:instrText>PAGEREF _Toc00000037 \h</w:instrText>
                 <w:fldChar w:fldCharType="separate" w:dirty="false"/>
                 <w:t xml:space="preserve">1</w:t>
                 <w:fldChar w:fldCharType="end" w:dirty="false"/>
@@ -1079,7 +1129,7 @@
               <w:r>
                 <w:rPr/>
                 <w:fldChar w:fldCharType="begin" w:dirty="false"/>
-                <w:instrText>PAGEREF _Toc00000036 \h</w:instrText>
+                <w:instrText>PAGEREF _Toc00000038 \h</w:instrText>
                 <w:fldChar w:fldCharType="separate" w:dirty="false"/>
                 <w:t xml:space="preserve">1</w:t>
                 <w:fldChar w:fldCharType="end" w:dirty="false"/>
@@ -1104,7 +1154,7 @@
               <w:r>
                 <w:rPr/>
                 <w:fldChar w:fldCharType="begin" w:dirty="false"/>
-                <w:instrText>PAGEREF _Toc00000037 \h</w:instrText>
+                <w:instrText>PAGEREF _Toc00000039 \h</w:instrText>
                 <w:fldChar w:fldCharType="separate" w:dirty="false"/>
                 <w:t xml:space="preserve">1</w:t>
                 <w:fldChar w:fldCharType="end" w:dirty="false"/>
@@ -1129,7 +1179,7 @@
               <w:r>
                 <w:rPr/>
                 <w:fldChar w:fldCharType="begin" w:dirty="false"/>
-                <w:instrText>PAGEREF _Toc00000038 \h</w:instrText>
+                <w:instrText>PAGEREF _Toc00000040 \h</w:instrText>
                 <w:fldChar w:fldCharType="separate" w:dirty="false"/>
                 <w:t xml:space="preserve">1</w:t>
                 <w:fldChar w:fldCharType="end" w:dirty="false"/>
@@ -1154,7 +1204,7 @@
               <w:r>
                 <w:rPr/>
                 <w:fldChar w:fldCharType="begin" w:dirty="false"/>
-                <w:instrText>PAGEREF _Toc00000039 \h</w:instrText>
+                <w:instrText>PAGEREF _Toc00000041 \h</w:instrText>
                 <w:fldChar w:fldCharType="separate" w:dirty="false"/>
                 <w:t xml:space="preserve">1</w:t>
                 <w:fldChar w:fldCharType="end" w:dirty="false"/>
@@ -1179,7 +1229,7 @@
               <w:r>
                 <w:rPr/>
                 <w:fldChar w:fldCharType="begin" w:dirty="false"/>
-                <w:instrText>PAGEREF _Toc00000040 \h</w:instrText>
+                <w:instrText>PAGEREF _Toc00000042 \h</w:instrText>
                 <w:fldChar w:fldCharType="separate" w:dirty="false"/>
                 <w:t xml:space="preserve">1</w:t>
                 <w:fldChar w:fldCharType="end" w:dirty="false"/>
@@ -1204,7 +1254,7 @@
               <w:r>
                 <w:rPr/>
                 <w:fldChar w:fldCharType="begin" w:dirty="false"/>
-                <w:instrText>PAGEREF _Toc00000041 \h</w:instrText>
+                <w:instrText>PAGEREF _Toc00000043 \h</w:instrText>
                 <w:fldChar w:fldCharType="separate" w:dirty="false"/>
                 <w:t xml:space="preserve">1</w:t>
                 <w:fldChar w:fldCharType="end" w:dirty="false"/>
@@ -1229,7 +1279,7 @@
               <w:r>
                 <w:rPr/>
                 <w:fldChar w:fldCharType="begin" w:dirty="false"/>
-                <w:instrText>PAGEREF _Toc00000042 \h</w:instrText>
+                <w:instrText>PAGEREF _Toc00000044 \h</w:instrText>
                 <w:fldChar w:fldCharType="separate" w:dirty="false"/>
                 <w:t xml:space="preserve">1</w:t>
                 <w:fldChar w:fldCharType="end" w:dirty="false"/>
@@ -1254,7 +1304,7 @@
               <w:r>
                 <w:rPr/>
                 <w:fldChar w:fldCharType="begin" w:dirty="false"/>
-                <w:instrText>PAGEREF _Toc00000043 \h</w:instrText>
+                <w:instrText>PAGEREF _Toc00000045 \h</w:instrText>
                 <w:fldChar w:fldCharType="separate" w:dirty="false"/>
                 <w:t xml:space="preserve">1</w:t>
                 <w:fldChar w:fldCharType="end" w:dirty="false"/>
@@ -1279,7 +1329,7 @@
               <w:r>
                 <w:rPr/>
                 <w:fldChar w:fldCharType="begin" w:dirty="false"/>
-                <w:instrText>PAGEREF _Toc00000044 \h</w:instrText>
+                <w:instrText>PAGEREF _Toc00000046 \h</w:instrText>
                 <w:fldChar w:fldCharType="separate" w:dirty="false"/>
                 <w:t xml:space="preserve">1</w:t>
                 <w:fldChar w:fldCharType="end" w:dirty="false"/>
@@ -1304,7 +1354,7 @@
               <w:r>
                 <w:rPr/>
                 <w:fldChar w:fldCharType="begin" w:dirty="false"/>
-                <w:instrText>PAGEREF _Toc00000045 \h</w:instrText>
+                <w:instrText>PAGEREF _Toc00000047 \h</w:instrText>
                 <w:fldChar w:fldCharType="separate" w:dirty="false"/>
                 <w:t xml:space="preserve">1</w:t>
                 <w:fldChar w:fldCharType="end" w:dirty="false"/>
@@ -1320,6 +1370,31 @@
               </w:pPr>
               <w:r>
                 <w:rPr/>
+                <w:t xml:space="preserve">Clean past the data</w:t>
+              </w:r>
+              <w:r>
+                <w:rPr/>
+                <w:tab/>
+              </w:r>
+              <w:r>
+                <w:rPr/>
+                <w:fldChar w:fldCharType="begin" w:dirty="false"/>
+                <w:instrText>PAGEREF _Toc00000048 \h</w:instrText>
+                <w:fldChar w:fldCharType="separate" w:dirty="false"/>
+                <w:t xml:space="preserve">1</w:t>
+                <w:fldChar w:fldCharType="end" w:dirty="false"/>
+              </w:r>
+            </w:p>
+            <w:p>
+              <w:pPr>
+                <w:rPr/>
+                <w:pStyle w:val="ToC2"/>
+                <w:tabs>
+                  <w:tab w:val="right" w:leader="dot" w:pos="80000"/>
+                </w:tabs>
+              </w:pPr>
+              <w:r>
+                <w:rPr/>
                 <w:t xml:space="preserve">Model check</w:t>
               </w:r>
               <w:r>
@@ -1329,7 +1404,7 @@
               <w:r>
                 <w:rPr/>
                 <w:fldChar w:fldCharType="begin" w:dirty="false"/>
-                <w:instrText>PAGEREF _Toc00000046 \h</w:instrText>
+                <w:instrText>PAGEREF _Toc00000049 \h</w:instrText>
                 <w:fldChar w:fldCharType="separate" w:dirty="false"/>
                 <w:t xml:space="preserve">1</w:t>
                 <w:fldChar w:fldCharType="end" w:dirty="false"/>
@@ -1354,7 +1429,7 @@
               <w:r>
                 <w:rPr/>
                 <w:fldChar w:fldCharType="begin" w:dirty="false"/>
-                <w:instrText>PAGEREF _Toc00000047 \h</w:instrText>
+                <w:instrText>PAGEREF _Toc00000050 \h</w:instrText>
                 <w:fldChar w:fldCharType="separate" w:dirty="false"/>
                 <w:t xml:space="preserve">1</w:t>
                 <w:fldChar w:fldCharType="end" w:dirty="false"/>
@@ -1379,7 +1454,7 @@
               <w:r>
                 <w:rPr/>
                 <w:fldChar w:fldCharType="begin" w:dirty="false"/>
-                <w:instrText>PAGEREF _Toc00000048 \h</w:instrText>
+                <w:instrText>PAGEREF _Toc00000051 \h</w:instrText>
                 <w:fldChar w:fldCharType="separate" w:dirty="false"/>
                 <w:t xml:space="preserve">1</w:t>
                 <w:fldChar w:fldCharType="end" w:dirty="false"/>
@@ -1404,7 +1479,7 @@
               <w:r>
                 <w:rPr/>
                 <w:fldChar w:fldCharType="begin" w:dirty="false"/>
-                <w:instrText>PAGEREF _Toc00000049 \h</w:instrText>
+                <w:instrText>PAGEREF _Toc00000052 \h</w:instrText>
                 <w:fldChar w:fldCharType="separate" w:dirty="false"/>
                 <w:t xml:space="preserve">1</w:t>
                 <w:fldChar w:fldCharType="end" w:dirty="false"/>
@@ -1429,7 +1504,7 @@
               <w:r>
                 <w:rPr/>
                 <w:fldChar w:fldCharType="begin" w:dirty="false"/>
-                <w:instrText>PAGEREF _Toc00000050 \h</w:instrText>
+                <w:instrText>PAGEREF _Toc00000053 \h</w:instrText>
                 <w:fldChar w:fldCharType="separate" w:dirty="false"/>
                 <w:t xml:space="preserve">1</w:t>
                 <w:fldChar w:fldCharType="end" w:dirty="false"/>
@@ -1454,7 +1529,7 @@
               <w:r>
                 <w:rPr/>
                 <w:fldChar w:fldCharType="begin" w:dirty="false"/>
-                <w:instrText>PAGEREF _Toc00000051 \h</w:instrText>
+                <w:instrText>PAGEREF _Toc00000054 \h</w:instrText>
                 <w:fldChar w:fldCharType="separate" w:dirty="false"/>
                 <w:t xml:space="preserve">1</w:t>
                 <w:fldChar w:fldCharType="end" w:dirty="false"/>
@@ -1479,7 +1554,7 @@
               <w:r>
                 <w:rPr/>
                 <w:fldChar w:fldCharType="begin" w:dirty="false"/>
-                <w:instrText>PAGEREF _Toc00000052 \h</w:instrText>
+                <w:instrText>PAGEREF _Toc00000055 \h</w:instrText>
                 <w:fldChar w:fldCharType="separate" w:dirty="false"/>
                 <w:t xml:space="preserve">1</w:t>
                 <w:fldChar w:fldCharType="end" w:dirty="false"/>
@@ -1504,7 +1579,7 @@
               <w:r>
                 <w:rPr/>
                 <w:fldChar w:fldCharType="begin" w:dirty="false"/>
-                <w:instrText>PAGEREF _Toc00000053 \h</w:instrText>
+                <w:instrText>PAGEREF _Toc00000056 \h</w:instrText>
                 <w:fldChar w:fldCharType="separate" w:dirty="false"/>
                 <w:t xml:space="preserve">1</w:t>
                 <w:fldChar w:fldCharType="end" w:dirty="false"/>
@@ -1529,7 +1604,7 @@
               <w:r>
                 <w:rPr/>
                 <w:fldChar w:fldCharType="begin" w:dirty="false"/>
-                <w:instrText>PAGEREF _Toc00000054 \h</w:instrText>
+                <w:instrText>PAGEREF _Toc00000057 \h</w:instrText>
                 <w:fldChar w:fldCharType="separate" w:dirty="false"/>
                 <w:t xml:space="preserve">1</w:t>
                 <w:fldChar w:fldCharType="end" w:dirty="false"/>
@@ -1554,7 +1629,7 @@
               <w:r>
                 <w:rPr/>
                 <w:fldChar w:fldCharType="begin" w:dirty="false"/>
-                <w:instrText>PAGEREF _Toc00000055 \h</w:instrText>
+                <w:instrText>PAGEREF _Toc00000058 \h</w:instrText>
                 <w:fldChar w:fldCharType="separate" w:dirty="false"/>
                 <w:t xml:space="preserve">1</w:t>
                 <w:fldChar w:fldCharType="end" w:dirty="false"/>
@@ -1579,7 +1654,7 @@
               <w:r>
                 <w:rPr/>
                 <w:fldChar w:fldCharType="begin" w:dirty="false"/>
-                <w:instrText>PAGEREF _Toc00000056 \h</w:instrText>
+                <w:instrText>PAGEREF _Toc00000059 \h</w:instrText>
                 <w:fldChar w:fldCharType="separate" w:dirty="false"/>
                 <w:t xml:space="preserve">1</w:t>
                 <w:fldChar w:fldCharType="end" w:dirty="false"/>
@@ -1604,7 +1679,7 @@
               <w:r>
                 <w:rPr/>
                 <w:fldChar w:fldCharType="begin" w:dirty="false"/>
-                <w:instrText>PAGEREF _Toc00000057 \h</w:instrText>
+                <w:instrText>PAGEREF _Toc00000060 \h</w:instrText>
                 <w:fldChar w:fldCharType="separate" w:dirty="false"/>
                 <w:t xml:space="preserve">1</w:t>
                 <w:fldChar w:fldCharType="end" w:dirty="false"/>
@@ -1629,7 +1704,7 @@
               <w:r>
                 <w:rPr/>
                 <w:fldChar w:fldCharType="begin" w:dirty="false"/>
-                <w:instrText>PAGEREF _Toc00000058 \h</w:instrText>
+                <w:instrText>PAGEREF _Toc00000061 \h</w:instrText>
                 <w:fldChar w:fldCharType="separate" w:dirty="false"/>
                 <w:t xml:space="preserve">1</w:t>
                 <w:fldChar w:fldCharType="end" w:dirty="false"/>
@@ -1654,7 +1729,7 @@
               <w:r>
                 <w:rPr/>
                 <w:fldChar w:fldCharType="begin" w:dirty="false"/>
-                <w:instrText>PAGEREF _Toc00000059 \h</w:instrText>
+                <w:instrText>PAGEREF _Toc00000062 \h</w:instrText>
                 <w:fldChar w:fldCharType="separate" w:dirty="false"/>
                 <w:t xml:space="preserve">1</w:t>
                 <w:fldChar w:fldCharType="end" w:dirty="false"/>
@@ -1679,7 +1754,7 @@
               <w:r>
                 <w:rPr/>
                 <w:fldChar w:fldCharType="begin" w:dirty="false"/>
-                <w:instrText>PAGEREF _Toc00000060 \h</w:instrText>
+                <w:instrText>PAGEREF _Toc00000063 \h</w:instrText>
                 <w:fldChar w:fldCharType="separate" w:dirty="false"/>
                 <w:t xml:space="preserve">1</w:t>
                 <w:fldChar w:fldCharType="end" w:dirty="false"/>
@@ -1704,7 +1779,7 @@
               <w:r>
                 <w:rPr/>
                 <w:fldChar w:fldCharType="begin" w:dirty="false"/>
-                <w:instrText>PAGEREF _Toc00000061 \h</w:instrText>
+                <w:instrText>PAGEREF _Toc00000064 \h</w:instrText>
                 <w:fldChar w:fldCharType="separate" w:dirty="false"/>
                 <w:t xml:space="preserve">1</w:t>
                 <w:fldChar w:fldCharType="end" w:dirty="false"/>
@@ -1729,7 +1804,7 @@
               <w:r>
                 <w:rPr/>
                 <w:fldChar w:fldCharType="begin" w:dirty="false"/>
-                <w:instrText>PAGEREF _Toc00000062 \h</w:instrText>
+                <w:instrText>PAGEREF _Toc00000065 \h</w:instrText>
                 <w:fldChar w:fldCharType="separate" w:dirty="false"/>
                 <w:t xml:space="preserve">1</w:t>
                 <w:fldChar w:fldCharType="end" w:dirty="false"/>
@@ -1754,7 +1829,7 @@
               <w:r>
                 <w:rPr/>
                 <w:fldChar w:fldCharType="begin" w:dirty="false"/>
-                <w:instrText>PAGEREF _Toc00000063 \h</w:instrText>
+                <w:instrText>PAGEREF _Toc00000066 \h</w:instrText>
                 <w:fldChar w:fldCharType="separate" w:dirty="false"/>
                 <w:t xml:space="preserve">1</w:t>
                 <w:fldChar w:fldCharType="end" w:dirty="false"/>
@@ -1779,7 +1854,7 @@
               <w:r>
                 <w:rPr/>
                 <w:fldChar w:fldCharType="begin" w:dirty="false"/>
-                <w:instrText>PAGEREF _Toc00000064 \h</w:instrText>
+                <w:instrText>PAGEREF _Toc00000067 \h</w:instrText>
                 <w:fldChar w:fldCharType="separate" w:dirty="false"/>
                 <w:t xml:space="preserve">1</w:t>
                 <w:fldChar w:fldCharType="end" w:dirty="false"/>
@@ -1804,7 +1879,7 @@
               <w:r>
                 <w:rPr/>
                 <w:fldChar w:fldCharType="begin" w:dirty="false"/>
-                <w:instrText>PAGEREF _Toc00000065 \h</w:instrText>
+                <w:instrText>PAGEREF _Toc00000068 \h</w:instrText>
                 <w:fldChar w:fldCharType="separate" w:dirty="false"/>
                 <w:t xml:space="preserve">1</w:t>
                 <w:fldChar w:fldCharType="end" w:dirty="false"/>
@@ -1820,6 +1895,31 @@
               </w:pPr>
               <w:r>
                 <w:rPr/>
+                <w:t xml:space="preserve">Keyboard shortcuts</w:t>
+              </w:r>
+              <w:r>
+                <w:rPr/>
+                <w:tab/>
+              </w:r>
+              <w:r>
+                <w:rPr/>
+                <w:fldChar w:fldCharType="begin" w:dirty="false"/>
+                <w:instrText>PAGEREF _Toc00000069 \h</w:instrText>
+                <w:fldChar w:fldCharType="separate" w:dirty="false"/>
+                <w:t xml:space="preserve">1</w:t>
+                <w:fldChar w:fldCharType="end" w:dirty="false"/>
+              </w:r>
+            </w:p>
+            <w:p>
+              <w:pPr>
+                <w:rPr/>
+                <w:pStyle w:val="ToC2"/>
+                <w:tabs>
+                  <w:tab w:val="right" w:leader="dot" w:pos="80000"/>
+                </w:tabs>
+              </w:pPr>
+              <w:r>
+                <w:rPr/>
                 <w:t xml:space="preserve">Iestatījumu pārnešana un atiestatīšana</w:t>
               </w:r>
               <w:r>
@@ -1829,7 +1929,7 @@
               <w:r>
                 <w:rPr/>
                 <w:fldChar w:fldCharType="begin" w:dirty="false"/>
-                <w:instrText>PAGEREF _Toc00000066 \h</w:instrText>
+                <w:instrText>PAGEREF _Toc00000070 \h</w:instrText>
                 <w:fldChar w:fldCharType="separate" w:dirty="false"/>
                 <w:t xml:space="preserve">1</w:t>
                 <w:fldChar w:fldCharType="end" w:dirty="false"/>
@@ -1854,7 +1954,7 @@
               <w:r>
                 <w:rPr/>
                 <w:fldChar w:fldCharType="begin" w:dirty="false"/>
-                <w:instrText>PAGEREF _Toc00000067 \h</w:instrText>
+                <w:instrText>PAGEREF _Toc00000071 \h</w:instrText>
                 <w:fldChar w:fldCharType="separate" w:dirty="false"/>
                 <w:t xml:space="preserve">1</w:t>
                 <w:fldChar w:fldCharType="end" w:dirty="false"/>
@@ -1879,7 +1979,7 @@
               <w:r>
                 <w:rPr/>
                 <w:fldChar w:fldCharType="begin" w:dirty="false"/>
-                <w:instrText>PAGEREF _Toc00000068 \h</w:instrText>
+                <w:instrText>PAGEREF _Toc00000072 \h</w:instrText>
                 <w:fldChar w:fldCharType="separate" w:dirty="false"/>
                 <w:t xml:space="preserve">1</w:t>
                 <w:fldChar w:fldCharType="end" w:dirty="false"/>
@@ -1904,7 +2004,7 @@
               <w:r>
                 <w:rPr/>
                 <w:fldChar w:fldCharType="begin" w:dirty="false"/>
-                <w:instrText>PAGEREF _Toc00000069 \h</w:instrText>
+                <w:instrText>PAGEREF _Toc00000073 \h</w:instrText>
                 <w:fldChar w:fldCharType="separate" w:dirty="false"/>
                 <w:t xml:space="preserve">1</w:t>
                 <w:fldChar w:fldCharType="end" w:dirty="false"/>
@@ -1929,7 +2029,7 @@
               <w:r>
                 <w:rPr/>
                 <w:fldChar w:fldCharType="begin" w:dirty="false"/>
-                <w:instrText>PAGEREF _Toc00000070 \h</w:instrText>
+                <w:instrText>PAGEREF _Toc00000074 \h</w:instrText>
                 <w:fldChar w:fldCharType="separate" w:dirty="false"/>
                 <w:t xml:space="preserve">1</w:t>
                 <w:fldChar w:fldCharType="end" w:dirty="false"/>
@@ -1954,7 +2054,7 @@
               <w:r>
                 <w:rPr/>
                 <w:fldChar w:fldCharType="begin" w:dirty="false"/>
-                <w:instrText>PAGEREF _Toc00000071 \h</w:instrText>
+                <w:instrText>PAGEREF _Toc00000075 \h</w:instrText>
                 <w:fldChar w:fldCharType="separate" w:dirty="false"/>
                 <w:t xml:space="preserve">1</w:t>
                 <w:fldChar w:fldCharType="end" w:dirty="false"/>
@@ -1979,7 +2079,7 @@
               <w:r>
                 <w:rPr/>
                 <w:fldChar w:fldCharType="begin" w:dirty="false"/>
-                <w:instrText>PAGEREF _Toc00000072 \h</w:instrText>
+                <w:instrText>PAGEREF _Toc00000076 \h</w:instrText>
                 <w:fldChar w:fldCharType="separate" w:dirty="false"/>
                 <w:t xml:space="preserve">1</w:t>
                 <w:fldChar w:fldCharType="end" w:dirty="false"/>
@@ -2004,7 +2104,7 @@
               <w:r>
                 <w:rPr/>
                 <w:fldChar w:fldCharType="begin" w:dirty="false"/>
-                <w:instrText>PAGEREF _Toc00000073 \h</w:instrText>
+                <w:instrText>PAGEREF _Toc00000077 \h</w:instrText>
                 <w:fldChar w:fldCharType="separate" w:dirty="false"/>
                 <w:t xml:space="preserve">1</w:t>
                 <w:fldChar w:fldCharType="end" w:dirty="false"/>
@@ -4641,6 +4741,170 @@
           </w:p>
         </w:tc>
       </w:tr>
+      <w:tr>
+        <w:trPr/>
+        <w:tc>
+          <w:tcPr>
+            <w:tcW w:w="2698" w:type="dxa"/>
+          </w:tcPr>
+          <w:p>
+            <w:pPr>
+              <w:rPr/>
+            </w:pPr>
+            <w:r>
+              <w:rPr>
+                <w:sz w:val="20"/>
+                <w:szCs w:val="20"/>
+                <w:color w:val="1A1A1A"/>
+                <w:rFonts w:ascii="Aptos" w:hAnsi="Aptos" w:cs="Aptos" w:eastAsia="Aptos"/>
+              </w:rPr>
+              <w:t xml:space="preserve">"Indent"</w:t>
+            </w:r>
+          </w:p>
+        </w:tc>
+        <w:tc>
+          <w:tcPr>
+            <w:tcW w:w="6940" w:type="dxa"/>
+          </w:tcPr>
+          <w:p>
+            <w:pPr>
+              <w:rPr/>
+            </w:pPr>
+            <w:r>
+              <w:rPr>
+                <w:sz w:val="20"/>
+                <w:szCs w:val="20"/>
+                <w:color w:val="1A1A1A"/>
+                <w:rFonts w:ascii="Aptos" w:hAnsi="Aptos" w:cs="Aptos" w:eastAsia="Aptos"/>
+              </w:rPr>
+              <w:t xml:space="preserve">atkāpe 0 / 1 / 2 / 3</w:t>
+            </w:r>
+          </w:p>
+        </w:tc>
+      </w:tr>
+      <w:tr>
+        <w:trPr/>
+        <w:tc>
+          <w:tcPr>
+            <w:tcW w:w="2698" w:type="dxa"/>
+          </w:tcPr>
+          <w:p>
+            <w:pPr>
+              <w:rPr/>
+            </w:pPr>
+            <w:r>
+              <w:rPr>
+                <w:sz w:val="20"/>
+                <w:szCs w:val="20"/>
+                <w:color w:val="1A1A1A"/>
+                <w:rFonts w:ascii="Aptos" w:hAnsi="Aptos" w:cs="Aptos" w:eastAsia="Aptos"/>
+              </w:rPr>
+              <w:t xml:space="preserve">"Align"</w:t>
+            </w:r>
+          </w:p>
+        </w:tc>
+        <w:tc>
+          <w:tcPr>
+            <w:tcW w:w="6940" w:type="dxa"/>
+          </w:tcPr>
+          <w:p>
+            <w:pPr>
+              <w:rPr/>
+            </w:pPr>
+            <w:r>
+              <w:rPr>
+                <w:sz w:val="20"/>
+                <w:szCs w:val="20"/>
+                <w:color w:val="1A1A1A"/>
+                <w:rFonts w:ascii="Aptos" w:hAnsi="Aptos" w:cs="Aptos" w:eastAsia="Aptos"/>
+              </w:rPr>
+              <w:t xml:space="preserve">pa kreisi / centrā / pa labi / vispārīgi</w:t>
+            </w:r>
+          </w:p>
+        </w:tc>
+      </w:tr>
+      <w:tr>
+        <w:trPr/>
+        <w:tc>
+          <w:tcPr>
+            <w:tcW w:w="2698" w:type="dxa"/>
+          </w:tcPr>
+          <w:p>
+            <w:pPr>
+              <w:rPr/>
+            </w:pPr>
+            <w:r>
+              <w:rPr>
+                <w:sz w:val="20"/>
+                <w:szCs w:val="20"/>
+                <w:color w:val="1A1A1A"/>
+                <w:rFonts w:ascii="Aptos" w:hAnsi="Aptos" w:cs="Aptos" w:eastAsia="Aptos"/>
+              </w:rPr>
+              <w:t xml:space="preserve">"Underline"</w:t>
+            </w:r>
+          </w:p>
+        </w:tc>
+        <w:tc>
+          <w:tcPr>
+            <w:tcW w:w="6940" w:type="dxa"/>
+          </w:tcPr>
+          <w:p>
+            <w:pPr>
+              <w:rPr/>
+            </w:pPr>
+            <w:r>
+              <w:rPr>
+                <w:sz w:val="20"/>
+                <w:szCs w:val="20"/>
+                <w:color w:val="1A1A1A"/>
+                <w:rFonts w:ascii="Aptos" w:hAnsi="Aptos" w:cs="Aptos" w:eastAsia="Aptos"/>
+              </w:rPr>
+              <w:t xml:space="preserve">viena līnija / dubulta / nav</w:t>
+            </w:r>
+          </w:p>
+        </w:tc>
+      </w:tr>
+      <w:tr>
+        <w:trPr/>
+        <w:tc>
+          <w:tcPr>
+            <w:tcW w:w="2698" w:type="dxa"/>
+          </w:tcPr>
+          <w:p>
+            <w:pPr>
+              <w:rPr/>
+            </w:pPr>
+            <w:r>
+              <w:rPr>
+                <w:sz w:val="20"/>
+                <w:szCs w:val="20"/>
+                <w:color w:val="1A1A1A"/>
+                <w:rFonts w:ascii="Aptos" w:hAnsi="Aptos" w:cs="Aptos" w:eastAsia="Aptos"/>
+              </w:rPr>
+              <w:t xml:space="preserve">"Pinstripes", "Pinstripes ↔"</w:t>
+            </w:r>
+          </w:p>
+        </w:tc>
+        <w:tc>
+          <w:tcPr>
+            <w:tcW w:w="6940" w:type="dxa"/>
+          </w:tcPr>
+          <w:p>
+            <w:pPr>
+              <w:rPr/>
+            </w:pPr>
+            <w:r>
+              <w:rPr>
+                <w:sz w:val="20"/>
+                <w:szCs w:val="20"/>
+                <w:color w:val="1A1A1A"/>
+                <w:rFonts w:ascii="Aptos" w:hAnsi="Aptos" w:cs="Aptos" w:eastAsia="Aptos"/>
+              </w:rPr>
+              <w:t xml:space="preserve">katra otrā rinda vai kolonna gaišā zīmola tonī; otrs spiediens joslas noņem</w:t>
+            </w:r>
+          </w:p>
+        </w:tc>
+      </w:tr>
     </w:tbl>
     <w:p>
       <w:pPr>
@@ -4660,6 +4924,21 @@
           <w:rFonts w:ascii="Aptos" w:hAnsi="Aptos" w:cs="Aptos" w:eastAsia="Aptos"/>
         </w:rPr>
         <w:t xml:space="preserve">Rindu stilu cikli strādā pa rindām un vienā reizē apstrādā līdz 500 rindām.</w:t>
+      </w:r>
+    </w:p>
+    <w:p>
+      <w:pPr>
+        <w:rPr/>
+        <w:spacing w:after="120" w:line="276"/>
+      </w:pPr>
+      <w:r>
+        <w:rPr>
+          <w:sz w:val="22"/>
+          <w:szCs w:val="22"/>
+          <w:color w:val="1A1A1A"/>
+          <w:rFonts w:ascii="Aptos" w:hAnsi="Aptos" w:cs="Aptos" w:eastAsia="Aptos"/>
+        </w:rPr>
+        <w:t xml:space="preserve">Joslas ("Pinstripes") netiek zīmētas, kamēr ieslēgts formulu pārbaudes pārklājums vai saistīto šūnu izcēlums: vispirms izslēdziet tos. Jūsu pašu aizpildījumus rīks saglabā, un "Undo last pls,fix action" tos atgriež.</w:t>
       </w:r>
     </w:p>
     <w:p>
@@ -4955,6 +5234,21 @@
       <w:pPr>
         <w:rPr/>
       </w:pPr>
+    </w:p>
+    <w:p>
+      <w:pPr>
+        <w:rPr/>
+        <w:spacing w:after="120" w:line="276"/>
+      </w:pPr>
+      <w:r>
+        <w:rPr>
+          <w:sz w:val="22"/>
+          <w:szCs w:val="22"/>
+          <w:color w:val="1A1A1A"/>
+          <w:rFonts w:ascii="Aptos" w:hAnsi="Aptos" w:cs="Aptos" w:eastAsia="Aptos"/>
+        </w:rPr>
+        <w:t xml:space="preserve">Trīs šaurās ielīmēšanas pogas strādā ar to pašu nokopēto bloku: "Paste: duplicate formulas" ielīmē formulas tā, ka atsauces uz nokopētā bloka iekšpusi pārvietojas līdzi, bet atsauces uz ārpusi paliek uz tām pašām šūnām; "Paste number formats only" pārnes tikai skaitļu formātus; "Paste row heights only" pārnes tikai rindu augstumus (ārpus "Undo last pls,fix action").</w:t>
+      </w:r>
     </w:p>
     <w:p>
       <w:pPr>
@@ -5337,6 +5631,21 @@
     <w:p>
       <w:pPr>
         <w:rPr/>
+        <w:spacing w:after="120" w:line="276"/>
+      </w:pPr>
+      <w:r>
+        <w:rPr>
+          <w:sz w:val="22"/>
+          <w:szCs w:val="22"/>
+          <w:color w:val="1A1A1A"/>
+          <w:rFonts w:ascii="Aptos" w:hAnsi="Aptos" w:cs="Aptos" w:eastAsia="Aptos"/>
+        </w:rPr>
+        <w:t xml:space="preserve">Poga "Select consistent region" no aktīvās šūnas formulas atlasa visu taisnstūri, kurā katra šūna nes to pašu formulu relatīvā formā, un pasaka, cik šūnu tajā ir. Poga "Precedents of selection" vienā reizē parāda līdz 50 atlasīto šūnu tiešos precedentus, sagrupētus pēc šūnas, un atlasa tos, kas atrodas tajā pašā lapā.</w:t>
+      </w:r>
+    </w:p>
+    <w:p>
+      <w:pPr>
+        <w:rPr/>
         <w:pStyle w:val="Heading2"/>
         <w:spacing w:before="240" w:after="100"/>
         <w:keepNext/>
@@ -5971,7 +6280,7 @@
           <w:bCs/>
           <w:rFonts w:ascii="Aptos" w:hAnsi="Aptos" w:cs="Aptos" w:eastAsia="Aptos"/>
         </w:rPr>
-        <w:t xml:space="preserve">Brand-format chart un CAGR label</w:t>
+        <w:t xml:space="preserve">Football field</w:t>
       </w:r>
       <w:bookmarkEnd w:id="28"/>
     </w:p>
@@ -5987,7 +6296,64 @@
           <w:color w:val="1A1A1A"/>
           <w:rFonts w:ascii="Aptos" w:hAnsi="Aptos" w:cs="Aptos" w:eastAsia="Aptos"/>
         </w:rPr>
-        <w:t xml:space="preserve">Poga "Brand-format chart" pārnoformē atlasīto diagrammu: fonts, sēriju krāsas un leģenda nāk no jūsu paletes, palīglīnijas tiek izslēgtas, un datu etiķetēs paliek tikai vērtības (bez kategoriju nosaukumiem, sēriju nosaukumiem un procentiem). Sektoru diagrammai etiķetes tiek novietotas ārpus sektoriem, un kategoriju nosaukumus rāda leģenda. Vispirms jāatlasa diagramma, citādi panelis paziņo "Select a chart first".</w:t>
+        <w:t xml:space="preserve">Poga "Football field" no trīs kolonnu tabulas (metode, zemākā vērtība, augstākā vērtība) uzzīmē vērtēšanas diapazonu diagrammu: katrai metodei viena peldoša josla no zemākās līdz augstākajai vērtībai, pirmā rinda augšā. Diagramma ir Excel joslu diagramma ar neredzamu pamata sēriju, tāpēc to var rediģēt kā jebkuru citu diagrammu.</w:t>
+      </w:r>
+    </w:p>
+    <w:p>
+      <w:pPr>
+        <w:rPr/>
+        <w:numPr>
+          <w:numId w:val="18"/>
+          <w:ilvl w:val="0"/>
+        </w:numPr>
+        <w:spacing w:after="60" w:line="276"/>
+      </w:pPr>
+      <w:r>
+        <w:rPr>
+          <w:sz w:val="22"/>
+          <w:szCs w:val="22"/>
+          <w:color w:val="1A1A1A"/>
+          <w:rFonts w:ascii="Aptos" w:hAnsi="Aptos" w:cs="Aptos" w:eastAsia="Aptos"/>
+        </w:rPr>
+        <w:t xml:space="preserve">Atlasiet trīs kolonnas: nosaukumi, zemākā un augstākā vērtība, no 2 līdz 20 rindām. Virsrakstu rinda tiek izlaista, ceturtā un tālākās kolonnas netiek izmantotas.</w:t>
+      </w:r>
+    </w:p>
+    <w:p>
+      <w:pPr>
+        <w:rPr/>
+        <w:numPr>
+          <w:numId w:val="18"/>
+          <w:ilvl w:val="0"/>
+        </w:numPr>
+        <w:spacing w:after="60" w:line="276"/>
+      </w:pPr>
+      <w:r>
+        <w:rPr>
+          <w:sz w:val="22"/>
+          <w:szCs w:val="22"/>
+          <w:color w:val="1A1A1A"/>
+          <w:rFonts w:ascii="Aptos" w:hAnsi="Aptos" w:cs="Aptos" w:eastAsia="Aptos"/>
+        </w:rPr>
+        <w:t xml:space="preserve">Nospiediet "Football field". Blakus atlasei tiek ierakstīts palīgbloks (metode, zemākā vērtība, diapazons), un diagramma tiek novietota brīvā vietā pie tā.</w:t>
+      </w:r>
+    </w:p>
+    <w:p>
+      <w:pPr>
+        <w:rPr/>
+        <w:numPr>
+          <w:numId w:val="18"/>
+          <w:ilvl w:val="0"/>
+        </w:numPr>
+        <w:spacing w:after="60" w:line="276"/>
+      </w:pPr>
+      <w:r>
+        <w:rPr>
+          <w:sz w:val="22"/>
+          <w:szCs w:val="22"/>
+          <w:color w:val="1A1A1A"/>
+          <w:rFonts w:ascii="Aptos" w:hAnsi="Aptos" w:cs="Aptos" w:eastAsia="Aptos"/>
+        </w:rPr>
+        <w:t xml:space="preserve">Ja kādā rindā zemākā vērtība ir lielāka par augstāko, rīks tās apmaina un paziņo, cik rindu apmainīts.</w:t>
       </w:r>
     </w:p>
     <w:p>
@@ -6002,7 +6368,7 @@
           <w:color w:val="1A1A1A"/>
           <w:rFonts w:ascii="Aptos" w:hAnsi="Aptos" w:cs="Aptos" w:eastAsia="Aptos"/>
         </w:rPr>
-        <w:t xml:space="preserve">Poga "CAGR label" pieraksta atlasītās sērijas vidējo gada pieaugumu diagrammas augšējā labajā stūrī.</w:t>
+        <w:t xml:space="preserve">Vērtību ass pārņem skaitļa formātu no zemākās vērtības kolonnas, leģenda ir izslēgta, diagrammas nosaukums ir "Valuation range".</w:t>
       </w:r>
     </w:p>
     <w:p>
@@ -6022,9 +6388,168 @@
           <w:bCs/>
           <w:rFonts w:ascii="Aptos" w:hAnsi="Aptos" w:cs="Aptos" w:eastAsia="Aptos"/>
         </w:rPr>
+        <w:t xml:space="preserve">Comps stats</w:t>
+      </w:r>
+      <w:bookmarkEnd w:id="29"/>
+    </w:p>
+    <w:p>
+      <w:pPr>
+        <w:rPr/>
+        <w:spacing w:after="120" w:line="276"/>
+      </w:pPr>
+      <w:r>
+        <w:rPr>
+          <w:sz w:val="22"/>
+          <w:szCs w:val="22"/>
+          <w:color w:val="1A1A1A"/>
+          <w:rFonts w:ascii="Aptos" w:hAnsi="Aptos" w:cs="Aptos" w:eastAsia="Aptos"/>
+        </w:rPr>
+        <w:t xml:space="preserve">Poga "Comps stats" zem atlasītās salīdzināmo uzņēmumu tabulas ieraksta sešas rindas ar dzīvām formulām: minimums, 25. procentile, mediāna, vidējais, 75. procentile un maksimums. Katra skaitļu kolonna saņem savas formulas, pirmā kolonna nes rindu nosaukumus, un katra šūna pārņem skaitļa formātu no kolonnas pēdējās datu rindas.</w:t>
+      </w:r>
+    </w:p>
+    <w:p>
+      <w:pPr>
+        <w:rPr/>
+        <w:numPr>
+          <w:numId w:val="19"/>
+          <w:ilvl w:val="0"/>
+        </w:numPr>
+        <w:spacing w:after="60" w:line="276"/>
+      </w:pPr>
+      <w:r>
+        <w:rPr>
+          <w:sz w:val="22"/>
+          <w:szCs w:val="22"/>
+          <w:color w:val="1A1A1A"/>
+          <w:rFonts w:ascii="Aptos" w:hAnsi="Aptos" w:cs="Aptos" w:eastAsia="Aptos"/>
+        </w:rPr>
+        <w:t xml:space="preserve">Atlasiet tabulu kopā ar virsrakstu rindu, ja tāda ir: rinda, kurā ir tikai teksts, tiek uzskatīta par virsrakstu un statistikā neietilpst.</w:t>
+      </w:r>
+    </w:p>
+    <w:p>
+      <w:pPr>
+        <w:rPr/>
+        <w:numPr>
+          <w:numId w:val="19"/>
+          <w:ilvl w:val="0"/>
+        </w:numPr>
+        <w:spacing w:after="60" w:line="276"/>
+      </w:pPr>
+      <w:r>
+        <w:rPr>
+          <w:sz w:val="22"/>
+          <w:szCs w:val="22"/>
+          <w:color w:val="1A1A1A"/>
+          <w:rFonts w:ascii="Aptos" w:hAnsi="Aptos" w:cs="Aptos" w:eastAsia="Aptos"/>
+        </w:rPr>
+        <w:t xml:space="preserve">Nospiediet "Comps stats". Bloks tiek ierakstīts vienu tukšu rindu zem tabulas un paliek atlasīts.</w:t>
+      </w:r>
+    </w:p>
+    <w:p>
+      <w:pPr>
+        <w:rPr/>
+        <w:numPr>
+          <w:numId w:val="19"/>
+          <w:ilvl w:val="0"/>
+        </w:numPr>
+        <w:spacing w:after="60" w:line="276"/>
+      </w:pPr>
+      <w:r>
+        <w:rPr>
+          <w:sz w:val="22"/>
+          <w:szCs w:val="22"/>
+          <w:color w:val="1A1A1A"/>
+          <w:rFonts w:ascii="Aptos" w:hAnsi="Aptos" w:cs="Aptos" w:eastAsia="Aptos"/>
+        </w:rPr>
+        <w:t xml:space="preserve">Mainot kādu reizinātāju tabulā, statistika pārrēķinās pati, jo šūnās ir formulas, nevis vērtības.</w:t>
+      </w:r>
+    </w:p>
+    <w:p>
+      <w:pPr>
+        <w:rPr/>
+        <w:spacing w:after="120" w:line="276"/>
+      </w:pPr>
+      <w:r>
+        <w:rPr>
+          <w:sz w:val="22"/>
+          <w:szCs w:val="22"/>
+          <w:color w:val="1A1A1A"/>
+          <w:rFonts w:ascii="Aptos" w:hAnsi="Aptos" w:cs="Aptos" w:eastAsia="Aptos"/>
+        </w:rPr>
+        <w:t xml:space="preserve">Rīks atsakās strādāt, ja zem tabulas nav sešu tukšu rindu, ja atlasīti vairāki apgabali, ja datu rindu ir mazāk par divām vai ja nevienā kolonnā nav skaitļu. Ierakstīto bloku var atsaukt ar "Undo last pls,fix action".</w:t>
+      </w:r>
+    </w:p>
+    <w:p>
+      <w:pPr>
+        <w:rPr/>
+        <w:pStyle w:val="Heading2"/>
+        <w:spacing w:before="240" w:after="100"/>
+        <w:keepNext/>
+      </w:pPr>
+      <w:bookmarkStart w:id="30" w:name="_Toc00000029"/>
+      <w:r>
+        <w:rPr>
+          <w:sz w:val="26"/>
+          <w:szCs w:val="26"/>
+          <w:color w:val="14213D"/>
+          <w:b/>
+          <w:bCs/>
+          <w:rFonts w:ascii="Aptos" w:hAnsi="Aptos" w:cs="Aptos" w:eastAsia="Aptos"/>
+        </w:rPr>
+        <w:t xml:space="preserve">Brand-format chart un CAGR label</w:t>
+      </w:r>
+      <w:bookmarkEnd w:id="30"/>
+    </w:p>
+    <w:p>
+      <w:pPr>
+        <w:rPr/>
+        <w:spacing w:after="120" w:line="276"/>
+      </w:pPr>
+      <w:r>
+        <w:rPr>
+          <w:sz w:val="22"/>
+          <w:szCs w:val="22"/>
+          <w:color w:val="1A1A1A"/>
+          <w:rFonts w:ascii="Aptos" w:hAnsi="Aptos" w:cs="Aptos" w:eastAsia="Aptos"/>
+        </w:rPr>
+        <w:t xml:space="preserve">Poga "Brand-format chart" pārnoformē atlasīto diagrammu: fonts, sēriju krāsas un leģenda nāk no jūsu paletes, palīglīnijas tiek izslēgtas, un datu etiķetēs paliek tikai vērtības (bez kategoriju nosaukumiem, sēriju nosaukumiem un procentiem). Sektoru diagrammai etiķetes tiek novietotas ārpus sektoriem, un kategoriju nosaukumus rāda leģenda. Vispirms jāatlasa diagramma, citādi panelis paziņo "Select a chart first".</w:t>
+      </w:r>
+    </w:p>
+    <w:p>
+      <w:pPr>
+        <w:rPr/>
+        <w:spacing w:after="120" w:line="276"/>
+      </w:pPr>
+      <w:r>
+        <w:rPr>
+          <w:sz w:val="22"/>
+          <w:szCs w:val="22"/>
+          <w:color w:val="1A1A1A"/>
+          <w:rFonts w:ascii="Aptos" w:hAnsi="Aptos" w:cs="Aptos" w:eastAsia="Aptos"/>
+        </w:rPr>
+        <w:t xml:space="preserve">Poga "CAGR label" pieraksta atlasītās sērijas vidējo gada pieaugumu diagrammas augšējā labajā stūrī.</w:t>
+      </w:r>
+    </w:p>
+    <w:p>
+      <w:pPr>
+        <w:rPr/>
+        <w:pStyle w:val="Heading2"/>
+        <w:spacing w:before="240" w:after="100"/>
+        <w:keepNext/>
+      </w:pPr>
+      <w:bookmarkStart w:id="31" w:name="_Toc00000030"/>
+      <w:r>
+        <w:rPr>
+          <w:sz w:val="26"/>
+          <w:szCs w:val="26"/>
+          <w:color w:val="14213D"/>
+          <w:b/>
+          <w:bCs/>
+          <w:rFonts w:ascii="Aptos" w:hAnsi="Aptos" w:cs="Aptos" w:eastAsia="Aptos"/>
+        </w:rPr>
         <w:t xml:space="preserve">Consistent rounding un funkcijas PLSFIX</w:t>
       </w:r>
-      <w:bookmarkEnd w:id="29"/>
+      <w:bookmarkEnd w:id="31"/>
     </w:p>
     <w:p>
       <w:pPr>
@@ -6211,6 +6736,47 @@
           </w:p>
         </w:tc>
       </w:tr>
+      <w:tr>
+        <w:trPr/>
+        <w:tc>
+          <w:tcPr>
+            <w:tcW w:w="2698" w:type="dxa"/>
+          </w:tcPr>
+          <w:p>
+            <w:pPr>
+              <w:rPr/>
+            </w:pPr>
+            <w:r>
+              <w:rPr>
+                <w:sz w:val="20"/>
+                <w:szCs w:val="20"/>
+                <w:color w:val="1A1A1A"/>
+                <w:rFonts w:ascii="Aptos" w:hAnsi="Aptos" w:cs="Aptos" w:eastAsia="Aptos"/>
+              </w:rPr>
+              <w:t xml:space="preserve">=PLSFIX.CAGR(sākums; beigas; periodi)</w:t>
+            </w:r>
+          </w:p>
+        </w:tc>
+        <w:tc>
+          <w:tcPr>
+            <w:tcW w:w="6940" w:type="dxa"/>
+          </w:tcPr>
+          <w:p>
+            <w:pPr>
+              <w:rPr/>
+            </w:pPr>
+            <w:r>
+              <w:rPr>
+                <w:sz w:val="20"/>
+                <w:szCs w:val="20"/>
+                <w:color w:val="1A1A1A"/>
+                <w:rFonts w:ascii="Aptos" w:hAnsi="Aptos" w:cs="Aptos" w:eastAsia="Aptos"/>
+              </w:rPr>
+              <w:t xml:space="preserve">vidējo gada pieauguma tempu no sākuma vērtības līdz beigu vērtībai norādītajā periodu skaitā</w:t>
+            </w:r>
+          </w:p>
+        </w:tc>
+      </w:tr>
     </w:tbl>
     <w:p>
       <w:pPr>
@@ -6230,6 +6796,21 @@
           <w:rFonts w:ascii="Aptos" w:hAnsi="Aptos" w:cs="Aptos" w:eastAsia="Aptos"/>
         </w:rPr>
         <w:t xml:space="preserve">Argumentu "zīmes" saprot tāpat kā Excel funkcijā ROUND: 0 nozīmē veselus skaitļus, negatīvs skaitlis noapaļo līdz desmitiem vai tūkstošiem.</w:t>
+      </w:r>
+    </w:p>
+    <w:p>
+      <w:pPr>
+        <w:rPr/>
+        <w:spacing w:after="120" w:line="276"/>
+      </w:pPr>
+      <w:r>
+        <w:rPr>
+          <w:sz w:val="22"/>
+          <w:szCs w:val="22"/>
+          <w:color w:val="1A1A1A"/>
+          <w:rFonts w:ascii="Aptos" w:hAnsi="Aptos" w:cs="Aptos" w:eastAsia="Aptos"/>
+        </w:rPr>
+        <w:t xml:space="preserve">Funkcija "=PLSFIX.CAGR(100; 200; 4)" atgriež 0,1892 jeb 18,92 % gadā. Negatīva vai nulles vērtība un periodu skaits, kas mazāks par 1, dod #VALUE!.</w:t>
       </w:r>
     </w:p>
     <w:p>
@@ -6254,7 +6835,7 @@
         <w:spacing w:before="240" w:after="100"/>
         <w:keepNext/>
       </w:pPr>
-      <w:bookmarkStart w:id="30" w:name="_Toc00000029"/>
+      <w:bookmarkStart w:id="32" w:name="_Toc00000031"/>
       <w:r>
         <w:rPr>
           <w:sz w:val="26"/>
@@ -6266,7 +6847,7 @@
         </w:rPr>
         <w:t xml:space="preserve">Unpivot selection</w:t>
       </w:r>
-      <w:bookmarkEnd w:id="30"/>
+      <w:bookmarkEnd w:id="32"/>
     </w:p>
     <w:p>
       <w:pPr>
@@ -6305,7 +6886,7 @@
         <w:spacing w:before="240" w:after="100"/>
         <w:keepNext/>
       </w:pPr>
-      <w:bookmarkStart w:id="31" w:name="_Toc00000030"/>
+      <w:bookmarkStart w:id="33" w:name="_Toc00000032"/>
       <w:r>
         <w:rPr>
           <w:sz w:val="26"/>
@@ -6317,7 +6898,7 @@
         </w:rPr>
         <w:t xml:space="preserve">Undo last pls,fix action</w:t>
       </w:r>
-      <w:bookmarkEnd w:id="31"/>
+      <w:bookmarkEnd w:id="33"/>
     </w:p>
     <w:p>
       <w:pPr>
@@ -6360,7 +6941,7 @@
         <w:keepNext/>
         <w:pageBreakBefore/>
       </w:pPr>
-      <w:bookmarkStart w:id="32" w:name="_Toc00000031"/>
+      <w:bookmarkStart w:id="34" w:name="_Toc00000033"/>
       <w:r>
         <w:rPr>
           <w:sz w:val="36"/>
@@ -6383,7 +6964,7 @@
         </w:rPr>
         <w:t xml:space="preserve">Veidnes</w:t>
       </w:r>
-      <w:bookmarkEnd w:id="32"/>
+      <w:bookmarkEnd w:id="34"/>
     </w:p>
     <w:p>
       <w:pPr>
@@ -6392,7 +6973,7 @@
         <w:spacing w:before="240" w:after="100"/>
         <w:keepNext/>
       </w:pPr>
-      <w:bookmarkStart w:id="33" w:name="_Toc00000032"/>
+      <w:bookmarkStart w:id="35" w:name="_Toc00000034"/>
       <w:r>
         <w:rPr>
           <w:sz w:val="26"/>
@@ -6404,7 +6985,7 @@
         </w:rPr>
         <w:t xml:space="preserve">Kas ir veidnes</w:t>
       </w:r>
-      <w:bookmarkEnd w:id="33"/>
+      <w:bookmarkEnd w:id="35"/>
     </w:p>
     <w:p>
       <w:pPr>
@@ -6458,7 +7039,7 @@
         <w:spacing w:before="240" w:after="100"/>
         <w:keepNext/>
       </w:pPr>
-      <w:bookmarkStart w:id="34" w:name="_Toc00000033"/>
+      <w:bookmarkStart w:id="36" w:name="_Toc00000035"/>
       <w:r>
         <w:rPr>
           <w:sz w:val="26"/>
@@ -6470,7 +7051,7 @@
         </w:rPr>
         <w:t xml:space="preserve">Debt schedule (annuity)</w:t>
       </w:r>
-      <w:bookmarkEnd w:id="34"/>
+      <w:bookmarkEnd w:id="36"/>
     </w:p>
     <w:p>
       <w:pPr>
@@ -6494,7 +7075,7 @@
         <w:spacing w:before="240" w:after="100"/>
         <w:keepNext/>
       </w:pPr>
-      <w:bookmarkStart w:id="35" w:name="_Toc00000034"/>
+      <w:bookmarkStart w:id="37" w:name="_Toc00000036"/>
       <w:r>
         <w:rPr>
           <w:sz w:val="26"/>
@@ -6506,7 +7087,7 @@
         </w:rPr>
         <w:t xml:space="preserve">DCF valuation</w:t>
       </w:r>
-      <w:bookmarkEnd w:id="35"/>
+      <w:bookmarkEnd w:id="37"/>
     </w:p>
     <w:p>
       <w:pPr>
@@ -6530,7 +7111,7 @@
         <w:spacing w:before="240" w:after="100"/>
         <w:keepNext/>
       </w:pPr>
-      <w:bookmarkStart w:id="36" w:name="_Toc00000035"/>
+      <w:bookmarkStart w:id="38" w:name="_Toc00000037"/>
       <w:r>
         <w:rPr>
           <w:sz w:val="26"/>
@@ -6542,7 +7123,7 @@
         </w:rPr>
         <w:t xml:space="preserve">NPV / IRR</w:t>
       </w:r>
-      <w:bookmarkEnd w:id="36"/>
+      <w:bookmarkEnd w:id="38"/>
     </w:p>
     <w:p>
       <w:pPr>
@@ -6566,7 +7147,7 @@
         <w:spacing w:before="240" w:after="100"/>
         <w:keepNext/>
       </w:pPr>
-      <w:bookmarkStart w:id="37" w:name="_Toc00000036"/>
+      <w:bookmarkStart w:id="39" w:name="_Toc00000038"/>
       <w:r>
         <w:rPr>
           <w:sz w:val="26"/>
@@ -6578,7 +7159,7 @@
         </w:rPr>
         <w:t xml:space="preserve">Working capital days</w:t>
       </w:r>
-      <w:bookmarkEnd w:id="37"/>
+      <w:bookmarkEnd w:id="39"/>
     </w:p>
     <w:p>
       <w:pPr>
@@ -6602,7 +7183,7 @@
         <w:spacing w:before="240" w:after="100"/>
         <w:keepNext/>
       </w:pPr>
-      <w:bookmarkStart w:id="38" w:name="_Toc00000037"/>
+      <w:bookmarkStart w:id="40" w:name="_Toc00000039"/>
       <w:r>
         <w:rPr>
           <w:sz w:val="26"/>
@@ -6614,7 +7195,7 @@
         </w:rPr>
         <w:t xml:space="preserve">Two-way sensitivity</w:t>
       </w:r>
-      <w:bookmarkEnd w:id="38"/>
+      <w:bookmarkEnd w:id="40"/>
     </w:p>
     <w:p>
       <w:pPr>
@@ -6638,7 +7219,7 @@
         <w:spacing w:before="240" w:after="100"/>
         <w:keepNext/>
       </w:pPr>
-      <w:bookmarkStart w:id="39" w:name="_Toc00000038"/>
+      <w:bookmarkStart w:id="41" w:name="_Toc00000040"/>
       <w:r>
         <w:rPr>
           <w:sz w:val="26"/>
@@ -6650,7 +7231,7 @@
         </w:rPr>
         <w:t xml:space="preserve">EBITDA bridge</w:t>
       </w:r>
-      <w:bookmarkEnd w:id="39"/>
+      <w:bookmarkEnd w:id="41"/>
     </w:p>
     <w:p>
       <w:pPr>
@@ -6678,7 +7259,7 @@
         <w:keepNext/>
         <w:pageBreakBefore/>
       </w:pPr>
-      <w:bookmarkStart w:id="40" w:name="_Toc00000039"/>
+      <w:bookmarkStart w:id="42" w:name="_Toc00000041"/>
       <w:r>
         <w:rPr>
           <w:sz w:val="36"/>
@@ -6701,7 +7282,7 @@
         </w:rPr>
         <w:t xml:space="preserve">Cilne Workbook</w:t>
       </w:r>
-      <w:bookmarkEnd w:id="40"/>
+      <w:bookmarkEnd w:id="42"/>
     </w:p>
     <w:p>
       <w:pPr>
@@ -6710,7 +7291,7 @@
         <w:spacing w:before="240" w:after="100"/>
         <w:keepNext/>
       </w:pPr>
-      <w:bookmarkStart w:id="41" w:name="_Toc00000040"/>
+      <w:bookmarkStart w:id="43" w:name="_Toc00000042"/>
       <w:r>
         <w:rPr>
           <w:sz w:val="26"/>
@@ -6722,7 +7303,7 @@
         </w:rPr>
         <w:t xml:space="preserve">Lapu saraksts</w:t>
       </w:r>
-      <w:bookmarkEnd w:id="41"/>
+      <w:bookmarkEnd w:id="43"/>
     </w:p>
     <w:p>
       <w:pPr>
@@ -6752,6 +7333,21 @@
           <w:rFonts w:ascii="Aptos" w:hAnsi="Aptos" w:cs="Aptos" w:eastAsia="Aptos"/>
         </w:rPr>
         <w:t xml:space="preserve">Aplītis rindas labajā pusē lapu paslēpj vai parāda. Ļoti paslēptās lapas sarakstā ir redzamas, bet netiek aiztiktas, jo tās var mainīt tikai ārpus Excel saskarnes.</w:t>
+      </w:r>
+    </w:p>
+    <w:p>
+      <w:pPr>
+        <w:rPr/>
+        <w:spacing w:after="120" w:line="276"/>
+      </w:pPr>
+      <w:r>
+        <w:rPr>
+          <w:sz w:val="22"/>
+          <w:szCs w:val="22"/>
+          <w:color w:val="1A1A1A"/>
+          <w:rFonts w:ascii="Aptos" w:hAnsi="Aptos" w:cs="Aptos" w:eastAsia="Aptos"/>
+        </w:rPr>
+        <w:t xml:space="preserve">Virs saraksta ir lapu rīku rinda: "Unhide all" parāda visas paslēptās lapas (ļoti paslēptās tikai ar atzīmi "Include very hidden"), "Show only this" paslēpj visas pārējās, "Bury this" padara aktīvo lapu ļoti paslēptu (pēdējo redzamo lapu paslēpt nevar), bet "Move up", "Move down" un "Move to end" pārvieto aktīvo lapu. Šīs darbības maina darbgrāmatas uzbūvi un neietilpst "Undo last pls,fix action"; ja darbgrāmatas struktūra ir aizsargāta, panelis to pasaka teikumā.</w:t>
       </w:r>
     </w:p>
     <w:p>
@@ -6826,7 +7422,7 @@
         <w:spacing w:before="240" w:after="100"/>
         <w:keepNext/>
       </w:pPr>
-      <w:bookmarkStart w:id="42" w:name="_Toc00000041"/>
+      <w:bookmarkStart w:id="44" w:name="_Toc00000043"/>
       <w:r>
         <w:rPr>
           <w:sz w:val="26"/>
@@ -6838,7 +7434,7 @@
         </w:rPr>
         <w:t xml:space="preserve">Super Find</w:t>
       </w:r>
-      <w:bookmarkEnd w:id="42"/>
+      <w:bookmarkEnd w:id="44"/>
     </w:p>
     <w:p>
       <w:pPr>
@@ -6874,7 +7470,7 @@
       <w:pPr>
         <w:rPr/>
         <w:numPr>
-          <w:numId w:val="18"/>
+          <w:numId w:val="20"/>
           <w:ilvl w:val="0"/>
         </w:numPr>
         <w:spacing w:after="60" w:line="276"/>
@@ -6893,7 +7489,7 @@
       <w:pPr>
         <w:rPr/>
         <w:numPr>
-          <w:numId w:val="18"/>
+          <w:numId w:val="20"/>
           <w:ilvl w:val="0"/>
         </w:numPr>
         <w:spacing w:after="60" w:line="276"/>
@@ -6912,7 +7508,7 @@
       <w:pPr>
         <w:rPr/>
         <w:numPr>
-          <w:numId w:val="18"/>
+          <w:numId w:val="20"/>
           <w:ilvl w:val="0"/>
         </w:numPr>
         <w:spacing w:after="60" w:line="276"/>
@@ -6931,7 +7527,7 @@
       <w:pPr>
         <w:rPr/>
         <w:numPr>
-          <w:numId w:val="18"/>
+          <w:numId w:val="20"/>
           <w:ilvl w:val="0"/>
         </w:numPr>
         <w:spacing w:after="60" w:line="276"/>
@@ -6950,7 +7546,7 @@
       <w:pPr>
         <w:rPr/>
         <w:numPr>
-          <w:numId w:val="18"/>
+          <w:numId w:val="20"/>
           <w:ilvl w:val="0"/>
         </w:numPr>
         <w:spacing w:after="60" w:line="276"/>
@@ -7002,7 +7598,7 @@
         <w:spacing w:before="240" w:after="100"/>
         <w:keepNext/>
       </w:pPr>
-      <w:bookmarkStart w:id="43" w:name="_Toc00000042"/>
+      <w:bookmarkStart w:id="45" w:name="_Toc00000044"/>
       <w:r>
         <w:rPr>
           <w:sz w:val="26"/>
@@ -7014,7 +7610,7 @@
         </w:rPr>
         <w:t xml:space="preserve">Satura rādītājs</w:t>
       </w:r>
-      <w:bookmarkEnd w:id="43"/>
+      <w:bookmarkEnd w:id="45"/>
     </w:p>
     <w:p>
       <w:pPr>
@@ -7038,7 +7634,7 @@
         <w:spacing w:before="240" w:after="100"/>
         <w:keepNext/>
       </w:pPr>
-      <w:bookmarkStart w:id="44" w:name="_Toc00000043"/>
+      <w:bookmarkStart w:id="46" w:name="_Toc00000045"/>
       <w:r>
         <w:rPr>
           <w:sz w:val="26"/>
@@ -7050,7 +7646,7 @@
         </w:rPr>
         <w:t xml:space="preserve">Bojātie nosaukumi</w:t>
       </w:r>
-      <w:bookmarkEnd w:id="44"/>
+      <w:bookmarkEnd w:id="46"/>
     </w:p>
     <w:p>
       <w:pPr>
@@ -7089,7 +7685,7 @@
         <w:spacing w:before="240" w:after="100"/>
         <w:keepNext/>
       </w:pPr>
-      <w:bookmarkStart w:id="45" w:name="_Toc00000044"/>
+      <w:bookmarkStart w:id="47" w:name="_Toc00000046"/>
       <w:r>
         <w:rPr>
           <w:sz w:val="26"/>
@@ -7101,7 +7697,7 @@
         </w:rPr>
         <w:t xml:space="preserve">Neizmantotie stili</w:t>
       </w:r>
-      <w:bookmarkEnd w:id="45"/>
+      <w:bookmarkEnd w:id="47"/>
     </w:p>
     <w:p>
       <w:pPr>
@@ -7140,7 +7736,7 @@
         <w:spacing w:before="240" w:after="100"/>
         <w:keepNext/>
       </w:pPr>
-      <w:bookmarkStart w:id="46" w:name="_Toc00000045"/>
+      <w:bookmarkStart w:id="48" w:name="_Toc00000047"/>
       <w:r>
         <w:rPr>
           <w:sz w:val="26"/>
@@ -7152,7 +7748,7 @@
         </w:rPr>
         <w:t xml:space="preserve">Prepare for sharing</w:t>
       </w:r>
-      <w:bookmarkEnd w:id="46"/>
+      <w:bookmarkEnd w:id="48"/>
     </w:p>
     <w:p>
       <w:pPr>
@@ -7188,7 +7784,7 @@
       <w:pPr>
         <w:rPr/>
         <w:numPr>
-          <w:numId w:val="19"/>
+          <w:numId w:val="21"/>
           <w:ilvl w:val="0"/>
         </w:numPr>
         <w:spacing w:after="60" w:line="276"/>
@@ -7207,7 +7803,7 @@
       <w:pPr>
         <w:rPr/>
         <w:numPr>
-          <w:numId w:val="19"/>
+          <w:numId w:val="21"/>
           <w:ilvl w:val="0"/>
         </w:numPr>
         <w:spacing w:after="60" w:line="276"/>
@@ -7226,7 +7822,7 @@
       <w:pPr>
         <w:rPr/>
         <w:numPr>
-          <w:numId w:val="19"/>
+          <w:numId w:val="21"/>
           <w:ilvl w:val="0"/>
         </w:numPr>
         <w:spacing w:after="60" w:line="276"/>
@@ -7245,7 +7841,7 @@
       <w:pPr>
         <w:rPr/>
         <w:numPr>
-          <w:numId w:val="19"/>
+          <w:numId w:val="21"/>
           <w:ilvl w:val="0"/>
         </w:numPr>
         <w:spacing w:after="60" w:line="276"/>
@@ -7264,7 +7860,7 @@
       <w:pPr>
         <w:rPr/>
         <w:numPr>
-          <w:numId w:val="19"/>
+          <w:numId w:val="21"/>
           <w:ilvl w:val="0"/>
         </w:numPr>
         <w:spacing w:after="60" w:line="276"/>
@@ -7283,7 +7879,7 @@
       <w:pPr>
         <w:rPr/>
         <w:numPr>
-          <w:numId w:val="19"/>
+          <w:numId w:val="21"/>
           <w:ilvl w:val="0"/>
         </w:numPr>
         <w:spacing w:after="60" w:line="276"/>
@@ -7320,7 +7916,7 @@
         <w:spacing w:before="240" w:after="100"/>
         <w:keepNext/>
       </w:pPr>
-      <w:bookmarkStart w:id="47" w:name="_Toc00000046"/>
+      <w:bookmarkStart w:id="49" w:name="_Toc00000048"/>
       <w:r>
         <w:rPr>
           <w:sz w:val="26"/>
@@ -7330,9 +7926,121 @@
           <w:bCs/>
           <w:rFonts w:ascii="Aptos" w:hAnsi="Aptos" w:cs="Aptos" w:eastAsia="Aptos"/>
         </w:rPr>
+        <w:t xml:space="preserve">Clean past the data</w:t>
+      </w:r>
+      <w:bookmarkEnd w:id="49"/>
+    </w:p>
+    <w:p>
+      <w:pPr>
+        <w:rPr/>
+        <w:spacing w:after="120" w:line="276"/>
+      </w:pPr>
+      <w:r>
+        <w:rPr>
+          <w:sz w:val="22"/>
+          <w:szCs w:val="22"/>
+          <w:color w:val="1A1A1A"/>
+          <w:rFonts w:ascii="Aptos" w:hAnsi="Aptos" w:cs="Aptos" w:eastAsia="Aptos"/>
+        </w:rPr>
+        <w:t xml:space="preserve">Liela darbgrāmata bieži nes tukšas, bet formatētas rindas un kolonnas tālu aiz datiem: tās palielina failu un padara ritināšanu lēnu. Poga "Clean past the data" salīdzina lapas izmantoto apgabalu ar apgabalu, kurā patiešām ir vērtības vai formulas, un liekās rindas un kolonnas izdzēš. Paziņojums nosauc skaitu, piemēram, "Removed 1,204 rows and 12 columns past the data on P&amp;L".</w:t>
+      </w:r>
+    </w:p>
+    <w:p>
+      <w:pPr>
+        <w:rPr/>
+        <w:numPr>
+          <w:numId w:val="22"/>
+          <w:ilvl w:val="0"/>
+        </w:numPr>
+        <w:spacing w:after="60" w:line="276"/>
+      </w:pPr>
+      <w:r>
+        <w:rPr>
+          <w:sz w:val="22"/>
+          <w:szCs w:val="22"/>
+          <w:color w:val="1A1A1A"/>
+          <w:rFonts w:ascii="Aptos" w:hAnsi="Aptos" w:cs="Aptos" w:eastAsia="Aptos"/>
+        </w:rPr>
+        <w:t xml:space="preserve">Ja lapā ir diagramma vai forma, rindas un kolonnas paliek un tiek notīrīti tikai formāti, lai objekts nepazustu.</w:t>
+      </w:r>
+    </w:p>
+    <w:p>
+      <w:pPr>
+        <w:rPr/>
+        <w:numPr>
+          <w:numId w:val="22"/>
+          <w:ilvl w:val="0"/>
+        </w:numPr>
+        <w:spacing w:after="60" w:line="276"/>
+      </w:pPr>
+      <w:r>
+        <w:rPr>
+          <w:sz w:val="22"/>
+          <w:szCs w:val="22"/>
+          <w:color w:val="1A1A1A"/>
+          <w:rFonts w:ascii="Aptos" w:hAnsi="Aptos" w:cs="Aptos" w:eastAsia="Aptos"/>
+        </w:rPr>
+        <w:t xml:space="preserve">Ja Excel versija nevar saskaitīt lapas objektus, rīks arī tad tikai notīra formātus un to pasaka.</w:t>
+      </w:r>
+    </w:p>
+    <w:p>
+      <w:pPr>
+        <w:rPr/>
+        <w:numPr>
+          <w:numId w:val="22"/>
+          <w:ilvl w:val="0"/>
+        </w:numPr>
+        <w:spacing w:after="60" w:line="276"/>
+      </w:pPr>
+      <w:r>
+        <w:rPr>
+          <w:sz w:val="22"/>
+          <w:szCs w:val="22"/>
+          <w:color w:val="1A1A1A"/>
+          <w:rFonts w:ascii="Aptos" w:hAnsi="Aptos" w:cs="Aptos" w:eastAsia="Aptos"/>
+        </w:rPr>
+        <w:t xml:space="preserve">Tukšā lapā un lapā bez liekā apgabala nekas nemainās; aizsargātā lapā rīks atbild ar teikumu.</w:t>
+      </w:r>
+    </w:p>
+    <w:p>
+      <w:pPr>
+        <w:rPr/>
+        <w:numPr>
+          <w:numId w:val="22"/>
+          <w:ilvl w:val="0"/>
+        </w:numPr>
+        <w:spacing w:after="60" w:line="276"/>
+      </w:pPr>
+      <w:r>
+        <w:rPr>
+          <w:sz w:val="22"/>
+          <w:szCs w:val="22"/>
+          <w:color w:val="1A1A1A"/>
+          <w:rFonts w:ascii="Aptos" w:hAnsi="Aptos" w:cs="Aptos" w:eastAsia="Aptos"/>
+        </w:rPr>
+        <w:t xml:space="preserve">Darbība maina lapas uzbūvi un neietilpst "Undo last pls,fix action": pirms tās saglabājiet failu.</w:t>
+      </w:r>
+    </w:p>
+    <w:p>
+      <w:pPr>
+        <w:rPr/>
+        <w:pStyle w:val="Heading2"/>
+        <w:spacing w:before="240" w:after="100"/>
+        <w:keepNext/>
+      </w:pPr>
+      <w:bookmarkStart w:id="50" w:name="_Toc00000049"/>
+      <w:r>
+        <w:rPr>
+          <w:sz w:val="26"/>
+          <w:szCs w:val="26"/>
+          <w:color w:val="14213D"/>
+          <w:b/>
+          <w:bCs/>
+          <w:rFonts w:ascii="Aptos" w:hAnsi="Aptos" w:cs="Aptos" w:eastAsia="Aptos"/>
+        </w:rPr>
         <w:t xml:space="preserve">Model check</w:t>
       </w:r>
-      <w:bookmarkEnd w:id="47"/>
+      <w:bookmarkEnd w:id="50"/>
     </w:p>
     <w:p>
       <w:pPr>
@@ -7360,7 +8068,7 @@
         <w:keepNext/>
         <w:pageBreakBefore/>
       </w:pPr>
-      <w:bookmarkStart w:id="48" w:name="_Toc00000047"/>
+      <w:bookmarkStart w:id="51" w:name="_Toc00000050"/>
       <w:r>
         <w:rPr>
           <w:sz w:val="36"/>
@@ -7383,7 +8091,7 @@
         </w:rPr>
         <w:t xml:space="preserve">Saites uz PowerPoint</w:t>
       </w:r>
-      <w:bookmarkEnd w:id="48"/>
+      <w:bookmarkEnd w:id="51"/>
     </w:p>
     <w:p>
       <w:pPr>
@@ -7392,7 +8100,7 @@
         <w:spacing w:before="240" w:after="100"/>
         <w:keepNext/>
       </w:pPr>
-      <w:bookmarkStart w:id="49" w:name="_Toc00000048"/>
+      <w:bookmarkStart w:id="52" w:name="_Toc00000051"/>
       <w:r>
         <w:rPr>
           <w:sz w:val="26"/>
@@ -7404,7 +8112,7 @@
         </w:rPr>
         <w:t xml:space="preserve">Kā saite darbojas</w:t>
       </w:r>
-      <w:bookmarkEnd w:id="49"/>
+      <w:bookmarkEnd w:id="52"/>
     </w:p>
     <w:p>
       <w:pPr>
@@ -7458,7 +8166,7 @@
         <w:spacing w:before="240" w:after="100"/>
         <w:keepNext/>
       </w:pPr>
-      <w:bookmarkStart w:id="50" w:name="_Toc00000049"/>
+      <w:bookmarkStart w:id="53" w:name="_Toc00000052"/>
       <w:r>
         <w:rPr>
           <w:sz w:val="26"/>
@@ -7470,7 +8178,7 @@
         </w:rPr>
         <w:t xml:space="preserve">Saites atslēga</w:t>
       </w:r>
-      <w:bookmarkEnd w:id="50"/>
+      <w:bookmarkEnd w:id="53"/>
     </w:p>
     <w:p>
       <w:pPr>
@@ -7491,7 +8199,7 @@
       <w:pPr>
         <w:rPr/>
         <w:numPr>
-          <w:numId w:val="20"/>
+          <w:numId w:val="23"/>
           <w:ilvl w:val="0"/>
         </w:numPr>
         <w:spacing w:after="60" w:line="276"/>
@@ -7510,7 +8218,7 @@
       <w:pPr>
         <w:rPr/>
         <w:numPr>
-          <w:numId w:val="20"/>
+          <w:numId w:val="23"/>
           <w:ilvl w:val="0"/>
         </w:numPr>
         <w:spacing w:after="60" w:line="276"/>
@@ -7529,7 +8237,7 @@
       <w:pPr>
         <w:rPr/>
         <w:numPr>
-          <w:numId w:val="20"/>
+          <w:numId w:val="23"/>
           <w:ilvl w:val="0"/>
         </w:numPr>
         <w:spacing w:after="60" w:line="276"/>
@@ -7646,7 +8354,7 @@
         <w:spacing w:before="240" w:after="100"/>
         <w:keepNext/>
       </w:pPr>
-      <w:bookmarkStart w:id="51" w:name="_Toc00000050"/>
+      <w:bookmarkStart w:id="54" w:name="_Toc00000053"/>
       <w:r>
         <w:rPr>
           <w:sz w:val="26"/>
@@ -7658,7 +8366,7 @@
         </w:rPr>
         <w:t xml:space="preserve">Eksports no Excel</w:t>
       </w:r>
-      <w:bookmarkEnd w:id="51"/>
+      <w:bookmarkEnd w:id="54"/>
     </w:p>
     <w:p>
       <w:pPr>
@@ -7679,7 +8387,7 @@
       <w:pPr>
         <w:rPr/>
         <w:numPr>
-          <w:numId w:val="21"/>
+          <w:numId w:val="24"/>
           <w:ilvl w:val="0"/>
         </w:numPr>
         <w:spacing w:after="60" w:line="276"/>
@@ -7698,7 +8406,7 @@
       <w:pPr>
         <w:rPr/>
         <w:numPr>
-          <w:numId w:val="21"/>
+          <w:numId w:val="24"/>
           <w:ilvl w:val="0"/>
         </w:numPr>
         <w:spacing w:after="60" w:line="276"/>
@@ -7815,7 +8523,7 @@
         <w:spacing w:before="240" w:after="100"/>
         <w:keepNext/>
       </w:pPr>
-      <w:bookmarkStart w:id="52" w:name="_Toc00000051"/>
+      <w:bookmarkStart w:id="55" w:name="_Toc00000054"/>
       <w:r>
         <w:rPr>
           <w:sz w:val="26"/>
@@ -7827,7 +8535,7 @@
         </w:rPr>
         <w:t xml:space="preserve">Saišu saraksts Excel pusē</w:t>
       </w:r>
-      <w:bookmarkEnd w:id="52"/>
+      <w:bookmarkEnd w:id="55"/>
     </w:p>
     <w:p>
       <w:pPr>
@@ -8094,7 +8802,7 @@
         <w:spacing w:before="240" w:after="100"/>
         <w:keepNext/>
       </w:pPr>
-      <w:bookmarkStart w:id="53" w:name="_Toc00000052"/>
+      <w:bookmarkStart w:id="56" w:name="_Toc00000055"/>
       <w:r>
         <w:rPr>
           <w:sz w:val="26"/>
@@ -8106,7 +8814,7 @@
         </w:rPr>
         <w:t xml:space="preserve">Auto-push on edit un Highlight linked cells</w:t>
       </w:r>
-      <w:bookmarkEnd w:id="53"/>
+      <w:bookmarkEnd w:id="56"/>
     </w:p>
     <w:p>
       <w:pPr>
@@ -8145,7 +8853,7 @@
         <w:spacing w:before="240" w:after="100"/>
         <w:keepNext/>
       </w:pPr>
-      <w:bookmarkStart w:id="54" w:name="_Toc00000053"/>
+      <w:bookmarkStart w:id="57" w:name="_Toc00000056"/>
       <w:r>
         <w:rPr>
           <w:sz w:val="26"/>
@@ -8157,7 +8865,7 @@
         </w:rPr>
         <w:t xml:space="preserve">Ievietošana PowerPoint</w:t>
       </w:r>
-      <w:bookmarkEnd w:id="54"/>
+      <w:bookmarkEnd w:id="57"/>
     </w:p>
     <w:p>
       <w:pPr>
@@ -8178,7 +8886,7 @@
       <w:pPr>
         <w:rPr/>
         <w:numPr>
-          <w:numId w:val="22"/>
+          <w:numId w:val="25"/>
           <w:ilvl w:val="0"/>
         </w:numPr>
         <w:spacing w:after="60" w:line="276"/>
@@ -8197,7 +8905,7 @@
       <w:pPr>
         <w:rPr/>
         <w:numPr>
-          <w:numId w:val="22"/>
+          <w:numId w:val="25"/>
           <w:ilvl w:val="0"/>
         </w:numPr>
         <w:spacing w:after="60" w:line="276"/>
@@ -8216,7 +8924,7 @@
       <w:pPr>
         <w:rPr/>
         <w:numPr>
-          <w:numId w:val="22"/>
+          <w:numId w:val="25"/>
           <w:ilvl w:val="0"/>
         </w:numPr>
         <w:spacing w:after="60" w:line="276"/>
@@ -8333,7 +9041,7 @@
         <w:spacing w:before="240" w:after="100"/>
         <w:keepNext/>
       </w:pPr>
-      <w:bookmarkStart w:id="55" w:name="_Toc00000054"/>
+      <w:bookmarkStart w:id="58" w:name="_Toc00000057"/>
       <w:r>
         <w:rPr>
           <w:sz w:val="26"/>
@@ -8345,7 +9053,7 @@
         </w:rPr>
         <w:t xml:space="preserve">Atjaunināšana</w:t>
       </w:r>
-      <w:bookmarkEnd w:id="55"/>
+      <w:bookmarkEnd w:id="58"/>
     </w:p>
     <w:p>
       <w:pPr>
@@ -8707,7 +9415,7 @@
         <w:spacing w:before="240" w:after="100"/>
         <w:keepNext/>
       </w:pPr>
-      <w:bookmarkStart w:id="56" w:name="_Toc00000055"/>
+      <w:bookmarkStart w:id="59" w:name="_Toc00000058"/>
       <w:r>
         <w:rPr>
           <w:sz w:val="26"/>
@@ -8719,7 +9427,7 @@
         </w:rPr>
         <w:t xml:space="preserve">Meklēšana un filtrēšana</w:t>
       </w:r>
-      <w:bookmarkEnd w:id="56"/>
+      <w:bookmarkEnd w:id="59"/>
     </w:p>
     <w:p>
       <w:pPr>
@@ -8998,7 +9706,7 @@
       <w:pPr>
         <w:rPr/>
         <w:numPr>
-          <w:numId w:val="23"/>
+          <w:numId w:val="26"/>
           <w:ilvl w:val="0"/>
         </w:numPr>
         <w:spacing w:after="60" w:line="276"/>
@@ -9017,7 +9725,7 @@
       <w:pPr>
         <w:rPr/>
         <w:numPr>
-          <w:numId w:val="23"/>
+          <w:numId w:val="26"/>
           <w:ilvl w:val="0"/>
         </w:numPr>
         <w:spacing w:after="60" w:line="276"/>
@@ -9036,7 +9744,7 @@
       <w:pPr>
         <w:rPr/>
         <w:numPr>
-          <w:numId w:val="23"/>
+          <w:numId w:val="26"/>
           <w:ilvl w:val="0"/>
         </w:numPr>
         <w:spacing w:after="60" w:line="276"/>
@@ -9055,7 +9763,7 @@
       <w:pPr>
         <w:rPr/>
         <w:numPr>
-          <w:numId w:val="23"/>
+          <w:numId w:val="26"/>
           <w:ilvl w:val="0"/>
         </w:numPr>
         <w:spacing w:after="60" w:line="276"/>
@@ -9077,7 +9785,7 @@
         <w:spacing w:before="240" w:after="100"/>
         <w:keepNext/>
       </w:pPr>
-      <w:bookmarkStart w:id="57" w:name="_Toc00000056"/>
+      <w:bookmarkStart w:id="60" w:name="_Toc00000059"/>
       <w:r>
         <w:rPr>
           <w:sz w:val="26"/>
@@ -9089,7 +9797,7 @@
         </w:rPr>
         <w:t xml:space="preserve">Go to slide, Change source un Break link</w:t>
       </w:r>
-      <w:bookmarkEnd w:id="57"/>
+      <w:bookmarkEnd w:id="60"/>
     </w:p>
     <w:p>
       <w:pPr>
@@ -9158,7 +9866,7 @@
         <w:spacing w:before="240" w:after="100"/>
         <w:keepNext/>
       </w:pPr>
-      <w:bookmarkStart w:id="58" w:name="_Toc00000057"/>
+      <w:bookmarkStart w:id="61" w:name="_Toc00000060"/>
       <w:r>
         <w:rPr>
           <w:sz w:val="26"/>
@@ -9170,7 +9878,7 @@
         </w:rPr>
         <w:t xml:space="preserve">Object tools</w:t>
       </w:r>
-      <w:bookmarkEnd w:id="58"/>
+      <w:bookmarkEnd w:id="61"/>
     </w:p>
     <w:p>
       <w:pPr>
@@ -9426,7 +10134,7 @@
         <w:spacing w:before="240" w:after="100"/>
         <w:keepNext/>
       </w:pPr>
-      <w:bookmarkStart w:id="59" w:name="_Toc00000058"/>
+      <w:bookmarkStart w:id="62" w:name="_Toc00000061"/>
       <w:r>
         <w:rPr>
           <w:sz w:val="26"/>
@@ -9438,7 +10146,7 @@
         </w:rPr>
         <w:t xml:space="preserve">Smart Painter</w:t>
       </w:r>
-      <w:bookmarkEnd w:id="59"/>
+      <w:bookmarkEnd w:id="62"/>
     </w:p>
     <w:p>
       <w:pPr>
@@ -9459,7 +10167,7 @@
       <w:pPr>
         <w:rPr/>
         <w:numPr>
-          <w:numId w:val="24"/>
+          <w:numId w:val="27"/>
           <w:ilvl w:val="0"/>
         </w:numPr>
         <w:spacing w:after="60" w:line="276"/>
@@ -9478,7 +10186,7 @@
       <w:pPr>
         <w:rPr/>
         <w:numPr>
-          <w:numId w:val="24"/>
+          <w:numId w:val="27"/>
           <w:ilvl w:val="0"/>
         </w:numPr>
         <w:spacing w:after="60" w:line="276"/>
@@ -9497,7 +10205,7 @@
       <w:pPr>
         <w:rPr/>
         <w:numPr>
-          <w:numId w:val="24"/>
+          <w:numId w:val="27"/>
           <w:ilvl w:val="0"/>
         </w:numPr>
         <w:spacing w:after="60" w:line="276"/>
@@ -9534,7 +10242,7 @@
         <w:spacing w:before="240" w:after="100"/>
         <w:keepNext/>
       </w:pPr>
-      <w:bookmarkStart w:id="60" w:name="_Toc00000059"/>
+      <w:bookmarkStart w:id="63" w:name="_Toc00000062"/>
       <w:r>
         <w:rPr>
           <w:sz w:val="26"/>
@@ -9546,7 +10254,7 @@
         </w:rPr>
         <w:t xml:space="preserve">Drošība</w:t>
       </w:r>
-      <w:bookmarkEnd w:id="60"/>
+      <w:bookmarkEnd w:id="63"/>
     </w:p>
     <w:p>
       <w:pPr>
@@ -9589,7 +10297,7 @@
         <w:keepNext/>
         <w:pageBreakBefore/>
       </w:pPr>
-      <w:bookmarkStart w:id="61" w:name="_Toc00000060"/>
+      <w:bookmarkStart w:id="64" w:name="_Toc00000063"/>
       <w:r>
         <w:rPr>
           <w:sz w:val="36"/>
@@ -9612,7 +10320,7 @@
         </w:rPr>
         <w:t xml:space="preserve">Cilne Brand</w:t>
       </w:r>
-      <w:bookmarkEnd w:id="61"/>
+      <w:bookmarkEnd w:id="64"/>
     </w:p>
     <w:p>
       <w:pPr>
@@ -9621,7 +10329,7 @@
         <w:spacing w:before="240" w:after="100"/>
         <w:keepNext/>
       </w:pPr>
-      <w:bookmarkStart w:id="62" w:name="_Toc00000061"/>
+      <w:bookmarkStart w:id="65" w:name="_Toc00000064"/>
       <w:r>
         <w:rPr>
           <w:sz w:val="26"/>
@@ -9633,7 +10341,7 @@
         </w:rPr>
         <w:t xml:space="preserve">Palete</w:t>
       </w:r>
-      <w:bookmarkEnd w:id="62"/>
+      <w:bookmarkEnd w:id="65"/>
     </w:p>
     <w:p>
       <w:pPr>
@@ -10103,7 +10811,7 @@
         <w:spacing w:before="240" w:after="100"/>
         <w:keepNext/>
       </w:pPr>
-      <w:bookmarkStart w:id="63" w:name="_Toc00000062"/>
+      <w:bookmarkStart w:id="66" w:name="_Toc00000065"/>
       <w:r>
         <w:rPr>
           <w:sz w:val="26"/>
@@ -10115,7 +10823,7 @@
         </w:rPr>
         <w:t xml:space="preserve">Krāsas no logotipa</w:t>
       </w:r>
-      <w:bookmarkEnd w:id="63"/>
+      <w:bookmarkEnd w:id="66"/>
     </w:p>
     <w:p>
       <w:pPr>
@@ -10139,7 +10847,7 @@
         <w:spacing w:before="240" w:after="100"/>
         <w:keepNext/>
       </w:pPr>
-      <w:bookmarkStart w:id="64" w:name="_Toc00000063"/>
+      <w:bookmarkStart w:id="67" w:name="_Toc00000066"/>
       <w:r>
         <w:rPr>
           <w:sz w:val="26"/>
@@ -10151,7 +10859,7 @@
         </w:rPr>
         <w:t xml:space="preserve">Fonts, valoda un skaitļu stils</w:t>
       </w:r>
-      <w:bookmarkEnd w:id="64"/>
+      <w:bookmarkEnd w:id="67"/>
     </w:p>
     <w:p>
       <w:pPr>
@@ -10582,7 +11290,7 @@
         <w:spacing w:before="240" w:after="100"/>
         <w:keepNext/>
       </w:pPr>
-      <w:bookmarkStart w:id="65" w:name="_Toc00000064"/>
+      <w:bookmarkStart w:id="68" w:name="_Toc00000067"/>
       <w:r>
         <w:rPr>
           <w:sz w:val="26"/>
@@ -10594,7 +11302,7 @@
         </w:rPr>
         <w:t xml:space="preserve">Valūta</w:t>
       </w:r>
-      <w:bookmarkEnd w:id="65"/>
+      <w:bookmarkEnd w:id="68"/>
     </w:p>
     <w:p>
       <w:pPr>
@@ -10618,7 +11326,7 @@
         <w:spacing w:before="240" w:after="100"/>
         <w:keepNext/>
       </w:pPr>
-      <w:bookmarkStart w:id="66" w:name="_Toc00000065"/>
+      <w:bookmarkStart w:id="69" w:name="_Toc00000068"/>
       <w:r>
         <w:rPr>
           <w:sz w:val="26"/>
@@ -10630,7 +11338,7 @@
         </w:rPr>
         <w:t xml:space="preserve">Autocolor on edit</w:t>
       </w:r>
-      <w:bookmarkEnd w:id="66"/>
+      <w:bookmarkEnd w:id="69"/>
     </w:p>
     <w:p>
       <w:pPr>
@@ -10654,7 +11362,7 @@
         <w:spacing w:before="240" w:after="100"/>
         <w:keepNext/>
       </w:pPr>
-      <w:bookmarkStart w:id="67" w:name="_Toc00000066"/>
+      <w:bookmarkStart w:id="70" w:name="_Toc00000069"/>
       <w:r>
         <w:rPr>
           <w:sz w:val="26"/>
@@ -10664,9 +11372,45 @@
           <w:bCs/>
           <w:rFonts w:ascii="Aptos" w:hAnsi="Aptos" w:cs="Aptos" w:eastAsia="Aptos"/>
         </w:rPr>
+        <w:t xml:space="preserve">Keyboard shortcuts</w:t>
+      </w:r>
+      <w:bookmarkEnd w:id="70"/>
+    </w:p>
+    <w:p>
+      <w:pPr>
+        <w:rPr/>
+        <w:spacing w:after="120" w:line="276"/>
+      </w:pPr>
+      <w:r>
+        <w:rPr>
+          <w:sz w:val="22"/>
+          <w:szCs w:val="22"/>
+          <w:color w:val="1A1A1A"/>
+          <w:rFonts w:ascii="Aptos" w:hAnsi="Aptos" w:cs="Aptos" w:eastAsia="Aptos"/>
+        </w:rPr>
+        <w:t xml:space="preserve">Sadaļā "Keyboard shortcuts" cilnē "Brand" katrai pls,fix taustiņu saīsnei var piešķirt savu kombināciju, piemēram, Ctrl+Shift+A (Mac datorā Ctrl nozīmē Cmd). "Apply" vispirms pārbauda, vai kombinācija jau nav aizņemta, un nosauc konfliktus; "Reset all" atgriež noklusējumus. Iestatījumi glabājas jūsu Microsoft 365 kontā, tāpēc jābūt pieteiktam Office; bez tā sadaļa to pasaka un paliek neaktīva.</w:t>
+      </w:r>
+    </w:p>
+    <w:p>
+      <w:pPr>
+        <w:rPr/>
+        <w:pStyle w:val="Heading2"/>
+        <w:spacing w:before="240" w:after="100"/>
+        <w:keepNext/>
+      </w:pPr>
+      <w:bookmarkStart w:id="71" w:name="_Toc00000070"/>
+      <w:r>
+        <w:rPr>
+          <w:sz w:val="26"/>
+          <w:szCs w:val="26"/>
+          <w:color w:val="14213D"/>
+          <w:b/>
+          <w:bCs/>
+          <w:rFonts w:ascii="Aptos" w:hAnsi="Aptos" w:cs="Aptos" w:eastAsia="Aptos"/>
+        </w:rPr>
         <w:t xml:space="preserve">Iestatījumu pārnešana un atiestatīšana</w:t>
       </w:r>
-      <w:bookmarkEnd w:id="67"/>
+      <w:bookmarkEnd w:id="71"/>
     </w:p>
     <w:p>
       <w:pPr>
@@ -10724,7 +11468,7 @@
         <w:keepNext/>
         <w:pageBreakBefore/>
       </w:pPr>
-      <w:bookmarkStart w:id="68" w:name="_Toc00000067"/>
+      <w:bookmarkStart w:id="72" w:name="_Toc00000071"/>
       <w:r>
         <w:rPr>
           <w:sz w:val="36"/>
@@ -10747,7 +11491,7 @@
         </w:rPr>
         <w:t xml:space="preserve">Īsinājumtaustiņi</w:t>
       </w:r>
-      <w:bookmarkEnd w:id="68"/>
+      <w:bookmarkEnd w:id="72"/>
     </w:p>
     <w:p>
       <w:pPr>
@@ -10756,7 +11500,7 @@
         <w:spacing w:before="240" w:after="100"/>
         <w:keepNext/>
       </w:pPr>
-      <w:bookmarkStart w:id="69" w:name="_Toc00000068"/>
+      <w:bookmarkStart w:id="73" w:name="_Toc00000072"/>
       <w:r>
         <w:rPr>
           <w:sz w:val="26"/>
@@ -10768,7 +11512,7 @@
         </w:rPr>
         <w:t xml:space="preserve">Visas kombinācijas</w:t>
       </w:r>
-      <w:bookmarkEnd w:id="69"/>
+      <w:bookmarkEnd w:id="73"/>
     </w:p>
     <w:p>
       <w:pPr>
@@ -13433,7 +14177,7 @@
         <w:keepNext/>
         <w:pageBreakBefore/>
       </w:pPr>
-      <w:bookmarkStart w:id="70" w:name="_Toc00000069"/>
+      <w:bookmarkStart w:id="74" w:name="_Toc00000073"/>
       <w:r>
         <w:rPr>
           <w:sz w:val="36"/>
@@ -13456,7 +14200,7 @@
         </w:rPr>
         <w:t xml:space="preserve">Biežākās problēmas</w:t>
       </w:r>
-      <w:bookmarkEnd w:id="70"/>
+      <w:bookmarkEnd w:id="74"/>
     </w:p>
     <w:p>
       <w:pPr>
@@ -13465,7 +14209,7 @@
         <w:spacing w:before="240" w:after="100"/>
         <w:keepNext/>
       </w:pPr>
-      <w:bookmarkStart w:id="71" w:name="_Toc00000070"/>
+      <w:bookmarkStart w:id="75" w:name="_Toc00000074"/>
       <w:r>
         <w:rPr>
           <w:sz w:val="26"/>
@@ -13477,7 +14221,7 @@
         </w:rPr>
         <w:t xml:space="preserve">Ziņojumi un to iemesli</w:t>
       </w:r>
-      <w:bookmarkEnd w:id="71"/>
+      <w:bookmarkEnd w:id="75"/>
     </w:p>
     <w:tbl>
       <w:tblPr>
@@ -14248,7 +14992,7 @@
         <w:spacing w:before="240" w:after="100"/>
         <w:keepNext/>
       </w:pPr>
-      <w:bookmarkStart w:id="72" w:name="_Toc00000071"/>
+      <w:bookmarkStart w:id="76" w:name="_Toc00000075"/>
       <w:r>
         <w:rPr>
           <w:sz w:val="26"/>
@@ -14260,13 +15004,13 @@
         </w:rPr>
         <w:t xml:space="preserve">Ierobežojumi</w:t>
       </w:r>
-      <w:bookmarkEnd w:id="72"/>
+      <w:bookmarkEnd w:id="76"/>
     </w:p>
     <w:p>
       <w:pPr>
         <w:rPr/>
         <w:numPr>
-          <w:numId w:val="25"/>
+          <w:numId w:val="28"/>
           <w:ilvl w:val="0"/>
         </w:numPr>
         <w:spacing w:after="60" w:line="276"/>
@@ -14285,7 +15029,7 @@
       <w:pPr>
         <w:rPr/>
         <w:numPr>
-          <w:numId w:val="25"/>
+          <w:numId w:val="28"/>
           <w:ilvl w:val="0"/>
         </w:numPr>
         <w:spacing w:after="60" w:line="276"/>
@@ -14304,7 +15048,7 @@
       <w:pPr>
         <w:rPr/>
         <w:numPr>
-          <w:numId w:val="25"/>
+          <w:numId w:val="28"/>
           <w:ilvl w:val="0"/>
         </w:numPr>
         <w:spacing w:after="60" w:line="276"/>
@@ -14323,7 +15067,7 @@
       <w:pPr>
         <w:rPr/>
         <w:numPr>
-          <w:numId w:val="25"/>
+          <w:numId w:val="28"/>
           <w:ilvl w:val="0"/>
         </w:numPr>
         <w:spacing w:after="60" w:line="276"/>
@@ -14342,7 +15086,7 @@
       <w:pPr>
         <w:rPr/>
         <w:numPr>
-          <w:numId w:val="25"/>
+          <w:numId w:val="28"/>
           <w:ilvl w:val="0"/>
         </w:numPr>
         <w:spacing w:after="60" w:line="276"/>
@@ -14361,7 +15105,7 @@
       <w:pPr>
         <w:rPr/>
         <w:numPr>
-          <w:numId w:val="25"/>
+          <w:numId w:val="28"/>
           <w:ilvl w:val="0"/>
         </w:numPr>
         <w:spacing w:after="60" w:line="276"/>
@@ -14380,7 +15124,7 @@
       <w:pPr>
         <w:rPr/>
         <w:numPr>
-          <w:numId w:val="25"/>
+          <w:numId w:val="28"/>
           <w:ilvl w:val="0"/>
         </w:numPr>
         <w:spacing w:after="60" w:line="276"/>
@@ -14399,7 +15143,7 @@
       <w:pPr>
         <w:rPr/>
         <w:numPr>
-          <w:numId w:val="25"/>
+          <w:numId w:val="28"/>
           <w:ilvl w:val="0"/>
         </w:numPr>
         <w:spacing w:after="60" w:line="276"/>
@@ -14418,7 +15162,7 @@
       <w:pPr>
         <w:rPr/>
         <w:numPr>
-          <w:numId w:val="25"/>
+          <w:numId w:val="28"/>
           <w:ilvl w:val="0"/>
         </w:numPr>
         <w:spacing w:after="60" w:line="276"/>
@@ -14437,7 +15181,7 @@
       <w:pPr>
         <w:rPr/>
         <w:numPr>
-          <w:numId w:val="25"/>
+          <w:numId w:val="28"/>
           <w:ilvl w:val="0"/>
         </w:numPr>
         <w:spacing w:after="60" w:line="276"/>
@@ -14456,7 +15200,7 @@
       <w:pPr>
         <w:rPr/>
         <w:numPr>
-          <w:numId w:val="25"/>
+          <w:numId w:val="28"/>
           <w:ilvl w:val="0"/>
         </w:numPr>
         <w:spacing w:after="60" w:line="276"/>
@@ -14475,7 +15219,7 @@
       <w:pPr>
         <w:rPr/>
         <w:numPr>
-          <w:numId w:val="25"/>
+          <w:numId w:val="28"/>
           <w:ilvl w:val="0"/>
         </w:numPr>
         <w:spacing w:after="60" w:line="276"/>
@@ -14501,7 +15245,7 @@
         <w:keepNext/>
         <w:pageBreakBefore/>
       </w:pPr>
-      <w:bookmarkStart w:id="73" w:name="_Toc00000072"/>
+      <w:bookmarkStart w:id="77" w:name="_Toc00000076"/>
       <w:r>
         <w:rPr>
           <w:sz w:val="36"/>
@@ -14524,7 +15268,7 @@
         </w:rPr>
         <w:t xml:space="preserve">Versija</w:t>
       </w:r>
-      <w:bookmarkEnd w:id="73"/>
+      <w:bookmarkEnd w:id="77"/>
     </w:p>
     <w:p>
       <w:pPr>
@@ -14533,7 +15277,7 @@
         <w:spacing w:before="240" w:after="100"/>
         <w:keepNext/>
       </w:pPr>
-      <w:bookmarkStart w:id="74" w:name="_Toc00000073"/>
+      <w:bookmarkStart w:id="78" w:name="_Toc00000077"/>
       <w:r>
         <w:rPr>
           <w:sz w:val="26"/>
@@ -14545,7 +15289,7 @@
         </w:rPr>
         <w:t xml:space="preserve">Kura versija ir aprakstīta</w:t>
       </w:r>
-      <w:bookmarkEnd w:id="74"/>
+      <w:bookmarkEnd w:id="78"/>
     </w:p>
     <w:p>
       <w:pPr>
@@ -14559,7 +15303,7 @@
           <w:color w:val="1A1A1A"/>
           <w:rFonts w:ascii="Aptos" w:hAnsi="Aptos" w:cs="Aptos" w:eastAsia="Aptos"/>
         </w:rPr>
-        <w:t xml:space="preserve">Šī rokasgrāmata apraksta pls,fix versiju v2.6.015. Tā pati versija ir uzrakstīta uz vāka un katras lapas apakšā.</w:t>
+        <w:t xml:space="preserve">Šī rokasgrāmata apraksta pls,fix versiju v2.7.009. Tā pati versija ir uzrakstīta uz vāka un katras lapas apakšā.</w:t>
       </w:r>
     </w:p>
     <w:p>
@@ -14624,7 +15368,7 @@
         <w:color w:val="5B6472"/>
         <w:rFonts w:ascii="Aptos" w:hAnsi="Aptos" w:cs="Aptos" w:eastAsia="Aptos"/>
       </w:rPr>
-      <w:t xml:space="preserve">pls,fix rokasgrāmata v2.6.015   |   </w:t>
+      <w:t xml:space="preserve">pls,fix rokasgrāmata v2.7.009   |   </w:t>
     </w:r>
     <w:r>
       <w:rPr>
@@ -14828,19 +15572,19 @@
     </w:lvlOverride>
   </w:num>
   <w:num w:numId="18">
-    <w:abstractNumId w:val="2"/>
+    <w:abstractNumId w:val="1"/>
     <w:lvlOverride w:ilvl="0">
       <w:startOverride w:val="1"/>
     </w:lvlOverride>
   </w:num>
   <w:num w:numId="19">
-    <w:abstractNumId w:val="2"/>
+    <w:abstractNumId w:val="1"/>
     <w:lvlOverride w:ilvl="0">
       <w:startOverride w:val="1"/>
     </w:lvlOverride>
   </w:num>
   <w:num w:numId="20">
-    <w:abstractNumId w:val="1"/>
+    <w:abstractNumId w:val="2"/>
     <w:lvlOverride w:ilvl="0">
       <w:startOverride w:val="1"/>
     </w:lvlOverride>
@@ -14852,24 +15596,42 @@
     </w:lvlOverride>
   </w:num>
   <w:num w:numId="22">
+    <w:abstractNumId w:val="2"/>
+    <w:lvlOverride w:ilvl="0">
+      <w:startOverride w:val="1"/>
+    </w:lvlOverride>
+  </w:num>
+  <w:num w:numId="23">
     <w:abstractNumId w:val="1"/>
     <w:lvlOverride w:ilvl="0">
       <w:startOverride w:val="1"/>
     </w:lvlOverride>
   </w:num>
-  <w:num w:numId="23">
+  <w:num w:numId="24">
     <w:abstractNumId w:val="2"/>
     <w:lvlOverride w:ilvl="0">
       <w:startOverride w:val="1"/>
     </w:lvlOverride>
   </w:num>
-  <w:num w:numId="24">
+  <w:num w:numId="25">
     <w:abstractNumId w:val="1"/>
     <w:lvlOverride w:ilvl="0">
       <w:startOverride w:val="1"/>
     </w:lvlOverride>
   </w:num>
-  <w:num w:numId="25">
+  <w:num w:numId="26">
+    <w:abstractNumId w:val="2"/>
+    <w:lvlOverride w:ilvl="0">
+      <w:startOverride w:val="1"/>
+    </w:lvlOverride>
+  </w:num>
+  <w:num w:numId="27">
+    <w:abstractNumId w:val="1"/>
+    <w:lvlOverride w:ilvl="0">
+      <w:startOverride w:val="1"/>
+    </w:lvlOverride>
+  </w:num>
+  <w:num w:numId="28">
     <w:abstractNumId w:val="2"/>
     <w:lvlOverride w:ilvl="0">
       <w:startOverride w:val="1"/>

</xml_diff>

<commit_message>
Manual regenerated at v2.7.13
</commit_message>
<xml_diff>
--- a/manual/out/pls,fix rokasgrāmata.docx
+++ b/manual/out/pls,fix rokasgrāmata.docx
@@ -123,7 +123,7 @@
           <w:bCs/>
           <w:rFonts w:ascii="Aptos" w:hAnsi="Aptos" w:cs="Aptos" w:eastAsia="Aptos"/>
         </w:rPr>
-        <w:t xml:space="preserve">v2.7.009</w:t>
+        <w:t xml:space="preserve">v2.7.013</w:t>
       </w:r>
     </w:p>
     <w:p>
@@ -15303,7 +15303,7 @@
           <w:color w:val="1A1A1A"/>
           <w:rFonts w:ascii="Aptos" w:hAnsi="Aptos" w:cs="Aptos" w:eastAsia="Aptos"/>
         </w:rPr>
-        <w:t xml:space="preserve">Šī rokasgrāmata apraksta pls,fix versiju v2.7.009. Tā pati versija ir uzrakstīta uz vāka un katras lapas apakšā.</w:t>
+        <w:t xml:space="preserve">Šī rokasgrāmata apraksta pls,fix versiju v2.7.013. Tā pati versija ir uzrakstīta uz vāka un katras lapas apakšā.</w:t>
       </w:r>
     </w:p>
     <w:p>
@@ -15368,7 +15368,7 @@
         <w:color w:val="5B6472"/>
         <w:rFonts w:ascii="Aptos" w:hAnsi="Aptos" w:cs="Aptos" w:eastAsia="Aptos"/>
       </w:rPr>
-      <w:t xml:space="preserve">pls,fix rokasgrāmata v2.7.009   |   </w:t>
+      <w:t xml:space="preserve">pls,fix rokasgrāmata v2.7.013   |   </w:t>
     </w:r>
     <w:r>
       <w:rPr>

</xml_diff>

<commit_message>
Manual regenerated at v2.7.14
</commit_message>
<xml_diff>
--- a/manual/out/pls,fix rokasgrāmata.docx
+++ b/manual/out/pls,fix rokasgrāmata.docx
@@ -123,7 +123,7 @@
           <w:bCs/>
           <w:rFonts w:ascii="Aptos" w:hAnsi="Aptos" w:cs="Aptos" w:eastAsia="Aptos"/>
         </w:rPr>
-        <w:t xml:space="preserve">v2.7.013</w:t>
+        <w:t xml:space="preserve">v2.7.014</w:t>
       </w:r>
     </w:p>
     <w:p>
@@ -15303,7 +15303,7 @@
           <w:color w:val="1A1A1A"/>
           <w:rFonts w:ascii="Aptos" w:hAnsi="Aptos" w:cs="Aptos" w:eastAsia="Aptos"/>
         </w:rPr>
-        <w:t xml:space="preserve">Šī rokasgrāmata apraksta pls,fix versiju v2.7.013. Tā pati versija ir uzrakstīta uz vāka un katras lapas apakšā.</w:t>
+        <w:t xml:space="preserve">Šī rokasgrāmata apraksta pls,fix versiju v2.7.014. Tā pati versija ir uzrakstīta uz vāka un katras lapas apakšā.</w:t>
       </w:r>
     </w:p>
     <w:p>
@@ -15368,7 +15368,7 @@
         <w:color w:val="5B6472"/>
         <w:rFonts w:ascii="Aptos" w:hAnsi="Aptos" w:cs="Aptos" w:eastAsia="Aptos"/>
       </w:rPr>
-      <w:t xml:space="preserve">pls,fix rokasgrāmata v2.7.013   |   </w:t>
+      <w:t xml:space="preserve">pls,fix rokasgrāmata v2.7.014   |   </w:t>
     </w:r>
     <w:r>
       <w:rPr>

</xml_diff>

<commit_message>
Manual regenerated at v2.7.15
</commit_message>
<xml_diff>
--- a/manual/out/pls,fix rokasgrāmata.docx
+++ b/manual/out/pls,fix rokasgrāmata.docx
@@ -123,7 +123,7 @@
           <w:bCs/>
           <w:rFonts w:ascii="Aptos" w:hAnsi="Aptos" w:cs="Aptos" w:eastAsia="Aptos"/>
         </w:rPr>
-        <w:t xml:space="preserve">v2.7.014</w:t>
+        <w:t xml:space="preserve">v2.7.015</w:t>
       </w:r>
     </w:p>
     <w:p>
@@ -15303,7 +15303,7 @@
           <w:color w:val="1A1A1A"/>
           <w:rFonts w:ascii="Aptos" w:hAnsi="Aptos" w:cs="Aptos" w:eastAsia="Aptos"/>
         </w:rPr>
-        <w:t xml:space="preserve">Šī rokasgrāmata apraksta pls,fix versiju v2.7.014. Tā pati versija ir uzrakstīta uz vāka un katras lapas apakšā.</w:t>
+        <w:t xml:space="preserve">Šī rokasgrāmata apraksta pls,fix versiju v2.7.015. Tā pati versija ir uzrakstīta uz vāka un katras lapas apakšā.</w:t>
       </w:r>
     </w:p>
     <w:p>
@@ -15368,7 +15368,7 @@
         <w:color w:val="5B6472"/>
         <w:rFonts w:ascii="Aptos" w:hAnsi="Aptos" w:cs="Aptos" w:eastAsia="Aptos"/>
       </w:rPr>
-      <w:t xml:space="preserve">pls,fix rokasgrāmata v2.7.014   |   </w:t>
+      <w:t xml:space="preserve">pls,fix rokasgrāmata v2.7.015   |   </w:t>
     </w:r>
     <w:r>
       <w:rPr>

</xml_diff>

<commit_message>
Manual regenerated at v2.8.0
</commit_message>
<xml_diff>
--- a/manual/out/pls,fix rokasgrāmata.docx
+++ b/manual/out/pls,fix rokasgrāmata.docx
@@ -123,7 +123,7 @@
           <w:bCs/>
           <w:rFonts w:ascii="Aptos" w:hAnsi="Aptos" w:cs="Aptos" w:eastAsia="Aptos"/>
         </w:rPr>
-        <w:t xml:space="preserve">v2.7.015</w:t>
+        <w:t xml:space="preserve">v2.8.000</w:t>
       </w:r>
     </w:p>
     <w:p>
@@ -363,6 +363,31 @@
             <w:p>
               <w:pPr>
                 <w:rPr/>
+                <w:pStyle w:val="ToC2"/>
+                <w:tabs>
+                  <w:tab w:val="right" w:leader="dot" w:pos="80000"/>
+                </w:tabs>
+              </w:pPr>
+              <w:r>
+                <w:rPr/>
+                <w:t xml:space="preserve">Paraugdarbgrāmata un paraugprezentācija</w:t>
+              </w:r>
+              <w:r>
+                <w:rPr/>
+                <w:tab/>
+              </w:r>
+              <w:r>
+                <w:rPr/>
+                <w:fldChar w:fldCharType="begin" w:dirty="false"/>
+                <w:instrText>PAGEREF _Toc00000008 \h</w:instrText>
+                <w:fldChar w:fldCharType="separate" w:dirty="false"/>
+                <w:t xml:space="preserve">1</w:t>
+                <w:fldChar w:fldCharType="end" w:dirty="false"/>
+              </w:r>
+            </w:p>
+            <w:p>
+              <w:pPr>
+                <w:rPr/>
                 <w:pStyle w:val="ToC1"/>
                 <w:tabs>
                   <w:tab w:val="right" w:leader="dot" w:pos="80000"/>
@@ -379,7 +404,7 @@
               <w:r>
                 <w:rPr/>
                 <w:fldChar w:fldCharType="begin" w:dirty="false"/>
-                <w:instrText>PAGEREF _Toc00000008 \h</w:instrText>
+                <w:instrText>PAGEREF _Toc00000009 \h</w:instrText>
                 <w:fldChar w:fldCharType="separate" w:dirty="false"/>
                 <w:t xml:space="preserve">1</w:t>
                 <w:fldChar w:fldCharType="end" w:dirty="false"/>
@@ -404,7 +429,7 @@
               <w:r>
                 <w:rPr/>
                 <w:fldChar w:fldCharType="begin" w:dirty="false"/>
-                <w:instrText>PAGEREF _Toc00000009 \h</w:instrText>
+                <w:instrText>PAGEREF _Toc00000010 \h</w:instrText>
                 <w:fldChar w:fldCharType="separate" w:dirty="false"/>
                 <w:t xml:space="preserve">1</w:t>
                 <w:fldChar w:fldCharType="end" w:dirty="false"/>
@@ -429,7 +454,7 @@
               <w:r>
                 <w:rPr/>
                 <w:fldChar w:fldCharType="begin" w:dirty="false"/>
-                <w:instrText>PAGEREF _Toc00000010 \h</w:instrText>
+                <w:instrText>PAGEREF _Toc00000011 \h</w:instrText>
                 <w:fldChar w:fldCharType="separate" w:dirty="false"/>
                 <w:t xml:space="preserve">1</w:t>
                 <w:fldChar w:fldCharType="end" w:dirty="false"/>
@@ -454,7 +479,7 @@
               <w:r>
                 <w:rPr/>
                 <w:fldChar w:fldCharType="begin" w:dirty="false"/>
-                <w:instrText>PAGEREF _Toc00000011 \h</w:instrText>
+                <w:instrText>PAGEREF _Toc00000012 \h</w:instrText>
                 <w:fldChar w:fldCharType="separate" w:dirty="false"/>
                 <w:t xml:space="preserve">1</w:t>
                 <w:fldChar w:fldCharType="end" w:dirty="false"/>
@@ -479,7 +504,7 @@
               <w:r>
                 <w:rPr/>
                 <w:fldChar w:fldCharType="begin" w:dirty="false"/>
-                <w:instrText>PAGEREF _Toc00000012 \h</w:instrText>
+                <w:instrText>PAGEREF _Toc00000013 \h</w:instrText>
                 <w:fldChar w:fldCharType="separate" w:dirty="false"/>
                 <w:t xml:space="preserve">1</w:t>
                 <w:fldChar w:fldCharType="end" w:dirty="false"/>
@@ -504,7 +529,7 @@
               <w:r>
                 <w:rPr/>
                 <w:fldChar w:fldCharType="begin" w:dirty="false"/>
-                <w:instrText>PAGEREF _Toc00000013 \h</w:instrText>
+                <w:instrText>PAGEREF _Toc00000014 \h</w:instrText>
                 <w:fldChar w:fldCharType="separate" w:dirty="false"/>
                 <w:t xml:space="preserve">1</w:t>
                 <w:fldChar w:fldCharType="end" w:dirty="false"/>
@@ -529,7 +554,7 @@
               <w:r>
                 <w:rPr/>
                 <w:fldChar w:fldCharType="begin" w:dirty="false"/>
-                <w:instrText>PAGEREF _Toc00000014 \h</w:instrText>
+                <w:instrText>PAGEREF _Toc00000015 \h</w:instrText>
                 <w:fldChar w:fldCharType="separate" w:dirty="false"/>
                 <w:t xml:space="preserve">1</w:t>
                 <w:fldChar w:fldCharType="end" w:dirty="false"/>
@@ -554,7 +579,7 @@
               <w:r>
                 <w:rPr/>
                 <w:fldChar w:fldCharType="begin" w:dirty="false"/>
-                <w:instrText>PAGEREF _Toc00000015 \h</w:instrText>
+                <w:instrText>PAGEREF _Toc00000016 \h</w:instrText>
                 <w:fldChar w:fldCharType="separate" w:dirty="false"/>
                 <w:t xml:space="preserve">1</w:t>
                 <w:fldChar w:fldCharType="end" w:dirty="false"/>
@@ -579,7 +604,7 @@
               <w:r>
                 <w:rPr/>
                 <w:fldChar w:fldCharType="begin" w:dirty="false"/>
-                <w:instrText>PAGEREF _Toc00000016 \h</w:instrText>
+                <w:instrText>PAGEREF _Toc00000017 \h</w:instrText>
                 <w:fldChar w:fldCharType="separate" w:dirty="false"/>
                 <w:t xml:space="preserve">1</w:t>
                 <w:fldChar w:fldCharType="end" w:dirty="false"/>
@@ -604,7 +629,7 @@
               <w:r>
                 <w:rPr/>
                 <w:fldChar w:fldCharType="begin" w:dirty="false"/>
-                <w:instrText>PAGEREF _Toc00000017 \h</w:instrText>
+                <w:instrText>PAGEREF _Toc00000018 \h</w:instrText>
                 <w:fldChar w:fldCharType="separate" w:dirty="false"/>
                 <w:t xml:space="preserve">1</w:t>
                 <w:fldChar w:fldCharType="end" w:dirty="false"/>
@@ -629,7 +654,7 @@
               <w:r>
                 <w:rPr/>
                 <w:fldChar w:fldCharType="begin" w:dirty="false"/>
-                <w:instrText>PAGEREF _Toc00000018 \h</w:instrText>
+                <w:instrText>PAGEREF _Toc00000019 \h</w:instrText>
                 <w:fldChar w:fldCharType="separate" w:dirty="false"/>
                 <w:t xml:space="preserve">1</w:t>
                 <w:fldChar w:fldCharType="end" w:dirty="false"/>
@@ -654,7 +679,7 @@
               <w:r>
                 <w:rPr/>
                 <w:fldChar w:fldCharType="begin" w:dirty="false"/>
-                <w:instrText>PAGEREF _Toc00000019 \h</w:instrText>
+                <w:instrText>PAGEREF _Toc00000020 \h</w:instrText>
                 <w:fldChar w:fldCharType="separate" w:dirty="false"/>
                 <w:t xml:space="preserve">1</w:t>
                 <w:fldChar w:fldCharType="end" w:dirty="false"/>
@@ -679,7 +704,7 @@
               <w:r>
                 <w:rPr/>
                 <w:fldChar w:fldCharType="begin" w:dirty="false"/>
-                <w:instrText>PAGEREF _Toc00000020 \h</w:instrText>
+                <w:instrText>PAGEREF _Toc00000021 \h</w:instrText>
                 <w:fldChar w:fldCharType="separate" w:dirty="false"/>
                 <w:t xml:space="preserve">1</w:t>
                 <w:fldChar w:fldCharType="end" w:dirty="false"/>
@@ -704,7 +729,7 @@
               <w:r>
                 <w:rPr/>
                 <w:fldChar w:fldCharType="begin" w:dirty="false"/>
-                <w:instrText>PAGEREF _Toc00000021 \h</w:instrText>
+                <w:instrText>PAGEREF _Toc00000022 \h</w:instrText>
                 <w:fldChar w:fldCharType="separate" w:dirty="false"/>
                 <w:t xml:space="preserve">1</w:t>
                 <w:fldChar w:fldCharType="end" w:dirty="false"/>
@@ -729,7 +754,7 @@
               <w:r>
                 <w:rPr/>
                 <w:fldChar w:fldCharType="begin" w:dirty="false"/>
-                <w:instrText>PAGEREF _Toc00000022 \h</w:instrText>
+                <w:instrText>PAGEREF _Toc00000023 \h</w:instrText>
                 <w:fldChar w:fldCharType="separate" w:dirty="false"/>
                 <w:t xml:space="preserve">1</w:t>
                 <w:fldChar w:fldCharType="end" w:dirty="false"/>
@@ -754,7 +779,7 @@
               <w:r>
                 <w:rPr/>
                 <w:fldChar w:fldCharType="begin" w:dirty="false"/>
-                <w:instrText>PAGEREF _Toc00000023 \h</w:instrText>
+                <w:instrText>PAGEREF _Toc00000024 \h</w:instrText>
                 <w:fldChar w:fldCharType="separate" w:dirty="false"/>
                 <w:t xml:space="preserve">1</w:t>
                 <w:fldChar w:fldCharType="end" w:dirty="false"/>
@@ -779,7 +804,7 @@
               <w:r>
                 <w:rPr/>
                 <w:fldChar w:fldCharType="begin" w:dirty="false"/>
-                <w:instrText>PAGEREF _Toc00000024 \h</w:instrText>
+                <w:instrText>PAGEREF _Toc00000025 \h</w:instrText>
                 <w:fldChar w:fldCharType="separate" w:dirty="false"/>
                 <w:t xml:space="preserve">1</w:t>
                 <w:fldChar w:fldCharType="end" w:dirty="false"/>
@@ -804,7 +829,7 @@
               <w:r>
                 <w:rPr/>
                 <w:fldChar w:fldCharType="begin" w:dirty="false"/>
-                <w:instrText>PAGEREF _Toc00000025 \h</w:instrText>
+                <w:instrText>PAGEREF _Toc00000026 \h</w:instrText>
                 <w:fldChar w:fldCharType="separate" w:dirty="false"/>
                 <w:t xml:space="preserve">1</w:t>
                 <w:fldChar w:fldCharType="end" w:dirty="false"/>
@@ -829,7 +854,7 @@
               <w:r>
                 <w:rPr/>
                 <w:fldChar w:fldCharType="begin" w:dirty="false"/>
-                <w:instrText>PAGEREF _Toc00000026 \h</w:instrText>
+                <w:instrText>PAGEREF _Toc00000027 \h</w:instrText>
                 <w:fldChar w:fldCharType="separate" w:dirty="false"/>
                 <w:t xml:space="preserve">1</w:t>
                 <w:fldChar w:fldCharType="end" w:dirty="false"/>
@@ -854,7 +879,7 @@
               <w:r>
                 <w:rPr/>
                 <w:fldChar w:fldCharType="begin" w:dirty="false"/>
-                <w:instrText>PAGEREF _Toc00000027 \h</w:instrText>
+                <w:instrText>PAGEREF _Toc00000028 \h</w:instrText>
                 <w:fldChar w:fldCharType="separate" w:dirty="false"/>
                 <w:t xml:space="preserve">1</w:t>
                 <w:fldChar w:fldCharType="end" w:dirty="false"/>
@@ -879,7 +904,7 @@
               <w:r>
                 <w:rPr/>
                 <w:fldChar w:fldCharType="begin" w:dirty="false"/>
-                <w:instrText>PAGEREF _Toc00000028 \h</w:instrText>
+                <w:instrText>PAGEREF _Toc00000029 \h</w:instrText>
                 <w:fldChar w:fldCharType="separate" w:dirty="false"/>
                 <w:t xml:space="preserve">1</w:t>
                 <w:fldChar w:fldCharType="end" w:dirty="false"/>
@@ -904,7 +929,7 @@
               <w:r>
                 <w:rPr/>
                 <w:fldChar w:fldCharType="begin" w:dirty="false"/>
-                <w:instrText>PAGEREF _Toc00000029 \h</w:instrText>
+                <w:instrText>PAGEREF _Toc00000030 \h</w:instrText>
                 <w:fldChar w:fldCharType="separate" w:dirty="false"/>
                 <w:t xml:space="preserve">1</w:t>
                 <w:fldChar w:fldCharType="end" w:dirty="false"/>
@@ -929,7 +954,7 @@
               <w:r>
                 <w:rPr/>
                 <w:fldChar w:fldCharType="begin" w:dirty="false"/>
-                <w:instrText>PAGEREF _Toc00000030 \h</w:instrText>
+                <w:instrText>PAGEREF _Toc00000031 \h</w:instrText>
                 <w:fldChar w:fldCharType="separate" w:dirty="false"/>
                 <w:t xml:space="preserve">1</w:t>
                 <w:fldChar w:fldCharType="end" w:dirty="false"/>
@@ -954,7 +979,7 @@
               <w:r>
                 <w:rPr/>
                 <w:fldChar w:fldCharType="begin" w:dirty="false"/>
-                <w:instrText>PAGEREF _Toc00000031 \h</w:instrText>
+                <w:instrText>PAGEREF _Toc00000032 \h</w:instrText>
                 <w:fldChar w:fldCharType="separate" w:dirty="false"/>
                 <w:t xml:space="preserve">1</w:t>
                 <w:fldChar w:fldCharType="end" w:dirty="false"/>
@@ -979,7 +1004,7 @@
               <w:r>
                 <w:rPr/>
                 <w:fldChar w:fldCharType="begin" w:dirty="false"/>
-                <w:instrText>PAGEREF _Toc00000032 \h</w:instrText>
+                <w:instrText>PAGEREF _Toc00000033 \h</w:instrText>
                 <w:fldChar w:fldCharType="separate" w:dirty="false"/>
                 <w:t xml:space="preserve">1</w:t>
                 <w:fldChar w:fldCharType="end" w:dirty="false"/>
@@ -1004,7 +1029,7 @@
               <w:r>
                 <w:rPr/>
                 <w:fldChar w:fldCharType="begin" w:dirty="false"/>
-                <w:instrText>PAGEREF _Toc00000033 \h</w:instrText>
+                <w:instrText>PAGEREF _Toc00000034 \h</w:instrText>
                 <w:fldChar w:fldCharType="separate" w:dirty="false"/>
                 <w:t xml:space="preserve">1</w:t>
                 <w:fldChar w:fldCharType="end" w:dirty="false"/>
@@ -1029,7 +1054,7 @@
               <w:r>
                 <w:rPr/>
                 <w:fldChar w:fldCharType="begin" w:dirty="false"/>
-                <w:instrText>PAGEREF _Toc00000034 \h</w:instrText>
+                <w:instrText>PAGEREF _Toc00000035 \h</w:instrText>
                 <w:fldChar w:fldCharType="separate" w:dirty="false"/>
                 <w:t xml:space="preserve">1</w:t>
                 <w:fldChar w:fldCharType="end" w:dirty="false"/>
@@ -1054,7 +1079,7 @@
               <w:r>
                 <w:rPr/>
                 <w:fldChar w:fldCharType="begin" w:dirty="false"/>
-                <w:instrText>PAGEREF _Toc00000035 \h</w:instrText>
+                <w:instrText>PAGEREF _Toc00000036 \h</w:instrText>
                 <w:fldChar w:fldCharType="separate" w:dirty="false"/>
                 <w:t xml:space="preserve">1</w:t>
                 <w:fldChar w:fldCharType="end" w:dirty="false"/>
@@ -1079,7 +1104,7 @@
               <w:r>
                 <w:rPr/>
                 <w:fldChar w:fldCharType="begin" w:dirty="false"/>
-                <w:instrText>PAGEREF _Toc00000036 \h</w:instrText>
+                <w:instrText>PAGEREF _Toc00000037 \h</w:instrText>
                 <w:fldChar w:fldCharType="separate" w:dirty="false"/>
                 <w:t xml:space="preserve">1</w:t>
                 <w:fldChar w:fldCharType="end" w:dirty="false"/>
@@ -1104,7 +1129,7 @@
               <w:r>
                 <w:rPr/>
                 <w:fldChar w:fldCharType="begin" w:dirty="false"/>
-                <w:instrText>PAGEREF _Toc00000037 \h</w:instrText>
+                <w:instrText>PAGEREF _Toc00000038 \h</w:instrText>
                 <w:fldChar w:fldCharType="separate" w:dirty="false"/>
                 <w:t xml:space="preserve">1</w:t>
                 <w:fldChar w:fldCharType="end" w:dirty="false"/>
@@ -1129,7 +1154,7 @@
               <w:r>
                 <w:rPr/>
                 <w:fldChar w:fldCharType="begin" w:dirty="false"/>
-                <w:instrText>PAGEREF _Toc00000038 \h</w:instrText>
+                <w:instrText>PAGEREF _Toc00000039 \h</w:instrText>
                 <w:fldChar w:fldCharType="separate" w:dirty="false"/>
                 <w:t xml:space="preserve">1</w:t>
                 <w:fldChar w:fldCharType="end" w:dirty="false"/>
@@ -1154,7 +1179,7 @@
               <w:r>
                 <w:rPr/>
                 <w:fldChar w:fldCharType="begin" w:dirty="false"/>
-                <w:instrText>PAGEREF _Toc00000039 \h</w:instrText>
+                <w:instrText>PAGEREF _Toc00000040 \h</w:instrText>
                 <w:fldChar w:fldCharType="separate" w:dirty="false"/>
                 <w:t xml:space="preserve">1</w:t>
                 <w:fldChar w:fldCharType="end" w:dirty="false"/>
@@ -1179,7 +1204,7 @@
               <w:r>
                 <w:rPr/>
                 <w:fldChar w:fldCharType="begin" w:dirty="false"/>
-                <w:instrText>PAGEREF _Toc00000040 \h</w:instrText>
+                <w:instrText>PAGEREF _Toc00000041 \h</w:instrText>
                 <w:fldChar w:fldCharType="separate" w:dirty="false"/>
                 <w:t xml:space="preserve">1</w:t>
                 <w:fldChar w:fldCharType="end" w:dirty="false"/>
@@ -1204,7 +1229,7 @@
               <w:r>
                 <w:rPr/>
                 <w:fldChar w:fldCharType="begin" w:dirty="false"/>
-                <w:instrText>PAGEREF _Toc00000041 \h</w:instrText>
+                <w:instrText>PAGEREF _Toc00000042 \h</w:instrText>
                 <w:fldChar w:fldCharType="separate" w:dirty="false"/>
                 <w:t xml:space="preserve">1</w:t>
                 <w:fldChar w:fldCharType="end" w:dirty="false"/>
@@ -1229,7 +1254,7 @@
               <w:r>
                 <w:rPr/>
                 <w:fldChar w:fldCharType="begin" w:dirty="false"/>
-                <w:instrText>PAGEREF _Toc00000042 \h</w:instrText>
+                <w:instrText>PAGEREF _Toc00000043 \h</w:instrText>
                 <w:fldChar w:fldCharType="separate" w:dirty="false"/>
                 <w:t xml:space="preserve">1</w:t>
                 <w:fldChar w:fldCharType="end" w:dirty="false"/>
@@ -1254,7 +1279,7 @@
               <w:r>
                 <w:rPr/>
                 <w:fldChar w:fldCharType="begin" w:dirty="false"/>
-                <w:instrText>PAGEREF _Toc00000043 \h</w:instrText>
+                <w:instrText>PAGEREF _Toc00000044 \h</w:instrText>
                 <w:fldChar w:fldCharType="separate" w:dirty="false"/>
                 <w:t xml:space="preserve">1</w:t>
                 <w:fldChar w:fldCharType="end" w:dirty="false"/>
@@ -1279,7 +1304,7 @@
               <w:r>
                 <w:rPr/>
                 <w:fldChar w:fldCharType="begin" w:dirty="false"/>
-                <w:instrText>PAGEREF _Toc00000044 \h</w:instrText>
+                <w:instrText>PAGEREF _Toc00000045 \h</w:instrText>
                 <w:fldChar w:fldCharType="separate" w:dirty="false"/>
                 <w:t xml:space="preserve">1</w:t>
                 <w:fldChar w:fldCharType="end" w:dirty="false"/>
@@ -1304,7 +1329,7 @@
               <w:r>
                 <w:rPr/>
                 <w:fldChar w:fldCharType="begin" w:dirty="false"/>
-                <w:instrText>PAGEREF _Toc00000045 \h</w:instrText>
+                <w:instrText>PAGEREF _Toc00000046 \h</w:instrText>
                 <w:fldChar w:fldCharType="separate" w:dirty="false"/>
                 <w:t xml:space="preserve">1</w:t>
                 <w:fldChar w:fldCharType="end" w:dirty="false"/>
@@ -1329,7 +1354,7 @@
               <w:r>
                 <w:rPr/>
                 <w:fldChar w:fldCharType="begin" w:dirty="false"/>
-                <w:instrText>PAGEREF _Toc00000046 \h</w:instrText>
+                <w:instrText>PAGEREF _Toc00000047 \h</w:instrText>
                 <w:fldChar w:fldCharType="separate" w:dirty="false"/>
                 <w:t xml:space="preserve">1</w:t>
                 <w:fldChar w:fldCharType="end" w:dirty="false"/>
@@ -1354,7 +1379,7 @@
               <w:r>
                 <w:rPr/>
                 <w:fldChar w:fldCharType="begin" w:dirty="false"/>
-                <w:instrText>PAGEREF _Toc00000047 \h</w:instrText>
+                <w:instrText>PAGEREF _Toc00000048 \h</w:instrText>
                 <w:fldChar w:fldCharType="separate" w:dirty="false"/>
                 <w:t xml:space="preserve">1</w:t>
                 <w:fldChar w:fldCharType="end" w:dirty="false"/>
@@ -1379,7 +1404,7 @@
               <w:r>
                 <w:rPr/>
                 <w:fldChar w:fldCharType="begin" w:dirty="false"/>
-                <w:instrText>PAGEREF _Toc00000048 \h</w:instrText>
+                <w:instrText>PAGEREF _Toc00000049 \h</w:instrText>
                 <w:fldChar w:fldCharType="separate" w:dirty="false"/>
                 <w:t xml:space="preserve">1</w:t>
                 <w:fldChar w:fldCharType="end" w:dirty="false"/>
@@ -1404,7 +1429,7 @@
               <w:r>
                 <w:rPr/>
                 <w:fldChar w:fldCharType="begin" w:dirty="false"/>
-                <w:instrText>PAGEREF _Toc00000049 \h</w:instrText>
+                <w:instrText>PAGEREF _Toc00000050 \h</w:instrText>
                 <w:fldChar w:fldCharType="separate" w:dirty="false"/>
                 <w:t xml:space="preserve">1</w:t>
                 <w:fldChar w:fldCharType="end" w:dirty="false"/>
@@ -1429,7 +1454,7 @@
               <w:r>
                 <w:rPr/>
                 <w:fldChar w:fldCharType="begin" w:dirty="false"/>
-                <w:instrText>PAGEREF _Toc00000050 \h</w:instrText>
+                <w:instrText>PAGEREF _Toc00000051 \h</w:instrText>
                 <w:fldChar w:fldCharType="separate" w:dirty="false"/>
                 <w:t xml:space="preserve">1</w:t>
                 <w:fldChar w:fldCharType="end" w:dirty="false"/>
@@ -1454,7 +1479,7 @@
               <w:r>
                 <w:rPr/>
                 <w:fldChar w:fldCharType="begin" w:dirty="false"/>
-                <w:instrText>PAGEREF _Toc00000051 \h</w:instrText>
+                <w:instrText>PAGEREF _Toc00000052 \h</w:instrText>
                 <w:fldChar w:fldCharType="separate" w:dirty="false"/>
                 <w:t xml:space="preserve">1</w:t>
                 <w:fldChar w:fldCharType="end" w:dirty="false"/>
@@ -1479,7 +1504,7 @@
               <w:r>
                 <w:rPr/>
                 <w:fldChar w:fldCharType="begin" w:dirty="false"/>
-                <w:instrText>PAGEREF _Toc00000052 \h</w:instrText>
+                <w:instrText>PAGEREF _Toc00000053 \h</w:instrText>
                 <w:fldChar w:fldCharType="separate" w:dirty="false"/>
                 <w:t xml:space="preserve">1</w:t>
                 <w:fldChar w:fldCharType="end" w:dirty="false"/>
@@ -1504,7 +1529,7 @@
               <w:r>
                 <w:rPr/>
                 <w:fldChar w:fldCharType="begin" w:dirty="false"/>
-                <w:instrText>PAGEREF _Toc00000053 \h</w:instrText>
+                <w:instrText>PAGEREF _Toc00000054 \h</w:instrText>
                 <w:fldChar w:fldCharType="separate" w:dirty="false"/>
                 <w:t xml:space="preserve">1</w:t>
                 <w:fldChar w:fldCharType="end" w:dirty="false"/>
@@ -1529,7 +1554,7 @@
               <w:r>
                 <w:rPr/>
                 <w:fldChar w:fldCharType="begin" w:dirty="false"/>
-                <w:instrText>PAGEREF _Toc00000054 \h</w:instrText>
+                <w:instrText>PAGEREF _Toc00000055 \h</w:instrText>
                 <w:fldChar w:fldCharType="separate" w:dirty="false"/>
                 <w:t xml:space="preserve">1</w:t>
                 <w:fldChar w:fldCharType="end" w:dirty="false"/>
@@ -1554,7 +1579,7 @@
               <w:r>
                 <w:rPr/>
                 <w:fldChar w:fldCharType="begin" w:dirty="false"/>
-                <w:instrText>PAGEREF _Toc00000055 \h</w:instrText>
+                <w:instrText>PAGEREF _Toc00000056 \h</w:instrText>
                 <w:fldChar w:fldCharType="separate" w:dirty="false"/>
                 <w:t xml:space="preserve">1</w:t>
                 <w:fldChar w:fldCharType="end" w:dirty="false"/>
@@ -1579,7 +1604,7 @@
               <w:r>
                 <w:rPr/>
                 <w:fldChar w:fldCharType="begin" w:dirty="false"/>
-                <w:instrText>PAGEREF _Toc00000056 \h</w:instrText>
+                <w:instrText>PAGEREF _Toc00000057 \h</w:instrText>
                 <w:fldChar w:fldCharType="separate" w:dirty="false"/>
                 <w:t xml:space="preserve">1</w:t>
                 <w:fldChar w:fldCharType="end" w:dirty="false"/>
@@ -1595,7 +1620,7 @@
               </w:pPr>
               <w:r>
                 <w:rPr/>
-                <w:t xml:space="preserve">Atjaunināšana</w:t>
+                <w:t xml:space="preserve">Slaids un vieta</w:t>
               </w:r>
               <w:r>
                 <w:rPr/>
@@ -1604,7 +1629,7 @@
               <w:r>
                 <w:rPr/>
                 <w:fldChar w:fldCharType="begin" w:dirty="false"/>
-                <w:instrText>PAGEREF _Toc00000057 \h</w:instrText>
+                <w:instrText>PAGEREF _Toc00000058 \h</w:instrText>
                 <w:fldChar w:fldCharType="separate" w:dirty="false"/>
                 <w:t xml:space="preserve">1</w:t>
                 <w:fldChar w:fldCharType="end" w:dirty="false"/>
@@ -1620,7 +1645,7 @@
               </w:pPr>
               <w:r>
                 <w:rPr/>
-                <w:t xml:space="preserve">Meklēšana un filtrēšana</w:t>
+                <w:t xml:space="preserve">Atjaunināšana</w:t>
               </w:r>
               <w:r>
                 <w:rPr/>
@@ -1629,7 +1654,7 @@
               <w:r>
                 <w:rPr/>
                 <w:fldChar w:fldCharType="begin" w:dirty="false"/>
-                <w:instrText>PAGEREF _Toc00000058 \h</w:instrText>
+                <w:instrText>PAGEREF _Toc00000059 \h</w:instrText>
                 <w:fldChar w:fldCharType="separate" w:dirty="false"/>
                 <w:t xml:space="preserve">1</w:t>
                 <w:fldChar w:fldCharType="end" w:dirty="false"/>
@@ -1645,7 +1670,7 @@
               </w:pPr>
               <w:r>
                 <w:rPr/>
-                <w:t xml:space="preserve">Go to slide, Change source un Break link</w:t>
+                <w:t xml:space="preserve">Meklēšana un filtrēšana</w:t>
               </w:r>
               <w:r>
                 <w:rPr/>
@@ -1654,7 +1679,7 @@
               <w:r>
                 <w:rPr/>
                 <w:fldChar w:fldCharType="begin" w:dirty="false"/>
-                <w:instrText>PAGEREF _Toc00000059 \h</w:instrText>
+                <w:instrText>PAGEREF _Toc00000060 \h</w:instrText>
                 <w:fldChar w:fldCharType="separate" w:dirty="false"/>
                 <w:t xml:space="preserve">1</w:t>
                 <w:fldChar w:fldCharType="end" w:dirty="false"/>
@@ -1670,7 +1695,7 @@
               </w:pPr>
               <w:r>
                 <w:rPr/>
-                <w:t xml:space="preserve">Object tools</w:t>
+                <w:t xml:space="preserve">Go to slide, Change source un Break link</w:t>
               </w:r>
               <w:r>
                 <w:rPr/>
@@ -1679,7 +1704,7 @@
               <w:r>
                 <w:rPr/>
                 <w:fldChar w:fldCharType="begin" w:dirty="false"/>
-                <w:instrText>PAGEREF _Toc00000060 \h</w:instrText>
+                <w:instrText>PAGEREF _Toc00000061 \h</w:instrText>
                 <w:fldChar w:fldCharType="separate" w:dirty="false"/>
                 <w:t xml:space="preserve">1</w:t>
                 <w:fldChar w:fldCharType="end" w:dirty="false"/>
@@ -1695,7 +1720,7 @@
               </w:pPr>
               <w:r>
                 <w:rPr/>
-                <w:t xml:space="preserve">Smart Painter</w:t>
+                <w:t xml:space="preserve">Object tools</w:t>
               </w:r>
               <w:r>
                 <w:rPr/>
@@ -1704,7 +1729,7 @@
               <w:r>
                 <w:rPr/>
                 <w:fldChar w:fldCharType="begin" w:dirty="false"/>
-                <w:instrText>PAGEREF _Toc00000061 \h</w:instrText>
+                <w:instrText>PAGEREF _Toc00000062 \h</w:instrText>
                 <w:fldChar w:fldCharType="separate" w:dirty="false"/>
                 <w:t xml:space="preserve">1</w:t>
                 <w:fldChar w:fldCharType="end" w:dirty="false"/>
@@ -1720,6 +1745,31 @@
               </w:pPr>
               <w:r>
                 <w:rPr/>
+                <w:t xml:space="preserve">Smart Painter</w:t>
+              </w:r>
+              <w:r>
+                <w:rPr/>
+                <w:tab/>
+              </w:r>
+              <w:r>
+                <w:rPr/>
+                <w:fldChar w:fldCharType="begin" w:dirty="false"/>
+                <w:instrText>PAGEREF _Toc00000063 \h</w:instrText>
+                <w:fldChar w:fldCharType="separate" w:dirty="false"/>
+                <w:t xml:space="preserve">1</w:t>
+                <w:fldChar w:fldCharType="end" w:dirty="false"/>
+              </w:r>
+            </w:p>
+            <w:p>
+              <w:pPr>
+                <w:rPr/>
+                <w:pStyle w:val="ToC2"/>
+                <w:tabs>
+                  <w:tab w:val="right" w:leader="dot" w:pos="80000"/>
+                </w:tabs>
+              </w:pPr>
+              <w:r>
+                <w:rPr/>
                 <w:t xml:space="preserve">Drošība</w:t>
               </w:r>
               <w:r>
@@ -1729,7 +1779,7 @@
               <w:r>
                 <w:rPr/>
                 <w:fldChar w:fldCharType="begin" w:dirty="false"/>
-                <w:instrText>PAGEREF _Toc00000062 \h</w:instrText>
+                <w:instrText>PAGEREF _Toc00000064 \h</w:instrText>
                 <w:fldChar w:fldCharType="separate" w:dirty="false"/>
                 <w:t xml:space="preserve">1</w:t>
                 <w:fldChar w:fldCharType="end" w:dirty="false"/>
@@ -1754,7 +1804,7 @@
               <w:r>
                 <w:rPr/>
                 <w:fldChar w:fldCharType="begin" w:dirty="false"/>
-                <w:instrText>PAGEREF _Toc00000063 \h</w:instrText>
+                <w:instrText>PAGEREF _Toc00000065 \h</w:instrText>
                 <w:fldChar w:fldCharType="separate" w:dirty="false"/>
                 <w:t xml:space="preserve">1</w:t>
                 <w:fldChar w:fldCharType="end" w:dirty="false"/>
@@ -1779,7 +1829,7 @@
               <w:r>
                 <w:rPr/>
                 <w:fldChar w:fldCharType="begin" w:dirty="false"/>
-                <w:instrText>PAGEREF _Toc00000064 \h</w:instrText>
+                <w:instrText>PAGEREF _Toc00000066 \h</w:instrText>
                 <w:fldChar w:fldCharType="separate" w:dirty="false"/>
                 <w:t xml:space="preserve">1</w:t>
                 <w:fldChar w:fldCharType="end" w:dirty="false"/>
@@ -1804,7 +1854,7 @@
               <w:r>
                 <w:rPr/>
                 <w:fldChar w:fldCharType="begin" w:dirty="false"/>
-                <w:instrText>PAGEREF _Toc00000065 \h</w:instrText>
+                <w:instrText>PAGEREF _Toc00000067 \h</w:instrText>
                 <w:fldChar w:fldCharType="separate" w:dirty="false"/>
                 <w:t xml:space="preserve">1</w:t>
                 <w:fldChar w:fldCharType="end" w:dirty="false"/>
@@ -1829,7 +1879,7 @@
               <w:r>
                 <w:rPr/>
                 <w:fldChar w:fldCharType="begin" w:dirty="false"/>
-                <w:instrText>PAGEREF _Toc00000066 \h</w:instrText>
+                <w:instrText>PAGEREF _Toc00000068 \h</w:instrText>
                 <w:fldChar w:fldCharType="separate" w:dirty="false"/>
                 <w:t xml:space="preserve">1</w:t>
                 <w:fldChar w:fldCharType="end" w:dirty="false"/>
@@ -1854,7 +1904,7 @@
               <w:r>
                 <w:rPr/>
                 <w:fldChar w:fldCharType="begin" w:dirty="false"/>
-                <w:instrText>PAGEREF _Toc00000067 \h</w:instrText>
+                <w:instrText>PAGEREF _Toc00000069 \h</w:instrText>
                 <w:fldChar w:fldCharType="separate" w:dirty="false"/>
                 <w:t xml:space="preserve">1</w:t>
                 <w:fldChar w:fldCharType="end" w:dirty="false"/>
@@ -1879,7 +1929,7 @@
               <w:r>
                 <w:rPr/>
                 <w:fldChar w:fldCharType="begin" w:dirty="false"/>
-                <w:instrText>PAGEREF _Toc00000068 \h</w:instrText>
+                <w:instrText>PAGEREF _Toc00000070 \h</w:instrText>
                 <w:fldChar w:fldCharType="separate" w:dirty="false"/>
                 <w:t xml:space="preserve">1</w:t>
                 <w:fldChar w:fldCharType="end" w:dirty="false"/>
@@ -1904,7 +1954,7 @@
               <w:r>
                 <w:rPr/>
                 <w:fldChar w:fldCharType="begin" w:dirty="false"/>
-                <w:instrText>PAGEREF _Toc00000069 \h</w:instrText>
+                <w:instrText>PAGEREF _Toc00000071 \h</w:instrText>
                 <w:fldChar w:fldCharType="separate" w:dirty="false"/>
                 <w:t xml:space="preserve">1</w:t>
                 <w:fldChar w:fldCharType="end" w:dirty="false"/>
@@ -1929,7 +1979,7 @@
               <w:r>
                 <w:rPr/>
                 <w:fldChar w:fldCharType="begin" w:dirty="false"/>
-                <w:instrText>PAGEREF _Toc00000070 \h</w:instrText>
+                <w:instrText>PAGEREF _Toc00000072 \h</w:instrText>
                 <w:fldChar w:fldCharType="separate" w:dirty="false"/>
                 <w:t xml:space="preserve">1</w:t>
                 <w:fldChar w:fldCharType="end" w:dirty="false"/>
@@ -1954,7 +2004,7 @@
               <w:r>
                 <w:rPr/>
                 <w:fldChar w:fldCharType="begin" w:dirty="false"/>
-                <w:instrText>PAGEREF _Toc00000071 \h</w:instrText>
+                <w:instrText>PAGEREF _Toc00000073 \h</w:instrText>
                 <w:fldChar w:fldCharType="separate" w:dirty="false"/>
                 <w:t xml:space="preserve">1</w:t>
                 <w:fldChar w:fldCharType="end" w:dirty="false"/>
@@ -1979,7 +2029,7 @@
               <w:r>
                 <w:rPr/>
                 <w:fldChar w:fldCharType="begin" w:dirty="false"/>
-                <w:instrText>PAGEREF _Toc00000072 \h</w:instrText>
+                <w:instrText>PAGEREF _Toc00000074 \h</w:instrText>
                 <w:fldChar w:fldCharType="separate" w:dirty="false"/>
                 <w:t xml:space="preserve">1</w:t>
                 <w:fldChar w:fldCharType="end" w:dirty="false"/>
@@ -2004,7 +2054,7 @@
               <w:r>
                 <w:rPr/>
                 <w:fldChar w:fldCharType="begin" w:dirty="false"/>
-                <w:instrText>PAGEREF _Toc00000073 \h</w:instrText>
+                <w:instrText>PAGEREF _Toc00000075 \h</w:instrText>
                 <w:fldChar w:fldCharType="separate" w:dirty="false"/>
                 <w:t xml:space="preserve">1</w:t>
                 <w:fldChar w:fldCharType="end" w:dirty="false"/>
@@ -2029,7 +2079,7 @@
               <w:r>
                 <w:rPr/>
                 <w:fldChar w:fldCharType="begin" w:dirty="false"/>
-                <w:instrText>PAGEREF _Toc00000074 \h</w:instrText>
+                <w:instrText>PAGEREF _Toc00000076 \h</w:instrText>
                 <w:fldChar w:fldCharType="separate" w:dirty="false"/>
                 <w:t xml:space="preserve">1</w:t>
                 <w:fldChar w:fldCharType="end" w:dirty="false"/>
@@ -2054,7 +2104,7 @@
               <w:r>
                 <w:rPr/>
                 <w:fldChar w:fldCharType="begin" w:dirty="false"/>
-                <w:instrText>PAGEREF _Toc00000075 \h</w:instrText>
+                <w:instrText>PAGEREF _Toc00000077 \h</w:instrText>
                 <w:fldChar w:fldCharType="separate" w:dirty="false"/>
                 <w:t xml:space="preserve">1</w:t>
                 <w:fldChar w:fldCharType="end" w:dirty="false"/>
@@ -2079,7 +2129,7 @@
               <w:r>
                 <w:rPr/>
                 <w:fldChar w:fldCharType="begin" w:dirty="false"/>
-                <w:instrText>PAGEREF _Toc00000076 \h</w:instrText>
+                <w:instrText>PAGEREF _Toc00000078 \h</w:instrText>
                 <w:fldChar w:fldCharType="separate" w:dirty="false"/>
                 <w:t xml:space="preserve">1</w:t>
                 <w:fldChar w:fldCharType="end" w:dirty="false"/>
@@ -2104,7 +2154,7 @@
               <w:r>
                 <w:rPr/>
                 <w:fldChar w:fldCharType="begin" w:dirty="false"/>
-                <w:instrText>PAGEREF _Toc00000077 \h</w:instrText>
+                <w:instrText>PAGEREF _Toc00000079 \h</w:instrText>
                 <w:fldChar w:fldCharType="separate" w:dirty="false"/>
                 <w:t xml:space="preserve">1</w:t>
                 <w:fldChar w:fldCharType="end" w:dirty="false"/>
@@ -3255,6 +3305,72 @@
     <w:p>
       <w:pPr>
         <w:rPr/>
+        <w:pStyle w:val="Heading2"/>
+        <w:spacing w:before="240" w:after="100"/>
+        <w:keepNext/>
+      </w:pPr>
+      <w:bookmarkStart w:id="9" w:name="_Toc00000008"/>
+      <w:r>
+        <w:rPr>
+          <w:sz w:val="26"/>
+          <w:szCs w:val="26"/>
+          <w:color w:val="14213D"/>
+          <w:b/>
+          <w:bCs/>
+          <w:rFonts w:ascii="Aptos" w:hAnsi="Aptos" w:cs="Aptos" w:eastAsia="Aptos"/>
+        </w:rPr>
+        <w:t xml:space="preserve">Paraugdarbgrāmata un paraugprezentācija</w:t>
+      </w:r>
+      <w:bookmarkEnd w:id="9"/>
+    </w:p>
+    <w:p>
+      <w:pPr>
+        <w:rPr/>
+        <w:spacing w:after="120" w:line="276"/>
+      </w:pPr>
+      <w:r>
+        <w:rPr>
+          <w:sz w:val="22"/>
+          <w:szCs w:val="22"/>
+          <w:color w:val="1A1A1A"/>
+          <w:rFonts w:ascii="Aptos" w:hAnsi="Aptos" w:cs="Aptos" w:eastAsia="Aptos"/>
+        </w:rPr>
+        <w:t xml:space="preserve">Katram izlaidumam GitHub lapā ir pievienota paraugdarbgrāmata pls,fix Demo Model.xlsx un paraugprezentācija pls,fix Demo Deck.pptx. Abos failos var izmēģināt pievienojumprogrammu, pirms sākat darbu ar savu darbgrāmatu.</w:t>
+      </w:r>
+    </w:p>
+    <w:p>
+      <w:pPr>
+        <w:rPr/>
+        <w:spacing w:after="120" w:line="276"/>
+      </w:pPr>
+      <w:r>
+        <w:rPr>
+          <w:sz w:val="22"/>
+          <w:szCs w:val="22"/>
+          <w:color w:val="1A1A1A"/>
+          <w:rFonts w:ascii="Aptos" w:hAnsi="Aptos" w:cs="Aptos" w:eastAsia="Aptos"/>
+        </w:rPr>
+        <w:t xml:space="preserve">Paraugdarbgrāmatā katras redzamās lapas augšā ir īss uzdevumu saraksts "Try on this sheet" un rinda "Commands" ar vajadzīgajām lentes pogām un taustiņu kombinācijām.</w:t>
+      </w:r>
+    </w:p>
+    <w:p>
+      <w:pPr>
+        <w:rPr/>
+        <w:spacing w:after="120" w:line="276"/>
+      </w:pPr>
+      <w:r>
+        <w:rPr>
+          <w:sz w:val="22"/>
+          <w:szCs w:val="22"/>
+          <w:color w:val="1A1A1A"/>
+          <w:rFonts w:ascii="Aptos" w:hAnsi="Aptos" w:cs="Aptos" w:eastAsia="Aptos"/>
+        </w:rPr>
+        <w:t xml:space="preserve">Paraugprezentācijā ir četri uzdevumi: katrā jāievieto kāds objekts izvēlētajā slaidā un vietā, izmantojot izvēlnes "Slide" un "Where" (skatiet nodaļu "Saites uz PowerPoint", sadaļu "Slaids un vieta").</w:t>
+      </w:r>
+    </w:p>
+    <w:p>
+      <w:pPr>
+        <w:rPr/>
         <w:pStyle w:val="Heading1"/>
         <w:spacing w:before="120" w:after="200"/>
         <w:pBdr>
@@ -3263,7 +3379,7 @@
         <w:keepNext/>
         <w:pageBreakBefore/>
       </w:pPr>
-      <w:bookmarkStart w:id="9" w:name="_Toc00000008"/>
+      <w:bookmarkStart w:id="10" w:name="_Toc00000009"/>
       <w:r>
         <w:rPr>
           <w:sz w:val="36"/>
@@ -3286,7 +3402,7 @@
         </w:rPr>
         <w:t xml:space="preserve">Panelis un cilnes</w:t>
       </w:r>
-      <w:bookmarkEnd w:id="9"/>
+      <w:bookmarkEnd w:id="10"/>
     </w:p>
     <w:p>
       <w:pPr>
@@ -3295,7 +3411,7 @@
         <w:spacing w:before="240" w:after="100"/>
         <w:keepNext/>
       </w:pPr>
-      <w:bookmarkStart w:id="10" w:name="_Toc00000009"/>
+      <w:bookmarkStart w:id="11" w:name="_Toc00000010"/>
       <w:r>
         <w:rPr>
           <w:sz w:val="26"/>
@@ -3307,7 +3423,7 @@
         </w:rPr>
         <w:t xml:space="preserve">Paneļa uzbūve</w:t>
       </w:r>
-      <w:bookmarkEnd w:id="10"/>
+      <w:bookmarkEnd w:id="11"/>
     </w:p>
     <w:p>
       <w:pPr>
@@ -3441,7 +3557,7 @@
         <w:spacing w:before="240" w:after="100"/>
         <w:keepNext/>
       </w:pPr>
-      <w:bookmarkStart w:id="11" w:name="_Toc00000010"/>
+      <w:bookmarkStart w:id="12" w:name="_Toc00000011"/>
       <w:r>
         <w:rPr>
           <w:sz w:val="26"/>
@@ -3453,7 +3569,7 @@
         </w:rPr>
         <w:t xml:space="preserve">Četras cilnes</w:t>
       </w:r>
-      <w:bookmarkEnd w:id="11"/>
+      <w:bookmarkEnd w:id="12"/>
     </w:p>
     <w:p>
       <w:pPr>
@@ -3735,7 +3851,7 @@
         <w:spacing w:before="240" w:after="100"/>
         <w:keepNext/>
       </w:pPr>
-      <w:bookmarkStart w:id="12" w:name="_Toc00000011"/>
+      <w:bookmarkStart w:id="13" w:name="_Toc00000012"/>
       <w:r>
         <w:rPr>
           <w:sz w:val="26"/>
@@ -3747,7 +3863,7 @@
         </w:rPr>
         <w:t xml:space="preserve">Kā panelis strādā ar atlasi</w:t>
       </w:r>
-      <w:bookmarkEnd w:id="12"/>
+      <w:bookmarkEnd w:id="13"/>
     </w:p>
     <w:p>
       <w:pPr>
@@ -3805,7 +3921,7 @@
         <w:keepNext/>
         <w:pageBreakBefore/>
       </w:pPr>
-      <w:bookmarkStart w:id="13" w:name="_Toc00000012"/>
+      <w:bookmarkStart w:id="14" w:name="_Toc00000013"/>
       <w:r>
         <w:rPr>
           <w:sz w:val="36"/>
@@ -3828,7 +3944,7 @@
         </w:rPr>
         <w:t xml:space="preserve">Cilne Tools</w:t>
       </w:r>
-      <w:bookmarkEnd w:id="13"/>
+      <w:bookmarkEnd w:id="14"/>
     </w:p>
     <w:p>
       <w:pPr>
@@ -3837,7 +3953,7 @@
         <w:spacing w:before="240" w:after="100"/>
         <w:keepNext/>
       </w:pPr>
-      <w:bookmarkStart w:id="14" w:name="_Toc00000013"/>
+      <w:bookmarkStart w:id="15" w:name="_Toc00000014"/>
       <w:r>
         <w:rPr>
           <w:sz w:val="26"/>
@@ -3849,7 +3965,7 @@
         </w:rPr>
         <w:t xml:space="preserve">Kas atrodas cilnē</w:t>
       </w:r>
-      <w:bookmarkEnd w:id="14"/>
+      <w:bookmarkEnd w:id="15"/>
     </w:p>
     <w:p>
       <w:pPr>
@@ -3938,7 +4054,7 @@
         <w:spacing w:before="240" w:after="100"/>
         <w:keepNext/>
       </w:pPr>
-      <w:bookmarkStart w:id="15" w:name="_Toc00000014"/>
+      <w:bookmarkStart w:id="16" w:name="_Toc00000015"/>
       <w:r>
         <w:rPr>
           <w:sz w:val="26"/>
@@ -3950,7 +4066,7 @@
         </w:rPr>
         <w:t xml:space="preserve">Atlases pārskats</w:t>
       </w:r>
-      <w:bookmarkEnd w:id="15"/>
+      <w:bookmarkEnd w:id="16"/>
     </w:p>
     <w:p>
       <w:pPr>
@@ -3989,7 +4105,7 @@
         <w:spacing w:before="240" w:after="100"/>
         <w:keepNext/>
       </w:pPr>
-      <w:bookmarkStart w:id="16" w:name="_Toc00000015"/>
+      <w:bookmarkStart w:id="17" w:name="_Toc00000016"/>
       <w:r>
         <w:rPr>
           <w:sz w:val="26"/>
@@ -4001,7 +4117,7 @@
         </w:rPr>
         <w:t xml:space="preserve">Atrast kombināciju</w:t>
       </w:r>
-      <w:bookmarkEnd w:id="16"/>
+      <w:bookmarkEnd w:id="17"/>
     </w:p>
     <w:p>
       <w:pPr>
@@ -4112,7 +4228,7 @@
         <w:spacing w:before="240" w:after="100"/>
         <w:keepNext/>
       </w:pPr>
-      <w:bookmarkStart w:id="17" w:name="_Toc00000016"/>
+      <w:bookmarkStart w:id="18" w:name="_Toc00000017"/>
       <w:r>
         <w:rPr>
           <w:sz w:val="26"/>
@@ -4124,7 +4240,7 @@
         </w:rPr>
         <w:t xml:space="preserve">Noformējuma stili un skaitļu formāti</w:t>
       </w:r>
-      <w:bookmarkEnd w:id="17"/>
+      <w:bookmarkEnd w:id="18"/>
     </w:p>
     <w:p>
       <w:pPr>
@@ -4178,7 +4294,7 @@
         <w:spacing w:before="240" w:after="100"/>
         <w:keepNext/>
       </w:pPr>
-      <w:bookmarkStart w:id="18" w:name="_Toc00000017"/>
+      <w:bookmarkStart w:id="19" w:name="_Toc00000018"/>
       <w:r>
         <w:rPr>
           <w:sz w:val="26"/>
@@ -4190,7 +4306,7 @@
         </w:rPr>
         <w:t xml:space="preserve">Otas sloti</w:t>
       </w:r>
-      <w:bookmarkEnd w:id="18"/>
+      <w:bookmarkEnd w:id="19"/>
     </w:p>
     <w:p>
       <w:pPr>
@@ -4229,7 +4345,7 @@
         <w:spacing w:before="240" w:after="100"/>
         <w:keepNext/>
       </w:pPr>
-      <w:bookmarkStart w:id="19" w:name="_Toc00000018"/>
+      <w:bookmarkStart w:id="20" w:name="_Toc00000019"/>
       <w:r>
         <w:rPr>
           <w:sz w:val="26"/>
@@ -4241,7 +4357,7 @@
         </w:rPr>
         <w:t xml:space="preserve">Formātu cikli</w:t>
       </w:r>
-      <w:bookmarkEnd w:id="19"/>
+      <w:bookmarkEnd w:id="20"/>
     </w:p>
     <w:p>
       <w:pPr>
@@ -4948,7 +5064,7 @@
         <w:spacing w:before="240" w:after="100"/>
         <w:keepNext/>
       </w:pPr>
-      <w:bookmarkStart w:id="20" w:name="_Toc00000019"/>
+      <w:bookmarkStart w:id="21" w:name="_Toc00000020"/>
       <w:r>
         <w:rPr>
           <w:sz w:val="26"/>
@@ -4960,7 +5076,7 @@
         </w:rPr>
         <w:t xml:space="preserve">Aizpildīšana un ielīmēšana</w:t>
       </w:r>
-      <w:bookmarkEnd w:id="20"/>
+      <w:bookmarkEnd w:id="21"/>
     </w:p>
     <w:p>
       <w:pPr>
@@ -5257,7 +5373,7 @@
         <w:spacing w:before="240" w:after="100"/>
         <w:keepNext/>
       </w:pPr>
-      <w:bookmarkStart w:id="21" w:name="_Toc00000020"/>
+      <w:bookmarkStart w:id="22" w:name="_Toc00000021"/>
       <w:r>
         <w:rPr>
           <w:sz w:val="26"/>
@@ -5269,7 +5385,7 @@
         </w:rPr>
         <w:t xml:space="preserve">IFERROR aizsargs</w:t>
       </w:r>
-      <w:bookmarkEnd w:id="21"/>
+      <w:bookmarkEnd w:id="22"/>
     </w:p>
     <w:p>
       <w:pPr>
@@ -5293,7 +5409,7 @@
         <w:spacing w:before="240" w:after="100"/>
         <w:keepNext/>
       </w:pPr>
-      <w:bookmarkStart w:id="22" w:name="_Toc00000021"/>
+      <w:bookmarkStart w:id="23" w:name="_Toc00000022"/>
       <w:r>
         <w:rPr>
           <w:sz w:val="26"/>
@@ -5305,7 +5421,7 @@
         </w:rPr>
         <w:t xml:space="preserve">Autocolor</w:t>
       </w:r>
-      <w:bookmarkEnd w:id="22"/>
+      <w:bookmarkEnd w:id="23"/>
     </w:p>
     <w:p>
       <w:pPr>
@@ -5504,7 +5620,7 @@
         <w:spacing w:before="240" w:after="100"/>
         <w:keepNext/>
       </w:pPr>
-      <w:bookmarkStart w:id="23" w:name="_Toc00000022"/>
+      <w:bookmarkStart w:id="24" w:name="_Toc00000023"/>
       <w:r>
         <w:rPr>
           <w:sz w:val="26"/>
@@ -5516,7 +5632,7 @@
         </w:rPr>
         <w:t xml:space="preserve">Formulu pārbaude</w:t>
       </w:r>
-      <w:bookmarkEnd w:id="23"/>
+      <w:bookmarkEnd w:id="24"/>
     </w:p>
     <w:p>
       <w:pPr>
@@ -5650,7 +5766,7 @@
         <w:spacing w:before="240" w:after="100"/>
         <w:keepNext/>
       </w:pPr>
-      <w:bookmarkStart w:id="24" w:name="_Toc00000023"/>
+      <w:bookmarkStart w:id="25" w:name="_Toc00000024"/>
       <w:r>
         <w:rPr>
           <w:sz w:val="26"/>
@@ -5662,7 +5778,7 @@
         </w:rPr>
         <w:t xml:space="preserve">Precedents un Dependents</w:t>
       </w:r>
-      <w:bookmarkEnd w:id="24"/>
+      <w:bookmarkEnd w:id="25"/>
     </w:p>
     <w:p>
       <w:pPr>
@@ -5716,7 +5832,7 @@
         <w:spacing w:before="240" w:after="100"/>
         <w:keepNext/>
       </w:pPr>
-      <w:bookmarkStart w:id="25" w:name="_Toc00000024"/>
+      <w:bookmarkStart w:id="26" w:name="_Toc00000025"/>
       <w:r>
         <w:rPr>
           <w:sz w:val="26"/>
@@ -5728,7 +5844,7 @@
         </w:rPr>
         <w:t xml:space="preserve">CAGR, zīme, mērogs un zīmes aiz komata</w:t>
       </w:r>
-      <w:bookmarkEnd w:id="25"/>
+      <w:bookmarkEnd w:id="26"/>
     </w:p>
     <w:tbl>
       <w:tblPr>
@@ -6077,7 +6193,7 @@
         <w:spacing w:before="240" w:after="100"/>
         <w:keepNext/>
       </w:pPr>
-      <w:bookmarkStart w:id="26" w:name="_Toc00000025"/>
+      <w:bookmarkStart w:id="27" w:name="_Toc00000026"/>
       <w:r>
         <w:rPr>
           <w:sz w:val="26"/>
@@ -6089,7 +6205,7 @@
         </w:rPr>
         <w:t xml:space="preserve">Waterfall from selection</w:t>
       </w:r>
-      <w:bookmarkEnd w:id="26"/>
+      <w:bookmarkEnd w:id="27"/>
     </w:p>
     <w:p>
       <w:pPr>
@@ -6204,7 +6320,7 @@
         <w:spacing w:before="240" w:after="100"/>
         <w:keepNext/>
       </w:pPr>
-      <w:bookmarkStart w:id="27" w:name="_Toc00000026"/>
+      <w:bookmarkStart w:id="28" w:name="_Toc00000027"/>
       <w:r>
         <w:rPr>
           <w:sz w:val="26"/>
@@ -6216,7 +6332,7 @@
         </w:rPr>
         <w:t xml:space="preserve">Tornado from selection</w:t>
       </w:r>
-      <w:bookmarkEnd w:id="27"/>
+      <w:bookmarkEnd w:id="28"/>
     </w:p>
     <w:p>
       <w:pPr>
@@ -6270,7 +6386,7 @@
         <w:spacing w:before="240" w:after="100"/>
         <w:keepNext/>
       </w:pPr>
-      <w:bookmarkStart w:id="28" w:name="_Toc00000027"/>
+      <w:bookmarkStart w:id="29" w:name="_Toc00000028"/>
       <w:r>
         <w:rPr>
           <w:sz w:val="26"/>
@@ -6282,7 +6398,7 @@
         </w:rPr>
         <w:t xml:space="preserve">Football field</w:t>
       </w:r>
-      <w:bookmarkEnd w:id="28"/>
+      <w:bookmarkEnd w:id="29"/>
     </w:p>
     <w:p>
       <w:pPr>
@@ -6378,7 +6494,7 @@
         <w:spacing w:before="240" w:after="100"/>
         <w:keepNext/>
       </w:pPr>
-      <w:bookmarkStart w:id="29" w:name="_Toc00000028"/>
+      <w:bookmarkStart w:id="30" w:name="_Toc00000029"/>
       <w:r>
         <w:rPr>
           <w:sz w:val="26"/>
@@ -6390,7 +6506,7 @@
         </w:rPr>
         <w:t xml:space="preserve">Comps stats</w:t>
       </w:r>
-      <w:bookmarkEnd w:id="29"/>
+      <w:bookmarkEnd w:id="30"/>
     </w:p>
     <w:p>
       <w:pPr>
@@ -6486,7 +6602,7 @@
         <w:spacing w:before="240" w:after="100"/>
         <w:keepNext/>
       </w:pPr>
-      <w:bookmarkStart w:id="30" w:name="_Toc00000029"/>
+      <w:bookmarkStart w:id="31" w:name="_Toc00000030"/>
       <w:r>
         <w:rPr>
           <w:sz w:val="26"/>
@@ -6498,7 +6614,7 @@
         </w:rPr>
         <w:t xml:space="preserve">Brand-format chart un CAGR label</w:t>
       </w:r>
-      <w:bookmarkEnd w:id="30"/>
+      <w:bookmarkEnd w:id="31"/>
     </w:p>
     <w:p>
       <w:pPr>
@@ -6537,7 +6653,7 @@
         <w:spacing w:before="240" w:after="100"/>
         <w:keepNext/>
       </w:pPr>
-      <w:bookmarkStart w:id="31" w:name="_Toc00000030"/>
+      <w:bookmarkStart w:id="32" w:name="_Toc00000031"/>
       <w:r>
         <w:rPr>
           <w:sz w:val="26"/>
@@ -6549,7 +6665,7 @@
         </w:rPr>
         <w:t xml:space="preserve">Consistent rounding un funkcijas PLSFIX</w:t>
       </w:r>
-      <w:bookmarkEnd w:id="31"/>
+      <w:bookmarkEnd w:id="32"/>
     </w:p>
     <w:p>
       <w:pPr>
@@ -6835,7 +6951,7 @@
         <w:spacing w:before="240" w:after="100"/>
         <w:keepNext/>
       </w:pPr>
-      <w:bookmarkStart w:id="32" w:name="_Toc00000031"/>
+      <w:bookmarkStart w:id="33" w:name="_Toc00000032"/>
       <w:r>
         <w:rPr>
           <w:sz w:val="26"/>
@@ -6847,7 +6963,7 @@
         </w:rPr>
         <w:t xml:space="preserve">Unpivot selection</w:t>
       </w:r>
-      <w:bookmarkEnd w:id="32"/>
+      <w:bookmarkEnd w:id="33"/>
     </w:p>
     <w:p>
       <w:pPr>
@@ -6886,7 +7002,7 @@
         <w:spacing w:before="240" w:after="100"/>
         <w:keepNext/>
       </w:pPr>
-      <w:bookmarkStart w:id="33" w:name="_Toc00000032"/>
+      <w:bookmarkStart w:id="34" w:name="_Toc00000033"/>
       <w:r>
         <w:rPr>
           <w:sz w:val="26"/>
@@ -6898,7 +7014,7 @@
         </w:rPr>
         <w:t xml:space="preserve">Undo last pls,fix action</w:t>
       </w:r>
-      <w:bookmarkEnd w:id="33"/>
+      <w:bookmarkEnd w:id="34"/>
     </w:p>
     <w:p>
       <w:pPr>
@@ -6941,7 +7057,7 @@
         <w:keepNext/>
         <w:pageBreakBefore/>
       </w:pPr>
-      <w:bookmarkStart w:id="34" w:name="_Toc00000033"/>
+      <w:bookmarkStart w:id="35" w:name="_Toc00000034"/>
       <w:r>
         <w:rPr>
           <w:sz w:val="36"/>
@@ -6964,7 +7080,7 @@
         </w:rPr>
         <w:t xml:space="preserve">Veidnes</w:t>
       </w:r>
-      <w:bookmarkEnd w:id="34"/>
+      <w:bookmarkEnd w:id="35"/>
     </w:p>
     <w:p>
       <w:pPr>
@@ -6973,7 +7089,7 @@
         <w:spacing w:before="240" w:after="100"/>
         <w:keepNext/>
       </w:pPr>
-      <w:bookmarkStart w:id="35" w:name="_Toc00000034"/>
+      <w:bookmarkStart w:id="36" w:name="_Toc00000035"/>
       <w:r>
         <w:rPr>
           <w:sz w:val="26"/>
@@ -6985,7 +7101,7 @@
         </w:rPr>
         <w:t xml:space="preserve">Kas ir veidnes</w:t>
       </w:r>
-      <w:bookmarkEnd w:id="35"/>
+      <w:bookmarkEnd w:id="36"/>
     </w:p>
     <w:p>
       <w:pPr>
@@ -7039,7 +7155,7 @@
         <w:spacing w:before="240" w:after="100"/>
         <w:keepNext/>
       </w:pPr>
-      <w:bookmarkStart w:id="36" w:name="_Toc00000035"/>
+      <w:bookmarkStart w:id="37" w:name="_Toc00000036"/>
       <w:r>
         <w:rPr>
           <w:sz w:val="26"/>
@@ -7051,7 +7167,7 @@
         </w:rPr>
         <w:t xml:space="preserve">Debt schedule (annuity)</w:t>
       </w:r>
-      <w:bookmarkEnd w:id="36"/>
+      <w:bookmarkEnd w:id="37"/>
     </w:p>
     <w:p>
       <w:pPr>
@@ -7075,7 +7191,7 @@
         <w:spacing w:before="240" w:after="100"/>
         <w:keepNext/>
       </w:pPr>
-      <w:bookmarkStart w:id="37" w:name="_Toc00000036"/>
+      <w:bookmarkStart w:id="38" w:name="_Toc00000037"/>
       <w:r>
         <w:rPr>
           <w:sz w:val="26"/>
@@ -7087,7 +7203,7 @@
         </w:rPr>
         <w:t xml:space="preserve">DCF valuation</w:t>
       </w:r>
-      <w:bookmarkEnd w:id="37"/>
+      <w:bookmarkEnd w:id="38"/>
     </w:p>
     <w:p>
       <w:pPr>
@@ -7111,7 +7227,7 @@
         <w:spacing w:before="240" w:after="100"/>
         <w:keepNext/>
       </w:pPr>
-      <w:bookmarkStart w:id="38" w:name="_Toc00000037"/>
+      <w:bookmarkStart w:id="39" w:name="_Toc00000038"/>
       <w:r>
         <w:rPr>
           <w:sz w:val="26"/>
@@ -7123,7 +7239,7 @@
         </w:rPr>
         <w:t xml:space="preserve">NPV / IRR</w:t>
       </w:r>
-      <w:bookmarkEnd w:id="38"/>
+      <w:bookmarkEnd w:id="39"/>
     </w:p>
     <w:p>
       <w:pPr>
@@ -7147,7 +7263,7 @@
         <w:spacing w:before="240" w:after="100"/>
         <w:keepNext/>
       </w:pPr>
-      <w:bookmarkStart w:id="39" w:name="_Toc00000038"/>
+      <w:bookmarkStart w:id="40" w:name="_Toc00000039"/>
       <w:r>
         <w:rPr>
           <w:sz w:val="26"/>
@@ -7159,7 +7275,7 @@
         </w:rPr>
         <w:t xml:space="preserve">Working capital days</w:t>
       </w:r>
-      <w:bookmarkEnd w:id="39"/>
+      <w:bookmarkEnd w:id="40"/>
     </w:p>
     <w:p>
       <w:pPr>
@@ -7183,7 +7299,7 @@
         <w:spacing w:before="240" w:after="100"/>
         <w:keepNext/>
       </w:pPr>
-      <w:bookmarkStart w:id="40" w:name="_Toc00000039"/>
+      <w:bookmarkStart w:id="41" w:name="_Toc00000040"/>
       <w:r>
         <w:rPr>
           <w:sz w:val="26"/>
@@ -7195,7 +7311,7 @@
         </w:rPr>
         <w:t xml:space="preserve">Two-way sensitivity</w:t>
       </w:r>
-      <w:bookmarkEnd w:id="40"/>
+      <w:bookmarkEnd w:id="41"/>
     </w:p>
     <w:p>
       <w:pPr>
@@ -7219,7 +7335,7 @@
         <w:spacing w:before="240" w:after="100"/>
         <w:keepNext/>
       </w:pPr>
-      <w:bookmarkStart w:id="41" w:name="_Toc00000040"/>
+      <w:bookmarkStart w:id="42" w:name="_Toc00000041"/>
       <w:r>
         <w:rPr>
           <w:sz w:val="26"/>
@@ -7231,7 +7347,7 @@
         </w:rPr>
         <w:t xml:space="preserve">EBITDA bridge</w:t>
       </w:r>
-      <w:bookmarkEnd w:id="41"/>
+      <w:bookmarkEnd w:id="42"/>
     </w:p>
     <w:p>
       <w:pPr>
@@ -7259,7 +7375,7 @@
         <w:keepNext/>
         <w:pageBreakBefore/>
       </w:pPr>
-      <w:bookmarkStart w:id="42" w:name="_Toc00000041"/>
+      <w:bookmarkStart w:id="43" w:name="_Toc00000042"/>
       <w:r>
         <w:rPr>
           <w:sz w:val="36"/>
@@ -7282,7 +7398,7 @@
         </w:rPr>
         <w:t xml:space="preserve">Cilne Workbook</w:t>
       </w:r>
-      <w:bookmarkEnd w:id="42"/>
+      <w:bookmarkEnd w:id="43"/>
     </w:p>
     <w:p>
       <w:pPr>
@@ -7291,7 +7407,7 @@
         <w:spacing w:before="240" w:after="100"/>
         <w:keepNext/>
       </w:pPr>
-      <w:bookmarkStart w:id="43" w:name="_Toc00000042"/>
+      <w:bookmarkStart w:id="44" w:name="_Toc00000043"/>
       <w:r>
         <w:rPr>
           <w:sz w:val="26"/>
@@ -7303,7 +7419,7 @@
         </w:rPr>
         <w:t xml:space="preserve">Lapu saraksts</w:t>
       </w:r>
-      <w:bookmarkEnd w:id="43"/>
+      <w:bookmarkEnd w:id="44"/>
     </w:p>
     <w:p>
       <w:pPr>
@@ -7422,7 +7538,7 @@
         <w:spacing w:before="240" w:after="100"/>
         <w:keepNext/>
       </w:pPr>
-      <w:bookmarkStart w:id="44" w:name="_Toc00000043"/>
+      <w:bookmarkStart w:id="45" w:name="_Toc00000044"/>
       <w:r>
         <w:rPr>
           <w:sz w:val="26"/>
@@ -7434,7 +7550,7 @@
         </w:rPr>
         <w:t xml:space="preserve">Super Find</w:t>
       </w:r>
-      <w:bookmarkEnd w:id="44"/>
+      <w:bookmarkEnd w:id="45"/>
     </w:p>
     <w:p>
       <w:pPr>
@@ -7598,7 +7714,7 @@
         <w:spacing w:before="240" w:after="100"/>
         <w:keepNext/>
       </w:pPr>
-      <w:bookmarkStart w:id="45" w:name="_Toc00000044"/>
+      <w:bookmarkStart w:id="46" w:name="_Toc00000045"/>
       <w:r>
         <w:rPr>
           <w:sz w:val="26"/>
@@ -7610,7 +7726,7 @@
         </w:rPr>
         <w:t xml:space="preserve">Satura rādītājs</w:t>
       </w:r>
-      <w:bookmarkEnd w:id="45"/>
+      <w:bookmarkEnd w:id="46"/>
     </w:p>
     <w:p>
       <w:pPr>
@@ -7634,7 +7750,7 @@
         <w:spacing w:before="240" w:after="100"/>
         <w:keepNext/>
       </w:pPr>
-      <w:bookmarkStart w:id="46" w:name="_Toc00000045"/>
+      <w:bookmarkStart w:id="47" w:name="_Toc00000046"/>
       <w:r>
         <w:rPr>
           <w:sz w:val="26"/>
@@ -7646,7 +7762,7 @@
         </w:rPr>
         <w:t xml:space="preserve">Bojātie nosaukumi</w:t>
       </w:r>
-      <w:bookmarkEnd w:id="46"/>
+      <w:bookmarkEnd w:id="47"/>
     </w:p>
     <w:p>
       <w:pPr>
@@ -7685,7 +7801,7 @@
         <w:spacing w:before="240" w:after="100"/>
         <w:keepNext/>
       </w:pPr>
-      <w:bookmarkStart w:id="47" w:name="_Toc00000046"/>
+      <w:bookmarkStart w:id="48" w:name="_Toc00000047"/>
       <w:r>
         <w:rPr>
           <w:sz w:val="26"/>
@@ -7697,7 +7813,7 @@
         </w:rPr>
         <w:t xml:space="preserve">Neizmantotie stili</w:t>
       </w:r>
-      <w:bookmarkEnd w:id="47"/>
+      <w:bookmarkEnd w:id="48"/>
     </w:p>
     <w:p>
       <w:pPr>
@@ -7736,7 +7852,7 @@
         <w:spacing w:before="240" w:after="100"/>
         <w:keepNext/>
       </w:pPr>
-      <w:bookmarkStart w:id="48" w:name="_Toc00000047"/>
+      <w:bookmarkStart w:id="49" w:name="_Toc00000048"/>
       <w:r>
         <w:rPr>
           <w:sz w:val="26"/>
@@ -7748,7 +7864,7 @@
         </w:rPr>
         <w:t xml:space="preserve">Prepare for sharing</w:t>
       </w:r>
-      <w:bookmarkEnd w:id="48"/>
+      <w:bookmarkEnd w:id="49"/>
     </w:p>
     <w:p>
       <w:pPr>
@@ -7916,7 +8032,7 @@
         <w:spacing w:before="240" w:after="100"/>
         <w:keepNext/>
       </w:pPr>
-      <w:bookmarkStart w:id="49" w:name="_Toc00000048"/>
+      <w:bookmarkStart w:id="50" w:name="_Toc00000049"/>
       <w:r>
         <w:rPr>
           <w:sz w:val="26"/>
@@ -7928,7 +8044,7 @@
         </w:rPr>
         <w:t xml:space="preserve">Clean past the data</w:t>
       </w:r>
-      <w:bookmarkEnd w:id="49"/>
+      <w:bookmarkEnd w:id="50"/>
     </w:p>
     <w:p>
       <w:pPr>
@@ -8028,7 +8144,7 @@
         <w:spacing w:before="240" w:after="100"/>
         <w:keepNext/>
       </w:pPr>
-      <w:bookmarkStart w:id="50" w:name="_Toc00000049"/>
+      <w:bookmarkStart w:id="51" w:name="_Toc00000050"/>
       <w:r>
         <w:rPr>
           <w:sz w:val="26"/>
@@ -8040,7 +8156,7 @@
         </w:rPr>
         <w:t xml:space="preserve">Model check</w:t>
       </w:r>
-      <w:bookmarkEnd w:id="50"/>
+      <w:bookmarkEnd w:id="51"/>
     </w:p>
     <w:p>
       <w:pPr>
@@ -8068,7 +8184,7 @@
         <w:keepNext/>
         <w:pageBreakBefore/>
       </w:pPr>
-      <w:bookmarkStart w:id="51" w:name="_Toc00000050"/>
+      <w:bookmarkStart w:id="52" w:name="_Toc00000051"/>
       <w:r>
         <w:rPr>
           <w:sz w:val="36"/>
@@ -8091,7 +8207,7 @@
         </w:rPr>
         <w:t xml:space="preserve">Saites uz PowerPoint</w:t>
       </w:r>
-      <w:bookmarkEnd w:id="51"/>
+      <w:bookmarkEnd w:id="52"/>
     </w:p>
     <w:p>
       <w:pPr>
@@ -8100,7 +8216,7 @@
         <w:spacing w:before="240" w:after="100"/>
         <w:keepNext/>
       </w:pPr>
-      <w:bookmarkStart w:id="52" w:name="_Toc00000051"/>
+      <w:bookmarkStart w:id="53" w:name="_Toc00000052"/>
       <w:r>
         <w:rPr>
           <w:sz w:val="26"/>
@@ -8112,7 +8228,7 @@
         </w:rPr>
         <w:t xml:space="preserve">Kā saite darbojas</w:t>
       </w:r>
-      <w:bookmarkEnd w:id="52"/>
+      <w:bookmarkEnd w:id="53"/>
     </w:p>
     <w:p>
       <w:pPr>
@@ -8166,7 +8282,7 @@
         <w:spacing w:before="240" w:after="100"/>
         <w:keepNext/>
       </w:pPr>
-      <w:bookmarkStart w:id="53" w:name="_Toc00000052"/>
+      <w:bookmarkStart w:id="54" w:name="_Toc00000053"/>
       <w:r>
         <w:rPr>
           <w:sz w:val="26"/>
@@ -8178,7 +8294,7 @@
         </w:rPr>
         <w:t xml:space="preserve">Saites atslēga</w:t>
       </w:r>
-      <w:bookmarkEnd w:id="53"/>
+      <w:bookmarkEnd w:id="54"/>
     </w:p>
     <w:p>
       <w:pPr>
@@ -8354,7 +8470,7 @@
         <w:spacing w:before="240" w:after="100"/>
         <w:keepNext/>
       </w:pPr>
-      <w:bookmarkStart w:id="54" w:name="_Toc00000053"/>
+      <w:bookmarkStart w:id="55" w:name="_Toc00000054"/>
       <w:r>
         <w:rPr>
           <w:sz w:val="26"/>
@@ -8366,7 +8482,7 @@
         </w:rPr>
         <w:t xml:space="preserve">Eksports no Excel</w:t>
       </w:r>
-      <w:bookmarkEnd w:id="54"/>
+      <w:bookmarkEnd w:id="55"/>
     </w:p>
     <w:p>
       <w:pPr>
@@ -8523,7 +8639,7 @@
         <w:spacing w:before="240" w:after="100"/>
         <w:keepNext/>
       </w:pPr>
-      <w:bookmarkStart w:id="55" w:name="_Toc00000054"/>
+      <w:bookmarkStart w:id="56" w:name="_Toc00000055"/>
       <w:r>
         <w:rPr>
           <w:sz w:val="26"/>
@@ -8535,7 +8651,7 @@
         </w:rPr>
         <w:t xml:space="preserve">Saišu saraksts Excel pusē</w:t>
       </w:r>
-      <w:bookmarkEnd w:id="55"/>
+      <w:bookmarkEnd w:id="56"/>
     </w:p>
     <w:p>
       <w:pPr>
@@ -8802,7 +8918,7 @@
         <w:spacing w:before="240" w:after="100"/>
         <w:keepNext/>
       </w:pPr>
-      <w:bookmarkStart w:id="56" w:name="_Toc00000055"/>
+      <w:bookmarkStart w:id="57" w:name="_Toc00000056"/>
       <w:r>
         <w:rPr>
           <w:sz w:val="26"/>
@@ -8814,7 +8930,7 @@
         </w:rPr>
         <w:t xml:space="preserve">Auto-push on edit un Highlight linked cells</w:t>
       </w:r>
-      <w:bookmarkEnd w:id="56"/>
+      <w:bookmarkEnd w:id="57"/>
     </w:p>
     <w:p>
       <w:pPr>
@@ -8853,7 +8969,7 @@
         <w:spacing w:before="240" w:after="100"/>
         <w:keepNext/>
       </w:pPr>
-      <w:bookmarkStart w:id="57" w:name="_Toc00000056"/>
+      <w:bookmarkStart w:id="58" w:name="_Toc00000057"/>
       <w:r>
         <w:rPr>
           <w:sz w:val="26"/>
@@ -8865,7 +8981,7 @@
         </w:rPr>
         <w:t xml:space="preserve">Ievietošana PowerPoint</w:t>
       </w:r>
-      <w:bookmarkEnd w:id="57"/>
+      <w:bookmarkEnd w:id="58"/>
     </w:p>
     <w:p>
       <w:pPr>
@@ -8898,7 +9014,7 @@
           <w:color w:val="1A1A1A"/>
           <w:rFonts w:ascii="Aptos" w:hAnsi="Aptos" w:cs="Aptos" w:eastAsia="Aptos"/>
         </w:rPr>
-        <w:t xml:space="preserve">Atlasiet slaidu, kurā attēls jāievieto.</w:t>
+        <w:t xml:space="preserve">Atlasiet slaidu, kurā attēls jāievieto, vai izvēlieties to izvēlnē "Slide" (skatiet sadaļu "Slaids un vieta").</w:t>
       </w:r>
     </w:p>
     <w:p>
@@ -8951,7 +9067,7 @@
           <w:color w:val="1A1A1A"/>
           <w:rFonts w:ascii="Aptos" w:hAnsi="Aptos" w:cs="Aptos" w:eastAsia="Aptos"/>
         </w:rPr>
-        <w:t xml:space="preserve">Poga "Paste latest linked" paveic to pašu vienā solī: tā ievieto jaunāko no Excel nosūtīto eksportu aktīvajā slaidā, neizvēloties konkrētu vienumu sarakstā.</w:t>
+        <w:t xml:space="preserve">Poga "Paste latest linked" paveic to pašu vienā solī: tā ievieto jaunāko no Excel nosūtīto eksportu aktīvajā slaidā, neizvēloties konkrētu vienumu sarakstā; arī šo pogu vada izvēlnes "Slide" un "Where".</w:t>
       </w:r>
     </w:p>
     <w:p>
@@ -9041,7 +9157,7 @@
         <w:spacing w:before="240" w:after="100"/>
         <w:keepNext/>
       </w:pPr>
-      <w:bookmarkStart w:id="58" w:name="_Toc00000057"/>
+      <w:bookmarkStart w:id="59" w:name="_Toc00000058"/>
       <w:r>
         <w:rPr>
           <w:sz w:val="26"/>
@@ -9051,9 +9167,230 @@
           <w:bCs/>
           <w:rFonts w:ascii="Aptos" w:hAnsi="Aptos" w:cs="Aptos" w:eastAsia="Aptos"/>
         </w:rPr>
+        <w:t xml:space="preserve">Slaids un vieta</w:t>
+      </w:r>
+      <w:bookmarkEnd w:id="59"/>
+    </w:p>
+    <w:p>
+      <w:pPr>
+        <w:rPr/>
+        <w:spacing w:after="120" w:line="276"/>
+      </w:pPr>
+      <w:r>
+        <w:rPr>
+          <w:sz w:val="22"/>
+          <w:szCs w:val="22"/>
+          <w:color w:val="1A1A1A"/>
+          <w:rFonts w:ascii="Aptos" w:hAnsi="Aptos" w:cs="Aptos" w:eastAsia="Aptos"/>
+        </w:rPr>
+        <w:t xml:space="preserve">Cilnes "Inbox" saraksta augšā ir divas izvēlnes: "Slide" un "Where". Tās nosaka, kurā slaidā un kurā vietā nonāks nākamais objekts, un attiecas uz katru pogu "Insert", kā arī uz "Paste latest linked".</w:t>
+      </w:r>
+    </w:p>
+    <w:p>
+      <w:pPr>
+        <w:rPr/>
+        <w:spacing w:after="120" w:line="276"/>
+      </w:pPr>
+      <w:r>
+        <w:rPr>
+          <w:sz w:val="22"/>
+          <w:szCs w:val="22"/>
+          <w:color w:val="1A1A1A"/>
+          <w:rFonts w:ascii="Aptos" w:hAnsi="Aptos" w:cs="Aptos" w:eastAsia="Aptos"/>
+        </w:rPr>
+        <w:t xml:space="preserve">Izvēlne "Slide" piedāvā aktīvo slaidu ("This slide", noklusējums) vai jebkuru prezentācijas slaidu pēc numura ("Slide 1", "Slide 2" un tā tālāk).</w:t>
+      </w:r>
+    </w:p>
+    <w:p>
+      <w:pPr>
+        <w:rPr/>
+        <w:spacing w:after="120" w:line="276"/>
+      </w:pPr>
+      <w:r>
+        <w:rPr>
+          <w:sz w:val="22"/>
+          <w:szCs w:val="22"/>
+          <w:color w:val="1A1A1A"/>
+          <w:rFonts w:ascii="Aptos" w:hAnsi="Aptos" w:cs="Aptos" w:eastAsia="Aptos"/>
+        </w:rPr>
+        <w:t xml:space="preserve">Izvēlnes "Where" vērtības:</w:t>
+      </w:r>
+    </w:p>
+    <w:p>
+      <w:pPr>
+        <w:rPr/>
+        <w:numPr>
+          <w:numId w:val="26"/>
+          <w:ilvl w:val="0"/>
+        </w:numPr>
+        <w:spacing w:after="60" w:line="276"/>
+      </w:pPr>
+      <w:r>
+        <w:rPr>
+          <w:sz w:val="22"/>
+          <w:szCs w:val="22"/>
+          <w:color w:val="1A1A1A"/>
+          <w:rFonts w:ascii="Aptos" w:hAnsi="Aptos" w:cs="Aptos" w:eastAsia="Aptos"/>
+        </w:rPr>
+        <w:t xml:space="preserve">"Free space": slaidā brīvā vietā (noklusējums).</w:t>
+      </w:r>
+    </w:p>
+    <w:p>
+      <w:pPr>
+        <w:rPr/>
+        <w:numPr>
+          <w:numId w:val="26"/>
+          <w:ilvl w:val="0"/>
+        </w:numPr>
+        <w:spacing w:after="60" w:line="276"/>
+      </w:pPr>
+      <w:r>
+        <w:rPr>
+          <w:sz w:val="22"/>
+          <w:szCs w:val="22"/>
+          <w:color w:val="1A1A1A"/>
+          <w:rFonts w:ascii="Aptos" w:hAnsi="Aptos" w:cs="Aptos" w:eastAsia="Aptos"/>
+        </w:rPr>
+        <w:t xml:space="preserve">"Selected shape": atlasītās figūras vietā.</w:t>
+      </w:r>
+    </w:p>
+    <w:p>
+      <w:pPr>
+        <w:rPr/>
+        <w:numPr>
+          <w:numId w:val="26"/>
+          <w:ilvl w:val="0"/>
+        </w:numPr>
+        <w:spacing w:after="60" w:line="276"/>
+      </w:pPr>
+      <w:r>
+        <w:rPr>
+          <w:sz w:val="22"/>
+          <w:szCs w:val="22"/>
+          <w:color w:val="1A1A1A"/>
+          <w:rFonts w:ascii="Aptos" w:hAnsi="Aptos" w:cs="Aptos" w:eastAsia="Aptos"/>
+        </w:rPr>
+        <w:t xml:space="preserve">"Left half" un "Right half": slaida kreisajā vai labajā pusē.</w:t>
+      </w:r>
+    </w:p>
+    <w:p>
+      <w:pPr>
+        <w:rPr/>
+        <w:numPr>
+          <w:numId w:val="26"/>
+          <w:ilvl w:val="0"/>
+        </w:numPr>
+        <w:spacing w:after="60" w:line="276"/>
+      </w:pPr>
+      <w:r>
+        <w:rPr>
+          <w:sz w:val="22"/>
+          <w:szCs w:val="22"/>
+          <w:color w:val="1A1A1A"/>
+          <w:rFonts w:ascii="Aptos" w:hAnsi="Aptos" w:cs="Aptos" w:eastAsia="Aptos"/>
+        </w:rPr>
+        <w:t xml:space="preserve">"Top left", "Top right", "Bottom left" un "Bottom right": vienā no četriem slaida ceturkšņiem.</w:t>
+      </w:r>
+    </w:p>
+    <w:p>
+      <w:pPr>
+        <w:rPr/>
+        <w:numPr>
+          <w:numId w:val="26"/>
+          <w:ilvl w:val="0"/>
+        </w:numPr>
+        <w:spacing w:after="60" w:line="276"/>
+      </w:pPr>
+      <w:r>
+        <w:rPr>
+          <w:sz w:val="22"/>
+          <w:szCs w:val="22"/>
+          <w:color w:val="1A1A1A"/>
+          <w:rFonts w:ascii="Aptos" w:hAnsi="Aptos" w:cs="Aptos" w:eastAsia="Aptos"/>
+        </w:rPr>
+        <w:t xml:space="preserve">"Whole slide": pa visu slaidu.</w:t>
+      </w:r>
+    </w:p>
+    <w:p>
+      <w:pPr>
+        <w:rPr/>
+        <w:spacing w:after="120" w:line="276"/>
+      </w:pPr>
+      <w:r>
+        <w:rPr>
+          <w:sz w:val="22"/>
+          <w:szCs w:val="22"/>
+          <w:color w:val="1A1A1A"/>
+          <w:rFonts w:ascii="Aptos" w:hAnsi="Aptos" w:cs="Aptos" w:eastAsia="Aptos"/>
+        </w:rPr>
+        <w:t xml:space="preserve">Puses, ceturkšņi un "Whole slide" ir slaida satura apgabala taisnstūri: slaids bez puscollas malas visapkārt. Objekts tajos tiek ievietots centrēti, saglabājot proporcijas, un netiek palielināts.</w:t>
+      </w:r>
+    </w:p>
+    <w:p>
+      <w:pPr>
+        <w:rPr/>
+        <w:spacing w:after="120" w:line="276"/>
+      </w:pPr>
+      <w:r>
+        <w:rPr>
+          <w:sz w:val="22"/>
+          <w:szCs w:val="22"/>
+          <w:color w:val="1A1A1A"/>
+          <w:rFonts w:ascii="Aptos" w:hAnsi="Aptos" w:cs="Aptos" w:eastAsia="Aptos"/>
+        </w:rPr>
+        <w:t xml:space="preserve">"Selected shape" pielāgo objektu tieši atlasītās figūras vietai. Ja atlasītā figūra ir tukšs izkārtojuma vietturis, tas pēc ievietošanas tiek izņemts; citas figūras paliek zem jaunā objekta.</w:t>
+      </w:r>
+    </w:p>
+    <w:p>
+      <w:pPr>
+        <w:rPr/>
+        <w:spacing w:after="120" w:line="276"/>
+      </w:pPr>
+      <w:r>
+        <w:rPr>
+          <w:sz w:val="22"/>
+          <w:szCs w:val="22"/>
+          <w:color w:val="1A1A1A"/>
+          <w:rFonts w:ascii="Aptos" w:hAnsi="Aptos" w:cs="Aptos" w:eastAsia="Aptos"/>
+        </w:rPr>
+        <w:t xml:space="preserve">Ja ir izvēlēts "Selected shape", bet slaidā nekas nav atlasīts, panelis neko neievieto un parāda paziņojumu: "Select a shape on the slide first, or choose another spot."</w:t>
+      </w:r>
+    </w:p>
+    <w:p>
+      <w:pPr>
+        <w:rPr/>
+        <w:spacing w:after="120" w:line="276"/>
+      </w:pPr>
+      <w:r>
+        <w:rPr>
+          <w:sz w:val="22"/>
+          <w:szCs w:val="22"/>
+          <w:color w:val="1A1A1A"/>
+          <w:rFonts w:ascii="Aptos" w:hAnsi="Aptos" w:cs="Aptos" w:eastAsia="Aptos"/>
+        </w:rPr>
+        <w:t xml:space="preserve">Kad objekts ir ievietots citā slaidā, panelis pārslēdz prezentāciju uz šo slaidu.</w:t>
+      </w:r>
+    </w:p>
+    <w:p>
+      <w:pPr>
+        <w:rPr/>
+        <w:pStyle w:val="Heading2"/>
+        <w:spacing w:before="240" w:after="100"/>
+        <w:keepNext/>
+      </w:pPr>
+      <w:bookmarkStart w:id="60" w:name="_Toc00000059"/>
+      <w:r>
+        <w:rPr>
+          <w:sz w:val="26"/>
+          <w:szCs w:val="26"/>
+          <w:color w:val="14213D"/>
+          <w:b/>
+          <w:bCs/>
+          <w:rFonts w:ascii="Aptos" w:hAnsi="Aptos" w:cs="Aptos" w:eastAsia="Aptos"/>
+        </w:rPr>
         <w:t xml:space="preserve">Atjaunināšana</w:t>
       </w:r>
-      <w:bookmarkEnd w:id="58"/>
+      <w:bookmarkEnd w:id="60"/>
     </w:p>
     <w:p>
       <w:pPr>
@@ -9415,7 +9752,7 @@
         <w:spacing w:before="240" w:after="100"/>
         <w:keepNext/>
       </w:pPr>
-      <w:bookmarkStart w:id="59" w:name="_Toc00000058"/>
+      <w:bookmarkStart w:id="61" w:name="_Toc00000060"/>
       <w:r>
         <w:rPr>
           <w:sz w:val="26"/>
@@ -9427,7 +9764,7 @@
         </w:rPr>
         <w:t xml:space="preserve">Meklēšana un filtrēšana</w:t>
       </w:r>
-      <w:bookmarkEnd w:id="59"/>
+      <w:bookmarkEnd w:id="61"/>
     </w:p>
     <w:p>
       <w:pPr>
@@ -9706,7 +10043,7 @@
       <w:pPr>
         <w:rPr/>
         <w:numPr>
-          <w:numId w:val="26"/>
+          <w:numId w:val="27"/>
           <w:ilvl w:val="0"/>
         </w:numPr>
         <w:spacing w:after="60" w:line="276"/>
@@ -9725,7 +10062,7 @@
       <w:pPr>
         <w:rPr/>
         <w:numPr>
-          <w:numId w:val="26"/>
+          <w:numId w:val="27"/>
           <w:ilvl w:val="0"/>
         </w:numPr>
         <w:spacing w:after="60" w:line="276"/>
@@ -9744,7 +10081,7 @@
       <w:pPr>
         <w:rPr/>
         <w:numPr>
-          <w:numId w:val="26"/>
+          <w:numId w:val="27"/>
           <w:ilvl w:val="0"/>
         </w:numPr>
         <w:spacing w:after="60" w:line="276"/>
@@ -9763,7 +10100,7 @@
       <w:pPr>
         <w:rPr/>
         <w:numPr>
-          <w:numId w:val="26"/>
+          <w:numId w:val="27"/>
           <w:ilvl w:val="0"/>
         </w:numPr>
         <w:spacing w:after="60" w:line="276"/>
@@ -9785,7 +10122,7 @@
         <w:spacing w:before="240" w:after="100"/>
         <w:keepNext/>
       </w:pPr>
-      <w:bookmarkStart w:id="60" w:name="_Toc00000059"/>
+      <w:bookmarkStart w:id="62" w:name="_Toc00000061"/>
       <w:r>
         <w:rPr>
           <w:sz w:val="26"/>
@@ -9797,7 +10134,7 @@
         </w:rPr>
         <w:t xml:space="preserve">Go to slide, Change source un Break link</w:t>
       </w:r>
-      <w:bookmarkEnd w:id="60"/>
+      <w:bookmarkEnd w:id="62"/>
     </w:p>
     <w:p>
       <w:pPr>
@@ -9866,7 +10203,7 @@
         <w:spacing w:before="240" w:after="100"/>
         <w:keepNext/>
       </w:pPr>
-      <w:bookmarkStart w:id="61" w:name="_Toc00000060"/>
+      <w:bookmarkStart w:id="63" w:name="_Toc00000062"/>
       <w:r>
         <w:rPr>
           <w:sz w:val="26"/>
@@ -9878,7 +10215,7 @@
         </w:rPr>
         <w:t xml:space="preserve">Object tools</w:t>
       </w:r>
-      <w:bookmarkEnd w:id="61"/>
+      <w:bookmarkEnd w:id="63"/>
     </w:p>
     <w:p>
       <w:pPr>
@@ -10134,7 +10471,7 @@
         <w:spacing w:before="240" w:after="100"/>
         <w:keepNext/>
       </w:pPr>
-      <w:bookmarkStart w:id="62" w:name="_Toc00000061"/>
+      <w:bookmarkStart w:id="64" w:name="_Toc00000063"/>
       <w:r>
         <w:rPr>
           <w:sz w:val="26"/>
@@ -10146,7 +10483,7 @@
         </w:rPr>
         <w:t xml:space="preserve">Smart Painter</w:t>
       </w:r>
-      <w:bookmarkEnd w:id="62"/>
+      <w:bookmarkEnd w:id="64"/>
     </w:p>
     <w:p>
       <w:pPr>
@@ -10167,7 +10504,7 @@
       <w:pPr>
         <w:rPr/>
         <w:numPr>
-          <w:numId w:val="27"/>
+          <w:numId w:val="28"/>
           <w:ilvl w:val="0"/>
         </w:numPr>
         <w:spacing w:after="60" w:line="276"/>
@@ -10186,7 +10523,7 @@
       <w:pPr>
         <w:rPr/>
         <w:numPr>
-          <w:numId w:val="27"/>
+          <w:numId w:val="28"/>
           <w:ilvl w:val="0"/>
         </w:numPr>
         <w:spacing w:after="60" w:line="276"/>
@@ -10205,7 +10542,7 @@
       <w:pPr>
         <w:rPr/>
         <w:numPr>
-          <w:numId w:val="27"/>
+          <w:numId w:val="28"/>
           <w:ilvl w:val="0"/>
         </w:numPr>
         <w:spacing w:after="60" w:line="276"/>
@@ -10242,7 +10579,7 @@
         <w:spacing w:before="240" w:after="100"/>
         <w:keepNext/>
       </w:pPr>
-      <w:bookmarkStart w:id="63" w:name="_Toc00000062"/>
+      <w:bookmarkStart w:id="65" w:name="_Toc00000064"/>
       <w:r>
         <w:rPr>
           <w:sz w:val="26"/>
@@ -10254,7 +10591,7 @@
         </w:rPr>
         <w:t xml:space="preserve">Drošība</w:t>
       </w:r>
-      <w:bookmarkEnd w:id="63"/>
+      <w:bookmarkEnd w:id="65"/>
     </w:p>
     <w:p>
       <w:pPr>
@@ -10297,7 +10634,7 @@
         <w:keepNext/>
         <w:pageBreakBefore/>
       </w:pPr>
-      <w:bookmarkStart w:id="64" w:name="_Toc00000063"/>
+      <w:bookmarkStart w:id="66" w:name="_Toc00000065"/>
       <w:r>
         <w:rPr>
           <w:sz w:val="36"/>
@@ -10320,7 +10657,7 @@
         </w:rPr>
         <w:t xml:space="preserve">Cilne Brand</w:t>
       </w:r>
-      <w:bookmarkEnd w:id="64"/>
+      <w:bookmarkEnd w:id="66"/>
     </w:p>
     <w:p>
       <w:pPr>
@@ -10329,7 +10666,7 @@
         <w:spacing w:before="240" w:after="100"/>
         <w:keepNext/>
       </w:pPr>
-      <w:bookmarkStart w:id="65" w:name="_Toc00000064"/>
+      <w:bookmarkStart w:id="67" w:name="_Toc00000066"/>
       <w:r>
         <w:rPr>
           <w:sz w:val="26"/>
@@ -10341,7 +10678,7 @@
         </w:rPr>
         <w:t xml:space="preserve">Palete</w:t>
       </w:r>
-      <w:bookmarkEnd w:id="65"/>
+      <w:bookmarkEnd w:id="67"/>
     </w:p>
     <w:p>
       <w:pPr>
@@ -10811,7 +11148,7 @@
         <w:spacing w:before="240" w:after="100"/>
         <w:keepNext/>
       </w:pPr>
-      <w:bookmarkStart w:id="66" w:name="_Toc00000065"/>
+      <w:bookmarkStart w:id="68" w:name="_Toc00000067"/>
       <w:r>
         <w:rPr>
           <w:sz w:val="26"/>
@@ -10823,7 +11160,7 @@
         </w:rPr>
         <w:t xml:space="preserve">Krāsas no logotipa</w:t>
       </w:r>
-      <w:bookmarkEnd w:id="66"/>
+      <w:bookmarkEnd w:id="68"/>
     </w:p>
     <w:p>
       <w:pPr>
@@ -10847,7 +11184,7 @@
         <w:spacing w:before="240" w:after="100"/>
         <w:keepNext/>
       </w:pPr>
-      <w:bookmarkStart w:id="67" w:name="_Toc00000066"/>
+      <w:bookmarkStart w:id="69" w:name="_Toc00000068"/>
       <w:r>
         <w:rPr>
           <w:sz w:val="26"/>
@@ -10859,7 +11196,7 @@
         </w:rPr>
         <w:t xml:space="preserve">Fonts, valoda un skaitļu stils</w:t>
       </w:r>
-      <w:bookmarkEnd w:id="67"/>
+      <w:bookmarkEnd w:id="69"/>
     </w:p>
     <w:p>
       <w:pPr>
@@ -11290,7 +11627,7 @@
         <w:spacing w:before="240" w:after="100"/>
         <w:keepNext/>
       </w:pPr>
-      <w:bookmarkStart w:id="68" w:name="_Toc00000067"/>
+      <w:bookmarkStart w:id="70" w:name="_Toc00000069"/>
       <w:r>
         <w:rPr>
           <w:sz w:val="26"/>
@@ -11302,7 +11639,7 @@
         </w:rPr>
         <w:t xml:space="preserve">Valūta</w:t>
       </w:r>
-      <w:bookmarkEnd w:id="68"/>
+      <w:bookmarkEnd w:id="70"/>
     </w:p>
     <w:p>
       <w:pPr>
@@ -11326,7 +11663,7 @@
         <w:spacing w:before="240" w:after="100"/>
         <w:keepNext/>
       </w:pPr>
-      <w:bookmarkStart w:id="69" w:name="_Toc00000068"/>
+      <w:bookmarkStart w:id="71" w:name="_Toc00000070"/>
       <w:r>
         <w:rPr>
           <w:sz w:val="26"/>
@@ -11338,7 +11675,7 @@
         </w:rPr>
         <w:t xml:space="preserve">Autocolor on edit</w:t>
       </w:r>
-      <w:bookmarkEnd w:id="69"/>
+      <w:bookmarkEnd w:id="71"/>
     </w:p>
     <w:p>
       <w:pPr>
@@ -11362,7 +11699,7 @@
         <w:spacing w:before="240" w:after="100"/>
         <w:keepNext/>
       </w:pPr>
-      <w:bookmarkStart w:id="70" w:name="_Toc00000069"/>
+      <w:bookmarkStart w:id="72" w:name="_Toc00000071"/>
       <w:r>
         <w:rPr>
           <w:sz w:val="26"/>
@@ -11374,7 +11711,7 @@
         </w:rPr>
         <w:t xml:space="preserve">Keyboard shortcuts</w:t>
       </w:r>
-      <w:bookmarkEnd w:id="70"/>
+      <w:bookmarkEnd w:id="72"/>
     </w:p>
     <w:p>
       <w:pPr>
@@ -11398,7 +11735,7 @@
         <w:spacing w:before="240" w:after="100"/>
         <w:keepNext/>
       </w:pPr>
-      <w:bookmarkStart w:id="71" w:name="_Toc00000070"/>
+      <w:bookmarkStart w:id="73" w:name="_Toc00000072"/>
       <w:r>
         <w:rPr>
           <w:sz w:val="26"/>
@@ -11410,7 +11747,7 @@
         </w:rPr>
         <w:t xml:space="preserve">Iestatījumu pārnešana un atiestatīšana</w:t>
       </w:r>
-      <w:bookmarkEnd w:id="71"/>
+      <w:bookmarkEnd w:id="73"/>
     </w:p>
     <w:p>
       <w:pPr>
@@ -11468,7 +11805,7 @@
         <w:keepNext/>
         <w:pageBreakBefore/>
       </w:pPr>
-      <w:bookmarkStart w:id="72" w:name="_Toc00000071"/>
+      <w:bookmarkStart w:id="74" w:name="_Toc00000073"/>
       <w:r>
         <w:rPr>
           <w:sz w:val="36"/>
@@ -11491,7 +11828,7 @@
         </w:rPr>
         <w:t xml:space="preserve">Īsinājumtaustiņi</w:t>
       </w:r>
-      <w:bookmarkEnd w:id="72"/>
+      <w:bookmarkEnd w:id="74"/>
     </w:p>
     <w:p>
       <w:pPr>
@@ -11500,7 +11837,7 @@
         <w:spacing w:before="240" w:after="100"/>
         <w:keepNext/>
       </w:pPr>
-      <w:bookmarkStart w:id="73" w:name="_Toc00000072"/>
+      <w:bookmarkStart w:id="75" w:name="_Toc00000074"/>
       <w:r>
         <w:rPr>
           <w:sz w:val="26"/>
@@ -11512,7 +11849,7 @@
         </w:rPr>
         <w:t xml:space="preserve">Visas kombinācijas</w:t>
       </w:r>
-      <w:bookmarkEnd w:id="73"/>
+      <w:bookmarkEnd w:id="75"/>
     </w:p>
     <w:p>
       <w:pPr>
@@ -14177,7 +14514,7 @@
         <w:keepNext/>
         <w:pageBreakBefore/>
       </w:pPr>
-      <w:bookmarkStart w:id="74" w:name="_Toc00000073"/>
+      <w:bookmarkStart w:id="76" w:name="_Toc00000075"/>
       <w:r>
         <w:rPr>
           <w:sz w:val="36"/>
@@ -14200,7 +14537,7 @@
         </w:rPr>
         <w:t xml:space="preserve">Biežākās problēmas</w:t>
       </w:r>
-      <w:bookmarkEnd w:id="74"/>
+      <w:bookmarkEnd w:id="76"/>
     </w:p>
     <w:p>
       <w:pPr>
@@ -14209,7 +14546,7 @@
         <w:spacing w:before="240" w:after="100"/>
         <w:keepNext/>
       </w:pPr>
-      <w:bookmarkStart w:id="75" w:name="_Toc00000074"/>
+      <w:bookmarkStart w:id="77" w:name="_Toc00000076"/>
       <w:r>
         <w:rPr>
           <w:sz w:val="26"/>
@@ -14221,7 +14558,7 @@
         </w:rPr>
         <w:t xml:space="preserve">Ziņojumi un to iemesli</w:t>
       </w:r>
-      <w:bookmarkEnd w:id="75"/>
+      <w:bookmarkEnd w:id="77"/>
     </w:p>
     <w:tbl>
       <w:tblPr>
@@ -14992,7 +15329,7 @@
         <w:spacing w:before="240" w:after="100"/>
         <w:keepNext/>
       </w:pPr>
-      <w:bookmarkStart w:id="76" w:name="_Toc00000075"/>
+      <w:bookmarkStart w:id="78" w:name="_Toc00000077"/>
       <w:r>
         <w:rPr>
           <w:sz w:val="26"/>
@@ -15004,13 +15341,13 @@
         </w:rPr>
         <w:t xml:space="preserve">Ierobežojumi</w:t>
       </w:r>
-      <w:bookmarkEnd w:id="76"/>
+      <w:bookmarkEnd w:id="78"/>
     </w:p>
     <w:p>
       <w:pPr>
         <w:rPr/>
         <w:numPr>
-          <w:numId w:val="28"/>
+          <w:numId w:val="29"/>
           <w:ilvl w:val="0"/>
         </w:numPr>
         <w:spacing w:after="60" w:line="276"/>
@@ -15029,7 +15366,7 @@
       <w:pPr>
         <w:rPr/>
         <w:numPr>
-          <w:numId w:val="28"/>
+          <w:numId w:val="29"/>
           <w:ilvl w:val="0"/>
         </w:numPr>
         <w:spacing w:after="60" w:line="276"/>
@@ -15048,7 +15385,7 @@
       <w:pPr>
         <w:rPr/>
         <w:numPr>
-          <w:numId w:val="28"/>
+          <w:numId w:val="29"/>
           <w:ilvl w:val="0"/>
         </w:numPr>
         <w:spacing w:after="60" w:line="276"/>
@@ -15067,7 +15404,7 @@
       <w:pPr>
         <w:rPr/>
         <w:numPr>
-          <w:numId w:val="28"/>
+          <w:numId w:val="29"/>
           <w:ilvl w:val="0"/>
         </w:numPr>
         <w:spacing w:after="60" w:line="276"/>
@@ -15086,7 +15423,7 @@
       <w:pPr>
         <w:rPr/>
         <w:numPr>
-          <w:numId w:val="28"/>
+          <w:numId w:val="29"/>
           <w:ilvl w:val="0"/>
         </w:numPr>
         <w:spacing w:after="60" w:line="276"/>
@@ -15105,7 +15442,7 @@
       <w:pPr>
         <w:rPr/>
         <w:numPr>
-          <w:numId w:val="28"/>
+          <w:numId w:val="29"/>
           <w:ilvl w:val="0"/>
         </w:numPr>
         <w:spacing w:after="60" w:line="276"/>
@@ -15124,7 +15461,7 @@
       <w:pPr>
         <w:rPr/>
         <w:numPr>
-          <w:numId w:val="28"/>
+          <w:numId w:val="29"/>
           <w:ilvl w:val="0"/>
         </w:numPr>
         <w:spacing w:after="60" w:line="276"/>
@@ -15143,7 +15480,7 @@
       <w:pPr>
         <w:rPr/>
         <w:numPr>
-          <w:numId w:val="28"/>
+          <w:numId w:val="29"/>
           <w:ilvl w:val="0"/>
         </w:numPr>
         <w:spacing w:after="60" w:line="276"/>
@@ -15162,7 +15499,7 @@
       <w:pPr>
         <w:rPr/>
         <w:numPr>
-          <w:numId w:val="28"/>
+          <w:numId w:val="29"/>
           <w:ilvl w:val="0"/>
         </w:numPr>
         <w:spacing w:after="60" w:line="276"/>
@@ -15181,7 +15518,7 @@
       <w:pPr>
         <w:rPr/>
         <w:numPr>
-          <w:numId w:val="28"/>
+          <w:numId w:val="29"/>
           <w:ilvl w:val="0"/>
         </w:numPr>
         <w:spacing w:after="60" w:line="276"/>
@@ -15200,7 +15537,7 @@
       <w:pPr>
         <w:rPr/>
         <w:numPr>
-          <w:numId w:val="28"/>
+          <w:numId w:val="29"/>
           <w:ilvl w:val="0"/>
         </w:numPr>
         <w:spacing w:after="60" w:line="276"/>
@@ -15219,7 +15556,7 @@
       <w:pPr>
         <w:rPr/>
         <w:numPr>
-          <w:numId w:val="28"/>
+          <w:numId w:val="29"/>
           <w:ilvl w:val="0"/>
         </w:numPr>
         <w:spacing w:after="60" w:line="276"/>
@@ -15245,7 +15582,7 @@
         <w:keepNext/>
         <w:pageBreakBefore/>
       </w:pPr>
-      <w:bookmarkStart w:id="77" w:name="_Toc00000076"/>
+      <w:bookmarkStart w:id="79" w:name="_Toc00000078"/>
       <w:r>
         <w:rPr>
           <w:sz w:val="36"/>
@@ -15268,7 +15605,7 @@
         </w:rPr>
         <w:t xml:space="preserve">Versija</w:t>
       </w:r>
-      <w:bookmarkEnd w:id="77"/>
+      <w:bookmarkEnd w:id="79"/>
     </w:p>
     <w:p>
       <w:pPr>
@@ -15277,7 +15614,7 @@
         <w:spacing w:before="240" w:after="100"/>
         <w:keepNext/>
       </w:pPr>
-      <w:bookmarkStart w:id="78" w:name="_Toc00000077"/>
+      <w:bookmarkStart w:id="80" w:name="_Toc00000079"/>
       <w:r>
         <w:rPr>
           <w:sz w:val="26"/>
@@ -15289,7 +15626,7 @@
         </w:rPr>
         <w:t xml:space="preserve">Kura versija ir aprakstīta</w:t>
       </w:r>
-      <w:bookmarkEnd w:id="78"/>
+      <w:bookmarkEnd w:id="80"/>
     </w:p>
     <w:p>
       <w:pPr>
@@ -15303,7 +15640,7 @@
           <w:color w:val="1A1A1A"/>
           <w:rFonts w:ascii="Aptos" w:hAnsi="Aptos" w:cs="Aptos" w:eastAsia="Aptos"/>
         </w:rPr>
-        <w:t xml:space="preserve">Šī rokasgrāmata apraksta pls,fix versiju v2.7.015. Tā pati versija ir uzrakstīta uz vāka un katras lapas apakšā.</w:t>
+        <w:t xml:space="preserve">Šī rokasgrāmata apraksta pls,fix versiju v2.8.000. Tā pati versija ir uzrakstīta uz vāka un katras lapas apakšā.</w:t>
       </w:r>
     </w:p>
     <w:p>
@@ -15368,7 +15705,7 @@
         <w:color w:val="5B6472"/>
         <w:rFonts w:ascii="Aptos" w:hAnsi="Aptos" w:cs="Aptos" w:eastAsia="Aptos"/>
       </w:rPr>
-      <w:t xml:space="preserve">pls,fix rokasgrāmata v2.7.015   |   </w:t>
+      <w:t xml:space="preserve">pls,fix rokasgrāmata v2.8.000   |   </w:t>
     </w:r>
     <w:r>
       <w:rPr>
@@ -15626,12 +15963,18 @@
     </w:lvlOverride>
   </w:num>
   <w:num w:numId="27">
+    <w:abstractNumId w:val="2"/>
+    <w:lvlOverride w:ilvl="0">
+      <w:startOverride w:val="1"/>
+    </w:lvlOverride>
+  </w:num>
+  <w:num w:numId="28">
     <w:abstractNumId w:val="1"/>
     <w:lvlOverride w:ilvl="0">
       <w:startOverride w:val="1"/>
     </w:lvlOverride>
   </w:num>
-  <w:num w:numId="28">
+  <w:num w:numId="29">
     <w:abstractNumId w:val="2"/>
     <w:lvlOverride w:ilvl="0">
       <w:startOverride w:val="1"/>

</xml_diff>

<commit_message>
Manual regenerated at v2.8.1
</commit_message>
<xml_diff>
--- a/manual/out/pls,fix rokasgrāmata.docx
+++ b/manual/out/pls,fix rokasgrāmata.docx
@@ -123,7 +123,7 @@
           <w:bCs/>
           <w:rFonts w:ascii="Aptos" w:hAnsi="Aptos" w:cs="Aptos" w:eastAsia="Aptos"/>
         </w:rPr>
-        <w:t xml:space="preserve">v2.8.000</w:t>
+        <w:t xml:space="preserve">v2.8.001</w:t>
       </w:r>
     </w:p>
     <w:p>
@@ -15640,7 +15640,7 @@
           <w:color w:val="1A1A1A"/>
           <w:rFonts w:ascii="Aptos" w:hAnsi="Aptos" w:cs="Aptos" w:eastAsia="Aptos"/>
         </w:rPr>
-        <w:t xml:space="preserve">Šī rokasgrāmata apraksta pls,fix versiju v2.8.000. Tā pati versija ir uzrakstīta uz vāka un katras lapas apakšā.</w:t>
+        <w:t xml:space="preserve">Šī rokasgrāmata apraksta pls,fix versiju v2.8.001. Tā pati versija ir uzrakstīta uz vāka un katras lapas apakšā.</w:t>
       </w:r>
     </w:p>
     <w:p>
@@ -15705,7 +15705,7 @@
         <w:color w:val="5B6472"/>
         <w:rFonts w:ascii="Aptos" w:hAnsi="Aptos" w:cs="Aptos" w:eastAsia="Aptos"/>
       </w:rPr>
-      <w:t xml:space="preserve">pls,fix rokasgrāmata v2.8.000   |   </w:t>
+      <w:t xml:space="preserve">pls,fix rokasgrāmata v2.8.001   |   </w:t>
     </w:r>
     <w:r>
       <w:rPr>

</xml_diff>

<commit_message>
Manual regenerated at v2.8.002
The docx label follows the bump; content unchanged since c18d172.
</commit_message>
<xml_diff>
--- a/manual/out/pls,fix rokasgrāmata.docx
+++ b/manual/out/pls,fix rokasgrāmata.docx
@@ -123,7 +123,7 @@
           <w:bCs/>
           <w:rFonts w:ascii="Aptos" w:hAnsi="Aptos" w:cs="Aptos" w:eastAsia="Aptos"/>
         </w:rPr>
-        <w:t xml:space="preserve">v2.8.001</w:t>
+        <w:t xml:space="preserve">v2.8.002</w:t>
       </w:r>
     </w:p>
     <w:p>
@@ -15640,7 +15640,7 @@
           <w:color w:val="1A1A1A"/>
           <w:rFonts w:ascii="Aptos" w:hAnsi="Aptos" w:cs="Aptos" w:eastAsia="Aptos"/>
         </w:rPr>
-        <w:t xml:space="preserve">Šī rokasgrāmata apraksta pls,fix versiju v2.8.001. Tā pati versija ir uzrakstīta uz vāka un katras lapas apakšā.</w:t>
+        <w:t xml:space="preserve">Šī rokasgrāmata apraksta pls,fix versiju v2.8.002. Tā pati versija ir uzrakstīta uz vāka un katras lapas apakšā.</w:t>
       </w:r>
     </w:p>
     <w:p>
@@ -15705,7 +15705,7 @@
         <w:color w:val="5B6472"/>
         <w:rFonts w:ascii="Aptos" w:hAnsi="Aptos" w:cs="Aptos" w:eastAsia="Aptos"/>
       </w:rPr>
-      <w:t xml:space="preserve">pls,fix rokasgrāmata v2.8.001   |   </w:t>
+      <w:t xml:space="preserve">pls,fix rokasgrāmata v2.8.002   |   </w:t>
     </w:r>
     <w:r>
       <w:rPr>

</xml_diff>

<commit_message>
Manual regenerated at v2.8.003
The docx label follows the bump; content as in the v2.8.3 commit.
</commit_message>
<xml_diff>
--- a/manual/out/pls,fix rokasgrāmata.docx
+++ b/manual/out/pls,fix rokasgrāmata.docx
@@ -123,7 +123,7 @@
           <w:bCs/>
           <w:rFonts w:ascii="Aptos" w:hAnsi="Aptos" w:cs="Aptos" w:eastAsia="Aptos"/>
         </w:rPr>
-        <w:t xml:space="preserve">v2.8.002</w:t>
+        <w:t xml:space="preserve">v2.8.003</w:t>
       </w:r>
     </w:p>
     <w:p>
@@ -8272,7 +8272,7 @@
           <w:color w:val="1A1A1A"/>
           <w:rFonts w:ascii="Aptos" w:hAnsi="Aptos" w:cs="Aptos" w:eastAsia="Aptos"/>
         </w:rPr>
-        <w:t xml:space="preserve">Saitē var būt attēls, tabula vai diagramma. Diagramma slaidā nonāk kā rediģējamu figūru grupa ar zīmola krāsām un tikai vērtību etiķetēm: stabiņu, joslu, tilta, sektoru un līniju diagrammas. Līniju diagrammā katrs punkts ir sava figūra, savienota ar līniju līdz nākamajam punktam. Šai figūru grupai nepieciešams PowerPoint 2504 vai jaunāks Windows datorā vai PowerPoint tīmeklī; Mac datorā diagramma pagaidām vienmēr nonāk kā attēls, jo figūru zīmēšana tur pārtrauc PowerPoint darbu (versija 16.107); vecākā Windows versijā, kā arī pāri 40 punktiem, 6 sērijām vai 12 sektoriem, kā arī diagrammas tipam, ko figūras neatveido, diagramma tiek ievietota kā attēls, un abi paneļi pasaka iemeslu.</w:t>
+        <w:t xml:space="preserve">Saitē var būt attēls, tabula vai diagramma. Diagramma slaidā nonāk kā rediģējamu figūru grupa ar zīmola krāsām un tikai vērtību etiķetēm: stabiņu, joslu, tilta, sektoru un līniju diagrammas. Līniju diagrammā katrs punkts ir sava figūra, savienota ar līniju līdz nākamajam punktam. Šai figūru grupai nepieciešams PowerPoint 2504 vai jaunāks Windows datorā, 16.96 vai jaunāks Mac datorā (Mac datorā grupa sastāv no apakšgrupām pa sešām figūrām); vecākā versijā, kā arī pāri 40 punktiem, 6 sērijām vai 12 sektoriem, kā arī diagrammas tipam, ko figūras neatveido, diagramma tiek ievietota kā attēls, un abi paneļi pasaka iemeslu.</w:t>
       </w:r>
     </w:p>
     <w:p>
@@ -15640,7 +15640,7 @@
           <w:color w:val="1A1A1A"/>
           <w:rFonts w:ascii="Aptos" w:hAnsi="Aptos" w:cs="Aptos" w:eastAsia="Aptos"/>
         </w:rPr>
-        <w:t xml:space="preserve">Šī rokasgrāmata apraksta pls,fix versiju v2.8.002. Tā pati versija ir uzrakstīta uz vāka un katras lapas apakšā.</w:t>
+        <w:t xml:space="preserve">Šī rokasgrāmata apraksta pls,fix versiju v2.8.003. Tā pati versija ir uzrakstīta uz vāka un katras lapas apakšā.</w:t>
       </w:r>
     </w:p>
     <w:p>
@@ -15705,7 +15705,7 @@
         <w:color w:val="5B6472"/>
         <w:rFonts w:ascii="Aptos" w:hAnsi="Aptos" w:cs="Aptos" w:eastAsia="Aptos"/>
       </w:rPr>
-      <w:t xml:space="preserve">pls,fix rokasgrāmata v2.8.002   |   </w:t>
+      <w:t xml:space="preserve">pls,fix rokasgrāmata v2.8.003   |   </w:t>
     </w:r>
     <w:r>
       <w:rPr>

</xml_diff>

<commit_message>
Manual regenerated at v2.8.017
manual/out: the LV manual rebuilt at v2.8.017 (Projekti section, the table header sentence, everything since v2.8.003).
</commit_message>
<xml_diff>
--- a/manual/out/pls,fix rokasgrāmata.docx
+++ b/manual/out/pls,fix rokasgrāmata.docx
@@ -123,7 +123,7 @@
           <w:bCs/>
           <w:rFonts w:ascii="Aptos" w:hAnsi="Aptos" w:cs="Aptos" w:eastAsia="Aptos"/>
         </w:rPr>
-        <w:t xml:space="preserve">v2.8.003</w:t>
+        <w:t xml:space="preserve">v2.8.017</w:t>
       </w:r>
     </w:p>
     <w:p>
@@ -1570,7 +1570,7 @@
               </w:pPr>
               <w:r>
                 <w:rPr/>
-                <w:t xml:space="preserve">Auto-push on edit un Highlight linked cells</w:t>
+                <w:t xml:space="preserve">Projekti</w:t>
               </w:r>
               <w:r>
                 <w:rPr/>
@@ -1595,7 +1595,7 @@
               </w:pPr>
               <w:r>
                 <w:rPr/>
-                <w:t xml:space="preserve">Ievietošana PowerPoint</w:t>
+                <w:t xml:space="preserve">Auto-push on edit un Highlight linked cells</w:t>
               </w:r>
               <w:r>
                 <w:rPr/>
@@ -1620,7 +1620,7 @@
               </w:pPr>
               <w:r>
                 <w:rPr/>
-                <w:t xml:space="preserve">Slaids un vieta</w:t>
+                <w:t xml:space="preserve">Ievietošana PowerPoint</w:t>
               </w:r>
               <w:r>
                 <w:rPr/>
@@ -1645,7 +1645,7 @@
               </w:pPr>
               <w:r>
                 <w:rPr/>
-                <w:t xml:space="preserve">Atjaunināšana</w:t>
+                <w:t xml:space="preserve">Slaids un vieta</w:t>
               </w:r>
               <w:r>
                 <w:rPr/>
@@ -1670,7 +1670,7 @@
               </w:pPr>
               <w:r>
                 <w:rPr/>
-                <w:t xml:space="preserve">Meklēšana un filtrēšana</w:t>
+                <w:t xml:space="preserve">Atjaunināšana</w:t>
               </w:r>
               <w:r>
                 <w:rPr/>
@@ -1695,7 +1695,7 @@
               </w:pPr>
               <w:r>
                 <w:rPr/>
-                <w:t xml:space="preserve">Go to slide, Change source un Break link</w:t>
+                <w:t xml:space="preserve">Meklēšana un filtrēšana</w:t>
               </w:r>
               <w:r>
                 <w:rPr/>
@@ -1720,7 +1720,7 @@
               </w:pPr>
               <w:r>
                 <w:rPr/>
-                <w:t xml:space="preserve">Object tools</w:t>
+                <w:t xml:space="preserve">Go to slide, Change source un Break link</w:t>
               </w:r>
               <w:r>
                 <w:rPr/>
@@ -1745,7 +1745,7 @@
               </w:pPr>
               <w:r>
                 <w:rPr/>
-                <w:t xml:space="preserve">Smart Painter</w:t>
+                <w:t xml:space="preserve">Object tools</w:t>
               </w:r>
               <w:r>
                 <w:rPr/>
@@ -1770,7 +1770,7 @@
               </w:pPr>
               <w:r>
                 <w:rPr/>
-                <w:t xml:space="preserve">Drošība</w:t>
+                <w:t xml:space="preserve">Smart Painter</w:t>
               </w:r>
               <w:r>
                 <w:rPr/>
@@ -1788,6 +1788,31 @@
             <w:p>
               <w:pPr>
                 <w:rPr/>
+                <w:pStyle w:val="ToC2"/>
+                <w:tabs>
+                  <w:tab w:val="right" w:leader="dot" w:pos="80000"/>
+                </w:tabs>
+              </w:pPr>
+              <w:r>
+                <w:rPr/>
+                <w:t xml:space="preserve">Drošība</w:t>
+              </w:r>
+              <w:r>
+                <w:rPr/>
+                <w:tab/>
+              </w:r>
+              <w:r>
+                <w:rPr/>
+                <w:fldChar w:fldCharType="begin" w:dirty="false"/>
+                <w:instrText>PAGEREF _Toc00000065 \h</w:instrText>
+                <w:fldChar w:fldCharType="separate" w:dirty="false"/>
+                <w:t xml:space="preserve">1</w:t>
+                <w:fldChar w:fldCharType="end" w:dirty="false"/>
+              </w:r>
+            </w:p>
+            <w:p>
+              <w:pPr>
+                <w:rPr/>
                 <w:pStyle w:val="ToC1"/>
                 <w:tabs>
                   <w:tab w:val="right" w:leader="dot" w:pos="80000"/>
@@ -1804,7 +1829,7 @@
               <w:r>
                 <w:rPr/>
                 <w:fldChar w:fldCharType="begin" w:dirty="false"/>
-                <w:instrText>PAGEREF _Toc00000065 \h</w:instrText>
+                <w:instrText>PAGEREF _Toc00000066 \h</w:instrText>
                 <w:fldChar w:fldCharType="separate" w:dirty="false"/>
                 <w:t xml:space="preserve">1</w:t>
                 <w:fldChar w:fldCharType="end" w:dirty="false"/>
@@ -1829,7 +1854,7 @@
               <w:r>
                 <w:rPr/>
                 <w:fldChar w:fldCharType="begin" w:dirty="false"/>
-                <w:instrText>PAGEREF _Toc00000066 \h</w:instrText>
+                <w:instrText>PAGEREF _Toc00000067 \h</w:instrText>
                 <w:fldChar w:fldCharType="separate" w:dirty="false"/>
                 <w:t xml:space="preserve">1</w:t>
                 <w:fldChar w:fldCharType="end" w:dirty="false"/>
@@ -1854,7 +1879,7 @@
               <w:r>
                 <w:rPr/>
                 <w:fldChar w:fldCharType="begin" w:dirty="false"/>
-                <w:instrText>PAGEREF _Toc00000067 \h</w:instrText>
+                <w:instrText>PAGEREF _Toc00000068 \h</w:instrText>
                 <w:fldChar w:fldCharType="separate" w:dirty="false"/>
                 <w:t xml:space="preserve">1</w:t>
                 <w:fldChar w:fldCharType="end" w:dirty="false"/>
@@ -1879,7 +1904,7 @@
               <w:r>
                 <w:rPr/>
                 <w:fldChar w:fldCharType="begin" w:dirty="false"/>
-                <w:instrText>PAGEREF _Toc00000068 \h</w:instrText>
+                <w:instrText>PAGEREF _Toc00000069 \h</w:instrText>
                 <w:fldChar w:fldCharType="separate" w:dirty="false"/>
                 <w:t xml:space="preserve">1</w:t>
                 <w:fldChar w:fldCharType="end" w:dirty="false"/>
@@ -1904,7 +1929,7 @@
               <w:r>
                 <w:rPr/>
                 <w:fldChar w:fldCharType="begin" w:dirty="false"/>
-                <w:instrText>PAGEREF _Toc00000069 \h</w:instrText>
+                <w:instrText>PAGEREF _Toc00000070 \h</w:instrText>
                 <w:fldChar w:fldCharType="separate" w:dirty="false"/>
                 <w:t xml:space="preserve">1</w:t>
                 <w:fldChar w:fldCharType="end" w:dirty="false"/>
@@ -1929,7 +1954,7 @@
               <w:r>
                 <w:rPr/>
                 <w:fldChar w:fldCharType="begin" w:dirty="false"/>
-                <w:instrText>PAGEREF _Toc00000070 \h</w:instrText>
+                <w:instrText>PAGEREF _Toc00000071 \h</w:instrText>
                 <w:fldChar w:fldCharType="separate" w:dirty="false"/>
                 <w:t xml:space="preserve">1</w:t>
                 <w:fldChar w:fldCharType="end" w:dirty="false"/>
@@ -1954,7 +1979,7 @@
               <w:r>
                 <w:rPr/>
                 <w:fldChar w:fldCharType="begin" w:dirty="false"/>
-                <w:instrText>PAGEREF _Toc00000071 \h</w:instrText>
+                <w:instrText>PAGEREF _Toc00000072 \h</w:instrText>
                 <w:fldChar w:fldCharType="separate" w:dirty="false"/>
                 <w:t xml:space="preserve">1</w:t>
                 <w:fldChar w:fldCharType="end" w:dirty="false"/>
@@ -1979,7 +2004,7 @@
               <w:r>
                 <w:rPr/>
                 <w:fldChar w:fldCharType="begin" w:dirty="false"/>
-                <w:instrText>PAGEREF _Toc00000072 \h</w:instrText>
+                <w:instrText>PAGEREF _Toc00000073 \h</w:instrText>
                 <w:fldChar w:fldCharType="separate" w:dirty="false"/>
                 <w:t xml:space="preserve">1</w:t>
                 <w:fldChar w:fldCharType="end" w:dirty="false"/>
@@ -2004,7 +2029,7 @@
               <w:r>
                 <w:rPr/>
                 <w:fldChar w:fldCharType="begin" w:dirty="false"/>
-                <w:instrText>PAGEREF _Toc00000073 \h</w:instrText>
+                <w:instrText>PAGEREF _Toc00000074 \h</w:instrText>
                 <w:fldChar w:fldCharType="separate" w:dirty="false"/>
                 <w:t xml:space="preserve">1</w:t>
                 <w:fldChar w:fldCharType="end" w:dirty="false"/>
@@ -2029,7 +2054,7 @@
               <w:r>
                 <w:rPr/>
                 <w:fldChar w:fldCharType="begin" w:dirty="false"/>
-                <w:instrText>PAGEREF _Toc00000074 \h</w:instrText>
+                <w:instrText>PAGEREF _Toc00000075 \h</w:instrText>
                 <w:fldChar w:fldCharType="separate" w:dirty="false"/>
                 <w:t xml:space="preserve">1</w:t>
                 <w:fldChar w:fldCharType="end" w:dirty="false"/>
@@ -2054,7 +2079,7 @@
               <w:r>
                 <w:rPr/>
                 <w:fldChar w:fldCharType="begin" w:dirty="false"/>
-                <w:instrText>PAGEREF _Toc00000075 \h</w:instrText>
+                <w:instrText>PAGEREF _Toc00000076 \h</w:instrText>
                 <w:fldChar w:fldCharType="separate" w:dirty="false"/>
                 <w:t xml:space="preserve">1</w:t>
                 <w:fldChar w:fldCharType="end" w:dirty="false"/>
@@ -2079,7 +2104,7 @@
               <w:r>
                 <w:rPr/>
                 <w:fldChar w:fldCharType="begin" w:dirty="false"/>
-                <w:instrText>PAGEREF _Toc00000076 \h</w:instrText>
+                <w:instrText>PAGEREF _Toc00000077 \h</w:instrText>
                 <w:fldChar w:fldCharType="separate" w:dirty="false"/>
                 <w:t xml:space="preserve">1</w:t>
                 <w:fldChar w:fldCharType="end" w:dirty="false"/>
@@ -2104,7 +2129,7 @@
               <w:r>
                 <w:rPr/>
                 <w:fldChar w:fldCharType="begin" w:dirty="false"/>
-                <w:instrText>PAGEREF _Toc00000077 \h</w:instrText>
+                <w:instrText>PAGEREF _Toc00000078 \h</w:instrText>
                 <w:fldChar w:fldCharType="separate" w:dirty="false"/>
                 <w:t xml:space="preserve">1</w:t>
                 <w:fldChar w:fldCharType="end" w:dirty="false"/>
@@ -2129,7 +2154,7 @@
               <w:r>
                 <w:rPr/>
                 <w:fldChar w:fldCharType="begin" w:dirty="false"/>
-                <w:instrText>PAGEREF _Toc00000078 \h</w:instrText>
+                <w:instrText>PAGEREF _Toc00000079 \h</w:instrText>
                 <w:fldChar w:fldCharType="separate" w:dirty="false"/>
                 <w:t xml:space="preserve">1</w:t>
                 <w:fldChar w:fldCharType="end" w:dirty="false"/>
@@ -2154,7 +2179,7 @@
               <w:r>
                 <w:rPr/>
                 <w:fldChar w:fldCharType="begin" w:dirty="false"/>
-                <w:instrText>PAGEREF _Toc00000079 \h</w:instrText>
+                <w:instrText>PAGEREF _Toc00000080 \h</w:instrText>
                 <w:fldChar w:fldCharType="separate" w:dirty="false"/>
                 <w:t xml:space="preserve">1</w:t>
                 <w:fldChar w:fldCharType="end" w:dirty="false"/>
@@ -8272,7 +8297,7 @@
           <w:color w:val="1A1A1A"/>
           <w:rFonts w:ascii="Aptos" w:hAnsi="Aptos" w:cs="Aptos" w:eastAsia="Aptos"/>
         </w:rPr>
-        <w:t xml:space="preserve">Saitē var būt attēls, tabula vai diagramma. Diagramma slaidā nonāk kā rediģējamu figūru grupa ar zīmola krāsām un tikai vērtību etiķetēm: stabiņu, joslu, tilta, sektoru un līniju diagrammas. Līniju diagrammā katrs punkts ir sava figūra, savienota ar līniju līdz nākamajam punktam. Šai figūru grupai nepieciešams PowerPoint 2504 vai jaunāks Windows datorā, 16.96 vai jaunāks Mac datorā (Mac datorā grupa sastāv no apakšgrupām pa sešām figūrām); vecākā versijā, kā arī pāri 40 punktiem, 6 sērijām vai 12 sektoriem, kā arī diagrammas tipam, ko figūras neatveido, diagramma tiek ievietota kā attēls, un abi paneļi pasaka iemeslu.</w:t>
+        <w:t xml:space="preserve">Saitē var būt attēls, tabula vai diagramma. Tabulas pirmā rinda kļūst par PowerPoint virsraksta rindu, ja katra tās netukšā šūna Excel bija treknrakstā. Poga "Update all" saglabā prezentācijas tabulas noformējumu un notīra tikai tos aizpildījumus, kurus iepriekš pievienojusi pls,fix. Diagramma slaidā nonāk kā rediģējamu figūru grupa ar zīmola krāsām un tikai vērtību etiķetēm: stabiņu, joslu, tilta, sektoru un līniju diagrammas. Līniju diagrammā katrs punkts ir sava figūra, savienota ar līniju līdz nākamajam punktam. Šai figūru grupai nepieciešams PowerPoint 2504 vai jaunāks Windows datorā, 16.96 vai jaunāks Mac datorā (Mac datorā grupa sastāv no apakšgrupām pa sešām figūrām); vecākā versijā, kā arī pāri 40 punktiem, 6 sērijām vai 12 sektoriem, kā arī diagrammas tipam, ko figūras neatveido, diagramma tiek ievietota kā attēls, un abi paneļi pasaka iemeslu.</w:t>
       </w:r>
     </w:p>
     <w:p>
@@ -8905,6 +8930,88 @@
           </w:p>
         </w:tc>
       </w:tr>
+      <w:tr>
+        <w:trPr/>
+        <w:tc>
+          <w:tcPr>
+            <w:tcW w:w="2698" w:type="dxa"/>
+          </w:tcPr>
+          <w:p>
+            <w:pPr>
+              <w:rPr/>
+            </w:pPr>
+            <w:r>
+              <w:rPr>
+                <w:sz w:val="20"/>
+                <w:szCs w:val="20"/>
+                <w:color w:val="1A1A1A"/>
+                <w:rFonts w:ascii="Aptos" w:hAnsi="Aptos" w:cs="Aptos" w:eastAsia="Aptos"/>
+              </w:rPr>
+              <w:t xml:space="preserve">"New project"</w:t>
+            </w:r>
+          </w:p>
+        </w:tc>
+        <w:tc>
+          <w:tcPr>
+            <w:tcW w:w="6940" w:type="dxa"/>
+          </w:tcPr>
+          <w:p>
+            <w:pPr>
+              <w:rPr/>
+            </w:pPr>
+            <w:r>
+              <w:rPr>
+                <w:sz w:val="20"/>
+                <w:szCs w:val="20"/>
+                <w:color w:val="1A1A1A"/>
+                <w:rFonts w:ascii="Aptos" w:hAnsi="Aptos" w:cs="Aptos" w:eastAsia="Aptos"/>
+              </w:rPr>
+              <w:t xml:space="preserve">atver nosaukuma lauku; jaunie eksporti pievienojas šim projektam</w:t>
+            </w:r>
+          </w:p>
+        </w:tc>
+      </w:tr>
+      <w:tr>
+        <w:trPr/>
+        <w:tc>
+          <w:tcPr>
+            <w:tcW w:w="2698" w:type="dxa"/>
+          </w:tcPr>
+          <w:p>
+            <w:pPr>
+              <w:rPr/>
+            </w:pPr>
+            <w:r>
+              <w:rPr>
+                <w:sz w:val="20"/>
+                <w:szCs w:val="20"/>
+                <w:color w:val="1A1A1A"/>
+                <w:rFonts w:ascii="Aptos" w:hAnsi="Aptos" w:cs="Aptos" w:eastAsia="Aptos"/>
+              </w:rPr>
+              <w:t xml:space="preserve">"Move to project"</w:t>
+            </w:r>
+          </w:p>
+        </w:tc>
+        <w:tc>
+          <w:tcPr>
+            <w:tcW w:w="6940" w:type="dxa"/>
+          </w:tcPr>
+          <w:p>
+            <w:pPr>
+              <w:rPr/>
+            </w:pPr>
+            <w:r>
+              <w:rPr>
+                <w:sz w:val="20"/>
+                <w:szCs w:val="20"/>
+                <w:color w:val="1A1A1A"/>
+                <w:rFonts w:ascii="Aptos" w:hAnsi="Aptos" w:cs="Aptos" w:eastAsia="Aptos"/>
+              </w:rPr>
+              <w:t xml:space="preserve">pārceļ atzīmētās saites uz izvēlēto projektu</w:t>
+            </w:r>
+          </w:p>
+        </w:tc>
+      </w:tr>
     </w:tbl>
     <w:p>
       <w:pPr>
@@ -8928,7 +9035,7 @@
           <w:bCs/>
           <w:rFonts w:ascii="Aptos" w:hAnsi="Aptos" w:cs="Aptos" w:eastAsia="Aptos"/>
         </w:rPr>
-        <w:t xml:space="preserve">Auto-push on edit un Highlight linked cells</w:t>
+        <w:t xml:space="preserve">Projekti</w:t>
       </w:r>
       <w:bookmarkEnd w:id="57"/>
     </w:p>
@@ -8944,7 +9051,83 @@
           <w:color w:val="1A1A1A"/>
           <w:rFonts w:ascii="Aptos" w:hAnsi="Aptos" w:cs="Aptos" w:eastAsia="Aptos"/>
         </w:rPr>
-        <w:t xml:space="preserve">Izvēles rūtiņa "Auto-push on edit" nosūta mainītās saites uz releju automātiski trīs sekundes pēc pēdējās rediģēšanas. Tā strādā, kamēr panelis ir atvērts, un tiek iegaumēta katrai darbgrāmatai atsevišķi.</w:t>
+        <w:t xml:space="preserve">Ja vienā darbgrāmatā ir vairāki darbi, katrai saitei var piešķirt projektu. Relejs projektu neredz: nosaukums paliek Excel reģistrā, iesūtnes vienumā un PowerPoint birkā.</w:t>
+      </w:r>
+    </w:p>
+    <w:p>
+      <w:pPr>
+        <w:rPr/>
+        <w:numPr>
+          <w:numId w:val="25"/>
+          <w:ilvl w:val="0"/>
+        </w:numPr>
+        <w:spacing w:after="60" w:line="276"/>
+      </w:pPr>
+      <w:r>
+        <w:rPr>
+          <w:sz w:val="22"/>
+          <w:szCs w:val="22"/>
+          <w:color w:val="1A1A1A"/>
+          <w:rFonts w:ascii="Aptos" w:hAnsi="Aptos" w:cs="Aptos" w:eastAsia="Aptos"/>
+        </w:rPr>
+        <w:t xml:space="preserve">Vir saraksta izvēlieties projektu vai nospiediet "New project" un ierakstiet nosaukumu (līdz 40 rakstzīmēm).</w:t>
+      </w:r>
+    </w:p>
+    <w:p>
+      <w:pPr>
+        <w:rPr/>
+        <w:numPr>
+          <w:numId w:val="25"/>
+          <w:ilvl w:val="0"/>
+        </w:numPr>
+        <w:spacing w:after="60" w:line="276"/>
+      </w:pPr>
+      <w:r>
+        <w:rPr>
+          <w:sz w:val="22"/>
+          <w:szCs w:val="22"/>
+          <w:color w:val="1A1A1A"/>
+          <w:rFonts w:ascii="Aptos" w:hAnsi="Aptos" w:cs="Aptos" w:eastAsia="Aptos"/>
+        </w:rPr>
+        <w:t xml:space="preserve">Jaunie eksporti pievienojas izvēlētajam projektam. "All projects" nozīmē, ka jaunie eksporti paliek bez projekta.</w:t>
+      </w:r>
+    </w:p>
+    <w:p>
+      <w:pPr>
+        <w:rPr/>
+        <w:numPr>
+          <w:numId w:val="25"/>
+          <w:ilvl w:val="0"/>
+        </w:numPr>
+        <w:spacing w:after="60" w:line="276"/>
+      </w:pPr>
+      <w:r>
+        <w:rPr>
+          <w:sz w:val="22"/>
+          <w:szCs w:val="22"/>
+          <w:color w:val="1A1A1A"/>
+          <w:rFonts w:ascii="Aptos" w:hAnsi="Aptos" w:cs="Aptos" w:eastAsia="Aptos"/>
+        </w:rPr>
+        <w:t xml:space="preserve">Saraksts grupē saites pēc projekta. "Push all" nosūta tikai redzamā projekta saites, vai visas, ja izvēlēts "All projects".</w:t>
+      </w:r>
+    </w:p>
+    <w:p>
+      <w:pPr>
+        <w:rPr/>
+        <w:numPr>
+          <w:numId w:val="25"/>
+          <w:ilvl w:val="0"/>
+        </w:numPr>
+        <w:spacing w:after="60" w:line="276"/>
+      </w:pPr>
+      <w:r>
+        <w:rPr>
+          <w:sz w:val="22"/>
+          <w:szCs w:val="22"/>
+          <w:color w:val="1A1A1A"/>
+          <w:rFonts w:ascii="Aptos" w:hAnsi="Aptos" w:cs="Aptos" w:eastAsia="Aptos"/>
+        </w:rPr>
+        <w:t xml:space="preserve">PowerPoint cilnē "Links" filtrs "All projects" rāda visu klāju; iesūtne ir grupēta pēc projekta. "Update all" atjaunina tikai filtram atbilstošās saites.</w:t>
       </w:r>
     </w:p>
     <w:p>
@@ -8959,7 +9142,7 @@
           <w:color w:val="1A1A1A"/>
           <w:rFonts w:ascii="Aptos" w:hAnsi="Aptos" w:cs="Aptos" w:eastAsia="Aptos"/>
         </w:rPr>
-        <w:t xml:space="preserve">Izvēles rūtiņa "Highlight linked cells" ar vieglu toni iekrāso visus saistītos šūnu apgabalus, tāpēc uzreiz redzams, kas baro prezentāciju. Izslēdzot to, sākotnējais noformējums tiek atjaunots. Diagrammas netiek iekrāsotas.</w:t>
+        <w:t xml:space="preserve">Vecās saites un veci klāji paliek bez projekta un turpina strādāt. Tukšs nosaukums ir "No project".</w:t>
       </w:r>
     </w:p>
     <w:p>
@@ -8979,9 +9162,60 @@
           <w:bCs/>
           <w:rFonts w:ascii="Aptos" w:hAnsi="Aptos" w:cs="Aptos" w:eastAsia="Aptos"/>
         </w:rPr>
+        <w:t xml:space="preserve">Auto-push on edit un Highlight linked cells</w:t>
+      </w:r>
+      <w:bookmarkEnd w:id="58"/>
+    </w:p>
+    <w:p>
+      <w:pPr>
+        <w:rPr/>
+        <w:spacing w:after="120" w:line="276"/>
+      </w:pPr>
+      <w:r>
+        <w:rPr>
+          <w:sz w:val="22"/>
+          <w:szCs w:val="22"/>
+          <w:color w:val="1A1A1A"/>
+          <w:rFonts w:ascii="Aptos" w:hAnsi="Aptos" w:cs="Aptos" w:eastAsia="Aptos"/>
+        </w:rPr>
+        <w:t xml:space="preserve">Izvēles rūtiņa "Auto-push on edit" nosūta mainītās saites uz releju automātiski trīs sekundes pēc pēdējās rediģēšanas. Tā strādā, kamēr panelis ir atvērts, un tiek iegaumēta katrai darbgrāmatai atsevišķi.</w:t>
+      </w:r>
+    </w:p>
+    <w:p>
+      <w:pPr>
+        <w:rPr/>
+        <w:spacing w:after="120" w:line="276"/>
+      </w:pPr>
+      <w:r>
+        <w:rPr>
+          <w:sz w:val="22"/>
+          <w:szCs w:val="22"/>
+          <w:color w:val="1A1A1A"/>
+          <w:rFonts w:ascii="Aptos" w:hAnsi="Aptos" w:cs="Aptos" w:eastAsia="Aptos"/>
+        </w:rPr>
+        <w:t xml:space="preserve">Izvēles rūtiņa "Highlight linked cells" ar vieglu toni iekrāso visus saistītos šūnu apgabalus, tāpēc uzreiz redzams, kas baro prezentāciju. Izslēdzot to, sākotnējais noformējums tiek atjaunots. Diagrammas netiek iekrāsotas.</w:t>
+      </w:r>
+    </w:p>
+    <w:p>
+      <w:pPr>
+        <w:rPr/>
+        <w:pStyle w:val="Heading2"/>
+        <w:spacing w:before="240" w:after="100"/>
+        <w:keepNext/>
+      </w:pPr>
+      <w:bookmarkStart w:id="59" w:name="_Toc00000058"/>
+      <w:r>
+        <w:rPr>
+          <w:sz w:val="26"/>
+          <w:szCs w:val="26"/>
+          <w:color w:val="14213D"/>
+          <w:b/>
+          <w:bCs/>
+          <w:rFonts w:ascii="Aptos" w:hAnsi="Aptos" w:cs="Aptos" w:eastAsia="Aptos"/>
+        </w:rPr>
         <w:t xml:space="preserve">Ievietošana PowerPoint</w:t>
       </w:r>
-      <w:bookmarkEnd w:id="58"/>
+      <w:bookmarkEnd w:id="59"/>
     </w:p>
     <w:p>
       <w:pPr>
@@ -9002,7 +9236,7 @@
       <w:pPr>
         <w:rPr/>
         <w:numPr>
-          <w:numId w:val="25"/>
+          <w:numId w:val="26"/>
           <w:ilvl w:val="0"/>
         </w:numPr>
         <w:spacing w:after="60" w:line="276"/>
@@ -9021,7 +9255,7 @@
       <w:pPr>
         <w:rPr/>
         <w:numPr>
-          <w:numId w:val="25"/>
+          <w:numId w:val="26"/>
           <w:ilvl w:val="0"/>
         </w:numPr>
         <w:spacing w:after="60" w:line="276"/>
@@ -9040,7 +9274,7 @@
       <w:pPr>
         <w:rPr/>
         <w:numPr>
-          <w:numId w:val="25"/>
+          <w:numId w:val="26"/>
           <w:ilvl w:val="0"/>
         </w:numPr>
         <w:spacing w:after="60" w:line="276"/>
@@ -9157,7 +9391,7 @@
         <w:spacing w:before="240" w:after="100"/>
         <w:keepNext/>
       </w:pPr>
-      <w:bookmarkStart w:id="59" w:name="_Toc00000058"/>
+      <w:bookmarkStart w:id="60" w:name="_Toc00000059"/>
       <w:r>
         <w:rPr>
           <w:sz w:val="26"/>
@@ -9169,7 +9403,7 @@
         </w:rPr>
         <w:t xml:space="preserve">Slaids un vieta</w:t>
       </w:r>
-      <w:bookmarkEnd w:id="59"/>
+      <w:bookmarkEnd w:id="60"/>
     </w:p>
     <w:p>
       <w:pPr>
@@ -9220,7 +9454,7 @@
       <w:pPr>
         <w:rPr/>
         <w:numPr>
-          <w:numId w:val="26"/>
+          <w:numId w:val="27"/>
           <w:ilvl w:val="0"/>
         </w:numPr>
         <w:spacing w:after="60" w:line="276"/>
@@ -9239,7 +9473,7 @@
       <w:pPr>
         <w:rPr/>
         <w:numPr>
-          <w:numId w:val="26"/>
+          <w:numId w:val="27"/>
           <w:ilvl w:val="0"/>
         </w:numPr>
         <w:spacing w:after="60" w:line="276"/>
@@ -9258,7 +9492,7 @@
       <w:pPr>
         <w:rPr/>
         <w:numPr>
-          <w:numId w:val="26"/>
+          <w:numId w:val="27"/>
           <w:ilvl w:val="0"/>
         </w:numPr>
         <w:spacing w:after="60" w:line="276"/>
@@ -9277,7 +9511,7 @@
       <w:pPr>
         <w:rPr/>
         <w:numPr>
-          <w:numId w:val="26"/>
+          <w:numId w:val="27"/>
           <w:ilvl w:val="0"/>
         </w:numPr>
         <w:spacing w:after="60" w:line="276"/>
@@ -9296,7 +9530,7 @@
       <w:pPr>
         <w:rPr/>
         <w:numPr>
-          <w:numId w:val="26"/>
+          <w:numId w:val="27"/>
           <w:ilvl w:val="0"/>
         </w:numPr>
         <w:spacing w:after="60" w:line="276"/>
@@ -9378,7 +9612,7 @@
         <w:spacing w:before="240" w:after="100"/>
         <w:keepNext/>
       </w:pPr>
-      <w:bookmarkStart w:id="60" w:name="_Toc00000059"/>
+      <w:bookmarkStart w:id="61" w:name="_Toc00000060"/>
       <w:r>
         <w:rPr>
           <w:sz w:val="26"/>
@@ -9390,7 +9624,7 @@
         </w:rPr>
         <w:t xml:space="preserve">Atjaunināšana</w:t>
       </w:r>
-      <w:bookmarkEnd w:id="60"/>
+      <w:bookmarkEnd w:id="61"/>
     </w:p>
     <w:p>
       <w:pPr>
@@ -9752,7 +9986,7 @@
         <w:spacing w:before="240" w:after="100"/>
         <w:keepNext/>
       </w:pPr>
-      <w:bookmarkStart w:id="61" w:name="_Toc00000060"/>
+      <w:bookmarkStart w:id="62" w:name="_Toc00000061"/>
       <w:r>
         <w:rPr>
           <w:sz w:val="26"/>
@@ -9764,7 +9998,7 @@
         </w:rPr>
         <w:t xml:space="preserve">Meklēšana un filtrēšana</w:t>
       </w:r>
-      <w:bookmarkEnd w:id="61"/>
+      <w:bookmarkEnd w:id="62"/>
     </w:p>
     <w:p>
       <w:pPr>
@@ -9778,7 +10012,7 @@
           <w:color w:val="1A1A1A"/>
           <w:rFonts w:ascii="Aptos" w:hAnsi="Aptos" w:cs="Aptos" w:eastAsia="Aptos"/>
         </w:rPr>
-        <w:t xml:space="preserve">Virs saišu tabulas cilnē "Links" ir meklēšanas lauks un trīs filtri. Tie sašaurina redzamo sarakstu, bet atzīmētās rindas paliek atzīmētas arī tad, kad filtrs tās paslēpj.</w:t>
+        <w:t xml:space="preserve">Virs saišu tabulas cilnē "Links" ir meklēšanas lauks un četri filtri. Tie sašaurina redzamo sarakstu, bet atzīmētās rindas paliek atzīmētas arī tad, kad filtrs tās paslēpj.</w:t>
       </w:r>
     </w:p>
     <w:tbl>
@@ -9912,7 +10146,7 @@
                 <w:color w:val="1A1A1A"/>
                 <w:rFonts w:ascii="Aptos" w:hAnsi="Aptos" w:cs="Aptos" w:eastAsia="Aptos"/>
               </w:rPr>
-              <w:t xml:space="preserve">"Source workbook"</w:t>
+              <w:t xml:space="preserve">"All projects"</w:t>
             </w:r>
           </w:p>
         </w:tc>
@@ -9931,7 +10165,7 @@
                 <w:color w:val="1A1A1A"/>
                 <w:rFonts w:ascii="Aptos" w:hAnsi="Aptos" w:cs="Aptos" w:eastAsia="Aptos"/>
               </w:rPr>
-              <w:t xml:space="preserve">rāda tikai izvēlētās darbgrāmatas saites</w:t>
+              <w:t xml:space="preserve">rāda visus projektus, vai tikai izvēlēto, vai saites bez projekta</w:t>
             </w:r>
           </w:p>
         </w:tc>
@@ -9953,7 +10187,7 @@
                 <w:color w:val="1A1A1A"/>
                 <w:rFonts w:ascii="Aptos" w:hAnsi="Aptos" w:cs="Aptos" w:eastAsia="Aptos"/>
               </w:rPr>
-              <w:t xml:space="preserve">"Slide"</w:t>
+              <w:t xml:space="preserve">"Source workbook"</w:t>
             </w:r>
           </w:p>
         </w:tc>
@@ -9972,7 +10206,7 @@
                 <w:color w:val="1A1A1A"/>
                 <w:rFonts w:ascii="Aptos" w:hAnsi="Aptos" w:cs="Aptos" w:eastAsia="Aptos"/>
               </w:rPr>
-              <w:t xml:space="preserve">rāda tikai izvēlētā slaida saites</w:t>
+              <w:t xml:space="preserve">rāda tikai izvēlētās darbgrāmatas saites</w:t>
             </w:r>
           </w:p>
         </w:tc>
@@ -9994,6 +10228,47 @@
                 <w:color w:val="1A1A1A"/>
                 <w:rFonts w:ascii="Aptos" w:hAnsi="Aptos" w:cs="Aptos" w:eastAsia="Aptos"/>
               </w:rPr>
+              <w:t xml:space="preserve">"Slide"</w:t>
+            </w:r>
+          </w:p>
+        </w:tc>
+        <w:tc>
+          <w:tcPr>
+            <w:tcW w:w="6940" w:type="dxa"/>
+          </w:tcPr>
+          <w:p>
+            <w:pPr>
+              <w:rPr/>
+            </w:pPr>
+            <w:r>
+              <w:rPr>
+                <w:sz w:val="20"/>
+                <w:szCs w:val="20"/>
+                <w:color w:val="1A1A1A"/>
+                <w:rFonts w:ascii="Aptos" w:hAnsi="Aptos" w:cs="Aptos" w:eastAsia="Aptos"/>
+              </w:rPr>
+              <w:t xml:space="preserve">rāda tikai izvēlētā slaida saites</w:t>
+            </w:r>
+          </w:p>
+        </w:tc>
+      </w:tr>
+      <w:tr>
+        <w:trPr/>
+        <w:tc>
+          <w:tcPr>
+            <w:tcW w:w="2698" w:type="dxa"/>
+          </w:tcPr>
+          <w:p>
+            <w:pPr>
+              <w:rPr/>
+            </w:pPr>
+            <w:r>
+              <w:rPr>
+                <w:sz w:val="20"/>
+                <w:szCs w:val="20"/>
+                <w:color w:val="1A1A1A"/>
+                <w:rFonts w:ascii="Aptos" w:hAnsi="Aptos" w:cs="Aptos" w:eastAsia="Aptos"/>
+              </w:rPr>
               <w:t xml:space="preserve">"Link status"</w:t>
             </w:r>
           </w:p>
@@ -10043,7 +10318,7 @@
       <w:pPr>
         <w:rPr/>
         <w:numPr>
-          <w:numId w:val="27"/>
+          <w:numId w:val="28"/>
           <w:ilvl w:val="0"/>
         </w:numPr>
         <w:spacing w:after="60" w:line="276"/>
@@ -10062,7 +10337,7 @@
       <w:pPr>
         <w:rPr/>
         <w:numPr>
-          <w:numId w:val="27"/>
+          <w:numId w:val="28"/>
           <w:ilvl w:val="0"/>
         </w:numPr>
         <w:spacing w:after="60" w:line="276"/>
@@ -10081,7 +10356,7 @@
       <w:pPr>
         <w:rPr/>
         <w:numPr>
-          <w:numId w:val="27"/>
+          <w:numId w:val="28"/>
           <w:ilvl w:val="0"/>
         </w:numPr>
         <w:spacing w:after="60" w:line="276"/>
@@ -10100,7 +10375,7 @@
       <w:pPr>
         <w:rPr/>
         <w:numPr>
-          <w:numId w:val="27"/>
+          <w:numId w:val="28"/>
           <w:ilvl w:val="0"/>
         </w:numPr>
         <w:spacing w:after="60" w:line="276"/>
@@ -10122,7 +10397,7 @@
         <w:spacing w:before="240" w:after="100"/>
         <w:keepNext/>
       </w:pPr>
-      <w:bookmarkStart w:id="62" w:name="_Toc00000061"/>
+      <w:bookmarkStart w:id="63" w:name="_Toc00000062"/>
       <w:r>
         <w:rPr>
           <w:sz w:val="26"/>
@@ -10134,7 +10409,7 @@
         </w:rPr>
         <w:t xml:space="preserve">Go to slide, Change source un Break link</w:t>
       </w:r>
-      <w:bookmarkEnd w:id="62"/>
+      <w:bookmarkEnd w:id="63"/>
     </w:p>
     <w:p>
       <w:pPr>
@@ -10203,7 +10478,7 @@
         <w:spacing w:before="240" w:after="100"/>
         <w:keepNext/>
       </w:pPr>
-      <w:bookmarkStart w:id="63" w:name="_Toc00000062"/>
+      <w:bookmarkStart w:id="64" w:name="_Toc00000063"/>
       <w:r>
         <w:rPr>
           <w:sz w:val="26"/>
@@ -10215,7 +10490,7 @@
         </w:rPr>
         <w:t xml:space="preserve">Object tools</w:t>
       </w:r>
-      <w:bookmarkEnd w:id="63"/>
+      <w:bookmarkEnd w:id="64"/>
     </w:p>
     <w:p>
       <w:pPr>
@@ -10471,7 +10746,7 @@
         <w:spacing w:before="240" w:after="100"/>
         <w:keepNext/>
       </w:pPr>
-      <w:bookmarkStart w:id="64" w:name="_Toc00000063"/>
+      <w:bookmarkStart w:id="65" w:name="_Toc00000064"/>
       <w:r>
         <w:rPr>
           <w:sz w:val="26"/>
@@ -10483,7 +10758,7 @@
         </w:rPr>
         <w:t xml:space="preserve">Smart Painter</w:t>
       </w:r>
-      <w:bookmarkEnd w:id="64"/>
+      <w:bookmarkEnd w:id="65"/>
     </w:p>
     <w:p>
       <w:pPr>
@@ -10504,7 +10779,7 @@
       <w:pPr>
         <w:rPr/>
         <w:numPr>
-          <w:numId w:val="28"/>
+          <w:numId w:val="29"/>
           <w:ilvl w:val="0"/>
         </w:numPr>
         <w:spacing w:after="60" w:line="276"/>
@@ -10523,7 +10798,7 @@
       <w:pPr>
         <w:rPr/>
         <w:numPr>
-          <w:numId w:val="28"/>
+          <w:numId w:val="29"/>
           <w:ilvl w:val="0"/>
         </w:numPr>
         <w:spacing w:after="60" w:line="276"/>
@@ -10542,7 +10817,7 @@
       <w:pPr>
         <w:rPr/>
         <w:numPr>
-          <w:numId w:val="28"/>
+          <w:numId w:val="29"/>
           <w:ilvl w:val="0"/>
         </w:numPr>
         <w:spacing w:after="60" w:line="276"/>
@@ -10579,7 +10854,7 @@
         <w:spacing w:before="240" w:after="100"/>
         <w:keepNext/>
       </w:pPr>
-      <w:bookmarkStart w:id="65" w:name="_Toc00000064"/>
+      <w:bookmarkStart w:id="66" w:name="_Toc00000065"/>
       <w:r>
         <w:rPr>
           <w:sz w:val="26"/>
@@ -10591,7 +10866,7 @@
         </w:rPr>
         <w:t xml:space="preserve">Drošība</w:t>
       </w:r>
-      <w:bookmarkEnd w:id="65"/>
+      <w:bookmarkEnd w:id="66"/>
     </w:p>
     <w:p>
       <w:pPr>
@@ -10634,7 +10909,7 @@
         <w:keepNext/>
         <w:pageBreakBefore/>
       </w:pPr>
-      <w:bookmarkStart w:id="66" w:name="_Toc00000065"/>
+      <w:bookmarkStart w:id="67" w:name="_Toc00000066"/>
       <w:r>
         <w:rPr>
           <w:sz w:val="36"/>
@@ -10657,7 +10932,7 @@
         </w:rPr>
         <w:t xml:space="preserve">Cilne Brand</w:t>
       </w:r>
-      <w:bookmarkEnd w:id="66"/>
+      <w:bookmarkEnd w:id="67"/>
     </w:p>
     <w:p>
       <w:pPr>
@@ -10666,7 +10941,7 @@
         <w:spacing w:before="240" w:after="100"/>
         <w:keepNext/>
       </w:pPr>
-      <w:bookmarkStart w:id="67" w:name="_Toc00000066"/>
+      <w:bookmarkStart w:id="68" w:name="_Toc00000067"/>
       <w:r>
         <w:rPr>
           <w:sz w:val="26"/>
@@ -10678,7 +10953,7 @@
         </w:rPr>
         <w:t xml:space="preserve">Palete</w:t>
       </w:r>
-      <w:bookmarkEnd w:id="67"/>
+      <w:bookmarkEnd w:id="68"/>
     </w:p>
     <w:p>
       <w:pPr>
@@ -11148,7 +11423,7 @@
         <w:spacing w:before="240" w:after="100"/>
         <w:keepNext/>
       </w:pPr>
-      <w:bookmarkStart w:id="68" w:name="_Toc00000067"/>
+      <w:bookmarkStart w:id="69" w:name="_Toc00000068"/>
       <w:r>
         <w:rPr>
           <w:sz w:val="26"/>
@@ -11160,7 +11435,7 @@
         </w:rPr>
         <w:t xml:space="preserve">Krāsas no logotipa</w:t>
       </w:r>
-      <w:bookmarkEnd w:id="68"/>
+      <w:bookmarkEnd w:id="69"/>
     </w:p>
     <w:p>
       <w:pPr>
@@ -11184,7 +11459,7 @@
         <w:spacing w:before="240" w:after="100"/>
         <w:keepNext/>
       </w:pPr>
-      <w:bookmarkStart w:id="69" w:name="_Toc00000068"/>
+      <w:bookmarkStart w:id="70" w:name="_Toc00000069"/>
       <w:r>
         <w:rPr>
           <w:sz w:val="26"/>
@@ -11196,7 +11471,7 @@
         </w:rPr>
         <w:t xml:space="preserve">Fonts, valoda un skaitļu stils</w:t>
       </w:r>
-      <w:bookmarkEnd w:id="69"/>
+      <w:bookmarkEnd w:id="70"/>
     </w:p>
     <w:p>
       <w:pPr>
@@ -11627,7 +11902,7 @@
         <w:spacing w:before="240" w:after="100"/>
         <w:keepNext/>
       </w:pPr>
-      <w:bookmarkStart w:id="70" w:name="_Toc00000069"/>
+      <w:bookmarkStart w:id="71" w:name="_Toc00000070"/>
       <w:r>
         <w:rPr>
           <w:sz w:val="26"/>
@@ -11639,7 +11914,7 @@
         </w:rPr>
         <w:t xml:space="preserve">Valūta</w:t>
       </w:r>
-      <w:bookmarkEnd w:id="70"/>
+      <w:bookmarkEnd w:id="71"/>
     </w:p>
     <w:p>
       <w:pPr>
@@ -11663,7 +11938,7 @@
         <w:spacing w:before="240" w:after="100"/>
         <w:keepNext/>
       </w:pPr>
-      <w:bookmarkStart w:id="71" w:name="_Toc00000070"/>
+      <w:bookmarkStart w:id="72" w:name="_Toc00000071"/>
       <w:r>
         <w:rPr>
           <w:sz w:val="26"/>
@@ -11675,7 +11950,7 @@
         </w:rPr>
         <w:t xml:space="preserve">Autocolor on edit</w:t>
       </w:r>
-      <w:bookmarkEnd w:id="71"/>
+      <w:bookmarkEnd w:id="72"/>
     </w:p>
     <w:p>
       <w:pPr>
@@ -11699,7 +11974,7 @@
         <w:spacing w:before="240" w:after="100"/>
         <w:keepNext/>
       </w:pPr>
-      <w:bookmarkStart w:id="72" w:name="_Toc00000071"/>
+      <w:bookmarkStart w:id="73" w:name="_Toc00000072"/>
       <w:r>
         <w:rPr>
           <w:sz w:val="26"/>
@@ -11711,7 +11986,7 @@
         </w:rPr>
         <w:t xml:space="preserve">Keyboard shortcuts</w:t>
       </w:r>
-      <w:bookmarkEnd w:id="72"/>
+      <w:bookmarkEnd w:id="73"/>
     </w:p>
     <w:p>
       <w:pPr>
@@ -11735,7 +12010,7 @@
         <w:spacing w:before="240" w:after="100"/>
         <w:keepNext/>
       </w:pPr>
-      <w:bookmarkStart w:id="73" w:name="_Toc00000072"/>
+      <w:bookmarkStart w:id="74" w:name="_Toc00000073"/>
       <w:r>
         <w:rPr>
           <w:sz w:val="26"/>
@@ -11747,7 +12022,7 @@
         </w:rPr>
         <w:t xml:space="preserve">Iestatījumu pārnešana un atiestatīšana</w:t>
       </w:r>
-      <w:bookmarkEnd w:id="73"/>
+      <w:bookmarkEnd w:id="74"/>
     </w:p>
     <w:p>
       <w:pPr>
@@ -11805,7 +12080,7 @@
         <w:keepNext/>
         <w:pageBreakBefore/>
       </w:pPr>
-      <w:bookmarkStart w:id="74" w:name="_Toc00000073"/>
+      <w:bookmarkStart w:id="75" w:name="_Toc00000074"/>
       <w:r>
         <w:rPr>
           <w:sz w:val="36"/>
@@ -11828,7 +12103,7 @@
         </w:rPr>
         <w:t xml:space="preserve">Īsinājumtaustiņi</w:t>
       </w:r>
-      <w:bookmarkEnd w:id="74"/>
+      <w:bookmarkEnd w:id="75"/>
     </w:p>
     <w:p>
       <w:pPr>
@@ -11837,7 +12112,7 @@
         <w:spacing w:before="240" w:after="100"/>
         <w:keepNext/>
       </w:pPr>
-      <w:bookmarkStart w:id="75" w:name="_Toc00000074"/>
+      <w:bookmarkStart w:id="76" w:name="_Toc00000075"/>
       <w:r>
         <w:rPr>
           <w:sz w:val="26"/>
@@ -11849,7 +12124,7 @@
         </w:rPr>
         <w:t xml:space="preserve">Visas kombinācijas</w:t>
       </w:r>
-      <w:bookmarkEnd w:id="75"/>
+      <w:bookmarkEnd w:id="76"/>
     </w:p>
     <w:p>
       <w:pPr>
@@ -14514,7 +14789,7 @@
         <w:keepNext/>
         <w:pageBreakBefore/>
       </w:pPr>
-      <w:bookmarkStart w:id="76" w:name="_Toc00000075"/>
+      <w:bookmarkStart w:id="77" w:name="_Toc00000076"/>
       <w:r>
         <w:rPr>
           <w:sz w:val="36"/>
@@ -14537,7 +14812,7 @@
         </w:rPr>
         <w:t xml:space="preserve">Biežākās problēmas</w:t>
       </w:r>
-      <w:bookmarkEnd w:id="76"/>
+      <w:bookmarkEnd w:id="77"/>
     </w:p>
     <w:p>
       <w:pPr>
@@ -14546,7 +14821,7 @@
         <w:spacing w:before="240" w:after="100"/>
         <w:keepNext/>
       </w:pPr>
-      <w:bookmarkStart w:id="77" w:name="_Toc00000076"/>
+      <w:bookmarkStart w:id="78" w:name="_Toc00000077"/>
       <w:r>
         <w:rPr>
           <w:sz w:val="26"/>
@@ -14558,7 +14833,7 @@
         </w:rPr>
         <w:t xml:space="preserve">Ziņojumi un to iemesli</w:t>
       </w:r>
-      <w:bookmarkEnd w:id="77"/>
+      <w:bookmarkEnd w:id="78"/>
     </w:p>
     <w:tbl>
       <w:tblPr>
@@ -15329,7 +15604,7 @@
         <w:spacing w:before="240" w:after="100"/>
         <w:keepNext/>
       </w:pPr>
-      <w:bookmarkStart w:id="78" w:name="_Toc00000077"/>
+      <w:bookmarkStart w:id="79" w:name="_Toc00000078"/>
       <w:r>
         <w:rPr>
           <w:sz w:val="26"/>
@@ -15341,13 +15616,13 @@
         </w:rPr>
         <w:t xml:space="preserve">Ierobežojumi</w:t>
       </w:r>
-      <w:bookmarkEnd w:id="78"/>
+      <w:bookmarkEnd w:id="79"/>
     </w:p>
     <w:p>
       <w:pPr>
         <w:rPr/>
         <w:numPr>
-          <w:numId w:val="29"/>
+          <w:numId w:val="30"/>
           <w:ilvl w:val="0"/>
         </w:numPr>
         <w:spacing w:after="60" w:line="276"/>
@@ -15366,7 +15641,7 @@
       <w:pPr>
         <w:rPr/>
         <w:numPr>
-          <w:numId w:val="29"/>
+          <w:numId w:val="30"/>
           <w:ilvl w:val="0"/>
         </w:numPr>
         <w:spacing w:after="60" w:line="276"/>
@@ -15385,7 +15660,7 @@
       <w:pPr>
         <w:rPr/>
         <w:numPr>
-          <w:numId w:val="29"/>
+          <w:numId w:val="30"/>
           <w:ilvl w:val="0"/>
         </w:numPr>
         <w:spacing w:after="60" w:line="276"/>
@@ -15404,7 +15679,7 @@
       <w:pPr>
         <w:rPr/>
         <w:numPr>
-          <w:numId w:val="29"/>
+          <w:numId w:val="30"/>
           <w:ilvl w:val="0"/>
         </w:numPr>
         <w:spacing w:after="60" w:line="276"/>
@@ -15423,7 +15698,7 @@
       <w:pPr>
         <w:rPr/>
         <w:numPr>
-          <w:numId w:val="29"/>
+          <w:numId w:val="30"/>
           <w:ilvl w:val="0"/>
         </w:numPr>
         <w:spacing w:after="60" w:line="276"/>
@@ -15442,7 +15717,7 @@
       <w:pPr>
         <w:rPr/>
         <w:numPr>
-          <w:numId w:val="29"/>
+          <w:numId w:val="30"/>
           <w:ilvl w:val="0"/>
         </w:numPr>
         <w:spacing w:after="60" w:line="276"/>
@@ -15461,7 +15736,7 @@
       <w:pPr>
         <w:rPr/>
         <w:numPr>
-          <w:numId w:val="29"/>
+          <w:numId w:val="30"/>
           <w:ilvl w:val="0"/>
         </w:numPr>
         <w:spacing w:after="60" w:line="276"/>
@@ -15480,7 +15755,7 @@
       <w:pPr>
         <w:rPr/>
         <w:numPr>
-          <w:numId w:val="29"/>
+          <w:numId w:val="30"/>
           <w:ilvl w:val="0"/>
         </w:numPr>
         <w:spacing w:after="60" w:line="276"/>
@@ -15499,7 +15774,7 @@
       <w:pPr>
         <w:rPr/>
         <w:numPr>
-          <w:numId w:val="29"/>
+          <w:numId w:val="30"/>
           <w:ilvl w:val="0"/>
         </w:numPr>
         <w:spacing w:after="60" w:line="276"/>
@@ -15518,7 +15793,7 @@
       <w:pPr>
         <w:rPr/>
         <w:numPr>
-          <w:numId w:val="29"/>
+          <w:numId w:val="30"/>
           <w:ilvl w:val="0"/>
         </w:numPr>
         <w:spacing w:after="60" w:line="276"/>
@@ -15537,7 +15812,7 @@
       <w:pPr>
         <w:rPr/>
         <w:numPr>
-          <w:numId w:val="29"/>
+          <w:numId w:val="30"/>
           <w:ilvl w:val="0"/>
         </w:numPr>
         <w:spacing w:after="60" w:line="276"/>
@@ -15556,7 +15831,7 @@
       <w:pPr>
         <w:rPr/>
         <w:numPr>
-          <w:numId w:val="29"/>
+          <w:numId w:val="30"/>
           <w:ilvl w:val="0"/>
         </w:numPr>
         <w:spacing w:after="60" w:line="276"/>
@@ -15582,7 +15857,7 @@
         <w:keepNext/>
         <w:pageBreakBefore/>
       </w:pPr>
-      <w:bookmarkStart w:id="79" w:name="_Toc00000078"/>
+      <w:bookmarkStart w:id="80" w:name="_Toc00000079"/>
       <w:r>
         <w:rPr>
           <w:sz w:val="36"/>
@@ -15605,7 +15880,7 @@
         </w:rPr>
         <w:t xml:space="preserve">Versija</w:t>
       </w:r>
-      <w:bookmarkEnd w:id="79"/>
+      <w:bookmarkEnd w:id="80"/>
     </w:p>
     <w:p>
       <w:pPr>
@@ -15614,7 +15889,7 @@
         <w:spacing w:before="240" w:after="100"/>
         <w:keepNext/>
       </w:pPr>
-      <w:bookmarkStart w:id="80" w:name="_Toc00000079"/>
+      <w:bookmarkStart w:id="81" w:name="_Toc00000080"/>
       <w:r>
         <w:rPr>
           <w:sz w:val="26"/>
@@ -15626,7 +15901,7 @@
         </w:rPr>
         <w:t xml:space="preserve">Kura versija ir aprakstīta</w:t>
       </w:r>
-      <w:bookmarkEnd w:id="80"/>
+      <w:bookmarkEnd w:id="81"/>
     </w:p>
     <w:p>
       <w:pPr>
@@ -15640,7 +15915,7 @@
           <w:color w:val="1A1A1A"/>
           <w:rFonts w:ascii="Aptos" w:hAnsi="Aptos" w:cs="Aptos" w:eastAsia="Aptos"/>
         </w:rPr>
-        <w:t xml:space="preserve">Šī rokasgrāmata apraksta pls,fix versiju v2.8.003. Tā pati versija ir uzrakstīta uz vāka un katras lapas apakšā.</w:t>
+        <w:t xml:space="preserve">Šī rokasgrāmata apraksta pls,fix versiju v2.8.017. Tā pati versija ir uzrakstīta uz vāka un katras lapas apakšā.</w:t>
       </w:r>
     </w:p>
     <w:p>
@@ -15705,7 +15980,7 @@
         <w:color w:val="5B6472"/>
         <w:rFonts w:ascii="Aptos" w:hAnsi="Aptos" w:cs="Aptos" w:eastAsia="Aptos"/>
       </w:rPr>
-      <w:t xml:space="preserve">pls,fix rokasgrāmata v2.8.003   |   </w:t>
+      <w:t xml:space="preserve">pls,fix rokasgrāmata v2.8.017   |   </w:t>
     </w:r>
     <w:r>
       <w:rPr>
@@ -15957,7 +16232,7 @@
     </w:lvlOverride>
   </w:num>
   <w:num w:numId="26">
-    <w:abstractNumId w:val="2"/>
+    <w:abstractNumId w:val="1"/>
     <w:lvlOverride w:ilvl="0">
       <w:startOverride w:val="1"/>
     </w:lvlOverride>
@@ -15969,12 +16244,18 @@
     </w:lvlOverride>
   </w:num>
   <w:num w:numId="28">
+    <w:abstractNumId w:val="2"/>
+    <w:lvlOverride w:ilvl="0">
+      <w:startOverride w:val="1"/>
+    </w:lvlOverride>
+  </w:num>
+  <w:num w:numId="29">
     <w:abstractNumId w:val="1"/>
     <w:lvlOverride w:ilvl="0">
       <w:startOverride w:val="1"/>
     </w:lvlOverride>
   </w:num>
-  <w:num w:numId="29">
+  <w:num w:numId="30">
     <w:abstractNumId w:val="2"/>
     <w:lvlOverride w:ilvl="0">
       <w:startOverride w:val="1"/>

</xml_diff>

<commit_message>
Manual regenerated at v2.8.018
</commit_message>
<xml_diff>
--- a/manual/out/pls,fix rokasgrāmata.docx
+++ b/manual/out/pls,fix rokasgrāmata.docx
@@ -123,7 +123,7 @@
           <w:bCs/>
           <w:rFonts w:ascii="Aptos" w:hAnsi="Aptos" w:cs="Aptos" w:eastAsia="Aptos"/>
         </w:rPr>
-        <w:t xml:space="preserve">v2.8.017</w:t>
+        <w:t xml:space="preserve">v2.8.018</w:t>
       </w:r>
     </w:p>
     <w:p>
@@ -15915,7 +15915,7 @@
           <w:color w:val="1A1A1A"/>
           <w:rFonts w:ascii="Aptos" w:hAnsi="Aptos" w:cs="Aptos" w:eastAsia="Aptos"/>
         </w:rPr>
-        <w:t xml:space="preserve">Šī rokasgrāmata apraksta pls,fix versiju v2.8.017. Tā pati versija ir uzrakstīta uz vāka un katras lapas apakšā.</w:t>
+        <w:t xml:space="preserve">Šī rokasgrāmata apraksta pls,fix versiju v2.8.018. Tā pati versija ir uzrakstīta uz vāka un katras lapas apakšā.</w:t>
       </w:r>
     </w:p>
     <w:p>
@@ -15980,7 +15980,7 @@
         <w:color w:val="5B6472"/>
         <w:rFonts w:ascii="Aptos" w:hAnsi="Aptos" w:cs="Aptos" w:eastAsia="Aptos"/>
       </w:rPr>
-      <w:t xml:space="preserve">pls,fix rokasgrāmata v2.8.017   |   </w:t>
+      <w:t xml:space="preserve">pls,fix rokasgrāmata v2.8.018   |   </w:t>
     </w:r>
     <w:r>
       <w:rPr>

</xml_diff>

<commit_message>
Manual regenerated at v2.8.019
</commit_message>
<xml_diff>
--- a/manual/out/pls,fix rokasgrāmata.docx
+++ b/manual/out/pls,fix rokasgrāmata.docx
@@ -123,7 +123,7 @@
           <w:bCs/>
           <w:rFonts w:ascii="Aptos" w:hAnsi="Aptos" w:cs="Aptos" w:eastAsia="Aptos"/>
         </w:rPr>
-        <w:t xml:space="preserve">v2.8.018</w:t>
+        <w:t xml:space="preserve">v2.8.019</w:t>
       </w:r>
     </w:p>
     <w:p>
@@ -9127,7 +9127,7 @@
           <w:color w:val="1A1A1A"/>
           <w:rFonts w:ascii="Aptos" w:hAnsi="Aptos" w:cs="Aptos" w:eastAsia="Aptos"/>
         </w:rPr>
-        <w:t xml:space="preserve">PowerPoint cilnē "Links" filtrs "All projects" rāda visu klāju; iesūtne ir grupēta pēc projekta. "Update all" atjaunina tikai filtram atbilstošās saites.</w:t>
+        <w:t xml:space="preserve">PowerPoint cilnē "Links" saraksts "Linked objects" ir sakārtots mapēs pēc projekta, un zem katra objekta ir norādīta darbgrāmata, no kuras tas nāk; filtrs "All projects" rāda visu klāju, un iesūtne ir grupēta tāpat. "Update all" atjaunina tikai filtram atbilstošās saites.</w:t>
       </w:r>
     </w:p>
     <w:p>
@@ -15915,7 +15915,7 @@
           <w:color w:val="1A1A1A"/>
           <w:rFonts w:ascii="Aptos" w:hAnsi="Aptos" w:cs="Aptos" w:eastAsia="Aptos"/>
         </w:rPr>
-        <w:t xml:space="preserve">Šī rokasgrāmata apraksta pls,fix versiju v2.8.018. Tā pati versija ir uzrakstīta uz vāka un katras lapas apakšā.</w:t>
+        <w:t xml:space="preserve">Šī rokasgrāmata apraksta pls,fix versiju v2.8.019. Tā pati versija ir uzrakstīta uz vāka un katras lapas apakšā.</w:t>
       </w:r>
     </w:p>
     <w:p>
@@ -15980,7 +15980,7 @@
         <w:color w:val="5B6472"/>
         <w:rFonts w:ascii="Aptos" w:hAnsi="Aptos" w:cs="Aptos" w:eastAsia="Aptos"/>
       </w:rPr>
-      <w:t xml:space="preserve">pls,fix rokasgrāmata v2.8.018   |   </w:t>
+      <w:t xml:space="preserve">pls,fix rokasgrāmata v2.8.019   |   </w:t>
     </w:r>
     <w:r>
       <w:rPr>

</xml_diff>

<commit_message>
Manual regenerated at v2.8.020
</commit_message>
<xml_diff>
--- a/manual/out/pls,fix rokasgrāmata.docx
+++ b/manual/out/pls,fix rokasgrāmata.docx
@@ -123,7 +123,7 @@
           <w:bCs/>
           <w:rFonts w:ascii="Aptos" w:hAnsi="Aptos" w:cs="Aptos" w:eastAsia="Aptos"/>
         </w:rPr>
-        <w:t xml:space="preserve">v2.8.019</w:t>
+        <w:t xml:space="preserve">v2.8.020</w:t>
       </w:r>
     </w:p>
     <w:p>
@@ -15915,7 +15915,7 @@
           <w:color w:val="1A1A1A"/>
           <w:rFonts w:ascii="Aptos" w:hAnsi="Aptos" w:cs="Aptos" w:eastAsia="Aptos"/>
         </w:rPr>
-        <w:t xml:space="preserve">Šī rokasgrāmata apraksta pls,fix versiju v2.8.019. Tā pati versija ir uzrakstīta uz vāka un katras lapas apakšā.</w:t>
+        <w:t xml:space="preserve">Šī rokasgrāmata apraksta pls,fix versiju v2.8.020. Tā pati versija ir uzrakstīta uz vāka un katras lapas apakšā.</w:t>
       </w:r>
     </w:p>
     <w:p>
@@ -15980,7 +15980,7 @@
         <w:color w:val="5B6472"/>
         <w:rFonts w:ascii="Aptos" w:hAnsi="Aptos" w:cs="Aptos" w:eastAsia="Aptos"/>
       </w:rPr>
-      <w:t xml:space="preserve">pls,fix rokasgrāmata v2.8.019   |   </w:t>
+      <w:t xml:space="preserve">pls,fix rokasgrāmata v2.8.020   |   </w:t>
     </w:r>
     <w:r>
       <w:rPr>

</xml_diff>

<commit_message>
Manual regenerated at v2.8.023
</commit_message>
<xml_diff>
--- a/manual/out/pls,fix rokasgrāmata.docx
+++ b/manual/out/pls,fix rokasgrāmata.docx
@@ -123,7 +123,7 @@
           <w:bCs/>
           <w:rFonts w:ascii="Aptos" w:hAnsi="Aptos" w:cs="Aptos" w:eastAsia="Aptos"/>
         </w:rPr>
-        <w:t xml:space="preserve">v2.8.020</w:t>
+        <w:t xml:space="preserve">v2.8.023</w:t>
       </w:r>
     </w:p>
     <w:p>
@@ -10330,7 +10330,7 @@
           <w:color w:val="1A1A1A"/>
           <w:rFonts w:ascii="Aptos" w:hAnsi="Aptos" w:cs="Aptos" w:eastAsia="Aptos"/>
         </w:rPr>
-        <w:t xml:space="preserve">"Needs update": avota dati Excel pusē mainījušies kopš pēdējās atjaunināšanas.</w:t>
+        <w:t xml:space="preserve">"Update available": avota dati Excel pusē mainījušies kopš pēdējās atjaunināšanas.</w:t>
       </w:r>
     </w:p>
     <w:p>
@@ -10349,7 +10349,7 @@
           <w:color w:val="1A1A1A"/>
           <w:rFonts w:ascii="Aptos" w:hAnsi="Aptos" w:cs="Aptos" w:eastAsia="Aptos"/>
         </w:rPr>
-        <w:t xml:space="preserve">"Missing source": relejā šai saitei vairs nav neviena attēla.</w:t>
+        <w:t xml:space="preserve">"Source missing": relejā šai saitei vairs nav neviena attēla.</w:t>
       </w:r>
     </w:p>
     <w:p>
@@ -15915,7 +15915,7 @@
           <w:color w:val="1A1A1A"/>
           <w:rFonts w:ascii="Aptos" w:hAnsi="Aptos" w:cs="Aptos" w:eastAsia="Aptos"/>
         </w:rPr>
-        <w:t xml:space="preserve">Šī rokasgrāmata apraksta pls,fix versiju v2.8.020. Tā pati versija ir uzrakstīta uz vāka un katras lapas apakšā.</w:t>
+        <w:t xml:space="preserve">Šī rokasgrāmata apraksta pls,fix versiju v2.8.023. Tā pati versija ir uzrakstīta uz vāka un katras lapas apakšā.</w:t>
       </w:r>
     </w:p>
     <w:p>
@@ -15980,7 +15980,7 @@
         <w:color w:val="5B6472"/>
         <w:rFonts w:ascii="Aptos" w:hAnsi="Aptos" w:cs="Aptos" w:eastAsia="Aptos"/>
       </w:rPr>
-      <w:t xml:space="preserve">pls,fix rokasgrāmata v2.8.020   |   </w:t>
+      <w:t xml:space="preserve">pls,fix rokasgrāmata v2.8.023   |   </w:t>
     </w:r>
     <w:r>
       <w:rPr>

</xml_diff>

<commit_message>
Manual regenerated at v2.9.001
</commit_message>
<xml_diff>
--- a/manual/out/pls,fix rokasgrāmata.docx
+++ b/manual/out/pls,fix rokasgrāmata.docx
@@ -123,7 +123,7 @@
           <w:bCs/>
           <w:rFonts w:ascii="Aptos" w:hAnsi="Aptos" w:cs="Aptos" w:eastAsia="Aptos"/>
         </w:rPr>
-        <w:t xml:space="preserve">v2.8.023</w:t>
+        <w:t xml:space="preserve">v2.9.001</w:t>
       </w:r>
     </w:p>
     <w:p>
@@ -1520,7 +1520,7 @@
               </w:pPr>
               <w:r>
                 <w:rPr/>
-                <w:t xml:space="preserve">Eksports no Excel</w:t>
+                <w:t xml:space="preserve">Saites bez servera: kopēt un ielīmēt</w:t>
               </w:r>
               <w:r>
                 <w:rPr/>
@@ -1545,7 +1545,7 @@
               </w:pPr>
               <w:r>
                 <w:rPr/>
-                <w:t xml:space="preserve">Saišu saraksts Excel pusē</w:t>
+                <w:t xml:space="preserve">Eksports no Excel</w:t>
               </w:r>
               <w:r>
                 <w:rPr/>
@@ -1570,7 +1570,7 @@
               </w:pPr>
               <w:r>
                 <w:rPr/>
-                <w:t xml:space="preserve">Projekti</w:t>
+                <w:t xml:space="preserve">Saišu saraksts Excel pusē</w:t>
               </w:r>
               <w:r>
                 <w:rPr/>
@@ -1595,7 +1595,7 @@
               </w:pPr>
               <w:r>
                 <w:rPr/>
-                <w:t xml:space="preserve">Auto-push on edit un Highlight linked cells</w:t>
+                <w:t xml:space="preserve">Projekti</w:t>
               </w:r>
               <w:r>
                 <w:rPr/>
@@ -1620,7 +1620,7 @@
               </w:pPr>
               <w:r>
                 <w:rPr/>
-                <w:t xml:space="preserve">Ievietošana PowerPoint</w:t>
+                <w:t xml:space="preserve">Auto-push on edit un Highlight linked cells</w:t>
               </w:r>
               <w:r>
                 <w:rPr/>
@@ -1645,7 +1645,7 @@
               </w:pPr>
               <w:r>
                 <w:rPr/>
-                <w:t xml:space="preserve">Slaids un vieta</w:t>
+                <w:t xml:space="preserve">Ievietošana PowerPoint</w:t>
               </w:r>
               <w:r>
                 <w:rPr/>
@@ -1670,7 +1670,7 @@
               </w:pPr>
               <w:r>
                 <w:rPr/>
-                <w:t xml:space="preserve">Atjaunināšana</w:t>
+                <w:t xml:space="preserve">Slaids un vieta</w:t>
               </w:r>
               <w:r>
                 <w:rPr/>
@@ -1695,7 +1695,7 @@
               </w:pPr>
               <w:r>
                 <w:rPr/>
-                <w:t xml:space="preserve">Meklēšana un filtrēšana</w:t>
+                <w:t xml:space="preserve">Atjaunināšana</w:t>
               </w:r>
               <w:r>
                 <w:rPr/>
@@ -1720,7 +1720,7 @@
               </w:pPr>
               <w:r>
                 <w:rPr/>
-                <w:t xml:space="preserve">Go to slide, Change source un Break link</w:t>
+                <w:t xml:space="preserve">Meklēšana un filtrēšana</w:t>
               </w:r>
               <w:r>
                 <w:rPr/>
@@ -1745,7 +1745,7 @@
               </w:pPr>
               <w:r>
                 <w:rPr/>
-                <w:t xml:space="preserve">Object tools</w:t>
+                <w:t xml:space="preserve">Go to slide, Change source un Break link</w:t>
               </w:r>
               <w:r>
                 <w:rPr/>
@@ -1770,7 +1770,7 @@
               </w:pPr>
               <w:r>
                 <w:rPr/>
-                <w:t xml:space="preserve">Smart Painter</w:t>
+                <w:t xml:space="preserve">Object tools</w:t>
               </w:r>
               <w:r>
                 <w:rPr/>
@@ -1795,7 +1795,7 @@
               </w:pPr>
               <w:r>
                 <w:rPr/>
-                <w:t xml:space="preserve">Drošība</w:t>
+                <w:t xml:space="preserve">Smart Painter</w:t>
               </w:r>
               <w:r>
                 <w:rPr/>
@@ -1813,6 +1813,31 @@
             <w:p>
               <w:pPr>
                 <w:rPr/>
+                <w:pStyle w:val="ToC2"/>
+                <w:tabs>
+                  <w:tab w:val="right" w:leader="dot" w:pos="80000"/>
+                </w:tabs>
+              </w:pPr>
+              <w:r>
+                <w:rPr/>
+                <w:t xml:space="preserve">Drošība</w:t>
+              </w:r>
+              <w:r>
+                <w:rPr/>
+                <w:tab/>
+              </w:r>
+              <w:r>
+                <w:rPr/>
+                <w:fldChar w:fldCharType="begin" w:dirty="false"/>
+                <w:instrText>PAGEREF _Toc00000066 \h</w:instrText>
+                <w:fldChar w:fldCharType="separate" w:dirty="false"/>
+                <w:t xml:space="preserve">1</w:t>
+                <w:fldChar w:fldCharType="end" w:dirty="false"/>
+              </w:r>
+            </w:p>
+            <w:p>
+              <w:pPr>
+                <w:rPr/>
                 <w:pStyle w:val="ToC1"/>
                 <w:tabs>
                   <w:tab w:val="right" w:leader="dot" w:pos="80000"/>
@@ -1829,7 +1854,7 @@
               <w:r>
                 <w:rPr/>
                 <w:fldChar w:fldCharType="begin" w:dirty="false"/>
-                <w:instrText>PAGEREF _Toc00000066 \h</w:instrText>
+                <w:instrText>PAGEREF _Toc00000067 \h</w:instrText>
                 <w:fldChar w:fldCharType="separate" w:dirty="false"/>
                 <w:t xml:space="preserve">1</w:t>
                 <w:fldChar w:fldCharType="end" w:dirty="false"/>
@@ -1854,7 +1879,7 @@
               <w:r>
                 <w:rPr/>
                 <w:fldChar w:fldCharType="begin" w:dirty="false"/>
-                <w:instrText>PAGEREF _Toc00000067 \h</w:instrText>
+                <w:instrText>PAGEREF _Toc00000068 \h</w:instrText>
                 <w:fldChar w:fldCharType="separate" w:dirty="false"/>
                 <w:t xml:space="preserve">1</w:t>
                 <w:fldChar w:fldCharType="end" w:dirty="false"/>
@@ -1879,7 +1904,7 @@
               <w:r>
                 <w:rPr/>
                 <w:fldChar w:fldCharType="begin" w:dirty="false"/>
-                <w:instrText>PAGEREF _Toc00000068 \h</w:instrText>
+                <w:instrText>PAGEREF _Toc00000069 \h</w:instrText>
                 <w:fldChar w:fldCharType="separate" w:dirty="false"/>
                 <w:t xml:space="preserve">1</w:t>
                 <w:fldChar w:fldCharType="end" w:dirty="false"/>
@@ -1904,7 +1929,7 @@
               <w:r>
                 <w:rPr/>
                 <w:fldChar w:fldCharType="begin" w:dirty="false"/>
-                <w:instrText>PAGEREF _Toc00000069 \h</w:instrText>
+                <w:instrText>PAGEREF _Toc00000070 \h</w:instrText>
                 <w:fldChar w:fldCharType="separate" w:dirty="false"/>
                 <w:t xml:space="preserve">1</w:t>
                 <w:fldChar w:fldCharType="end" w:dirty="false"/>
@@ -1929,7 +1954,7 @@
               <w:r>
                 <w:rPr/>
                 <w:fldChar w:fldCharType="begin" w:dirty="false"/>
-                <w:instrText>PAGEREF _Toc00000070 \h</w:instrText>
+                <w:instrText>PAGEREF _Toc00000071 \h</w:instrText>
                 <w:fldChar w:fldCharType="separate" w:dirty="false"/>
                 <w:t xml:space="preserve">1</w:t>
                 <w:fldChar w:fldCharType="end" w:dirty="false"/>
@@ -1954,7 +1979,7 @@
               <w:r>
                 <w:rPr/>
                 <w:fldChar w:fldCharType="begin" w:dirty="false"/>
-                <w:instrText>PAGEREF _Toc00000071 \h</w:instrText>
+                <w:instrText>PAGEREF _Toc00000072 \h</w:instrText>
                 <w:fldChar w:fldCharType="separate" w:dirty="false"/>
                 <w:t xml:space="preserve">1</w:t>
                 <w:fldChar w:fldCharType="end" w:dirty="false"/>
@@ -1979,7 +2004,7 @@
               <w:r>
                 <w:rPr/>
                 <w:fldChar w:fldCharType="begin" w:dirty="false"/>
-                <w:instrText>PAGEREF _Toc00000072 \h</w:instrText>
+                <w:instrText>PAGEREF _Toc00000073 \h</w:instrText>
                 <w:fldChar w:fldCharType="separate" w:dirty="false"/>
                 <w:t xml:space="preserve">1</w:t>
                 <w:fldChar w:fldCharType="end" w:dirty="false"/>
@@ -2004,7 +2029,7 @@
               <w:r>
                 <w:rPr/>
                 <w:fldChar w:fldCharType="begin" w:dirty="false"/>
-                <w:instrText>PAGEREF _Toc00000073 \h</w:instrText>
+                <w:instrText>PAGEREF _Toc00000074 \h</w:instrText>
                 <w:fldChar w:fldCharType="separate" w:dirty="false"/>
                 <w:t xml:space="preserve">1</w:t>
                 <w:fldChar w:fldCharType="end" w:dirty="false"/>
@@ -2029,7 +2054,7 @@
               <w:r>
                 <w:rPr/>
                 <w:fldChar w:fldCharType="begin" w:dirty="false"/>
-                <w:instrText>PAGEREF _Toc00000074 \h</w:instrText>
+                <w:instrText>PAGEREF _Toc00000075 \h</w:instrText>
                 <w:fldChar w:fldCharType="separate" w:dirty="false"/>
                 <w:t xml:space="preserve">1</w:t>
                 <w:fldChar w:fldCharType="end" w:dirty="false"/>
@@ -2054,7 +2079,7 @@
               <w:r>
                 <w:rPr/>
                 <w:fldChar w:fldCharType="begin" w:dirty="false"/>
-                <w:instrText>PAGEREF _Toc00000075 \h</w:instrText>
+                <w:instrText>PAGEREF _Toc00000076 \h</w:instrText>
                 <w:fldChar w:fldCharType="separate" w:dirty="false"/>
                 <w:t xml:space="preserve">1</w:t>
                 <w:fldChar w:fldCharType="end" w:dirty="false"/>
@@ -2079,7 +2104,7 @@
               <w:r>
                 <w:rPr/>
                 <w:fldChar w:fldCharType="begin" w:dirty="false"/>
-                <w:instrText>PAGEREF _Toc00000076 \h</w:instrText>
+                <w:instrText>PAGEREF _Toc00000077 \h</w:instrText>
                 <w:fldChar w:fldCharType="separate" w:dirty="false"/>
                 <w:t xml:space="preserve">1</w:t>
                 <w:fldChar w:fldCharType="end" w:dirty="false"/>
@@ -2104,7 +2129,7 @@
               <w:r>
                 <w:rPr/>
                 <w:fldChar w:fldCharType="begin" w:dirty="false"/>
-                <w:instrText>PAGEREF _Toc00000077 \h</w:instrText>
+                <w:instrText>PAGEREF _Toc00000078 \h</w:instrText>
                 <w:fldChar w:fldCharType="separate" w:dirty="false"/>
                 <w:t xml:space="preserve">1</w:t>
                 <w:fldChar w:fldCharType="end" w:dirty="false"/>
@@ -2129,7 +2154,7 @@
               <w:r>
                 <w:rPr/>
                 <w:fldChar w:fldCharType="begin" w:dirty="false"/>
-                <w:instrText>PAGEREF _Toc00000078 \h</w:instrText>
+                <w:instrText>PAGEREF _Toc00000079 \h</w:instrText>
                 <w:fldChar w:fldCharType="separate" w:dirty="false"/>
                 <w:t xml:space="preserve">1</w:t>
                 <w:fldChar w:fldCharType="end" w:dirty="false"/>
@@ -2154,7 +2179,7 @@
               <w:r>
                 <w:rPr/>
                 <w:fldChar w:fldCharType="begin" w:dirty="false"/>
-                <w:instrText>PAGEREF _Toc00000079 \h</w:instrText>
+                <w:instrText>PAGEREF _Toc00000080 \h</w:instrText>
                 <w:fldChar w:fldCharType="separate" w:dirty="false"/>
                 <w:t xml:space="preserve">1</w:t>
                 <w:fldChar w:fldCharType="end" w:dirty="false"/>
@@ -2179,7 +2204,7 @@
               <w:r>
                 <w:rPr/>
                 <w:fldChar w:fldCharType="begin" w:dirty="false"/>
-                <w:instrText>PAGEREF _Toc00000080 \h</w:instrText>
+                <w:instrText>PAGEREF _Toc00000081 \h</w:instrText>
                 <w:fldChar w:fldCharType="separate" w:dirty="false"/>
                 <w:t xml:space="preserve">1</w:t>
                 <w:fldChar w:fldCharType="end" w:dirty="false"/>
@@ -8505,7 +8530,7 @@
           <w:bCs/>
           <w:rFonts w:ascii="Aptos" w:hAnsi="Aptos" w:cs="Aptos" w:eastAsia="Aptos"/>
         </w:rPr>
-        <w:t xml:space="preserve">Eksports no Excel</w:t>
+        <w:t xml:space="preserve">Saites bez servera: kopēt un ielīmēt</w:t>
       </w:r>
       <w:bookmarkEnd w:id="55"/>
     </w:p>
@@ -8521,7 +8546,7 @@
           <w:color w:val="1A1A1A"/>
           <w:rFonts w:ascii="Aptos" w:hAnsi="Aptos" w:cs="Aptos" w:eastAsia="Aptos"/>
         </w:rPr>
-        <w:t xml:space="preserve">Excel cilnē "Links" atlasiet to, ko vēlaties nosūtīt uz PowerPoint.</w:t>
+        <w:t xml:space="preserve">Saiti no Excel uz PowerPoint var nosūtīt arī bez releja: viss paliek uz viena datora, un saturs ceļo tikai caur starpliktuvi. Jauna instalācija sākas tieši šādi; dators, kas jau lietoja releju, pie tā arī paliek, kamēr izvēlni nemaina.</w:t>
       </w:r>
     </w:p>
     <w:p>
@@ -8540,7 +8565,7 @@
           <w:color w:val="1A1A1A"/>
           <w:rFonts w:ascii="Aptos" w:hAnsi="Aptos" w:cs="Aptos" w:eastAsia="Aptos"/>
         </w:rPr>
-        <w:t xml:space="preserve">Šūnu apgabalam nospiediet "Export selection". Atlasei jābūt vienam nepārtrauktam apgabalam.</w:t>
+        <w:t xml:space="preserve">Excel pusē eksportējiet ierasti, piemēram, ar "Export selection", vai atzīmējiet vienu vai vairākas saites sarakstā un nospiediet "Copy selected" vai "Copy all".</w:t>
       </w:r>
     </w:p>
     <w:p>
@@ -8548,6 +8573,129 @@
         <w:rPr/>
         <w:numPr>
           <w:numId w:val="24"/>
+          <w:ilvl w:val="0"/>
+        </w:numPr>
+        <w:spacing w:after="60" w:line="276"/>
+      </w:pPr>
+      <w:r>
+        <w:rPr>
+          <w:sz w:val="22"/>
+          <w:szCs w:val="22"/>
+          <w:color w:val="1A1A1A"/>
+          <w:rFonts w:ascii="Aptos" w:hAnsi="Aptos" w:cs="Aptos" w:eastAsia="Aptos"/>
+        </w:rPr>
+        <w:t xml:space="preserve">PowerPoint pusē atveriet pls,fix paneli, sadaļu "Inbox", noklikšķiniet ielīmēšanas laukā "Paste from Excel" un nospiediet Ctrl+V (Mac datorā Cmd+V).</w:t>
+      </w:r>
+    </w:p>
+    <w:p>
+      <w:pPr>
+        <w:rPr/>
+        <w:numPr>
+          <w:numId w:val="24"/>
+          <w:ilvl w:val="0"/>
+        </w:numPr>
+        <w:spacing w:after="60" w:line="276"/>
+      </w:pPr>
+      <w:r>
+        <w:rPr>
+          <w:sz w:val="22"/>
+          <w:szCs w:val="22"/>
+          <w:color w:val="1A1A1A"/>
+          <w:rFonts w:ascii="Aptos" w:hAnsi="Aptos" w:cs="Aptos" w:eastAsia="Aptos"/>
+        </w:rPr>
+        <w:t xml:space="preserve">Saites, kas prezentācijā jau ir, atjaunojas uzreiz. Jaunās parādās sarakstā "Waiting to insert" tāpat kā no releja saņemtās; ievietojiet tās ar "Insert" vai "Paste latest linked".</w:t>
+      </w:r>
+    </w:p>
+    <w:p>
+      <w:pPr>
+        <w:rPr/>
+        <w:spacing w:after="120" w:line="276"/>
+      </w:pPr>
+      <w:r>
+        <w:rPr>
+          <w:sz w:val="22"/>
+          <w:szCs w:val="22"/>
+          <w:color w:val="1A1A1A"/>
+          <w:rFonts w:ascii="Aptos" w:hAnsi="Aptos" w:cs="Aptos" w:eastAsia="Aptos"/>
+        </w:rPr>
+        <w:t xml:space="preserve">Kuru ceļu saite izvēlas, nosaka izvēlne "Links travel" zem saišu saraksta Excel pusē un izvēlne "How links reach PowerPoint" PowerPoint pusē, sadaļā "Settings". "Copy and paste on this computer" saiti sūta tikai ar kopēšanu un ielīmēšanu; "Through the relay" izmanto releju kā līdz šim. Pārslēgšanās neizdzēš nedz saglabāto atslēgu, nedz relejā jau nosūtītās saites, nedz ielīmētās saites.</w:t>
+      </w:r>
+    </w:p>
+    <w:p>
+      <w:pPr>
+        <w:rPr/>
+        <w:spacing w:after="120" w:line="276"/>
+      </w:pPr>
+      <w:r>
+        <w:rPr>
+          <w:sz w:val="22"/>
+          <w:szCs w:val="22"/>
+          <w:color w:val="1A1A1A"/>
+          <w:rFonts w:ascii="Aptos" w:hAnsi="Aptos" w:cs="Aptos" w:eastAsia="Aptos"/>
+        </w:rPr>
+        <w:t xml:space="preserve">Ielīmētās saites paliek šī datora PowerPoint pusē, sadaļā "Inbox", kamēr tās neizdzēš poga "Clear pasted links". Ielīmējot saiti citur, piemēram, slaidā vai e-pastā, tur nonāk tikai viens teikums, nevis saites saturs.</w:t>
+      </w:r>
+    </w:p>
+    <w:p>
+      <w:pPr>
+        <w:rPr/>
+        <w:pStyle w:val="Heading2"/>
+        <w:spacing w:before="240" w:after="100"/>
+        <w:keepNext/>
+      </w:pPr>
+      <w:bookmarkStart w:id="56" w:name="_Toc00000055"/>
+      <w:r>
+        <w:rPr>
+          <w:sz w:val="26"/>
+          <w:szCs w:val="26"/>
+          <w:color w:val="14213D"/>
+          <w:b/>
+          <w:bCs/>
+          <w:rFonts w:ascii="Aptos" w:hAnsi="Aptos" w:cs="Aptos" w:eastAsia="Aptos"/>
+        </w:rPr>
+        <w:t xml:space="preserve">Eksports no Excel</w:t>
+      </w:r>
+      <w:bookmarkEnd w:id="56"/>
+    </w:p>
+    <w:p>
+      <w:pPr>
+        <w:rPr/>
+        <w:spacing w:after="120" w:line="276"/>
+      </w:pPr>
+      <w:r>
+        <w:rPr>
+          <w:sz w:val="22"/>
+          <w:szCs w:val="22"/>
+          <w:color w:val="1A1A1A"/>
+          <w:rFonts w:ascii="Aptos" w:hAnsi="Aptos" w:cs="Aptos" w:eastAsia="Aptos"/>
+        </w:rPr>
+        <w:t xml:space="preserve">Excel cilnē "Links" atlasiet to, ko vēlaties nosūtīt uz PowerPoint.</w:t>
+      </w:r>
+    </w:p>
+    <w:p>
+      <w:pPr>
+        <w:rPr/>
+        <w:numPr>
+          <w:numId w:val="25"/>
+          <w:ilvl w:val="0"/>
+        </w:numPr>
+        <w:spacing w:after="60" w:line="276"/>
+      </w:pPr>
+      <w:r>
+        <w:rPr>
+          <w:sz w:val="22"/>
+          <w:szCs w:val="22"/>
+          <w:color w:val="1A1A1A"/>
+          <w:rFonts w:ascii="Aptos" w:hAnsi="Aptos" w:cs="Aptos" w:eastAsia="Aptos"/>
+        </w:rPr>
+        <w:t xml:space="preserve">Šūnu apgabalam nospiediet "Export selection". Atlasei jābūt vienam nepārtrauktam apgabalam.</w:t>
+      </w:r>
+    </w:p>
+    <w:p>
+      <w:pPr>
+        <w:rPr/>
+        <w:numPr>
+          <w:numId w:val="25"/>
           <w:ilvl w:val="0"/>
         </w:numPr>
         <w:spacing w:after="60" w:line="276"/>
@@ -8664,7 +8812,7 @@
         <w:spacing w:before="240" w:after="100"/>
         <w:keepNext/>
       </w:pPr>
-      <w:bookmarkStart w:id="56" w:name="_Toc00000055"/>
+      <w:bookmarkStart w:id="57" w:name="_Toc00000056"/>
       <w:r>
         <w:rPr>
           <w:sz w:val="26"/>
@@ -8676,7 +8824,7 @@
         </w:rPr>
         <w:t xml:space="preserve">Saišu saraksts Excel pusē</w:t>
       </w:r>
-      <w:bookmarkEnd w:id="56"/>
+      <w:bookmarkEnd w:id="57"/>
     </w:p>
     <w:p>
       <w:pPr>
@@ -9025,7 +9173,7 @@
         <w:spacing w:before="240" w:after="100"/>
         <w:keepNext/>
       </w:pPr>
-      <w:bookmarkStart w:id="57" w:name="_Toc00000056"/>
+      <w:bookmarkStart w:id="58" w:name="_Toc00000057"/>
       <w:r>
         <w:rPr>
           <w:sz w:val="26"/>
@@ -9037,7 +9185,7 @@
         </w:rPr>
         <w:t xml:space="preserve">Projekti</w:t>
       </w:r>
-      <w:bookmarkEnd w:id="57"/>
+      <w:bookmarkEnd w:id="58"/>
     </w:p>
     <w:p>
       <w:pPr>
@@ -9058,7 +9206,7 @@
       <w:pPr>
         <w:rPr/>
         <w:numPr>
-          <w:numId w:val="25"/>
+          <w:numId w:val="26"/>
           <w:ilvl w:val="0"/>
         </w:numPr>
         <w:spacing w:after="60" w:line="276"/>
@@ -9077,7 +9225,7 @@
       <w:pPr>
         <w:rPr/>
         <w:numPr>
-          <w:numId w:val="25"/>
+          <w:numId w:val="26"/>
           <w:ilvl w:val="0"/>
         </w:numPr>
         <w:spacing w:after="60" w:line="276"/>
@@ -9096,7 +9244,7 @@
       <w:pPr>
         <w:rPr/>
         <w:numPr>
-          <w:numId w:val="25"/>
+          <w:numId w:val="26"/>
           <w:ilvl w:val="0"/>
         </w:numPr>
         <w:spacing w:after="60" w:line="276"/>
@@ -9115,7 +9263,7 @@
       <w:pPr>
         <w:rPr/>
         <w:numPr>
-          <w:numId w:val="25"/>
+          <w:numId w:val="26"/>
           <w:ilvl w:val="0"/>
         </w:numPr>
         <w:spacing w:after="60" w:line="276"/>
@@ -9152,7 +9300,7 @@
         <w:spacing w:before="240" w:after="100"/>
         <w:keepNext/>
       </w:pPr>
-      <w:bookmarkStart w:id="58" w:name="_Toc00000057"/>
+      <w:bookmarkStart w:id="59" w:name="_Toc00000058"/>
       <w:r>
         <w:rPr>
           <w:sz w:val="26"/>
@@ -9164,7 +9312,7 @@
         </w:rPr>
         <w:t xml:space="preserve">Auto-push on edit un Highlight linked cells</w:t>
       </w:r>
-      <w:bookmarkEnd w:id="58"/>
+      <w:bookmarkEnd w:id="59"/>
     </w:p>
     <w:p>
       <w:pPr>
@@ -9203,7 +9351,7 @@
         <w:spacing w:before="240" w:after="100"/>
         <w:keepNext/>
       </w:pPr>
-      <w:bookmarkStart w:id="59" w:name="_Toc00000058"/>
+      <w:bookmarkStart w:id="60" w:name="_Toc00000059"/>
       <w:r>
         <w:rPr>
           <w:sz w:val="26"/>
@@ -9215,7 +9363,7 @@
         </w:rPr>
         <w:t xml:space="preserve">Ievietošana PowerPoint</w:t>
       </w:r>
-      <w:bookmarkEnd w:id="59"/>
+      <w:bookmarkEnd w:id="60"/>
     </w:p>
     <w:p>
       <w:pPr>
@@ -9236,7 +9384,7 @@
       <w:pPr>
         <w:rPr/>
         <w:numPr>
-          <w:numId w:val="26"/>
+          <w:numId w:val="27"/>
           <w:ilvl w:val="0"/>
         </w:numPr>
         <w:spacing w:after="60" w:line="276"/>
@@ -9255,7 +9403,7 @@
       <w:pPr>
         <w:rPr/>
         <w:numPr>
-          <w:numId w:val="26"/>
+          <w:numId w:val="27"/>
           <w:ilvl w:val="0"/>
         </w:numPr>
         <w:spacing w:after="60" w:line="276"/>
@@ -9274,7 +9422,7 @@
       <w:pPr>
         <w:rPr/>
         <w:numPr>
-          <w:numId w:val="26"/>
+          <w:numId w:val="27"/>
           <w:ilvl w:val="0"/>
         </w:numPr>
         <w:spacing w:after="60" w:line="276"/>
@@ -9391,7 +9539,7 @@
         <w:spacing w:before="240" w:after="100"/>
         <w:keepNext/>
       </w:pPr>
-      <w:bookmarkStart w:id="60" w:name="_Toc00000059"/>
+      <w:bookmarkStart w:id="61" w:name="_Toc00000060"/>
       <w:r>
         <w:rPr>
           <w:sz w:val="26"/>
@@ -9403,7 +9551,7 @@
         </w:rPr>
         <w:t xml:space="preserve">Slaids un vieta</w:t>
       </w:r>
-      <w:bookmarkEnd w:id="60"/>
+      <w:bookmarkEnd w:id="61"/>
     </w:p>
     <w:p>
       <w:pPr>
@@ -9454,7 +9602,7 @@
       <w:pPr>
         <w:rPr/>
         <w:numPr>
-          <w:numId w:val="27"/>
+          <w:numId w:val="28"/>
           <w:ilvl w:val="0"/>
         </w:numPr>
         <w:spacing w:after="60" w:line="276"/>
@@ -9473,7 +9621,7 @@
       <w:pPr>
         <w:rPr/>
         <w:numPr>
-          <w:numId w:val="27"/>
+          <w:numId w:val="28"/>
           <w:ilvl w:val="0"/>
         </w:numPr>
         <w:spacing w:after="60" w:line="276"/>
@@ -9492,7 +9640,7 @@
       <w:pPr>
         <w:rPr/>
         <w:numPr>
-          <w:numId w:val="27"/>
+          <w:numId w:val="28"/>
           <w:ilvl w:val="0"/>
         </w:numPr>
         <w:spacing w:after="60" w:line="276"/>
@@ -9511,7 +9659,7 @@
       <w:pPr>
         <w:rPr/>
         <w:numPr>
-          <w:numId w:val="27"/>
+          <w:numId w:val="28"/>
           <w:ilvl w:val="0"/>
         </w:numPr>
         <w:spacing w:after="60" w:line="276"/>
@@ -9530,7 +9678,7 @@
       <w:pPr>
         <w:rPr/>
         <w:numPr>
-          <w:numId w:val="27"/>
+          <w:numId w:val="28"/>
           <w:ilvl w:val="0"/>
         </w:numPr>
         <w:spacing w:after="60" w:line="276"/>
@@ -9612,7 +9760,7 @@
         <w:spacing w:before="240" w:after="100"/>
         <w:keepNext/>
       </w:pPr>
-      <w:bookmarkStart w:id="61" w:name="_Toc00000060"/>
+      <w:bookmarkStart w:id="62" w:name="_Toc00000061"/>
       <w:r>
         <w:rPr>
           <w:sz w:val="26"/>
@@ -9624,7 +9772,7 @@
         </w:rPr>
         <w:t xml:space="preserve">Atjaunināšana</w:t>
       </w:r>
-      <w:bookmarkEnd w:id="61"/>
+      <w:bookmarkEnd w:id="62"/>
     </w:p>
     <w:p>
       <w:pPr>
@@ -9986,7 +10134,7 @@
         <w:spacing w:before="240" w:after="100"/>
         <w:keepNext/>
       </w:pPr>
-      <w:bookmarkStart w:id="62" w:name="_Toc00000061"/>
+      <w:bookmarkStart w:id="63" w:name="_Toc00000062"/>
       <w:r>
         <w:rPr>
           <w:sz w:val="26"/>
@@ -9998,7 +10146,7 @@
         </w:rPr>
         <w:t xml:space="preserve">Meklēšana un filtrēšana</w:t>
       </w:r>
-      <w:bookmarkEnd w:id="62"/>
+      <w:bookmarkEnd w:id="63"/>
     </w:p>
     <w:p>
       <w:pPr>
@@ -10318,7 +10466,7 @@
       <w:pPr>
         <w:rPr/>
         <w:numPr>
-          <w:numId w:val="28"/>
+          <w:numId w:val="29"/>
           <w:ilvl w:val="0"/>
         </w:numPr>
         <w:spacing w:after="60" w:line="276"/>
@@ -10337,7 +10485,7 @@
       <w:pPr>
         <w:rPr/>
         <w:numPr>
-          <w:numId w:val="28"/>
+          <w:numId w:val="29"/>
           <w:ilvl w:val="0"/>
         </w:numPr>
         <w:spacing w:after="60" w:line="276"/>
@@ -10356,7 +10504,7 @@
       <w:pPr>
         <w:rPr/>
         <w:numPr>
-          <w:numId w:val="28"/>
+          <w:numId w:val="29"/>
           <w:ilvl w:val="0"/>
         </w:numPr>
         <w:spacing w:after="60" w:line="276"/>
@@ -10375,7 +10523,7 @@
       <w:pPr>
         <w:rPr/>
         <w:numPr>
-          <w:numId w:val="28"/>
+          <w:numId w:val="29"/>
           <w:ilvl w:val="0"/>
         </w:numPr>
         <w:spacing w:after="60" w:line="276"/>
@@ -10397,7 +10545,7 @@
         <w:spacing w:before="240" w:after="100"/>
         <w:keepNext/>
       </w:pPr>
-      <w:bookmarkStart w:id="63" w:name="_Toc00000062"/>
+      <w:bookmarkStart w:id="64" w:name="_Toc00000063"/>
       <w:r>
         <w:rPr>
           <w:sz w:val="26"/>
@@ -10409,7 +10557,7 @@
         </w:rPr>
         <w:t xml:space="preserve">Go to slide, Change source un Break link</w:t>
       </w:r>
-      <w:bookmarkEnd w:id="63"/>
+      <w:bookmarkEnd w:id="64"/>
     </w:p>
     <w:p>
       <w:pPr>
@@ -10478,7 +10626,7 @@
         <w:spacing w:before="240" w:after="100"/>
         <w:keepNext/>
       </w:pPr>
-      <w:bookmarkStart w:id="64" w:name="_Toc00000063"/>
+      <w:bookmarkStart w:id="65" w:name="_Toc00000064"/>
       <w:r>
         <w:rPr>
           <w:sz w:val="26"/>
@@ -10490,7 +10638,7 @@
         </w:rPr>
         <w:t xml:space="preserve">Object tools</w:t>
       </w:r>
-      <w:bookmarkEnd w:id="64"/>
+      <w:bookmarkEnd w:id="65"/>
     </w:p>
     <w:p>
       <w:pPr>
@@ -10746,7 +10894,7 @@
         <w:spacing w:before="240" w:after="100"/>
         <w:keepNext/>
       </w:pPr>
-      <w:bookmarkStart w:id="65" w:name="_Toc00000064"/>
+      <w:bookmarkStart w:id="66" w:name="_Toc00000065"/>
       <w:r>
         <w:rPr>
           <w:sz w:val="26"/>
@@ -10758,7 +10906,7 @@
         </w:rPr>
         <w:t xml:space="preserve">Smart Painter</w:t>
       </w:r>
-      <w:bookmarkEnd w:id="65"/>
+      <w:bookmarkEnd w:id="66"/>
     </w:p>
     <w:p>
       <w:pPr>
@@ -10779,7 +10927,7 @@
       <w:pPr>
         <w:rPr/>
         <w:numPr>
-          <w:numId w:val="29"/>
+          <w:numId w:val="30"/>
           <w:ilvl w:val="0"/>
         </w:numPr>
         <w:spacing w:after="60" w:line="276"/>
@@ -10798,7 +10946,7 @@
       <w:pPr>
         <w:rPr/>
         <w:numPr>
-          <w:numId w:val="29"/>
+          <w:numId w:val="30"/>
           <w:ilvl w:val="0"/>
         </w:numPr>
         <w:spacing w:after="60" w:line="276"/>
@@ -10817,7 +10965,7 @@
       <w:pPr>
         <w:rPr/>
         <w:numPr>
-          <w:numId w:val="29"/>
+          <w:numId w:val="30"/>
           <w:ilvl w:val="0"/>
         </w:numPr>
         <w:spacing w:after="60" w:line="276"/>
@@ -10854,7 +11002,7 @@
         <w:spacing w:before="240" w:after="100"/>
         <w:keepNext/>
       </w:pPr>
-      <w:bookmarkStart w:id="66" w:name="_Toc00000065"/>
+      <w:bookmarkStart w:id="67" w:name="_Toc00000066"/>
       <w:r>
         <w:rPr>
           <w:sz w:val="26"/>
@@ -10866,7 +11014,7 @@
         </w:rPr>
         <w:t xml:space="preserve">Drošība</w:t>
       </w:r>
-      <w:bookmarkEnd w:id="66"/>
+      <w:bookmarkEnd w:id="67"/>
     </w:p>
     <w:p>
       <w:pPr>
@@ -10909,7 +11057,7 @@
         <w:keepNext/>
         <w:pageBreakBefore/>
       </w:pPr>
-      <w:bookmarkStart w:id="67" w:name="_Toc00000066"/>
+      <w:bookmarkStart w:id="68" w:name="_Toc00000067"/>
       <w:r>
         <w:rPr>
           <w:sz w:val="36"/>
@@ -10932,7 +11080,7 @@
         </w:rPr>
         <w:t xml:space="preserve">Cilne Brand</w:t>
       </w:r>
-      <w:bookmarkEnd w:id="67"/>
+      <w:bookmarkEnd w:id="68"/>
     </w:p>
     <w:p>
       <w:pPr>
@@ -10941,7 +11089,7 @@
         <w:spacing w:before="240" w:after="100"/>
         <w:keepNext/>
       </w:pPr>
-      <w:bookmarkStart w:id="68" w:name="_Toc00000067"/>
+      <w:bookmarkStart w:id="69" w:name="_Toc00000068"/>
       <w:r>
         <w:rPr>
           <w:sz w:val="26"/>
@@ -10953,7 +11101,7 @@
         </w:rPr>
         <w:t xml:space="preserve">Palete</w:t>
       </w:r>
-      <w:bookmarkEnd w:id="68"/>
+      <w:bookmarkEnd w:id="69"/>
     </w:p>
     <w:p>
       <w:pPr>
@@ -11423,7 +11571,7 @@
         <w:spacing w:before="240" w:after="100"/>
         <w:keepNext/>
       </w:pPr>
-      <w:bookmarkStart w:id="69" w:name="_Toc00000068"/>
+      <w:bookmarkStart w:id="70" w:name="_Toc00000069"/>
       <w:r>
         <w:rPr>
           <w:sz w:val="26"/>
@@ -11435,7 +11583,7 @@
         </w:rPr>
         <w:t xml:space="preserve">Krāsas no logotipa</w:t>
       </w:r>
-      <w:bookmarkEnd w:id="69"/>
+      <w:bookmarkEnd w:id="70"/>
     </w:p>
     <w:p>
       <w:pPr>
@@ -11459,7 +11607,7 @@
         <w:spacing w:before="240" w:after="100"/>
         <w:keepNext/>
       </w:pPr>
-      <w:bookmarkStart w:id="70" w:name="_Toc00000069"/>
+      <w:bookmarkStart w:id="71" w:name="_Toc00000070"/>
       <w:r>
         <w:rPr>
           <w:sz w:val="26"/>
@@ -11471,7 +11619,7 @@
         </w:rPr>
         <w:t xml:space="preserve">Fonts, valoda un skaitļu stils</w:t>
       </w:r>
-      <w:bookmarkEnd w:id="70"/>
+      <w:bookmarkEnd w:id="71"/>
     </w:p>
     <w:p>
       <w:pPr>
@@ -11902,7 +12050,7 @@
         <w:spacing w:before="240" w:after="100"/>
         <w:keepNext/>
       </w:pPr>
-      <w:bookmarkStart w:id="71" w:name="_Toc00000070"/>
+      <w:bookmarkStart w:id="72" w:name="_Toc00000071"/>
       <w:r>
         <w:rPr>
           <w:sz w:val="26"/>
@@ -11914,7 +12062,7 @@
         </w:rPr>
         <w:t xml:space="preserve">Valūta</w:t>
       </w:r>
-      <w:bookmarkEnd w:id="71"/>
+      <w:bookmarkEnd w:id="72"/>
     </w:p>
     <w:p>
       <w:pPr>
@@ -11938,7 +12086,7 @@
         <w:spacing w:before="240" w:after="100"/>
         <w:keepNext/>
       </w:pPr>
-      <w:bookmarkStart w:id="72" w:name="_Toc00000071"/>
+      <w:bookmarkStart w:id="73" w:name="_Toc00000072"/>
       <w:r>
         <w:rPr>
           <w:sz w:val="26"/>
@@ -11950,7 +12098,7 @@
         </w:rPr>
         <w:t xml:space="preserve">Autocolor on edit</w:t>
       </w:r>
-      <w:bookmarkEnd w:id="72"/>
+      <w:bookmarkEnd w:id="73"/>
     </w:p>
     <w:p>
       <w:pPr>
@@ -11974,7 +12122,7 @@
         <w:spacing w:before="240" w:after="100"/>
         <w:keepNext/>
       </w:pPr>
-      <w:bookmarkStart w:id="73" w:name="_Toc00000072"/>
+      <w:bookmarkStart w:id="74" w:name="_Toc00000073"/>
       <w:r>
         <w:rPr>
           <w:sz w:val="26"/>
@@ -11986,7 +12134,7 @@
         </w:rPr>
         <w:t xml:space="preserve">Keyboard shortcuts</w:t>
       </w:r>
-      <w:bookmarkEnd w:id="73"/>
+      <w:bookmarkEnd w:id="74"/>
     </w:p>
     <w:p>
       <w:pPr>
@@ -12010,7 +12158,7 @@
         <w:spacing w:before="240" w:after="100"/>
         <w:keepNext/>
       </w:pPr>
-      <w:bookmarkStart w:id="74" w:name="_Toc00000073"/>
+      <w:bookmarkStart w:id="75" w:name="_Toc00000074"/>
       <w:r>
         <w:rPr>
           <w:sz w:val="26"/>
@@ -12022,7 +12170,7 @@
         </w:rPr>
         <w:t xml:space="preserve">Iestatījumu pārnešana un atiestatīšana</w:t>
       </w:r>
-      <w:bookmarkEnd w:id="74"/>
+      <w:bookmarkEnd w:id="75"/>
     </w:p>
     <w:p>
       <w:pPr>
@@ -12080,7 +12228,7 @@
         <w:keepNext/>
         <w:pageBreakBefore/>
       </w:pPr>
-      <w:bookmarkStart w:id="75" w:name="_Toc00000074"/>
+      <w:bookmarkStart w:id="76" w:name="_Toc00000075"/>
       <w:r>
         <w:rPr>
           <w:sz w:val="36"/>
@@ -12103,7 +12251,7 @@
         </w:rPr>
         <w:t xml:space="preserve">Īsinājumtaustiņi</w:t>
       </w:r>
-      <w:bookmarkEnd w:id="75"/>
+      <w:bookmarkEnd w:id="76"/>
     </w:p>
     <w:p>
       <w:pPr>
@@ -12112,7 +12260,7 @@
         <w:spacing w:before="240" w:after="100"/>
         <w:keepNext/>
       </w:pPr>
-      <w:bookmarkStart w:id="76" w:name="_Toc00000075"/>
+      <w:bookmarkStart w:id="77" w:name="_Toc00000076"/>
       <w:r>
         <w:rPr>
           <w:sz w:val="26"/>
@@ -12124,7 +12272,7 @@
         </w:rPr>
         <w:t xml:space="preserve">Visas kombinācijas</w:t>
       </w:r>
-      <w:bookmarkEnd w:id="76"/>
+      <w:bookmarkEnd w:id="77"/>
     </w:p>
     <w:p>
       <w:pPr>
@@ -14789,7 +14937,7 @@
         <w:keepNext/>
         <w:pageBreakBefore/>
       </w:pPr>
-      <w:bookmarkStart w:id="77" w:name="_Toc00000076"/>
+      <w:bookmarkStart w:id="78" w:name="_Toc00000077"/>
       <w:r>
         <w:rPr>
           <w:sz w:val="36"/>
@@ -14812,7 +14960,7 @@
         </w:rPr>
         <w:t xml:space="preserve">Biežākās problēmas</w:t>
       </w:r>
-      <w:bookmarkEnd w:id="77"/>
+      <w:bookmarkEnd w:id="78"/>
     </w:p>
     <w:p>
       <w:pPr>
@@ -14821,7 +14969,7 @@
         <w:spacing w:before="240" w:after="100"/>
         <w:keepNext/>
       </w:pPr>
-      <w:bookmarkStart w:id="78" w:name="_Toc00000077"/>
+      <w:bookmarkStart w:id="79" w:name="_Toc00000078"/>
       <w:r>
         <w:rPr>
           <w:sz w:val="26"/>
@@ -14833,7 +14981,7 @@
         </w:rPr>
         <w:t xml:space="preserve">Ziņojumi un to iemesli</w:t>
       </w:r>
-      <w:bookmarkEnd w:id="78"/>
+      <w:bookmarkEnd w:id="79"/>
     </w:p>
     <w:tbl>
       <w:tblPr>
@@ -15604,7 +15752,7 @@
         <w:spacing w:before="240" w:after="100"/>
         <w:keepNext/>
       </w:pPr>
-      <w:bookmarkStart w:id="79" w:name="_Toc00000078"/>
+      <w:bookmarkStart w:id="80" w:name="_Toc00000079"/>
       <w:r>
         <w:rPr>
           <w:sz w:val="26"/>
@@ -15616,13 +15764,13 @@
         </w:rPr>
         <w:t xml:space="preserve">Ierobežojumi</w:t>
       </w:r>
-      <w:bookmarkEnd w:id="79"/>
+      <w:bookmarkEnd w:id="80"/>
     </w:p>
     <w:p>
       <w:pPr>
         <w:rPr/>
         <w:numPr>
-          <w:numId w:val="30"/>
+          <w:numId w:val="31"/>
           <w:ilvl w:val="0"/>
         </w:numPr>
         <w:spacing w:after="60" w:line="276"/>
@@ -15641,7 +15789,7 @@
       <w:pPr>
         <w:rPr/>
         <w:numPr>
-          <w:numId w:val="30"/>
+          <w:numId w:val="31"/>
           <w:ilvl w:val="0"/>
         </w:numPr>
         <w:spacing w:after="60" w:line="276"/>
@@ -15660,7 +15808,7 @@
       <w:pPr>
         <w:rPr/>
         <w:numPr>
-          <w:numId w:val="30"/>
+          <w:numId w:val="31"/>
           <w:ilvl w:val="0"/>
         </w:numPr>
         <w:spacing w:after="60" w:line="276"/>
@@ -15679,7 +15827,7 @@
       <w:pPr>
         <w:rPr/>
         <w:numPr>
-          <w:numId w:val="30"/>
+          <w:numId w:val="31"/>
           <w:ilvl w:val="0"/>
         </w:numPr>
         <w:spacing w:after="60" w:line="276"/>
@@ -15698,7 +15846,7 @@
       <w:pPr>
         <w:rPr/>
         <w:numPr>
-          <w:numId w:val="30"/>
+          <w:numId w:val="31"/>
           <w:ilvl w:val="0"/>
         </w:numPr>
         <w:spacing w:after="60" w:line="276"/>
@@ -15717,7 +15865,7 @@
       <w:pPr>
         <w:rPr/>
         <w:numPr>
-          <w:numId w:val="30"/>
+          <w:numId w:val="31"/>
           <w:ilvl w:val="0"/>
         </w:numPr>
         <w:spacing w:after="60" w:line="276"/>
@@ -15736,7 +15884,7 @@
       <w:pPr>
         <w:rPr/>
         <w:numPr>
-          <w:numId w:val="30"/>
+          <w:numId w:val="31"/>
           <w:ilvl w:val="0"/>
         </w:numPr>
         <w:spacing w:after="60" w:line="276"/>
@@ -15755,7 +15903,7 @@
       <w:pPr>
         <w:rPr/>
         <w:numPr>
-          <w:numId w:val="30"/>
+          <w:numId w:val="31"/>
           <w:ilvl w:val="0"/>
         </w:numPr>
         <w:spacing w:after="60" w:line="276"/>
@@ -15774,7 +15922,7 @@
       <w:pPr>
         <w:rPr/>
         <w:numPr>
-          <w:numId w:val="30"/>
+          <w:numId w:val="31"/>
           <w:ilvl w:val="0"/>
         </w:numPr>
         <w:spacing w:after="60" w:line="276"/>
@@ -15793,7 +15941,7 @@
       <w:pPr>
         <w:rPr/>
         <w:numPr>
-          <w:numId w:val="30"/>
+          <w:numId w:val="31"/>
           <w:ilvl w:val="0"/>
         </w:numPr>
         <w:spacing w:after="60" w:line="276"/>
@@ -15812,7 +15960,7 @@
       <w:pPr>
         <w:rPr/>
         <w:numPr>
-          <w:numId w:val="30"/>
+          <w:numId w:val="31"/>
           <w:ilvl w:val="0"/>
         </w:numPr>
         <w:spacing w:after="60" w:line="276"/>
@@ -15831,7 +15979,7 @@
       <w:pPr>
         <w:rPr/>
         <w:numPr>
-          <w:numId w:val="30"/>
+          <w:numId w:val="31"/>
           <w:ilvl w:val="0"/>
         </w:numPr>
         <w:spacing w:after="60" w:line="276"/>
@@ -15857,7 +16005,7 @@
         <w:keepNext/>
         <w:pageBreakBefore/>
       </w:pPr>
-      <w:bookmarkStart w:id="80" w:name="_Toc00000079"/>
+      <w:bookmarkStart w:id="81" w:name="_Toc00000080"/>
       <w:r>
         <w:rPr>
           <w:sz w:val="36"/>
@@ -15880,7 +16028,7 @@
         </w:rPr>
         <w:t xml:space="preserve">Versija</w:t>
       </w:r>
-      <w:bookmarkEnd w:id="80"/>
+      <w:bookmarkEnd w:id="81"/>
     </w:p>
     <w:p>
       <w:pPr>
@@ -15889,7 +16037,7 @@
         <w:spacing w:before="240" w:after="100"/>
         <w:keepNext/>
       </w:pPr>
-      <w:bookmarkStart w:id="81" w:name="_Toc00000080"/>
+      <w:bookmarkStart w:id="82" w:name="_Toc00000081"/>
       <w:r>
         <w:rPr>
           <w:sz w:val="26"/>
@@ -15901,7 +16049,7 @@
         </w:rPr>
         <w:t xml:space="preserve">Kura versija ir aprakstīta</w:t>
       </w:r>
-      <w:bookmarkEnd w:id="81"/>
+      <w:bookmarkEnd w:id="82"/>
     </w:p>
     <w:p>
       <w:pPr>
@@ -15915,7 +16063,7 @@
           <w:color w:val="1A1A1A"/>
           <w:rFonts w:ascii="Aptos" w:hAnsi="Aptos" w:cs="Aptos" w:eastAsia="Aptos"/>
         </w:rPr>
-        <w:t xml:space="preserve">Šī rokasgrāmata apraksta pls,fix versiju v2.8.023. Tā pati versija ir uzrakstīta uz vāka un katras lapas apakšā.</w:t>
+        <w:t xml:space="preserve">Šī rokasgrāmata apraksta pls,fix versiju v2.9.001. Tā pati versija ir uzrakstīta uz vāka un katras lapas apakšā.</w:t>
       </w:r>
     </w:p>
     <w:p>
@@ -15980,7 +16128,7 @@
         <w:color w:val="5B6472"/>
         <w:rFonts w:ascii="Aptos" w:hAnsi="Aptos" w:cs="Aptos" w:eastAsia="Aptos"/>
       </w:rPr>
-      <w:t xml:space="preserve">pls,fix rokasgrāmata v2.8.023   |   </w:t>
+      <w:t xml:space="preserve">pls,fix rokasgrāmata v2.9.001   |   </w:t>
     </w:r>
     <w:r>
       <w:rPr>
@@ -16220,13 +16368,13 @@
     </w:lvlOverride>
   </w:num>
   <w:num w:numId="24">
-    <w:abstractNumId w:val="2"/>
+    <w:abstractNumId w:val="1"/>
     <w:lvlOverride w:ilvl="0">
       <w:startOverride w:val="1"/>
     </w:lvlOverride>
   </w:num>
   <w:num w:numId="25">
-    <w:abstractNumId w:val="1"/>
+    <w:abstractNumId w:val="2"/>
     <w:lvlOverride w:ilvl="0">
       <w:startOverride w:val="1"/>
     </w:lvlOverride>
@@ -16238,7 +16386,7 @@
     </w:lvlOverride>
   </w:num>
   <w:num w:numId="27">
-    <w:abstractNumId w:val="2"/>
+    <w:abstractNumId w:val="1"/>
     <w:lvlOverride w:ilvl="0">
       <w:startOverride w:val="1"/>
     </w:lvlOverride>
@@ -16250,12 +16398,18 @@
     </w:lvlOverride>
   </w:num>
   <w:num w:numId="29">
+    <w:abstractNumId w:val="2"/>
+    <w:lvlOverride w:ilvl="0">
+      <w:startOverride w:val="1"/>
+    </w:lvlOverride>
+  </w:num>
+  <w:num w:numId="30">
     <w:abstractNumId w:val="1"/>
     <w:lvlOverride w:ilvl="0">
       <w:startOverride w:val="1"/>
     </w:lvlOverride>
   </w:num>
-  <w:num w:numId="30">
+  <w:num w:numId="31">
     <w:abstractNumId w:val="2"/>
     <w:lvlOverride w:ilvl="0">
       <w:startOverride w:val="1"/>

</xml_diff>